<commit_message>
Rename product and refine report notation
제품명 형식 변경 및 서술 표기 정리.

- 제품명을 국외근무직원 관리를 위한 HR 에이전트로 변경.
  대상을 앞세우는 형식으로 통일하고 문서 제목과 제품 요약에 반영
- 종결어미에서 함, 임, 음, 됨을 제거하고 명사에서 종결하도록 정리
  (수행함 → 수행, 에이전트임 → 에이전트, 제공함 → 제공)
- 계산식 줄의 불릿을 제거하고 상위 목표에 딸린 들여쓴 연속 줄로 변경.
  변환 스크립트에 불릿 하위 연속 줄 처리 로직 추가

분량 추정 6.8페이지 유지

Co-Authored-By: Claude Opus 5 <noreply@anthropic.com>
Claude-Session: https://claude.ai/code/session_01Ekn86cpQq9yULpsy9iFqKx
</commit_message>
<xml_diff>
--- a/prds/국외근무직원-HR-에이전트-PRD.docx
+++ b/prds/국외근무직원-HR-에이전트-PRD.docx
@@ -57,25 +57,25 @@
           <w:sz w:val="20"/>
           <w:szCs w:val="20"/>
         </w:rPr>
-        <w:t xml:space="preserve">문서 제목 / Title: 국외근무직원 관리 에이전트 제품 요구사항 정의서</w:t>
-      </w:r>
-    </w:p>
-    <w:p>
-      <w:pPr>
-        <w:pStyle w:val="ListParagraph"/>
-        <w:numPr>
-          <w:ilvl w:val="0"/>
-          <w:numId w:val="2"/>
-        </w:numPr>
-        <w:spacing w:after="30" w:line="264"/>
-      </w:pPr>
-      <w:r>
-        <w:rPr>
-          <w:rFonts w:ascii="맑은 고딕" w:cs="맑은 고딕" w:eastAsia="맑은 고딕" w:hAnsi="맑은 고딕"/>
-          <w:sz w:val="20"/>
-          <w:szCs w:val="20"/>
-        </w:rPr>
-        <w:t xml:space="preserve">버전 / Version: v0.3 (초안)</w:t>
+        <w:t xml:space="preserve">문서 제목 / Title: 국외근무직원 관리를 위한 HR 에이전트 제품 요구사항 정의서</w:t>
+      </w:r>
+    </w:p>
+    <w:p>
+      <w:pPr>
+        <w:pStyle w:val="ListParagraph"/>
+        <w:numPr>
+          <w:ilvl w:val="0"/>
+          <w:numId w:val="2"/>
+        </w:numPr>
+        <w:spacing w:after="30" w:line="264"/>
+      </w:pPr>
+      <w:r>
+        <w:rPr>
+          <w:rFonts w:ascii="맑은 고딕" w:cs="맑은 고딕" w:eastAsia="맑은 고딕" w:hAnsi="맑은 고딕"/>
+          <w:sz w:val="20"/>
+          <w:szCs w:val="20"/>
+        </w:rPr>
+        <w:t xml:space="preserve">버전 / Version: v0.4 (초안)</w:t>
       </w:r>
     </w:p>
     <w:p>
@@ -181,7 +181,7 @@
           <w:sz w:val="20"/>
           <w:szCs w:val="20"/>
         </w:rPr>
-        <w:t xml:space="preserve">국외근무직원 관리 에이전트</w:t>
+        <w:t xml:space="preserve">국외근무직원 관리를 위한 HR 에이전트</w:t>
       </w:r>
     </w:p>
     <w:p>
@@ -214,7 +214,7 @@
           <w:sz w:val="20"/>
           <w:szCs w:val="20"/>
         </w:rPr>
-        <w:t xml:space="preserve">국외근무직원 관리 에이전트는 </w:t>
+        <w:t xml:space="preserve">국외근무직원 관리를 위한 HR 에이전트는 </w:t>
       </w:r>
       <w:r>
         <w:rPr>
@@ -232,7 +232,7 @@
           <w:sz w:val="20"/>
           <w:szCs w:val="20"/>
         </w:rPr>
-        <w:t xml:space="preserve">임. 국외 근무와 관련된 절차 및 규정에 대한 질의응답 창구 역할을 수행함.</w:t>
+        <w:t xml:space="preserve">. 국외 근무와 관련된 절차 및 규정에 대한 질의응답 창구 역할 수행</w:t>
       </w:r>
     </w:p>
     <w:p>
@@ -245,7 +245,7 @@
           <w:sz w:val="20"/>
           <w:szCs w:val="20"/>
         </w:rPr>
-        <w:t xml:space="preserve">현재 국외근무직원 약 120명의 관련 문의가 글로벌사업그룹 HR 담당자 1~2명에게 집중되어 있으며, 동일 질문의 반복 발생과 답변 미기록으로 인한 재작업이 상시 발생. 본 에이전트는 해당 문의를 시스템이 1차로 수용하여 근거 기반 답변을 즉시 제공함.</w:t>
+        <w:t xml:space="preserve">현재 국외근무직원 약 120명의 관련 문의가 글로벌사업그룹 HR 담당자 1~2명에게 집중되어 있으며, 동일 질문의 반복 발생과 답변 미기록으로 인한 재작업이 상시 발생. 본 에이전트는 해당 문의를 시스템이 1차로 수용하여 근거 기반 답변 즉시 제공</w:t>
       </w:r>
     </w:p>
     <w:p>
@@ -258,7 +258,7 @@
           <w:sz w:val="20"/>
           <w:szCs w:val="20"/>
         </w:rPr>
-        <w:t xml:space="preserve">주요 제공 기능은 다음과 같음.</w:t>
+        <w:t xml:space="preserve">주요 제공 기능</w:t>
       </w:r>
     </w:p>
     <w:p>
@@ -540,12 +540,8 @@
     </w:p>
     <w:p>
       <w:pPr>
-        <w:pStyle w:val="ListParagraph"/>
-        <w:numPr>
-          <w:ilvl w:val="0"/>
-          <w:numId w:val="2"/>
-        </w:numPr>
-        <w:spacing w:after="30" w:line="264"/>
+        <w:spacing w:after="60" w:line="264"/>
+        <w:ind w:left="640"/>
       </w:pPr>
       <w:r>
         <w:rPr>
@@ -586,12 +582,8 @@
     </w:p>
     <w:p>
       <w:pPr>
-        <w:pStyle w:val="ListParagraph"/>
-        <w:numPr>
-          <w:ilvl w:val="0"/>
-          <w:numId w:val="2"/>
-        </w:numPr>
-        <w:spacing w:after="30" w:line="264"/>
+        <w:spacing w:after="60" w:line="264"/>
+        <w:ind w:left="640"/>
       </w:pPr>
       <w:r>
         <w:rPr>
@@ -632,12 +624,8 @@
     </w:p>
     <w:p>
       <w:pPr>
-        <w:pStyle w:val="ListParagraph"/>
-        <w:numPr>
-          <w:ilvl w:val="0"/>
-          <w:numId w:val="2"/>
-        </w:numPr>
-        <w:spacing w:after="30" w:line="264"/>
+        <w:spacing w:after="60" w:line="264"/>
+        <w:ind w:left="640"/>
       </w:pPr>
       <w:r>
         <w:rPr>
@@ -678,12 +666,8 @@
     </w:p>
     <w:p>
       <w:pPr>
-        <w:pStyle w:val="ListParagraph"/>
-        <w:numPr>
-          <w:ilvl w:val="0"/>
-          <w:numId w:val="2"/>
-        </w:numPr>
-        <w:spacing w:after="30" w:line="264"/>
+        <w:spacing w:after="60" w:line="264"/>
+        <w:ind w:left="640"/>
       </w:pPr>
       <w:r>
         <w:rPr>
@@ -724,12 +708,8 @@
     </w:p>
     <w:p>
       <w:pPr>
-        <w:pStyle w:val="ListParagraph"/>
-        <w:numPr>
-          <w:ilvl w:val="0"/>
-          <w:numId w:val="2"/>
-        </w:numPr>
-        <w:spacing w:after="30" w:line="264"/>
+        <w:spacing w:after="60" w:line="264"/>
+        <w:ind w:left="640"/>
       </w:pPr>
       <w:r>
         <w:rPr>
@@ -770,12 +750,8 @@
     </w:p>
     <w:p>
       <w:pPr>
-        <w:pStyle w:val="ListParagraph"/>
-        <w:numPr>
-          <w:ilvl w:val="0"/>
-          <w:numId w:val="2"/>
-        </w:numPr>
-        <w:spacing w:after="30" w:line="264"/>
+        <w:spacing w:after="60" w:line="264"/>
+        <w:ind w:left="640"/>
       </w:pPr>
       <w:r>
         <w:rPr>
@@ -983,7 +959,7 @@
           <w:sz w:val="20"/>
           <w:szCs w:val="20"/>
         </w:rPr>
-        <w:t xml:space="preserve">1차 버전을 글로벌사업그룹 HR 담당자 전용으로 출시하는 사유는, 담당자의 상시 규정 확인 업무로 인한 사용 보장과 오답의 즉시 발견·교정 가능성 확보에 있음. 검증되지 않은 답변이 국외근무직원에게 우선 전달되는 상황 방지 목적.</w:t>
+        <w:t xml:space="preserve">1차 버전을 글로벌사업그룹 HR 담당자 전용으로 출시하는 사유는, 담당자의 상시 규정 확인 업무로 인한 사용 보장과 오답의 즉시 발견·교정 가능성 확보. 검증되지 않은 답변이 국외근무직원에게 우선 전달되는 상황 방지 목적.</w:t>
       </w:r>
     </w:p>
     <w:p>

</xml_diff>

<commit_message>
Split user segments and expand use case dialogues
대상 사용자 구분, 문제 정의 수정, 유스케이스 상세화, 목표 축소.

대상 사용자:
- 주요 사용자(글로벌사업그룹 HR 담당자, 후임 HR 담당자)와
  부가 사용자(예비발령자, 국외근무직원)로 구분

문제 정의 수정:
- 국가별 안내 자료의 형식이 미통일이라는 서술을 정정. 형식은
  통일되어 있으며 국가별 현지 사정이 상이한 것이 실제 원인이므로,
  문의자가 본인 해당 내용을 특정하기 어려운 문제로 재기술

기능 명칭:
- 서류 양식 제공을 제출 서류 양식 제공으로 변경하고, 부임 전 제출
  서류가 대상임을 명시

유스케이스:
- 7개 유형의 대화를 다회 턴과 구체적 응답 내용으로 확장. 조항 구성,
  제출 기한, 근거 조항과 시행일, 소관부서, 후속 질의와 답변까지 포함

목표:
- 6개에서 4개로 축소. 건당 소요시간 항목을 제외하고 근거 표시율과
  기록률을 하나로 통합
- 계산식 줄을 불릿 텍스트와 같은 위치에서 시작하도록 정렬하고 상위
  항목과의 간격을 제거해 한 세트로 보이도록 서식 조정

분량 추정 7.7페이지

Co-Authored-By: Claude Opus 5 <noreply@anthropic.com>
Claude-Session: https://claude.ai/code/session_01Ekn86cpQq9yULpsy9iFqKx
</commit_message>
<xml_diff>
--- a/prds/국외근무직원-HR-에이전트-PRD.docx
+++ b/prds/국외근무직원-HR-에이전트-PRD.docx
@@ -362,15 +362,15 @@
           <w:sz w:val="20"/>
           <w:szCs w:val="20"/>
         </w:rPr>
-        <w:t xml:space="preserve">서류 양식 제공</w:t>
-      </w:r>
-      <w:r>
-        <w:rPr>
-          <w:rFonts w:ascii="맑은 고딕" w:cs="맑은 고딕" w:eastAsia="맑은 고딕" w:hAnsi="맑은 고딕"/>
-          <w:sz w:val="20"/>
-          <w:szCs w:val="20"/>
-        </w:rPr>
-        <w:t xml:space="preserve"> — 국가별·용도별 최신 서류 양식 직접 제공</w:t>
+        <w:t xml:space="preserve">제출 서류 양식 제공</w:t>
+      </w:r>
+      <w:r>
+        <w:rPr>
+          <w:rFonts w:ascii="맑은 고딕" w:cs="맑은 고딕" w:eastAsia="맑은 고딕" w:hAnsi="맑은 고딕"/>
+          <w:sz w:val="20"/>
+          <w:szCs w:val="20"/>
+        </w:rPr>
+        <w:t xml:space="preserve"> — 부임 전 제출 서류 등 국가별·용도별 최신 양식 직접 제공</w:t>
       </w:r>
     </w:p>
     <w:p>
@@ -509,7 +509,7 @@
           <w:ilvl w:val="0"/>
           <w:numId w:val="2"/>
         </w:numPr>
-        <w:spacing w:after="30" w:line="264"/>
+        <w:spacing w:after="0" w:line="264"/>
       </w:pPr>
       <w:r>
         <w:rPr>
@@ -529,25 +529,18 @@
         </w:rPr>
         <w:t xml:space="preserve">40% 감축</w:t>
       </w:r>
-      <w:r>
-        <w:rPr>
-          <w:rFonts w:ascii="맑은 고딕" w:cs="맑은 고딕" w:eastAsia="맑은 고딕" w:hAnsi="맑은 고딕"/>
-          <w:sz w:val="20"/>
-          <w:szCs w:val="20"/>
-        </w:rPr>
-        <w:t xml:space="preserve"> (도입 전 2주 기준값 대비)</w:t>
-      </w:r>
-    </w:p>
-    <w:p>
-      <w:pPr>
-        <w:spacing w:after="60" w:line="264"/>
-        <w:ind w:left="640"/>
-      </w:pPr>
-      <w:r>
-        <w:rPr>
-          <w:rFonts w:ascii="맑은 고딕" w:cs="맑은 고딕" w:eastAsia="맑은 고딕" w:hAnsi="맑은 고딕"/>
-          <w:sz w:val="20"/>
-          <w:szCs w:val="20"/>
+    </w:p>
+    <w:p>
+      <w:pPr>
+        <w:spacing w:after="130" w:before="0" w:line="252"/>
+        <w:ind w:left="300"/>
+      </w:pPr>
+      <w:r>
+        <w:rPr>
+          <w:rFonts w:ascii="맑은 고딕" w:cs="맑은 고딕" w:eastAsia="맑은 고딕" w:hAnsi="맑은 고딕"/>
+          <w:color w:val="595959"/>
+          <w:sz w:val="19"/>
+          <w:szCs w:val="19"/>
         </w:rPr>
         <w:t xml:space="preserve">(계산식) (도입 전 월평균 문의 건수 − 도입 후 월평균 문의 건수) ÷ 도입 전 월평균 문의 건수 × 100</w:t>
       </w:r>
@@ -559,7 +552,7 @@
           <w:ilvl w:val="0"/>
           <w:numId w:val="2"/>
         </w:numPr>
-        <w:spacing w:after="30" w:line="264"/>
+        <w:spacing w:after="0" w:line="264"/>
       </w:pPr>
       <w:r>
         <w:rPr>
@@ -582,14 +575,15 @@
     </w:p>
     <w:p>
       <w:pPr>
-        <w:spacing w:after="60" w:line="264"/>
-        <w:ind w:left="640"/>
-      </w:pPr>
-      <w:r>
-        <w:rPr>
-          <w:rFonts w:ascii="맑은 고딕" w:cs="맑은 고딕" w:eastAsia="맑은 고딕" w:hAnsi="맑은 고딕"/>
-          <w:sz w:val="20"/>
-          <w:szCs w:val="20"/>
+        <w:spacing w:after="130" w:before="0" w:line="252"/>
+        <w:ind w:left="300"/>
+      </w:pPr>
+      <w:r>
+        <w:rPr>
+          <w:rFonts w:ascii="맑은 고딕" w:cs="맑은 고딕" w:eastAsia="맑은 고딕" w:hAnsi="맑은 고딕"/>
+          <w:color w:val="595959"/>
+          <w:sz w:val="19"/>
+          <w:szCs w:val="19"/>
         </w:rPr>
         <w:t xml:space="preserve">(계산식) 담당자 개입 없이 종결된 문의 건수 ÷ 전체 문의 건수 × 100</w:t>
       </w:r>
@@ -601,7 +595,7 @@
           <w:ilvl w:val="0"/>
           <w:numId w:val="2"/>
         </w:numPr>
-        <w:spacing w:after="30" w:line="264"/>
+        <w:spacing w:after="0" w:line="264"/>
       </w:pPr>
       <w:r>
         <w:rPr>
@@ -624,14 +618,15 @@
     </w:p>
     <w:p>
       <w:pPr>
-        <w:spacing w:after="60" w:line="264"/>
-        <w:ind w:left="640"/>
-      </w:pPr>
-      <w:r>
-        <w:rPr>
-          <w:rFonts w:ascii="맑은 고딕" w:cs="맑은 고딕" w:eastAsia="맑은 고딕" w:hAnsi="맑은 고딕"/>
-          <w:sz w:val="20"/>
-          <w:szCs w:val="20"/>
+        <w:spacing w:after="130" w:before="0" w:line="252"/>
+        <w:ind w:left="300"/>
+      </w:pPr>
+      <w:r>
+        <w:rPr>
+          <w:rFonts w:ascii="맑은 고딕" w:cs="맑은 고딕" w:eastAsia="맑은 고딕" w:hAnsi="맑은 고딕"/>
+          <w:color w:val="595959"/>
+          <w:sz w:val="19"/>
+          <w:szCs w:val="19"/>
         </w:rPr>
         <w:t xml:space="preserve">(계산식) 평가 문항 중 정답 처리 문항 수 ÷ 전체 평가 문항 수 × 100</w:t>
       </w:r>
@@ -643,99 +638,15 @@
           <w:ilvl w:val="0"/>
           <w:numId w:val="2"/>
         </w:numPr>
-        <w:spacing w:after="30" w:line="264"/>
-      </w:pPr>
-      <w:r>
-        <w:rPr>
-          <w:rFonts w:ascii="맑은 고딕" w:cs="맑은 고딕" w:eastAsia="맑은 고딕" w:hAnsi="맑은 고딕"/>
-          <w:sz w:val="20"/>
-          <w:szCs w:val="20"/>
-        </w:rPr>
-        <w:t xml:space="preserve">답변 근거(조항 원문·소관부서) 표시율 </w:t>
-      </w:r>
-      <w:r>
-        <w:rPr>
-          <w:rFonts w:ascii="맑은 고딕" w:cs="맑은 고딕" w:eastAsia="맑은 고딕" w:hAnsi="맑은 고딕"/>
-          <w:b/>
-          <w:bCs/>
-          <w:sz w:val="20"/>
-          <w:szCs w:val="20"/>
-        </w:rPr>
-        <w:t xml:space="preserve">100% 유지</w:t>
-      </w:r>
-    </w:p>
-    <w:p>
-      <w:pPr>
-        <w:spacing w:after="60" w:line="264"/>
-        <w:ind w:left="640"/>
-      </w:pPr>
-      <w:r>
-        <w:rPr>
-          <w:rFonts w:ascii="맑은 고딕" w:cs="맑은 고딕" w:eastAsia="맑은 고딕" w:hAnsi="맑은 고딕"/>
-          <w:sz w:val="20"/>
-          <w:szCs w:val="20"/>
-        </w:rPr>
-        <w:t xml:space="preserve">(계산식) 조항 원문 및 소관부서가 표시된 답변 수 ÷ 전체 답변 수 × 100</w:t>
-      </w:r>
-    </w:p>
-    <w:p>
-      <w:pPr>
-        <w:pStyle w:val="ListParagraph"/>
-        <w:numPr>
-          <w:ilvl w:val="0"/>
-          <w:numId w:val="2"/>
-        </w:numPr>
-        <w:spacing w:after="30" w:line="264"/>
-      </w:pPr>
-      <w:r>
-        <w:rPr>
-          <w:rFonts w:ascii="맑은 고딕" w:cs="맑은 고딕" w:eastAsia="맑은 고딕" w:hAnsi="맑은 고딕"/>
-          <w:sz w:val="20"/>
-          <w:szCs w:val="20"/>
-        </w:rPr>
-        <w:t xml:space="preserve">문의 1건당 담당자 소요시간 </w:t>
-      </w:r>
-      <w:r>
-        <w:rPr>
-          <w:rFonts w:ascii="맑은 고딕" w:cs="맑은 고딕" w:eastAsia="맑은 고딕" w:hAnsi="맑은 고딕"/>
-          <w:b/>
-          <w:bCs/>
-          <w:sz w:val="20"/>
-          <w:szCs w:val="20"/>
-        </w:rPr>
-        <w:t xml:space="preserve">30% 단축</w:t>
-      </w:r>
-    </w:p>
-    <w:p>
-      <w:pPr>
-        <w:spacing w:after="60" w:line="264"/>
-        <w:ind w:left="640"/>
-      </w:pPr>
-      <w:r>
-        <w:rPr>
-          <w:rFonts w:ascii="맑은 고딕" w:cs="맑은 고딕" w:eastAsia="맑은 고딕" w:hAnsi="맑은 고딕"/>
-          <w:sz w:val="20"/>
-          <w:szCs w:val="20"/>
-        </w:rPr>
-        <w:t xml:space="preserve">(계산식) (도입 전 건당 평균 소요시간 − 도입 후 건당 평균 소요시간) ÷ 도입 전 건당 평균 소요시간 × 100</w:t>
-      </w:r>
-    </w:p>
-    <w:p>
-      <w:pPr>
-        <w:pStyle w:val="ListParagraph"/>
-        <w:numPr>
-          <w:ilvl w:val="0"/>
-          <w:numId w:val="2"/>
-        </w:numPr>
-        <w:spacing w:after="30" w:line="264"/>
-      </w:pPr>
-      <w:r>
-        <w:rPr>
-          <w:rFonts w:ascii="맑은 고딕" w:cs="맑은 고딕" w:eastAsia="맑은 고딕" w:hAnsi="맑은 고딕"/>
-          <w:sz w:val="20"/>
-          <w:szCs w:val="20"/>
-        </w:rPr>
-        <w:t xml:space="preserve">확정 답변의 근거 기록률 </w:t>
+        <w:spacing w:after="0" w:line="264"/>
+      </w:pPr>
+      <w:r>
+        <w:rPr>
+          <w:rFonts w:ascii="맑은 고딕" w:cs="맑은 고딕" w:eastAsia="맑은 고딕" w:hAnsi="맑은 고딕"/>
+          <w:sz w:val="20"/>
+          <w:szCs w:val="20"/>
+        </w:rPr>
+        <w:t xml:space="preserve">답변 근거(조항 원문·소관부서) 표시 및 기록률 </w:t>
       </w:r>
       <w:r>
         <w:rPr>
@@ -750,16 +661,17 @@
     </w:p>
     <w:p>
       <w:pPr>
-        <w:spacing w:after="60" w:line="264"/>
-        <w:ind w:left="640"/>
-      </w:pPr>
-      <w:r>
-        <w:rPr>
-          <w:rFonts w:ascii="맑은 고딕" w:cs="맑은 고딕" w:eastAsia="맑은 고딕" w:hAnsi="맑은 고딕"/>
-          <w:sz w:val="20"/>
-          <w:szCs w:val="20"/>
-        </w:rPr>
-        <w:t xml:space="preserve">(계산식) 근거 조항이 기록된 확정 답변 수 ÷ 전체 확정 답변 수 × 100</w:t>
+        <w:spacing w:after="130" w:before="0" w:line="252"/>
+        <w:ind w:left="300"/>
+      </w:pPr>
+      <w:r>
+        <w:rPr>
+          <w:rFonts w:ascii="맑은 고딕" w:cs="맑은 고딕" w:eastAsia="맑은 고딕" w:hAnsi="맑은 고딕"/>
+          <w:color w:val="595959"/>
+          <w:sz w:val="19"/>
+          <w:szCs w:val="19"/>
+        </w:rPr>
+        <w:t xml:space="preserve">(계산식) 조항 원문 및 소관부서가 표시·기록된 답변 수 ÷ 전체 답변 수 × 100</w:t>
       </w:r>
     </w:p>
     <w:p>
@@ -839,6 +751,23 @@
     </w:p>
     <w:p>
       <w:pPr>
+        <w:pStyle w:val="Heading2"/>
+        <w:spacing w:after="70" w:before="180"/>
+      </w:pPr>
+      <w:r>
+        <w:rPr>
+          <w:rFonts w:ascii="맑은 고딕" w:cs="맑은 고딕" w:eastAsia="맑은 고딕" w:hAnsi="맑은 고딕"/>
+          <w:b/>
+          <w:bCs/>
+          <w:color w:val="1F4E79"/>
+          <w:sz w:val="22"/>
+          <w:szCs w:val="22"/>
+        </w:rPr>
+        <w:t xml:space="preserve">주요 사용자</w:t>
+      </w:r>
+    </w:p>
+    <w:p>
+      <w:pPr>
         <w:pStyle w:val="ListParagraph"/>
         <w:numPr>
           <w:ilvl w:val="0"/>
@@ -862,7 +791,52 @@
           <w:sz w:val="20"/>
           <w:szCs w:val="20"/>
         </w:rPr>
-        <w:t xml:space="preserve"> — 본부에서 국외 HR 업무를 담당하는 1~2명. 문의 응대 및 규정 확인을 상시 수행하는 주 사용자이자 1차 버전의 유일한 사용자</w:t>
+        <w:t xml:space="preserve"> — 본부에서 국외 HR 업무를 담당하는 1~2명. 문의 응대 및 규정 확인을 상시 수행하는 1차 버전의 유일한 사용자</w:t>
+      </w:r>
+    </w:p>
+    <w:p>
+      <w:pPr>
+        <w:pStyle w:val="ListParagraph"/>
+        <w:numPr>
+          <w:ilvl w:val="0"/>
+          <w:numId w:val="2"/>
+        </w:numPr>
+        <w:spacing w:after="30" w:line="264"/>
+      </w:pPr>
+      <w:r>
+        <w:rPr>
+          <w:rFonts w:ascii="맑은 고딕" w:cs="맑은 고딕" w:eastAsia="맑은 고딕" w:hAnsi="맑은 고딕"/>
+          <w:b/>
+          <w:bCs/>
+          <w:sz w:val="20"/>
+          <w:szCs w:val="20"/>
+        </w:rPr>
+        <w:t xml:space="preserve">후임 HR 담당자</w:t>
+      </w:r>
+      <w:r>
+        <w:rPr>
+          <w:rFonts w:ascii="맑은 고딕" w:cs="맑은 고딕" w:eastAsia="맑은 고딕" w:hAnsi="맑은 고딕"/>
+          <w:sz w:val="20"/>
+          <w:szCs w:val="20"/>
+        </w:rPr>
+        <w:t xml:space="preserve"> — 인사발령으로 업무를 승계하는 담당자. 전임자의 처리 기준 및 근거 파악 요구</w:t>
+      </w:r>
+    </w:p>
+    <w:p>
+      <w:pPr>
+        <w:pStyle w:val="Heading2"/>
+        <w:spacing w:after="70" w:before="180"/>
+      </w:pPr>
+      <w:r>
+        <w:rPr>
+          <w:rFonts w:ascii="맑은 고딕" w:cs="맑은 고딕" w:eastAsia="맑은 고딕" w:hAnsi="맑은 고딕"/>
+          <w:b/>
+          <w:bCs/>
+          <w:color w:val="1F4E79"/>
+          <w:sz w:val="22"/>
+          <w:szCs w:val="22"/>
+        </w:rPr>
+        <w:t xml:space="preserve">부가 사용자</w:t>
       </w:r>
     </w:p>
     <w:p>
@@ -923,34 +897,6 @@
     </w:p>
     <w:p>
       <w:pPr>
-        <w:pStyle w:val="ListParagraph"/>
-        <w:numPr>
-          <w:ilvl w:val="0"/>
-          <w:numId w:val="2"/>
-        </w:numPr>
-        <w:spacing w:after="30" w:line="264"/>
-      </w:pPr>
-      <w:r>
-        <w:rPr>
-          <w:rFonts w:ascii="맑은 고딕" w:cs="맑은 고딕" w:eastAsia="맑은 고딕" w:hAnsi="맑은 고딕"/>
-          <w:b/>
-          <w:bCs/>
-          <w:sz w:val="20"/>
-          <w:szCs w:val="20"/>
-        </w:rPr>
-        <w:t xml:space="preserve">후임 담당자</w:t>
-      </w:r>
-      <w:r>
-        <w:rPr>
-          <w:rFonts w:ascii="맑은 고딕" w:cs="맑은 고딕" w:eastAsia="맑은 고딕" w:hAnsi="맑은 고딕"/>
-          <w:sz w:val="20"/>
-          <w:szCs w:val="20"/>
-        </w:rPr>
-        <w:t xml:space="preserve"> — 인사발령으로 업무를 승계하는 담당자. 과거 처리 기준 및 근거 파악 요구</w:t>
-      </w:r>
-    </w:p>
-    <w:p>
-      <w:pPr>
         <w:spacing w:after="80" w:line="264"/>
       </w:pPr>
       <w:r>
@@ -959,7 +905,7 @@
           <w:sz w:val="20"/>
           <w:szCs w:val="20"/>
         </w:rPr>
-        <w:t xml:space="preserve">1차 버전을 글로벌사업그룹 HR 담당자 전용으로 출시하는 사유는, 담당자의 상시 규정 확인 업무로 인한 사용 보장과 오답의 즉시 발견·교정 가능성 확보. 검증되지 않은 답변이 국외근무직원에게 우선 전달되는 상황 방지 목적.</w:t>
+        <w:t xml:space="preserve">1차 버전을 글로벌사업그룹 HR 담당자 전용으로 출시하는 사유는, 담당자의 상시 규정 확인 업무로 인한 사용 보장과 오답의 즉시 발견·교정 가능성 확보. 검증되지 않은 답변이 부가 사용자에게 우선 전달되는 상황 방지 목적.</w:t>
       </w:r>
     </w:p>
     <w:p>
@@ -1068,7 +1014,7 @@
           <w:sz w:val="20"/>
           <w:szCs w:val="20"/>
         </w:rPr>
-        <w:t xml:space="preserve">국가별 부임 안내 자료의 형식 미통일로 문의자의 자체 확인 어려움</w:t>
+        <w:t xml:space="preserve">국가별 현지 사정 및 적용 사항 상이로 문의자가 본인 해당 내용의 특정에 어려움</w:t>
       </w:r>
     </w:p>
     <w:p>
@@ -1761,15 +1707,15 @@
           <w:sz w:val="20"/>
           <w:szCs w:val="20"/>
         </w:rPr>
-        <w:t xml:space="preserve">서류 양식 제공</w:t>
-      </w:r>
-      <w:r>
-        <w:rPr>
-          <w:rFonts w:ascii="맑은 고딕" w:cs="맑은 고딕" w:eastAsia="맑은 고딕" w:hAnsi="맑은 고딕"/>
-          <w:sz w:val="20"/>
-          <w:szCs w:val="20"/>
-        </w:rPr>
-        <w:t xml:space="preserve"> — 국가별·용도별 최신 양식의 직접 제공</w:t>
+        <w:t xml:space="preserve">제출 서류 양식 제공</w:t>
+      </w:r>
+      <w:r>
+        <w:rPr>
+          <w:rFonts w:ascii="맑은 고딕" w:cs="맑은 고딕" w:eastAsia="맑은 고딕" w:hAnsi="맑은 고딕"/>
+          <w:sz w:val="20"/>
+          <w:szCs w:val="20"/>
+        </w:rPr>
+        <w:t xml:space="preserve"> — 부임 전 제출 서류 등 국가별·용도별 최신 양식의 직접 제공</w:t>
       </w:r>
     </w:p>
     <w:p>
@@ -2026,23 +1972,180 @@
             <w:r>
               <w:rPr>
                 <w:rFonts w:ascii="맑은 고딕" w:cs="맑은 고딕" w:eastAsia="맑은 고딕" w:hAnsi="맑은 고딕"/>
-                <w:sz w:val="17"/>
-                <w:szCs w:val="17"/>
-              </w:rPr>
-              <w:t xml:space="preserve">(직원) 홍콩 부임여비는 어떻게 되나요?</w:t>
-            </w:r>
-          </w:p>
-          <w:p>
-            <w:pPr>
-              <w:spacing w:after="0" w:line="224"/>
-            </w:pPr>
-            <w:r>
-              <w:rPr>
-                <w:rFonts w:ascii="맑은 고딕" w:cs="맑은 고딕" w:eastAsia="맑은 고딕" w:hAnsi="맑은 고딕"/>
-                <w:sz w:val="17"/>
-                <w:szCs w:val="17"/>
-              </w:rPr>
-              <w:t xml:space="preserve">(AI) 「복지·여비규정」 제○조 검색 결과, 홍콩 지역 부임여비는 ○○입니다. 소관은 HR·직원만족부이며, 본 안내는 규정 원문 인용입니다.</w:t>
+                <w:b/>
+                <w:bCs/>
+                <w:sz w:val="17"/>
+                <w:szCs w:val="17"/>
+              </w:rPr>
+              <w:t xml:space="preserve">(직원)</w:t>
+            </w:r>
+            <w:r>
+              <w:rPr>
+                <w:rFonts w:ascii="맑은 고딕" w:cs="맑은 고딕" w:eastAsia="맑은 고딕" w:hAnsi="맑은 고딕"/>
+                <w:sz w:val="17"/>
+                <w:szCs w:val="17"/>
+              </w:rPr>
+              <w:t xml:space="preserve"> 홍콩 부임여비는 어떻게 되나요?</w:t>
+            </w:r>
+          </w:p>
+          <w:p>
+            <w:pPr>
+              <w:spacing w:after="0" w:line="224"/>
+            </w:pPr>
+            <w:r>
+              <w:rPr>
+                <w:rFonts w:ascii="맑은 고딕" w:cs="맑은 고딕" w:eastAsia="맑은 고딕" w:hAnsi="맑은 고딕"/>
+                <w:b/>
+                <w:bCs/>
+                <w:sz w:val="17"/>
+                <w:szCs w:val="17"/>
+              </w:rPr>
+              <w:t xml:space="preserve">(AI)</w:t>
+            </w:r>
+            <w:r>
+              <w:rPr>
+                <w:rFonts w:ascii="맑은 고딕" w:cs="맑은 고딕" w:eastAsia="맑은 고딕" w:hAnsi="맑은 고딕"/>
+                <w:sz w:val="17"/>
+                <w:szCs w:val="17"/>
+              </w:rPr>
+              <w:t xml:space="preserve"> 홍콩지점 부임 기준으로 안내드립니다. 「복지·여비규정」 제○조 및 「복지·여비운영지침」 제○조에 따라 부임여비는 다음 항목으로 구성됩니다.</w:t>
+            </w:r>
+          </w:p>
+          <w:p>
+            <w:pPr>
+              <w:spacing w:after="0" w:line="224"/>
+            </w:pPr>
+            <w:r>
+              <w:rPr>
+                <w:rFonts w:ascii="맑은 고딕" w:cs="맑은 고딕" w:eastAsia="맑은 고딕" w:hAnsi="맑은 고딕"/>
+                <w:sz w:val="17"/>
+                <w:szCs w:val="17"/>
+              </w:rPr>
+              <w:t xml:space="preserve">　① 항공운임 — 본인 및 동반가족 실비 (이코노미 기준)</w:t>
+            </w:r>
+          </w:p>
+          <w:p>
+            <w:pPr>
+              <w:spacing w:after="0" w:line="224"/>
+            </w:pPr>
+            <w:r>
+              <w:rPr>
+                <w:rFonts w:ascii="맑은 고딕" w:cs="맑은 고딕" w:eastAsia="맑은 고딕" w:hAnsi="맑은 고딕"/>
+                <w:sz w:val="17"/>
+                <w:szCs w:val="17"/>
+              </w:rPr>
+              <w:t xml:space="preserve">　② 이전비 — 직급별 정액 ○○원</w:t>
+            </w:r>
+          </w:p>
+          <w:p>
+            <w:pPr>
+              <w:spacing w:after="0" w:line="224"/>
+            </w:pPr>
+            <w:r>
+              <w:rPr>
+                <w:rFonts w:ascii="맑은 고딕" w:cs="맑은 고딕" w:eastAsia="맑은 고딕" w:hAnsi="맑은 고딕"/>
+                <w:sz w:val="17"/>
+                <w:szCs w:val="17"/>
+              </w:rPr>
+              <w:t xml:space="preserve">　③ 착후정착비 — 월 기본급의 ○○%</w:t>
+            </w:r>
+          </w:p>
+          <w:p>
+            <w:pPr>
+              <w:spacing w:after="0" w:line="224"/>
+            </w:pPr>
+            <w:r>
+              <w:rPr>
+                <w:rFonts w:ascii="맑은 고딕" w:cs="맑은 고딕" w:eastAsia="맑은 고딕" w:hAnsi="맑은 고딕"/>
+                <w:sz w:val="17"/>
+                <w:szCs w:val="17"/>
+              </w:rPr>
+              <w:t xml:space="preserve">동반가족이 있는 경우 ②·③의 지급 기준이 달라집니다.</w:t>
+            </w:r>
+          </w:p>
+          <w:p>
+            <w:pPr>
+              <w:spacing w:after="0" w:line="224"/>
+            </w:pPr>
+            <w:r>
+              <w:rPr>
+                <w:rFonts w:ascii="맑은 고딕" w:cs="맑은 고딕" w:eastAsia="맑은 고딕" w:hAnsi="맑은 고딕"/>
+                <w:sz w:val="17"/>
+                <w:szCs w:val="17"/>
+              </w:rPr>
+              <w:t xml:space="preserve">　· 근거: 「복지·여비규정」 제○조 (시행일 2026.○.○)</w:t>
+            </w:r>
+          </w:p>
+          <w:p>
+            <w:pPr>
+              <w:spacing w:after="0" w:line="224"/>
+            </w:pPr>
+            <w:r>
+              <w:rPr>
+                <w:rFonts w:ascii="맑은 고딕" w:cs="맑은 고딕" w:eastAsia="맑은 고딕" w:hAnsi="맑은 고딕"/>
+                <w:sz w:val="17"/>
+                <w:szCs w:val="17"/>
+              </w:rPr>
+              <w:t xml:space="preserve">　· 소관: HR·직원만족부</w:t>
+            </w:r>
+          </w:p>
+          <w:p>
+            <w:pPr>
+              <w:spacing w:after="0" w:line="224"/>
+            </w:pPr>
+            <w:r>
+              <w:rPr>
+                <w:rFonts w:ascii="맑은 고딕" w:cs="맑은 고딕" w:eastAsia="맑은 고딕" w:hAnsi="맑은 고딕"/>
+                <w:sz w:val="17"/>
+                <w:szCs w:val="17"/>
+              </w:rPr>
+              <w:t xml:space="preserve">본 안내는 규정 원문 인용이며, 개별 적용 여부는 담당자 확인이 필요합니다.</w:t>
+            </w:r>
+          </w:p>
+          <w:p>
+            <w:pPr>
+              <w:spacing w:after="0" w:line="224"/>
+            </w:pPr>
+            <w:r>
+              <w:rPr>
+                <w:rFonts w:ascii="맑은 고딕" w:cs="맑은 고딕" w:eastAsia="맑은 고딕" w:hAnsi="맑은 고딕"/>
+                <w:b/>
+                <w:bCs/>
+                <w:sz w:val="17"/>
+                <w:szCs w:val="17"/>
+              </w:rPr>
+              <w:t xml:space="preserve">(직원)</w:t>
+            </w:r>
+            <w:r>
+              <w:rPr>
+                <w:rFonts w:ascii="맑은 고딕" w:cs="맑은 고딕" w:eastAsia="맑은 고딕" w:hAnsi="맑은 고딕"/>
+                <w:sz w:val="17"/>
+                <w:szCs w:val="17"/>
+              </w:rPr>
+              <w:t xml:space="preserve"> 가족을 동반하면 얼마나 달라지나요?</w:t>
+            </w:r>
+          </w:p>
+          <w:p>
+            <w:pPr>
+              <w:spacing w:after="0" w:line="224"/>
+            </w:pPr>
+            <w:r>
+              <w:rPr>
+                <w:rFonts w:ascii="맑은 고딕" w:cs="맑은 고딕" w:eastAsia="맑은 고딕" w:hAnsi="맑은 고딕"/>
+                <w:b/>
+                <w:bCs/>
+                <w:sz w:val="17"/>
+                <w:szCs w:val="17"/>
+              </w:rPr>
+              <w:t xml:space="preserve">(AI)</w:t>
+            </w:r>
+            <w:r>
+              <w:rPr>
+                <w:rFonts w:ascii="맑은 고딕" w:cs="맑은 고딕" w:eastAsia="맑은 고딕" w:hAnsi="맑은 고딕"/>
+                <w:sz w:val="17"/>
+                <w:szCs w:val="17"/>
+              </w:rPr>
+              <w:t xml:space="preserve"> 동반가족 1인당 이전비 ○○원이 가산되고, 착후정착비는 ○○% 상향 적용됩니다. 다만 동반가족의 인정 범위는 개별 확인이 필요한 사항이므로 담당자 문의를 권장드립니다.</w:t>
             </w:r>
           </w:p>
         </w:tc>
@@ -2094,23 +2197,167 @@
             <w:r>
               <w:rPr>
                 <w:rFonts w:ascii="맑은 고딕" w:cs="맑은 고딕" w:eastAsia="맑은 고딕" w:hAnsi="맑은 고딕"/>
-                <w:sz w:val="17"/>
-                <w:szCs w:val="17"/>
-              </w:rPr>
-              <w:t xml:space="preserve">(예비발령자) 인도네시아 부임 전에 제출할 서류가 무엇인가요?</w:t>
-            </w:r>
-          </w:p>
-          <w:p>
-            <w:pPr>
-              <w:spacing w:after="0" w:line="224"/>
-            </w:pPr>
-            <w:r>
-              <w:rPr>
-                <w:rFonts w:ascii="맑은 고딕" w:cs="맑은 고딕" w:eastAsia="맑은 고딕" w:hAnsi="맑은 고딕"/>
-                <w:sz w:val="17"/>
-                <w:szCs w:val="17"/>
-              </w:rPr>
-              <w:t xml:space="preserve">(AI) 인도네시아 부임 시 제출 서류는 ①○○ ②○○ ③○○이며, 각 양식은 아래에서 내려받으실 수 있습니다. 제출 기한은 발령일 ○일 전입니다.</w:t>
+                <w:b/>
+                <w:bCs/>
+                <w:sz w:val="17"/>
+                <w:szCs w:val="17"/>
+              </w:rPr>
+              <w:t xml:space="preserve">(예비발령자)</w:t>
+            </w:r>
+            <w:r>
+              <w:rPr>
+                <w:rFonts w:ascii="맑은 고딕" w:cs="맑은 고딕" w:eastAsia="맑은 고딕" w:hAnsi="맑은 고딕"/>
+                <w:sz w:val="17"/>
+                <w:szCs w:val="17"/>
+              </w:rPr>
+              <w:t xml:space="preserve"> 인도네시아 부임 전에 제출할 서류가 무엇인가요?</w:t>
+            </w:r>
+          </w:p>
+          <w:p>
+            <w:pPr>
+              <w:spacing w:after="0" w:line="224"/>
+            </w:pPr>
+            <w:r>
+              <w:rPr>
+                <w:rFonts w:ascii="맑은 고딕" w:cs="맑은 고딕" w:eastAsia="맑은 고딕" w:hAnsi="맑은 고딕"/>
+                <w:b/>
+                <w:bCs/>
+                <w:sz w:val="17"/>
+                <w:szCs w:val="17"/>
+              </w:rPr>
+              <w:t xml:space="preserve">(AI)</w:t>
+            </w:r>
+            <w:r>
+              <w:rPr>
+                <w:rFonts w:ascii="맑은 고딕" w:cs="맑은 고딕" w:eastAsia="맑은 고딕" w:hAnsi="맑은 고딕"/>
+                <w:sz w:val="17"/>
+                <w:szCs w:val="17"/>
+              </w:rPr>
+              <w:t xml:space="preserve"> 인도네시아 자회사 부임 기준 제출 서류는 다음과 같습니다.</w:t>
+            </w:r>
+          </w:p>
+          <w:p>
+            <w:pPr>
+              <w:spacing w:after="0" w:line="224"/>
+            </w:pPr>
+            <w:r>
+              <w:rPr>
+                <w:rFonts w:ascii="맑은 고딕" w:cs="맑은 고딕" w:eastAsia="맑은 고딕" w:hAnsi="맑은 고딕"/>
+                <w:sz w:val="17"/>
+                <w:szCs w:val="17"/>
+              </w:rPr>
+              <w:t xml:space="preserve">　① 부임 신고서 — 발령일 ○일 전까지 [양식 내려받기]</w:t>
+            </w:r>
+          </w:p>
+          <w:p>
+            <w:pPr>
+              <w:spacing w:after="0" w:line="224"/>
+            </w:pPr>
+            <w:r>
+              <w:rPr>
+                <w:rFonts w:ascii="맑은 고딕" w:cs="맑은 고딕" w:eastAsia="맑은 고딕" w:hAnsi="맑은 고딕"/>
+                <w:sz w:val="17"/>
+                <w:szCs w:val="17"/>
+              </w:rPr>
+              <w:t xml:space="preserve">　② 가족관계증명서 — 동반가족이 있는 경우에 한함</w:t>
+            </w:r>
+          </w:p>
+          <w:p>
+            <w:pPr>
+              <w:spacing w:after="0" w:line="224"/>
+            </w:pPr>
+            <w:r>
+              <w:rPr>
+                <w:rFonts w:ascii="맑은 고딕" w:cs="맑은 고딕" w:eastAsia="맑은 고딕" w:hAnsi="맑은 고딕"/>
+                <w:sz w:val="17"/>
+                <w:szCs w:val="17"/>
+              </w:rPr>
+              <w:t xml:space="preserve">　③ 건강진단 결과서 — 지정 병원 발급분, 발급일 ○개월 이내</w:t>
+            </w:r>
+          </w:p>
+          <w:p>
+            <w:pPr>
+              <w:spacing w:after="0" w:line="224"/>
+            </w:pPr>
+            <w:r>
+              <w:rPr>
+                <w:rFonts w:ascii="맑은 고딕" w:cs="맑은 고딕" w:eastAsia="맑은 고딕" w:hAnsi="맑은 고딕"/>
+                <w:sz w:val="17"/>
+                <w:szCs w:val="17"/>
+              </w:rPr>
+              <w:t xml:space="preserve">　④ 사택 임차 관련 서류 — 현지 계약 체결 후 제출</w:t>
+            </w:r>
+          </w:p>
+          <w:p>
+            <w:pPr>
+              <w:spacing w:after="0" w:line="224"/>
+            </w:pPr>
+            <w:r>
+              <w:rPr>
+                <w:rFonts w:ascii="맑은 고딕" w:cs="맑은 고딕" w:eastAsia="맑은 고딕" w:hAnsi="맑은 고딕"/>
+                <w:sz w:val="17"/>
+                <w:szCs w:val="17"/>
+              </w:rPr>
+              <w:t xml:space="preserve">①~③은 부임 전, ④는 부임 후 ○일 이내 제출 대상입니다.</w:t>
+            </w:r>
+          </w:p>
+          <w:p>
+            <w:pPr>
+              <w:spacing w:after="0" w:line="224"/>
+            </w:pPr>
+            <w:r>
+              <w:rPr>
+                <w:rFonts w:ascii="맑은 고딕" w:cs="맑은 고딕" w:eastAsia="맑은 고딕" w:hAnsi="맑은 고딕"/>
+                <w:sz w:val="17"/>
+                <w:szCs w:val="17"/>
+              </w:rPr>
+              <w:t xml:space="preserve">제출처는 글로벌성장지원부이며, 서류 누락 시 부임 절차가 지연될 수 있습니다.</w:t>
+            </w:r>
+          </w:p>
+          <w:p>
+            <w:pPr>
+              <w:spacing w:after="0" w:line="224"/>
+            </w:pPr>
+            <w:r>
+              <w:rPr>
+                <w:rFonts w:ascii="맑은 고딕" w:cs="맑은 고딕" w:eastAsia="맑은 고딕" w:hAnsi="맑은 고딕"/>
+                <w:b/>
+                <w:bCs/>
+                <w:sz w:val="17"/>
+                <w:szCs w:val="17"/>
+              </w:rPr>
+              <w:t xml:space="preserve">(예비발령자)</w:t>
+            </w:r>
+            <w:r>
+              <w:rPr>
+                <w:rFonts w:ascii="맑은 고딕" w:cs="맑은 고딕" w:eastAsia="맑은 고딕" w:hAnsi="맑은 고딕"/>
+                <w:sz w:val="17"/>
+                <w:szCs w:val="17"/>
+              </w:rPr>
+              <w:t xml:space="preserve"> 건강진단은 아무 병원에서나 받아도 되나요?</w:t>
+            </w:r>
+          </w:p>
+          <w:p>
+            <w:pPr>
+              <w:spacing w:after="0" w:line="224"/>
+            </w:pPr>
+            <w:r>
+              <w:rPr>
+                <w:rFonts w:ascii="맑은 고딕" w:cs="맑은 고딕" w:eastAsia="맑은 고딕" w:hAnsi="맑은 고딕"/>
+                <w:b/>
+                <w:bCs/>
+                <w:sz w:val="17"/>
+                <w:szCs w:val="17"/>
+              </w:rPr>
+              <w:t xml:space="preserve">(AI)</w:t>
+            </w:r>
+            <w:r>
+              <w:rPr>
+                <w:rFonts w:ascii="맑은 고딕" w:cs="맑은 고딕" w:eastAsia="맑은 고딕" w:hAnsi="맑은 고딕"/>
+                <w:sz w:val="17"/>
+                <w:szCs w:val="17"/>
+              </w:rPr>
+              <w:t xml:space="preserve"> 지정 병원 발급분만 인정됩니다. 지정 병원 목록은 [부임 안내서]에서 확인하실 수 있으며, 부득이하게 다른 기관을 이용해야 하는 경우 담당자 사전 협의가 필요합니다.</w:t>
             </w:r>
           </w:p>
         </w:tc>
@@ -2162,23 +2409,167 @@
             <w:r>
               <w:rPr>
                 <w:rFonts w:ascii="맑은 고딕" w:cs="맑은 고딕" w:eastAsia="맑은 고딕" w:hAnsi="맑은 고딕"/>
-                <w:sz w:val="17"/>
-                <w:szCs w:val="17"/>
-              </w:rPr>
-              <w:t xml:space="preserve">(직원) 배우자가 현지에서 취업했는데 가족수당을 계속 받을 수 있나요?</w:t>
-            </w:r>
-          </w:p>
-          <w:p>
-            <w:pPr>
-              <w:spacing w:after="0" w:line="224"/>
-            </w:pPr>
-            <w:r>
-              <w:rPr>
-                <w:rFonts w:ascii="맑은 고딕" w:cs="맑은 고딕" w:eastAsia="맑은 고딕" w:hAnsi="맑은 고딕"/>
-                <w:sz w:val="17"/>
-                <w:szCs w:val="17"/>
-              </w:rPr>
-              <w:t xml:space="preserve">(AI) 개별 상황에 대한 규정 적용 판단이 필요한 사안으로 답변이 어렵습니다. 소관부서(HR·직원만족부) 확인이 필요하며, 참고 조항은 「국외근무직원 보수·복지에 관한 규정」 제○조입니다.</w:t>
+                <w:b/>
+                <w:bCs/>
+                <w:sz w:val="17"/>
+                <w:szCs w:val="17"/>
+              </w:rPr>
+              <w:t xml:space="preserve">(직원)</w:t>
+            </w:r>
+            <w:r>
+              <w:rPr>
+                <w:rFonts w:ascii="맑은 고딕" w:cs="맑은 고딕" w:eastAsia="맑은 고딕" w:hAnsi="맑은 고딕"/>
+                <w:sz w:val="17"/>
+                <w:szCs w:val="17"/>
+              </w:rPr>
+              <w:t xml:space="preserve"> 배우자가 현지에서 취업했는데 가족수당을 계속 받을 수 있나요?</w:t>
+            </w:r>
+          </w:p>
+          <w:p>
+            <w:pPr>
+              <w:spacing w:after="0" w:line="224"/>
+            </w:pPr>
+            <w:r>
+              <w:rPr>
+                <w:rFonts w:ascii="맑은 고딕" w:cs="맑은 고딕" w:eastAsia="맑은 고딕" w:hAnsi="맑은 고딕"/>
+                <w:b/>
+                <w:bCs/>
+                <w:sz w:val="17"/>
+                <w:szCs w:val="17"/>
+              </w:rPr>
+              <w:t xml:space="preserve">(AI)</w:t>
+            </w:r>
+            <w:r>
+              <w:rPr>
+                <w:rFonts w:ascii="맑은 고딕" w:cs="맑은 고딕" w:eastAsia="맑은 고딕" w:hAnsi="맑은 고딕"/>
+                <w:sz w:val="17"/>
+                <w:szCs w:val="17"/>
+              </w:rPr>
+              <w:t xml:space="preserve"> 해당 사안은 규정을 개별 상황에 적용할지 판단이 필요한 사항으로, 본 시스템에서는 답변드리기 어렵습니다.</w:t>
+            </w:r>
+          </w:p>
+          <w:p>
+            <w:pPr>
+              <w:spacing w:after="0" w:line="224"/>
+            </w:pPr>
+            <w:r>
+              <w:rPr>
+                <w:rFonts w:ascii="맑은 고딕" w:cs="맑은 고딕" w:eastAsia="맑은 고딕" w:hAnsi="맑은 고딕"/>
+                <w:sz w:val="17"/>
+                <w:szCs w:val="17"/>
+              </w:rPr>
+              <w:t xml:space="preserve">참고하실 수 있는 관련 조항은 다음과 같습니다.</w:t>
+            </w:r>
+          </w:p>
+          <w:p>
+            <w:pPr>
+              <w:spacing w:after="0" w:line="224"/>
+            </w:pPr>
+            <w:r>
+              <w:rPr>
+                <w:rFonts w:ascii="맑은 고딕" w:cs="맑은 고딕" w:eastAsia="맑은 고딕" w:hAnsi="맑은 고딕"/>
+                <w:sz w:val="17"/>
+                <w:szCs w:val="17"/>
+              </w:rPr>
+              <w:t xml:space="preserve">　· 「국외근무직원 보수·복지에 관한 규정」 제○조 (가족수당 지급 대상)</w:t>
+            </w:r>
+          </w:p>
+          <w:p>
+            <w:pPr>
+              <w:spacing w:after="0" w:line="224"/>
+            </w:pPr>
+            <w:r>
+              <w:rPr>
+                <w:rFonts w:ascii="맑은 고딕" w:cs="맑은 고딕" w:eastAsia="맑은 고딕" w:hAnsi="맑은 고딕"/>
+                <w:sz w:val="17"/>
+                <w:szCs w:val="17"/>
+              </w:rPr>
+              <w:t xml:space="preserve">　· 같은 규정 제○조 (지급 제외 사유)</w:t>
+            </w:r>
+          </w:p>
+          <w:p>
+            <w:pPr>
+              <w:spacing w:after="0" w:line="224"/>
+            </w:pPr>
+            <w:r>
+              <w:rPr>
+                <w:rFonts w:ascii="맑은 고딕" w:cs="맑은 고딕" w:eastAsia="맑은 고딕" w:hAnsi="맑은 고딕"/>
+                <w:sz w:val="17"/>
+                <w:szCs w:val="17"/>
+              </w:rPr>
+              <w:t xml:space="preserve">배우자의 소득 발생이 지급 제외 사유에 해당하는지는 소관부서의 확인이 필요합니다.</w:t>
+            </w:r>
+          </w:p>
+          <w:p>
+            <w:pPr>
+              <w:spacing w:after="0" w:line="224"/>
+            </w:pPr>
+            <w:r>
+              <w:rPr>
+                <w:rFonts w:ascii="맑은 고딕" w:cs="맑은 고딕" w:eastAsia="맑은 고딕" w:hAnsi="맑은 고딕"/>
+                <w:sz w:val="17"/>
+                <w:szCs w:val="17"/>
+              </w:rPr>
+              <w:t xml:space="preserve">　· 소관: HR·직원만족부</w:t>
+            </w:r>
+          </w:p>
+          <w:p>
+            <w:pPr>
+              <w:spacing w:after="0" w:line="224"/>
+            </w:pPr>
+            <w:r>
+              <w:rPr>
+                <w:rFonts w:ascii="맑은 고딕" w:cs="맑은 고딕" w:eastAsia="맑은 고딕" w:hAnsi="맑은 고딕"/>
+                <w:sz w:val="17"/>
+                <w:szCs w:val="17"/>
+              </w:rPr>
+              <w:t xml:space="preserve">　· 안내: 담당자를 통해 소관부서에 질의하시기 바랍니다.</w:t>
+            </w:r>
+          </w:p>
+          <w:p>
+            <w:pPr>
+              <w:spacing w:after="0" w:line="224"/>
+            </w:pPr>
+            <w:r>
+              <w:rPr>
+                <w:rFonts w:ascii="맑은 고딕" w:cs="맑은 고딕" w:eastAsia="맑은 고딕" w:hAnsi="맑은 고딕"/>
+                <w:b/>
+                <w:bCs/>
+                <w:sz w:val="17"/>
+                <w:szCs w:val="17"/>
+              </w:rPr>
+              <w:t xml:space="preserve">(직원)</w:t>
+            </w:r>
+            <w:r>
+              <w:rPr>
+                <w:rFonts w:ascii="맑은 고딕" w:cs="맑은 고딕" w:eastAsia="맑은 고딕" w:hAnsi="맑은 고딕"/>
+                <w:sz w:val="17"/>
+                <w:szCs w:val="17"/>
+              </w:rPr>
+              <w:t xml:space="preserve"> 그럼 일단 계속 받아도 되나요?</w:t>
+            </w:r>
+          </w:p>
+          <w:p>
+            <w:pPr>
+              <w:spacing w:after="0" w:line="224"/>
+            </w:pPr>
+            <w:r>
+              <w:rPr>
+                <w:rFonts w:ascii="맑은 고딕" w:cs="맑은 고딕" w:eastAsia="맑은 고딕" w:hAnsi="맑은 고딕"/>
+                <w:b/>
+                <w:bCs/>
+                <w:sz w:val="17"/>
+                <w:szCs w:val="17"/>
+              </w:rPr>
+              <w:t xml:space="preserve">(AI)</w:t>
+            </w:r>
+            <w:r>
+              <w:rPr>
+                <w:rFonts w:ascii="맑은 고딕" w:cs="맑은 고딕" w:eastAsia="맑은 고딕" w:hAnsi="맑은 고딕"/>
+                <w:sz w:val="17"/>
+                <w:szCs w:val="17"/>
+              </w:rPr>
+              <w:t xml:space="preserve"> 지급 여부에 대한 판단은 소관부서 확인 사항으로, 본 시스템에서 안내드릴 수 없습니다. 확인 전 수령분에 대한 정산이 발생할 수 있으므로 사전 확인을 권장드립니다.</w:t>
             </w:r>
           </w:p>
         </w:tc>
@@ -2230,23 +2621,167 @@
             <w:r>
               <w:rPr>
                 <w:rFonts w:ascii="맑은 고딕" w:cs="맑은 고딕" w:eastAsia="맑은 고딕" w:hAnsi="맑은 고딕"/>
-                <w:sz w:val="17"/>
-                <w:szCs w:val="17"/>
-              </w:rPr>
-              <w:t xml:space="preserve">(담당자) 주택수당 한도가 얼마인가요?</w:t>
-            </w:r>
-          </w:p>
-          <w:p>
-            <w:pPr>
-              <w:spacing w:after="0" w:line="224"/>
-            </w:pPr>
-            <w:r>
-              <w:rPr>
-                <w:rFonts w:ascii="맑은 고딕" w:cs="맑은 고딕" w:eastAsia="맑은 고딕" w:hAnsi="맑은 고딕"/>
-                <w:sz w:val="17"/>
-                <w:szCs w:val="17"/>
-              </w:rPr>
-              <w:t xml:space="preserve">(AI) 국가 및 법인격에 따라 기준이 상이합니다. 대상 국가와 자회사·국외점포 중 해당 구분을 알려주시기 바랍니다.</w:t>
+                <w:b/>
+                <w:bCs/>
+                <w:sz w:val="17"/>
+                <w:szCs w:val="17"/>
+              </w:rPr>
+              <w:t xml:space="preserve">(담당자)</w:t>
+            </w:r>
+            <w:r>
+              <w:rPr>
+                <w:rFonts w:ascii="맑은 고딕" w:cs="맑은 고딕" w:eastAsia="맑은 고딕" w:hAnsi="맑은 고딕"/>
+                <w:sz w:val="17"/>
+                <w:szCs w:val="17"/>
+              </w:rPr>
+              <w:t xml:space="preserve"> 주택수당 한도가 얼마인가요?</w:t>
+            </w:r>
+          </w:p>
+          <w:p>
+            <w:pPr>
+              <w:spacing w:after="0" w:line="224"/>
+            </w:pPr>
+            <w:r>
+              <w:rPr>
+                <w:rFonts w:ascii="맑은 고딕" w:cs="맑은 고딕" w:eastAsia="맑은 고딕" w:hAnsi="맑은 고딕"/>
+                <w:b/>
+                <w:bCs/>
+                <w:sz w:val="17"/>
+                <w:szCs w:val="17"/>
+              </w:rPr>
+              <w:t xml:space="preserve">(AI)</w:t>
+            </w:r>
+            <w:r>
+              <w:rPr>
+                <w:rFonts w:ascii="맑은 고딕" w:cs="맑은 고딕" w:eastAsia="맑은 고딕" w:hAnsi="맑은 고딕"/>
+                <w:sz w:val="17"/>
+                <w:szCs w:val="17"/>
+              </w:rPr>
+              <w:t xml:space="preserve"> 주택수당 한도는 근무 국가와 법인격에 따라 기준이 다릅니다. 아래 정보를 알려주시면 해당 기준을 안내드리겠습니다.</w:t>
+            </w:r>
+          </w:p>
+          <w:p>
+            <w:pPr>
+              <w:spacing w:after="0" w:line="224"/>
+            </w:pPr>
+            <w:r>
+              <w:rPr>
+                <w:rFonts w:ascii="맑은 고딕" w:cs="맑은 고딕" w:eastAsia="맑은 고딕" w:hAnsi="맑은 고딕"/>
+                <w:sz w:val="17"/>
+                <w:szCs w:val="17"/>
+              </w:rPr>
+              <w:t xml:space="preserve">　· 근무 국가</w:t>
+            </w:r>
+          </w:p>
+          <w:p>
+            <w:pPr>
+              <w:spacing w:after="0" w:line="224"/>
+            </w:pPr>
+            <w:r>
+              <w:rPr>
+                <w:rFonts w:ascii="맑은 고딕" w:cs="맑은 고딕" w:eastAsia="맑은 고딕" w:hAnsi="맑은 고딕"/>
+                <w:sz w:val="17"/>
+                <w:szCs w:val="17"/>
+              </w:rPr>
+              <w:t xml:space="preserve">　· 법인격 구분 (자회사 / 국외점포)</w:t>
+            </w:r>
+          </w:p>
+          <w:p>
+            <w:pPr>
+              <w:spacing w:after="0" w:line="224"/>
+            </w:pPr>
+            <w:r>
+              <w:rPr>
+                <w:rFonts w:ascii="맑은 고딕" w:cs="맑은 고딕" w:eastAsia="맑은 고딕" w:hAnsi="맑은 고딕"/>
+                <w:b/>
+                <w:bCs/>
+                <w:sz w:val="17"/>
+                <w:szCs w:val="17"/>
+              </w:rPr>
+              <w:t xml:space="preserve">(담당자)</w:t>
+            </w:r>
+            <w:r>
+              <w:rPr>
+                <w:rFonts w:ascii="맑은 고딕" w:cs="맑은 고딕" w:eastAsia="맑은 고딕" w:hAnsi="맑은 고딕"/>
+                <w:sz w:val="17"/>
+                <w:szCs w:val="17"/>
+              </w:rPr>
+              <w:t xml:space="preserve"> 인도네시아 자회사요.</w:t>
+            </w:r>
+          </w:p>
+          <w:p>
+            <w:pPr>
+              <w:spacing w:after="0" w:line="224"/>
+            </w:pPr>
+            <w:r>
+              <w:rPr>
+                <w:rFonts w:ascii="맑은 고딕" w:cs="맑은 고딕" w:eastAsia="맑은 고딕" w:hAnsi="맑은 고딕"/>
+                <w:b/>
+                <w:bCs/>
+                <w:sz w:val="17"/>
+                <w:szCs w:val="17"/>
+              </w:rPr>
+              <w:t xml:space="preserve">(AI)</w:t>
+            </w:r>
+            <w:r>
+              <w:rPr>
+                <w:rFonts w:ascii="맑은 고딕" w:cs="맑은 고딕" w:eastAsia="맑은 고딕" w:hAnsi="맑은 고딕"/>
+                <w:sz w:val="17"/>
+                <w:szCs w:val="17"/>
+              </w:rPr>
+              <w:t xml:space="preserve"> 인도네시아 자회사 기준으로 안내드립니다. 「국외근무직원 보수·복지에 관한 규정」 제○조에 따라 주택수당 한도는 직급별로 다음과 같습니다.</w:t>
+            </w:r>
+          </w:p>
+          <w:p>
+            <w:pPr>
+              <w:spacing w:after="0" w:line="224"/>
+            </w:pPr>
+            <w:r>
+              <w:rPr>
+                <w:rFonts w:ascii="맑은 고딕" w:cs="맑은 고딕" w:eastAsia="맑은 고딕" w:hAnsi="맑은 고딕"/>
+                <w:sz w:val="17"/>
+                <w:szCs w:val="17"/>
+              </w:rPr>
+              <w:t xml:space="preserve">　· ○급 이상 — 월 ○○</w:t>
+            </w:r>
+          </w:p>
+          <w:p>
+            <w:pPr>
+              <w:spacing w:after="0" w:line="224"/>
+            </w:pPr>
+            <w:r>
+              <w:rPr>
+                <w:rFonts w:ascii="맑은 고딕" w:cs="맑은 고딕" w:eastAsia="맑은 고딕" w:hAnsi="맑은 고딕"/>
+                <w:sz w:val="17"/>
+                <w:szCs w:val="17"/>
+              </w:rPr>
+              <w:t xml:space="preserve">　· ○급 이하 — 월 ○○</w:t>
+            </w:r>
+          </w:p>
+          <w:p>
+            <w:pPr>
+              <w:spacing w:after="0" w:line="224"/>
+            </w:pPr>
+            <w:r>
+              <w:rPr>
+                <w:rFonts w:ascii="맑은 고딕" w:cs="맑은 고딕" w:eastAsia="맑은 고딕" w:hAnsi="맑은 고딕"/>
+                <w:sz w:val="17"/>
+                <w:szCs w:val="17"/>
+              </w:rPr>
+              <w:t xml:space="preserve">실제 임차료가 한도를 초과하는 경우의 처리는 별도 확인이 필요한 사항입니다.</w:t>
+            </w:r>
+          </w:p>
+          <w:p>
+            <w:pPr>
+              <w:spacing w:after="0" w:line="224"/>
+            </w:pPr>
+            <w:r>
+              <w:rPr>
+                <w:rFonts w:ascii="맑은 고딕" w:cs="맑은 고딕" w:eastAsia="맑은 고딕" w:hAnsi="맑은 고딕"/>
+                <w:sz w:val="17"/>
+                <w:szCs w:val="17"/>
+              </w:rPr>
+              <w:t xml:space="preserve">　· 근거: 제○조 (시행일 2026.○.○) · 소관: HR·직원만족부</w:t>
             </w:r>
           </w:p>
         </w:tc>
@@ -2298,23 +2833,108 @@
             <w:r>
               <w:rPr>
                 <w:rFonts w:ascii="맑은 고딕" w:cs="맑은 고딕" w:eastAsia="맑은 고딕" w:hAnsi="맑은 고딕"/>
-                <w:sz w:val="17"/>
-                <w:szCs w:val="17"/>
-              </w:rPr>
-              <w:t xml:space="preserve">(담당자) 현지 차량 리스 비용도 지원되나요?</w:t>
-            </w:r>
-          </w:p>
-          <w:p>
-            <w:pPr>
-              <w:spacing w:after="0" w:line="224"/>
-            </w:pPr>
-            <w:r>
-              <w:rPr>
-                <w:rFonts w:ascii="맑은 고딕" w:cs="맑은 고딕" w:eastAsia="맑은 고딕" w:hAnsi="맑은 고딕"/>
-                <w:sz w:val="17"/>
-                <w:szCs w:val="17"/>
-              </w:rPr>
-              <w:t xml:space="preserve">(AI) 규정 및 안내 자료에서 관련 근거를 찾지 못했습니다. 담당자 확인이 필요합니다.</w:t>
+                <w:b/>
+                <w:bCs/>
+                <w:sz w:val="17"/>
+                <w:szCs w:val="17"/>
+              </w:rPr>
+              <w:t xml:space="preserve">(담당자)</w:t>
+            </w:r>
+            <w:r>
+              <w:rPr>
+                <w:rFonts w:ascii="맑은 고딕" w:cs="맑은 고딕" w:eastAsia="맑은 고딕" w:hAnsi="맑은 고딕"/>
+                <w:sz w:val="17"/>
+                <w:szCs w:val="17"/>
+              </w:rPr>
+              <w:t xml:space="preserve"> 현지 차량 리스 비용도 지원되나요?</w:t>
+            </w:r>
+          </w:p>
+          <w:p>
+            <w:pPr>
+              <w:spacing w:after="0" w:line="224"/>
+            </w:pPr>
+            <w:r>
+              <w:rPr>
+                <w:rFonts w:ascii="맑은 고딕" w:cs="맑은 고딕" w:eastAsia="맑은 고딕" w:hAnsi="맑은 고딕"/>
+                <w:b/>
+                <w:bCs/>
+                <w:sz w:val="17"/>
+                <w:szCs w:val="17"/>
+              </w:rPr>
+              <w:t xml:space="preserve">(AI)</w:t>
+            </w:r>
+            <w:r>
+              <w:rPr>
+                <w:rFonts w:ascii="맑은 고딕" w:cs="맑은 고딕" w:eastAsia="맑은 고딕" w:hAnsi="맑은 고딕"/>
+                <w:sz w:val="17"/>
+                <w:szCs w:val="17"/>
+              </w:rPr>
+              <w:t xml:space="preserve"> 현재 등록된 규정과 안내 자료에서 차량 리스 비용 지원에 대한 근거를 찾지 못했습니다. 추정하여 답변드리지 않겠습니다.</w:t>
+            </w:r>
+          </w:p>
+          <w:p>
+            <w:pPr>
+              <w:spacing w:after="0" w:line="224"/>
+            </w:pPr>
+            <w:r>
+              <w:rPr>
+                <w:rFonts w:ascii="맑은 고딕" w:cs="맑은 고딕" w:eastAsia="맑은 고딕" w:hAnsi="맑은 고딕"/>
+                <w:sz w:val="17"/>
+                <w:szCs w:val="17"/>
+              </w:rPr>
+              <w:t xml:space="preserve">검색 대상은 다음과 같았습니다.</w:t>
+            </w:r>
+          </w:p>
+          <w:p>
+            <w:pPr>
+              <w:spacing w:after="0" w:line="224"/>
+            </w:pPr>
+            <w:r>
+              <w:rPr>
+                <w:rFonts w:ascii="맑은 고딕" w:cs="맑은 고딕" w:eastAsia="맑은 고딕" w:hAnsi="맑은 고딕"/>
+                <w:sz w:val="17"/>
+                <w:szCs w:val="17"/>
+              </w:rPr>
+              <w:t xml:space="preserve">　· 「국외근무직원 보수·복지에 관한 규정」</w:t>
+            </w:r>
+          </w:p>
+          <w:p>
+            <w:pPr>
+              <w:spacing w:after="0" w:line="224"/>
+            </w:pPr>
+            <w:r>
+              <w:rPr>
+                <w:rFonts w:ascii="맑은 고딕" w:cs="맑은 고딕" w:eastAsia="맑은 고딕" w:hAnsi="맑은 고딕"/>
+                <w:sz w:val="17"/>
+                <w:szCs w:val="17"/>
+              </w:rPr>
+              <w:t xml:space="preserve">　· 「복지·여비규정」 및 운영지침</w:t>
+            </w:r>
+          </w:p>
+          <w:p>
+            <w:pPr>
+              <w:spacing w:after="0" w:line="224"/>
+            </w:pPr>
+            <w:r>
+              <w:rPr>
+                <w:rFonts w:ascii="맑은 고딕" w:cs="맑은 고딕" w:eastAsia="맑은 고딕" w:hAnsi="맑은 고딕"/>
+                <w:sz w:val="17"/>
+                <w:szCs w:val="17"/>
+              </w:rPr>
+              <w:t xml:space="preserve">　· 국가별 부임 안내서 (인도네시아·캄보디아·홍콩·런던)</w:t>
+            </w:r>
+          </w:p>
+          <w:p>
+            <w:pPr>
+              <w:spacing w:after="0" w:line="224"/>
+            </w:pPr>
+            <w:r>
+              <w:rPr>
+                <w:rFonts w:ascii="맑은 고딕" w:cs="맑은 고딕" w:eastAsia="맑은 고딕" w:hAnsi="맑은 고딕"/>
+                <w:sz w:val="17"/>
+                <w:szCs w:val="17"/>
+              </w:rPr>
+              <w:t xml:space="preserve">근거가 존재하나 미등록 상태일 수 있으므로, 소관부서 확인 후 자료 등록을 권장드립니다.</w:t>
             </w:r>
           </w:p>
         </w:tc>
@@ -2366,23 +2986,147 @@
             <w:r>
               <w:rPr>
                 <w:rFonts w:ascii="맑은 고딕" w:cs="맑은 고딕" w:eastAsia="맑은 고딕" w:hAnsi="맑은 고딕"/>
-                <w:sz w:val="17"/>
-                <w:szCs w:val="17"/>
-              </w:rPr>
-              <w:t xml:space="preserve">(후임 담당자) 작년 캄보디아 학자금 지원 처리 사례를 보여주세요.</w:t>
-            </w:r>
-          </w:p>
-          <w:p>
-            <w:pPr>
-              <w:spacing w:after="0" w:line="224"/>
-            </w:pPr>
-            <w:r>
-              <w:rPr>
-                <w:rFonts w:ascii="맑은 고딕" w:cs="맑은 고딕" w:eastAsia="맑은 고딕" w:hAnsi="맑은 고딕"/>
-                <w:sz w:val="17"/>
-                <w:szCs w:val="17"/>
-              </w:rPr>
-              <w:t xml:space="preserve">(AI) 2025년 캄보디아 학자금 관련 확정 건은 ○건입니다. 각 건의 질의, 적용 조항, 답변, 확정일을 함께 표시합니다.</w:t>
+                <w:b/>
+                <w:bCs/>
+                <w:sz w:val="17"/>
+                <w:szCs w:val="17"/>
+              </w:rPr>
+              <w:t xml:space="preserve">(후임 담당자)</w:t>
+            </w:r>
+            <w:r>
+              <w:rPr>
+                <w:rFonts w:ascii="맑은 고딕" w:cs="맑은 고딕" w:eastAsia="맑은 고딕" w:hAnsi="맑은 고딕"/>
+                <w:sz w:val="17"/>
+                <w:szCs w:val="17"/>
+              </w:rPr>
+              <w:t xml:space="preserve"> 작년 캄보디아 학자금 지원 처리 사례를 보여주세요.</w:t>
+            </w:r>
+          </w:p>
+          <w:p>
+            <w:pPr>
+              <w:spacing w:after="0" w:line="224"/>
+            </w:pPr>
+            <w:r>
+              <w:rPr>
+                <w:rFonts w:ascii="맑은 고딕" w:cs="맑은 고딕" w:eastAsia="맑은 고딕" w:hAnsi="맑은 고딕"/>
+                <w:b/>
+                <w:bCs/>
+                <w:sz w:val="17"/>
+                <w:szCs w:val="17"/>
+              </w:rPr>
+              <w:t xml:space="preserve">(AI)</w:t>
+            </w:r>
+            <w:r>
+              <w:rPr>
+                <w:rFonts w:ascii="맑은 고딕" w:cs="맑은 고딕" w:eastAsia="맑은 고딕" w:hAnsi="맑은 고딕"/>
+                <w:sz w:val="17"/>
+                <w:szCs w:val="17"/>
+              </w:rPr>
+              <w:t xml:space="preserve"> 2025년 캄보디아 학자금 관련 확정 건은 ○건입니다.</w:t>
+            </w:r>
+          </w:p>
+          <w:p>
+            <w:pPr>
+              <w:spacing w:after="0" w:line="224"/>
+            </w:pPr>
+            <w:r>
+              <w:rPr>
+                <w:rFonts w:ascii="맑은 고딕" w:cs="맑은 고딕" w:eastAsia="맑은 고딕" w:hAnsi="맑은 고딕"/>
+                <w:sz w:val="17"/>
+                <w:szCs w:val="17"/>
+              </w:rPr>
+              <w:t xml:space="preserve">　① 2025.○.○ — 국제학교 학비 초과분 처리</w:t>
+            </w:r>
+          </w:p>
+          <w:p>
+            <w:pPr>
+              <w:spacing w:after="0" w:line="224"/>
+            </w:pPr>
+            <w:r>
+              <w:rPr>
+                <w:rFonts w:ascii="맑은 고딕" w:cs="맑은 고딕" w:eastAsia="맑은 고딕" w:hAnsi="맑은 고딕"/>
+                <w:sz w:val="17"/>
+                <w:szCs w:val="17"/>
+              </w:rPr>
+              <w:t xml:space="preserve">　　· 적용 조항: 「보수·복지에 관한 규정」 제○조</w:t>
+            </w:r>
+          </w:p>
+          <w:p>
+            <w:pPr>
+              <w:spacing w:after="0" w:line="224"/>
+            </w:pPr>
+            <w:r>
+              <w:rPr>
+                <w:rFonts w:ascii="맑은 고딕" w:cs="맑은 고딕" w:eastAsia="맑은 고딕" w:hAnsi="맑은 고딕"/>
+                <w:sz w:val="17"/>
+                <w:szCs w:val="17"/>
+              </w:rPr>
+              <w:t xml:space="preserve">　　· 답변 요지: 한도 내 실비 지원, 초과분 본인 부담</w:t>
+            </w:r>
+          </w:p>
+          <w:p>
+            <w:pPr>
+              <w:spacing w:after="0" w:line="224"/>
+            </w:pPr>
+            <w:r>
+              <w:rPr>
+                <w:rFonts w:ascii="맑은 고딕" w:cs="맑은 고딕" w:eastAsia="맑은 고딕" w:hAnsi="맑은 고딕"/>
+                <w:sz w:val="17"/>
+                <w:szCs w:val="17"/>
+              </w:rPr>
+              <w:t xml:space="preserve">　② 2025.○.○ — 학기 중 전학에 따른 정산</w:t>
+            </w:r>
+          </w:p>
+          <w:p>
+            <w:pPr>
+              <w:spacing w:after="0" w:line="224"/>
+            </w:pPr>
+            <w:r>
+              <w:rPr>
+                <w:rFonts w:ascii="맑은 고딕" w:cs="맑은 고딕" w:eastAsia="맑은 고딕" w:hAnsi="맑은 고딕"/>
+                <w:sz w:val="17"/>
+                <w:szCs w:val="17"/>
+              </w:rPr>
+              <w:t xml:space="preserve">　　· 적용 조항: 같은 규정 제○조</w:t>
+            </w:r>
+          </w:p>
+          <w:p>
+            <w:pPr>
+              <w:spacing w:after="0" w:line="224"/>
+            </w:pPr>
+            <w:r>
+              <w:rPr>
+                <w:rFonts w:ascii="맑은 고딕" w:cs="맑은 고딕" w:eastAsia="맑은 고딕" w:hAnsi="맑은 고딕"/>
+                <w:sz w:val="17"/>
+                <w:szCs w:val="17"/>
+              </w:rPr>
+              <w:t xml:space="preserve">　　· 답변 요지: 일할 계산 적용, 증빙 제출 필요</w:t>
+            </w:r>
+          </w:p>
+          <w:p>
+            <w:pPr>
+              <w:spacing w:after="0" w:line="224"/>
+            </w:pPr>
+            <w:r>
+              <w:rPr>
+                <w:rFonts w:ascii="맑은 고딕" w:cs="맑은 고딕" w:eastAsia="맑은 고딕" w:hAnsi="맑은 고딕"/>
+                <w:sz w:val="17"/>
+                <w:szCs w:val="17"/>
+              </w:rPr>
+              <w:t xml:space="preserve">　　· 비고: 예외 처리 건 (소관부서 협의 후 확정)</w:t>
+            </w:r>
+          </w:p>
+          <w:p>
+            <w:pPr>
+              <w:spacing w:after="0" w:line="224"/>
+            </w:pPr>
+            <w:r>
+              <w:rPr>
+                <w:rFonts w:ascii="맑은 고딕" w:cs="맑은 고딕" w:eastAsia="맑은 고딕" w:hAnsi="맑은 고딕"/>
+                <w:sz w:val="17"/>
+                <w:szCs w:val="17"/>
+              </w:rPr>
+              <w:t xml:space="preserve">각 건의 원 질의와 확정일은 상세 보기에서 확인하실 수 있습니다.</w:t>
             </w:r>
           </w:p>
         </w:tc>
@@ -2434,23 +3178,184 @@
             <w:r>
               <w:rPr>
                 <w:rFonts w:ascii="맑은 고딕" w:cs="맑은 고딕" w:eastAsia="맑은 고딕" w:hAnsi="맑은 고딕"/>
-                <w:sz w:val="17"/>
-                <w:szCs w:val="17"/>
-              </w:rPr>
-              <w:t xml:space="preserve">(예비발령자) 부임까지 남은 준비 항목을 알려주세요.</w:t>
-            </w:r>
-          </w:p>
-          <w:p>
-            <w:pPr>
-              <w:spacing w:after="0" w:line="224"/>
-            </w:pPr>
-            <w:r>
-              <w:rPr>
-                <w:rFonts w:ascii="맑은 고딕" w:cs="맑은 고딕" w:eastAsia="맑은 고딕" w:hAnsi="맑은 고딕"/>
-                <w:sz w:val="17"/>
-                <w:szCs w:val="17"/>
-              </w:rPr>
-              <w:t xml:space="preserve">(AI) 인도네시아 부임(가족 동반) 기준 준비 항목 ○건 중 ○건이 완료되었습니다. 미완료 항목과 기한은 다음과 같습니다.</w:t>
+                <w:b/>
+                <w:bCs/>
+                <w:sz w:val="17"/>
+                <w:szCs w:val="17"/>
+              </w:rPr>
+              <w:t xml:space="preserve">(예비발령자)</w:t>
+            </w:r>
+            <w:r>
+              <w:rPr>
+                <w:rFonts w:ascii="맑은 고딕" w:cs="맑은 고딕" w:eastAsia="맑은 고딕" w:hAnsi="맑은 고딕"/>
+                <w:sz w:val="17"/>
+                <w:szCs w:val="17"/>
+              </w:rPr>
+              <w:t xml:space="preserve"> 부임까지 남은 준비 항목을 알려주세요.</w:t>
+            </w:r>
+          </w:p>
+          <w:p>
+            <w:pPr>
+              <w:spacing w:after="0" w:line="224"/>
+            </w:pPr>
+            <w:r>
+              <w:rPr>
+                <w:rFonts w:ascii="맑은 고딕" w:cs="맑은 고딕" w:eastAsia="맑은 고딕" w:hAnsi="맑은 고딕"/>
+                <w:b/>
+                <w:bCs/>
+                <w:sz w:val="17"/>
+                <w:szCs w:val="17"/>
+              </w:rPr>
+              <w:t xml:space="preserve">(AI)</w:t>
+            </w:r>
+            <w:r>
+              <w:rPr>
+                <w:rFonts w:ascii="맑은 고딕" w:cs="맑은 고딕" w:eastAsia="맑은 고딕" w:hAnsi="맑은 고딕"/>
+                <w:sz w:val="17"/>
+                <w:szCs w:val="17"/>
+              </w:rPr>
+              <w:t xml:space="preserve"> 인도네시아 부임(가족 동반) 기준 준비 항목 ○건 중 ○건이 완료되었습니다.</w:t>
+            </w:r>
+          </w:p>
+          <w:p>
+            <w:pPr>
+              <w:spacing w:after="0" w:line="224"/>
+            </w:pPr>
+            <w:r>
+              <w:rPr>
+                <w:rFonts w:ascii="맑은 고딕" w:cs="맑은 고딕" w:eastAsia="맑은 고딕" w:hAnsi="맑은 고딕"/>
+                <w:b/>
+                <w:bCs/>
+                <w:sz w:val="17"/>
+                <w:szCs w:val="17"/>
+              </w:rPr>
+              <w:t xml:space="preserve">미완료 항목</w:t>
+            </w:r>
+          </w:p>
+          <w:p>
+            <w:pPr>
+              <w:spacing w:after="0" w:line="224"/>
+            </w:pPr>
+            <w:r>
+              <w:rPr>
+                <w:rFonts w:ascii="맑은 고딕" w:cs="맑은 고딕" w:eastAsia="맑은 고딕" w:hAnsi="맑은 고딕"/>
+                <w:sz w:val="17"/>
+                <w:szCs w:val="17"/>
+              </w:rPr>
+              <w:t xml:space="preserve">　· 건강진단 결과서 제출 — 기한 ○월 ○일 (○일 남음)</w:t>
+            </w:r>
+          </w:p>
+          <w:p>
+            <w:pPr>
+              <w:spacing w:after="0" w:line="224"/>
+            </w:pPr>
+            <w:r>
+              <w:rPr>
+                <w:rFonts w:ascii="맑은 고딕" w:cs="맑은 고딕" w:eastAsia="맑은 고딕" w:hAnsi="맑은 고딕"/>
+                <w:sz w:val="17"/>
+                <w:szCs w:val="17"/>
+              </w:rPr>
+              <w:t xml:space="preserve">　· 가족관계증명서 제출 — 기한 ○월 ○일 (○일 남음)</w:t>
+            </w:r>
+          </w:p>
+          <w:p>
+            <w:pPr>
+              <w:spacing w:after="0" w:line="224"/>
+            </w:pPr>
+            <w:r>
+              <w:rPr>
+                <w:rFonts w:ascii="맑은 고딕" w:cs="맑은 고딕" w:eastAsia="맑은 고딕" w:hAnsi="맑은 고딕"/>
+                <w:sz w:val="17"/>
+                <w:szCs w:val="17"/>
+              </w:rPr>
+              <w:t xml:space="preserve">　· 현지 비자 신청 — 기한 ○월 ○일</w:t>
+            </w:r>
+          </w:p>
+          <w:p>
+            <w:pPr>
+              <w:spacing w:after="0" w:line="224"/>
+            </w:pPr>
+            <w:r>
+              <w:rPr>
+                <w:rFonts w:ascii="맑은 고딕" w:cs="맑은 고딕" w:eastAsia="맑은 고딕" w:hAnsi="맑은 고딕"/>
+                <w:b/>
+                <w:bCs/>
+                <w:sz w:val="17"/>
+                <w:szCs w:val="17"/>
+              </w:rPr>
+              <w:t xml:space="preserve">완료 항목</w:t>
+            </w:r>
+          </w:p>
+          <w:p>
+            <w:pPr>
+              <w:spacing w:after="0" w:line="224"/>
+            </w:pPr>
+            <w:r>
+              <w:rPr>
+                <w:rFonts w:ascii="맑은 고딕" w:cs="맑은 고딕" w:eastAsia="맑은 고딕" w:hAnsi="맑은 고딕"/>
+                <w:sz w:val="17"/>
+                <w:szCs w:val="17"/>
+              </w:rPr>
+              <w:t xml:space="preserve">　· 부임 신고서 제출 (○월 ○일 완료)</w:t>
+            </w:r>
+          </w:p>
+          <w:p>
+            <w:pPr>
+              <w:spacing w:after="0" w:line="224"/>
+            </w:pPr>
+            <w:r>
+              <w:rPr>
+                <w:rFonts w:ascii="맑은 고딕" w:cs="맑은 고딕" w:eastAsia="맑은 고딕" w:hAnsi="맑은 고딕"/>
+                <w:sz w:val="17"/>
+                <w:szCs w:val="17"/>
+              </w:rPr>
+              <w:t xml:space="preserve">기한이 임박한 항목은 건강진단 결과서이며, 지정 병원 예약에 통상 ○일이 소요됩니다.</w:t>
+            </w:r>
+          </w:p>
+          <w:p>
+            <w:pPr>
+              <w:spacing w:after="0" w:line="224"/>
+            </w:pPr>
+            <w:r>
+              <w:rPr>
+                <w:rFonts w:ascii="맑은 고딕" w:cs="맑은 고딕" w:eastAsia="맑은 고딕" w:hAnsi="맑은 고딕"/>
+                <w:b/>
+                <w:bCs/>
+                <w:sz w:val="17"/>
+                <w:szCs w:val="17"/>
+              </w:rPr>
+              <w:t xml:space="preserve">(예비발령자)</w:t>
+            </w:r>
+            <w:r>
+              <w:rPr>
+                <w:rFonts w:ascii="맑은 고딕" w:cs="맑은 고딕" w:eastAsia="맑은 고딕" w:hAnsi="맑은 고딕"/>
+                <w:sz w:val="17"/>
+                <w:szCs w:val="17"/>
+              </w:rPr>
+              <w:t xml:space="preserve"> 비자는 어디에 신청하나요?</w:t>
+            </w:r>
+          </w:p>
+          <w:p>
+            <w:pPr>
+              <w:spacing w:after="0" w:line="224"/>
+            </w:pPr>
+            <w:r>
+              <w:rPr>
+                <w:rFonts w:ascii="맑은 고딕" w:cs="맑은 고딕" w:eastAsia="맑은 고딕" w:hAnsi="맑은 고딕"/>
+                <w:b/>
+                <w:bCs/>
+                <w:sz w:val="17"/>
+                <w:szCs w:val="17"/>
+              </w:rPr>
+              <w:t xml:space="preserve">(AI)</w:t>
+            </w:r>
+            <w:r>
+              <w:rPr>
+                <w:rFonts w:ascii="맑은 고딕" w:cs="맑은 고딕" w:eastAsia="맑은 고딕" w:hAnsi="맑은 고딕"/>
+                <w:sz w:val="17"/>
+                <w:szCs w:val="17"/>
+              </w:rPr>
+              <w:t xml:space="preserve"> 인도네시아 취업비자는 현지 법인이 신청을 대행합니다. 필요 서류와 절차는 [인도네시아 부임 안내서] ○면에 안내되어 있으며, 현지 담당 RM을 통해 진행하시면 됩니다.</w:t>
             </w:r>
           </w:p>
         </w:tc>

</xml_diff>

<commit_message>
Split goals and users by stage, revise use case categories
제품명 환원 및 단계 기준 재구성.

제품명:
- 국외근무직원 관리 에이전트로 환원

목표:
- 1단계와 2단계로 분리
- 1단계는 담당자 전용 운영 기간의 사용률과 정확도를 측정
  (담당자 주간 사용률 주 3일 이상, 규정 답변 정답률 90퍼센트 이상)
- 2단계는 배포 이후의 업무 부담 경감을 측정
  (수신 문의 건수 40퍼센트 감축, 담당자 미개입 종결률 60퍼센트)
- 1단계 목표 미달 시 2단계 배포를 보류하는 조건 명시

대상 사용자:
- 1단계 사용자(HR 담당자, 후임 담당자)와 2단계 사용자(예비발령자,
  국외근무직원)로 분리

내용 수정:
- 부임여비 구성 항목을 체재비, 이전료, 가족부임비로 정정.
  실재하지 않는 착후정착비와 항공운임 항목 제거

유스케이스:
- 구분을 응답 유형에서 문의 내용 기준으로 변경
  (부임여비, 부임 제출서류, 복귀 절차, 가족수당, 주택수당,
  복리후생 지원범위, 과거 처리사례, 부임 준비현황)
- 복귀 절차 문의 사례 신설

용어:
- 문서 전반의 1차 버전, 2차 버전 표기 16건을 1단계, 2단계로 통일

분량 추정 7.9페이지

Co-Authored-By: Claude Opus 5 <noreply@anthropic.com>
Claude-Session: https://claude.ai/code/session_01Ekn86cpQq9yULpsy9iFqKx
</commit_message>
<xml_diff>
--- a/prds/국외근무직원-HR-에이전트-PRD.docx
+++ b/prds/국외근무직원-HR-에이전트-PRD.docx
@@ -57,25 +57,25 @@
           <w:sz w:val="20"/>
           <w:szCs w:val="20"/>
         </w:rPr>
-        <w:t xml:space="preserve">문서 제목 / Title: 국외근무직원 관리를 위한 HR 에이전트 제품 요구사항 정의서</w:t>
-      </w:r>
-    </w:p>
-    <w:p>
-      <w:pPr>
-        <w:pStyle w:val="ListParagraph"/>
-        <w:numPr>
-          <w:ilvl w:val="0"/>
-          <w:numId w:val="2"/>
-        </w:numPr>
-        <w:spacing w:after="30" w:line="264"/>
-      </w:pPr>
-      <w:r>
-        <w:rPr>
-          <w:rFonts w:ascii="맑은 고딕" w:cs="맑은 고딕" w:eastAsia="맑은 고딕" w:hAnsi="맑은 고딕"/>
-          <w:sz w:val="20"/>
-          <w:szCs w:val="20"/>
-        </w:rPr>
-        <w:t xml:space="preserve">버전 / Version: v0.4 (초안)</w:t>
+        <w:t xml:space="preserve">문서 제목 / Title: 국외근무직원 관리 에이전트 제품 요구사항 정의서</w:t>
+      </w:r>
+    </w:p>
+    <w:p>
+      <w:pPr>
+        <w:pStyle w:val="ListParagraph"/>
+        <w:numPr>
+          <w:ilvl w:val="0"/>
+          <w:numId w:val="2"/>
+        </w:numPr>
+        <w:spacing w:after="30" w:line="264"/>
+      </w:pPr>
+      <w:r>
+        <w:rPr>
+          <w:rFonts w:ascii="맑은 고딕" w:cs="맑은 고딕" w:eastAsia="맑은 고딕" w:hAnsi="맑은 고딕"/>
+          <w:sz w:val="20"/>
+          <w:szCs w:val="20"/>
+        </w:rPr>
+        <w:t xml:space="preserve">버전 / Version: v0.5 (초안)</w:t>
       </w:r>
     </w:p>
     <w:p>
@@ -181,7 +181,7 @@
           <w:sz w:val="20"/>
           <w:szCs w:val="20"/>
         </w:rPr>
-        <w:t xml:space="preserve">국외근무직원 관리를 위한 HR 에이전트</w:t>
+        <w:t xml:space="preserve">국외근무직원 관리 에이전트</w:t>
       </w:r>
     </w:p>
     <w:p>
@@ -214,7 +214,7 @@
           <w:sz w:val="20"/>
           <w:szCs w:val="20"/>
         </w:rPr>
-        <w:t xml:space="preserve">국외근무직원 관리를 위한 HR 에이전트는 </w:t>
+        <w:t xml:space="preserve">국외근무직원 관리 에이전트는 </w:t>
       </w:r>
       <w:r>
         <w:rPr>
@@ -439,7 +439,7 @@
           <w:sz w:val="20"/>
           <w:szCs w:val="20"/>
         </w:rPr>
-        <w:t xml:space="preserve">1차 버전은 </w:t>
+        <w:t xml:space="preserve">1단계은 </w:t>
       </w:r>
       <w:r>
         <w:rPr>
@@ -504,6 +504,23 @@
     </w:p>
     <w:p>
       <w:pPr>
+        <w:pStyle w:val="Heading2"/>
+        <w:spacing w:after="70" w:before="180"/>
+      </w:pPr>
+      <w:r>
+        <w:rPr>
+          <w:rFonts w:ascii="맑은 고딕" w:cs="맑은 고딕" w:eastAsia="맑은 고딕" w:hAnsi="맑은 고딕"/>
+          <w:b/>
+          <w:bCs/>
+          <w:color w:val="1F4E79"/>
+          <w:sz w:val="22"/>
+          <w:szCs w:val="22"/>
+        </w:rPr>
+        <w:t xml:space="preserve">1단계 — 담당자 전용 운영 (사용률·정확도 검증)</w:t>
+      </w:r>
+    </w:p>
+    <w:p>
+      <w:pPr>
         <w:pStyle w:val="ListParagraph"/>
         <w:numPr>
           <w:ilvl w:val="0"/>
@@ -517,17 +534,17 @@
           <w:sz w:val="20"/>
           <w:szCs w:val="20"/>
         </w:rPr>
-        <w:t xml:space="preserve">담당자 수신 문의 건수 </w:t>
-      </w:r>
-      <w:r>
-        <w:rPr>
-          <w:rFonts w:ascii="맑은 고딕" w:cs="맑은 고딕" w:eastAsia="맑은 고딕" w:hAnsi="맑은 고딕"/>
-          <w:b/>
-          <w:bCs/>
-          <w:sz w:val="20"/>
-          <w:szCs w:val="20"/>
-        </w:rPr>
-        <w:t xml:space="preserve">40% 감축</w:t>
+        <w:t xml:space="preserve">담당자 주간 사용률 </w:t>
+      </w:r>
+      <w:r>
+        <w:rPr>
+          <w:rFonts w:ascii="맑은 고딕" w:cs="맑은 고딕" w:eastAsia="맑은 고딕" w:hAnsi="맑은 고딕"/>
+          <w:b/>
+          <w:bCs/>
+          <w:sz w:val="20"/>
+          <w:szCs w:val="20"/>
+        </w:rPr>
+        <w:t xml:space="preserve">주 3일 이상 확보</w:t>
       </w:r>
     </w:p>
     <w:p>
@@ -542,7 +559,7 @@
           <w:sz w:val="19"/>
           <w:szCs w:val="19"/>
         </w:rPr>
-        <w:t xml:space="preserve">(계산식) (도입 전 월평균 문의 건수 − 도입 후 월평균 문의 건수) ÷ 도입 전 월평균 문의 건수 × 100</w:t>
+        <w:t xml:space="preserve">(계산식) 담당자가 1회 이상 사용한 일수 ÷ 주간 근무일수 × 100</w:t>
       </w:r>
     </w:p>
     <w:p>
@@ -560,17 +577,17 @@
           <w:sz w:val="20"/>
           <w:szCs w:val="20"/>
         </w:rPr>
-        <w:t xml:space="preserve">담당자 개입 없이 종결되는 문의 비율 </w:t>
-      </w:r>
-      <w:r>
-        <w:rPr>
-          <w:rFonts w:ascii="맑은 고딕" w:cs="맑은 고딕" w:eastAsia="맑은 고딕" w:hAnsi="맑은 고딕"/>
-          <w:b/>
-          <w:bCs/>
-          <w:sz w:val="20"/>
-          <w:szCs w:val="20"/>
-        </w:rPr>
-        <w:t xml:space="preserve">60% 확보</w:t>
+        <w:t xml:space="preserve">규정 답변 정답률 </w:t>
+      </w:r>
+      <w:r>
+        <w:rPr>
+          <w:rFonts w:ascii="맑은 고딕" w:cs="맑은 고딕" w:eastAsia="맑은 고딕" w:hAnsi="맑은 고딕"/>
+          <w:b/>
+          <w:bCs/>
+          <w:sz w:val="20"/>
+          <w:szCs w:val="20"/>
+        </w:rPr>
+        <w:t xml:space="preserve">90% 이상 달성</w:t>
       </w:r>
     </w:p>
     <w:p>
@@ -585,7 +602,24 @@
           <w:sz w:val="19"/>
           <w:szCs w:val="19"/>
         </w:rPr>
-        <w:t xml:space="preserve">(계산식) 담당자 개입 없이 종결된 문의 건수 ÷ 전체 문의 건수 × 100</w:t>
+        <w:t xml:space="preserve">(계산식) 평가 문항 중 정답 처리 문항 수 ÷ 전체 평가 문항 수 × 100</w:t>
+      </w:r>
+    </w:p>
+    <w:p>
+      <w:pPr>
+        <w:pStyle w:val="Heading2"/>
+        <w:spacing w:after="70" w:before="180"/>
+      </w:pPr>
+      <w:r>
+        <w:rPr>
+          <w:rFonts w:ascii="맑은 고딕" w:cs="맑은 고딕" w:eastAsia="맑은 고딕" w:hAnsi="맑은 고딕"/>
+          <w:b/>
+          <w:bCs/>
+          <w:color w:val="1F4E79"/>
+          <w:sz w:val="22"/>
+          <w:szCs w:val="22"/>
+        </w:rPr>
+        <w:t xml:space="preserve">2단계 — 국외근무직원 대상 배포 (업무 부담 경감)</w:t>
       </w:r>
     </w:p>
     <w:p>
@@ -603,17 +637,17 @@
           <w:sz w:val="20"/>
           <w:szCs w:val="20"/>
         </w:rPr>
-        <w:t xml:space="preserve">규정 답변 정답률 </w:t>
-      </w:r>
-      <w:r>
-        <w:rPr>
-          <w:rFonts w:ascii="맑은 고딕" w:cs="맑은 고딕" w:eastAsia="맑은 고딕" w:hAnsi="맑은 고딕"/>
-          <w:b/>
-          <w:bCs/>
-          <w:sz w:val="20"/>
-          <w:szCs w:val="20"/>
-        </w:rPr>
-        <w:t xml:space="preserve">90% 이상 달성</w:t>
+        <w:t xml:space="preserve">담당자 수신 문의 건수 </w:t>
+      </w:r>
+      <w:r>
+        <w:rPr>
+          <w:rFonts w:ascii="맑은 고딕" w:cs="맑은 고딕" w:eastAsia="맑은 고딕" w:hAnsi="맑은 고딕"/>
+          <w:b/>
+          <w:bCs/>
+          <w:sz w:val="20"/>
+          <w:szCs w:val="20"/>
+        </w:rPr>
+        <w:t xml:space="preserve">40% 감축</w:t>
       </w:r>
     </w:p>
     <w:p>
@@ -628,7 +662,7 @@
           <w:sz w:val="19"/>
           <w:szCs w:val="19"/>
         </w:rPr>
-        <w:t xml:space="preserve">(계산식) 평가 문항 중 정답 처리 문항 수 ÷ 전체 평가 문항 수 × 100</w:t>
+        <w:t xml:space="preserve">(계산식) (도입 전 월평균 문의 건수 − 도입 후 월평균 문의 건수) ÷ 도입 전 월평균 문의 건수 × 100</w:t>
       </w:r>
     </w:p>
     <w:p>
@@ -646,17 +680,17 @@
           <w:sz w:val="20"/>
           <w:szCs w:val="20"/>
         </w:rPr>
-        <w:t xml:space="preserve">답변 근거(조항 원문·소관부서) 표시 및 기록률 </w:t>
-      </w:r>
-      <w:r>
-        <w:rPr>
-          <w:rFonts w:ascii="맑은 고딕" w:cs="맑은 고딕" w:eastAsia="맑은 고딕" w:hAnsi="맑은 고딕"/>
-          <w:b/>
-          <w:bCs/>
-          <w:sz w:val="20"/>
-          <w:szCs w:val="20"/>
-        </w:rPr>
-        <w:t xml:space="preserve">100% 확보</w:t>
+        <w:t xml:space="preserve">담당자 개입 없이 종결되는 문의 비율 </w:t>
+      </w:r>
+      <w:r>
+        <w:rPr>
+          <w:rFonts w:ascii="맑은 고딕" w:cs="맑은 고딕" w:eastAsia="맑은 고딕" w:hAnsi="맑은 고딕"/>
+          <w:b/>
+          <w:bCs/>
+          <w:sz w:val="20"/>
+          <w:szCs w:val="20"/>
+        </w:rPr>
+        <w:t xml:space="preserve">60% 확보</w:t>
       </w:r>
     </w:p>
     <w:p>
@@ -671,7 +705,7 @@
           <w:sz w:val="19"/>
           <w:szCs w:val="19"/>
         </w:rPr>
-        <w:t xml:space="preserve">(계산식) 조항 원문 및 소관부서가 표시·기록된 답변 수 ÷ 전체 답변 수 × 100</w:t>
+        <w:t xml:space="preserve">(계산식) 담당자 개입 없이 종결된 문의 건수 ÷ 전체 문의 건수 × 100</w:t>
       </w:r>
     </w:p>
     <w:p>
@@ -691,7 +725,7 @@
           <w:sz w:val="20"/>
           <w:szCs w:val="20"/>
         </w:rPr>
-        <w:t xml:space="preserve">도입 전 2주간 기준값 측정 후 목표치 확정 필요. 기준값 부재 시 성과 증명 불가.</w:t>
+        <w:t xml:space="preserve">1단계 목표 미달 시 2단계 배포 보류. 도입 전 2주간 기준값 측정 후 2단계 목표치 확정 필요.</w:t>
       </w:r>
     </w:p>
     <w:p>
@@ -763,7 +797,7 @@
           <w:sz w:val="22"/>
           <w:szCs w:val="22"/>
         </w:rPr>
-        <w:t xml:space="preserve">주요 사용자</w:t>
+        <w:t xml:space="preserve">1단계 사용자 (주요 사용자)</w:t>
       </w:r>
     </w:p>
     <w:p>
@@ -791,7 +825,7 @@
           <w:sz w:val="20"/>
           <w:szCs w:val="20"/>
         </w:rPr>
-        <w:t xml:space="preserve"> — 본부에서 국외 HR 업무를 담당하는 1~2명. 문의 응대 및 규정 확인을 상시 수행하는 1차 버전의 유일한 사용자</w:t>
+        <w:t xml:space="preserve"> — 본부에서 국외 HR 업무를 담당하는 1~2명. 문의 응대 및 규정 확인을 상시 수행하는 1단계의 유일한 사용자</w:t>
       </w:r>
     </w:p>
     <w:p>
@@ -836,7 +870,7 @@
           <w:sz w:val="22"/>
           <w:szCs w:val="22"/>
         </w:rPr>
-        <w:t xml:space="preserve">부가 사용자</w:t>
+        <w:t xml:space="preserve">2단계 사용자 (부가 사용자)</w:t>
       </w:r>
     </w:p>
     <w:p>
@@ -905,7 +939,7 @@
           <w:sz w:val="20"/>
           <w:szCs w:val="20"/>
         </w:rPr>
-        <w:t xml:space="preserve">1차 버전을 글로벌사업그룹 HR 담당자 전용으로 출시하는 사유는, 담당자의 상시 규정 확인 업무로 인한 사용 보장과 오답의 즉시 발견·교정 가능성 확보. 검증되지 않은 답변이 부가 사용자에게 우선 전달되는 상황 방지 목적.</w:t>
+        <w:t xml:space="preserve">1단계를 글로벌사업그룹 HR 담당자 전용으로 운영하는 사유는, 담당자의 상시 규정 확인 업무로 인한 사용 보장과 오답의 즉시 발견·교정 가능성 확보. 검증되지 않은 답변이 2단계 사용자에게 우선 전달되는 상황 방지 목적.</w:t>
       </w:r>
     </w:p>
     <w:p>
@@ -1863,8 +1897,8 @@
         </w:tblBorders>
       </w:tblPr>
       <w:tblGrid>
-        <w:gridCol w:w="1200"/>
-        <w:gridCol w:w="8546"/>
+        <w:gridCol w:w="1500"/>
+        <w:gridCol w:w="8246"/>
       </w:tblGrid>
       <w:tr>
         <w:trPr>
@@ -1872,7 +1906,7 @@
         </w:trPr>
         <w:tc>
           <w:tcPr>
-            <w:tcW w:type="dxa" w:w="1200"/>
+            <w:tcW w:type="dxa" w:w="1500"/>
             <w:shd w:fill="E8EEF4" w:val="clear"/>
             <w:tcMar>
               <w:top w:type="dxa" w:w="36"/>
@@ -1899,7 +1933,7 @@
         </w:tc>
         <w:tc>
           <w:tcPr>
-            <w:tcW w:type="dxa" w:w="8546"/>
+            <w:tcW w:type="dxa" w:w="8246"/>
             <w:shd w:fill="E8EEF4" w:val="clear"/>
             <w:tcMar>
               <w:top w:type="dxa" w:w="36"/>
@@ -1931,7 +1965,7 @@
         </w:trPr>
         <w:tc>
           <w:tcPr>
-            <w:tcW w:type="dxa" w:w="1200"/>
+            <w:tcW w:type="dxa" w:w="1500"/>
             <w:tcMar>
               <w:top w:type="dxa" w:w="36"/>
               <w:left w:type="dxa" w:w="80"/>
@@ -1951,13 +1985,13 @@
                 <w:sz w:val="17"/>
                 <w:szCs w:val="17"/>
               </w:rPr>
-              <w:t xml:space="preserve">규정 인용</w:t>
+              <w:t xml:space="preserve">부임여비 문의</w:t>
             </w:r>
           </w:p>
         </w:tc>
         <w:tc>
           <w:tcPr>
-            <w:tcW w:type="dxa" w:w="8546"/>
+            <w:tcW w:type="dxa" w:w="8246"/>
             <w:tcMar>
               <w:top w:type="dxa" w:w="36"/>
               <w:left w:type="dxa" w:w="80"/>
@@ -2021,46 +2055,33 @@
                 <w:sz w:val="17"/>
                 <w:szCs w:val="17"/>
               </w:rPr>
-              <w:t xml:space="preserve">　① 항공운임 — 본인 및 동반가족 실비 (이코노미 기준)</w:t>
-            </w:r>
-          </w:p>
-          <w:p>
-            <w:pPr>
-              <w:spacing w:after="0" w:line="224"/>
-            </w:pPr>
-            <w:r>
-              <w:rPr>
-                <w:rFonts w:ascii="맑은 고딕" w:cs="맑은 고딕" w:eastAsia="맑은 고딕" w:hAnsi="맑은 고딕"/>
-                <w:sz w:val="17"/>
-                <w:szCs w:val="17"/>
-              </w:rPr>
-              <w:t xml:space="preserve">　② 이전비 — 직급별 정액 ○○원</w:t>
-            </w:r>
-          </w:p>
-          <w:p>
-            <w:pPr>
-              <w:spacing w:after="0" w:line="224"/>
-            </w:pPr>
-            <w:r>
-              <w:rPr>
-                <w:rFonts w:ascii="맑은 고딕" w:cs="맑은 고딕" w:eastAsia="맑은 고딕" w:hAnsi="맑은 고딕"/>
-                <w:sz w:val="17"/>
-                <w:szCs w:val="17"/>
-              </w:rPr>
-              <w:t xml:space="preserve">　③ 착후정착비 — 월 기본급의 ○○%</w:t>
-            </w:r>
-          </w:p>
-          <w:p>
-            <w:pPr>
-              <w:spacing w:after="0" w:line="224"/>
-            </w:pPr>
-            <w:r>
-              <w:rPr>
-                <w:rFonts w:ascii="맑은 고딕" w:cs="맑은 고딕" w:eastAsia="맑은 고딕" w:hAnsi="맑은 고딕"/>
-                <w:sz w:val="17"/>
-                <w:szCs w:val="17"/>
-              </w:rPr>
-              <w:t xml:space="preserve">동반가족이 있는 경우 ②·③의 지급 기준이 달라집니다.</w:t>
+              <w:t xml:space="preserve">　① 체재비 — 부임 초기 ○일간, 1일 ○○ 지급</w:t>
+            </w:r>
+          </w:p>
+          <w:p>
+            <w:pPr>
+              <w:spacing w:after="0" w:line="224"/>
+            </w:pPr>
+            <w:r>
+              <w:rPr>
+                <w:rFonts w:ascii="맑은 고딕" w:cs="맑은 고딕" w:eastAsia="맑은 고딕" w:hAnsi="맑은 고딕"/>
+                <w:sz w:val="17"/>
+                <w:szCs w:val="17"/>
+              </w:rPr>
+              <w:t xml:space="preserve">　② 이전료 — 직급별 정액 ○○ 지급</w:t>
+            </w:r>
+          </w:p>
+          <w:p>
+            <w:pPr>
+              <w:spacing w:after="0" w:line="224"/>
+            </w:pPr>
+            <w:r>
+              <w:rPr>
+                <w:rFonts w:ascii="맑은 고딕" w:cs="맑은 고딕" w:eastAsia="맑은 고딕" w:hAnsi="맑은 고딕"/>
+                <w:sz w:val="17"/>
+                <w:szCs w:val="17"/>
+              </w:rPr>
+              <w:t xml:space="preserve">　③ 가족부임비 — 동반가족이 있는 경우 1인당 ○○ 지급</w:t>
             </w:r>
           </w:p>
           <w:p>
@@ -2145,7 +2166,7 @@
                 <w:sz w:val="17"/>
                 <w:szCs w:val="17"/>
               </w:rPr>
-              <w:t xml:space="preserve"> 동반가족 1인당 이전비 ○○원이 가산되고, 착후정착비는 ○○% 상향 적용됩니다. 다만 동반가족의 인정 범위는 개별 확인이 필요한 사항이므로 담당자 문의를 권장드립니다.</w:t>
+              <w:t xml:space="preserve"> 동반가족 1인당 가족부임비 ○○이 추가 지급되며, 체재비는 본인 기준으로 산정됩니다. 다만 동반가족의 인정 범위는 개별 확인이 필요한 사항이므로 담당자 문의를 권장드립니다.</w:t>
             </w:r>
           </w:p>
         </w:tc>
@@ -2156,7 +2177,7 @@
         </w:trPr>
         <w:tc>
           <w:tcPr>
-            <w:tcW w:type="dxa" w:w="1200"/>
+            <w:tcW w:type="dxa" w:w="1500"/>
             <w:tcMar>
               <w:top w:type="dxa" w:w="36"/>
               <w:left w:type="dxa" w:w="80"/>
@@ -2176,13 +2197,13 @@
                 <w:sz w:val="17"/>
                 <w:szCs w:val="17"/>
               </w:rPr>
-              <w:t xml:space="preserve">절차 안내</w:t>
+              <w:t xml:space="preserve">부임 제출서류 문의</w:t>
             </w:r>
           </w:p>
         </w:tc>
         <w:tc>
           <w:tcPr>
-            <w:tcW w:type="dxa" w:w="8546"/>
+            <w:tcW w:type="dxa" w:w="8246"/>
             <w:tcMar>
               <w:top w:type="dxa" w:w="36"/>
               <w:left w:type="dxa" w:w="80"/>
@@ -2368,7 +2389,7 @@
         </w:trPr>
         <w:tc>
           <w:tcPr>
-            <w:tcW w:type="dxa" w:w="1200"/>
+            <w:tcW w:type="dxa" w:w="1500"/>
             <w:tcMar>
               <w:top w:type="dxa" w:w="36"/>
               <w:left w:type="dxa" w:w="80"/>
@@ -2388,13 +2409,13 @@
                 <w:sz w:val="17"/>
                 <w:szCs w:val="17"/>
               </w:rPr>
-              <w:t xml:space="preserve">해석 판단 (연결)</w:t>
+              <w:t xml:space="preserve">복귀 절차 문의</w:t>
             </w:r>
           </w:p>
         </w:tc>
         <w:tc>
           <w:tcPr>
-            <w:tcW w:type="dxa" w:w="8546"/>
+            <w:tcW w:type="dxa" w:w="8246"/>
             <w:tcMar>
               <w:top w:type="dxa" w:w="36"/>
               <w:left w:type="dxa" w:w="80"/>
@@ -2422,7 +2443,7 @@
                 <w:sz w:val="17"/>
                 <w:szCs w:val="17"/>
               </w:rPr>
-              <w:t xml:space="preserve"> 배우자가 현지에서 취업했는데 가족수당을 계속 받을 수 있나요?</w:t>
+              <w:t xml:space="preserve"> 다음 달에 복귀하는데 무엇을 준비해야 하나요?</w:t>
             </w:r>
           </w:p>
           <w:p>
@@ -2445,59 +2466,72 @@
                 <w:sz w:val="17"/>
                 <w:szCs w:val="17"/>
               </w:rPr>
-              <w:t xml:space="preserve"> 해당 사안은 규정을 개별 상황에 적용할지 판단이 필요한 사항으로, 본 시스템에서는 답변드리기 어렵습니다.</w:t>
-            </w:r>
-          </w:p>
-          <w:p>
-            <w:pPr>
-              <w:spacing w:after="0" w:line="224"/>
-            </w:pPr>
-            <w:r>
-              <w:rPr>
-                <w:rFonts w:ascii="맑은 고딕" w:cs="맑은 고딕" w:eastAsia="맑은 고딕" w:hAnsi="맑은 고딕"/>
-                <w:sz w:val="17"/>
-                <w:szCs w:val="17"/>
-              </w:rPr>
-              <w:t xml:space="preserve">참고하실 수 있는 관련 조항은 다음과 같습니다.</w:t>
-            </w:r>
-          </w:p>
-          <w:p>
-            <w:pPr>
-              <w:spacing w:after="0" w:line="224"/>
-            </w:pPr>
-            <w:r>
-              <w:rPr>
-                <w:rFonts w:ascii="맑은 고딕" w:cs="맑은 고딕" w:eastAsia="맑은 고딕" w:hAnsi="맑은 고딕"/>
-                <w:sz w:val="17"/>
-                <w:szCs w:val="17"/>
-              </w:rPr>
-              <w:t xml:space="preserve">　· 「국외근무직원 보수·복지에 관한 규정」 제○조 (가족수당 지급 대상)</w:t>
-            </w:r>
-          </w:p>
-          <w:p>
-            <w:pPr>
-              <w:spacing w:after="0" w:line="224"/>
-            </w:pPr>
-            <w:r>
-              <w:rPr>
-                <w:rFonts w:ascii="맑은 고딕" w:cs="맑은 고딕" w:eastAsia="맑은 고딕" w:hAnsi="맑은 고딕"/>
-                <w:sz w:val="17"/>
-                <w:szCs w:val="17"/>
-              </w:rPr>
-              <w:t xml:space="preserve">　· 같은 규정 제○조 (지급 제외 사유)</w:t>
-            </w:r>
-          </w:p>
-          <w:p>
-            <w:pPr>
-              <w:spacing w:after="0" w:line="224"/>
-            </w:pPr>
-            <w:r>
-              <w:rPr>
-                <w:rFonts w:ascii="맑은 고딕" w:cs="맑은 고딕" w:eastAsia="맑은 고딕" w:hAnsi="맑은 고딕"/>
-                <w:sz w:val="17"/>
-                <w:szCs w:val="17"/>
-              </w:rPr>
-              <w:t xml:space="preserve">배우자의 소득 발생이 지급 제외 사유에 해당하는지는 소관부서의 확인이 필요합니다.</w:t>
+              <w:t xml:space="preserve"> 복귀 준비 항목은 다음과 같습니다.</w:t>
+            </w:r>
+          </w:p>
+          <w:p>
+            <w:pPr>
+              <w:spacing w:after="0" w:line="224"/>
+            </w:pPr>
+            <w:r>
+              <w:rPr>
+                <w:rFonts w:ascii="맑은 고딕" w:cs="맑은 고딕" w:eastAsia="맑은 고딕" w:hAnsi="맑은 고딕"/>
+                <w:sz w:val="17"/>
+                <w:szCs w:val="17"/>
+              </w:rPr>
+              <w:t xml:space="preserve">　① 복귀 신고서 제출 — 복귀일 ○일 전까지 [양식 내려받기]</w:t>
+            </w:r>
+          </w:p>
+          <w:p>
+            <w:pPr>
+              <w:spacing w:after="0" w:line="224"/>
+            </w:pPr>
+            <w:r>
+              <w:rPr>
+                <w:rFonts w:ascii="맑은 고딕" w:cs="맑은 고딕" w:eastAsia="맑은 고딕" w:hAnsi="맑은 고딕"/>
+                <w:sz w:val="17"/>
+                <w:szCs w:val="17"/>
+              </w:rPr>
+              <w:t xml:space="preserve">　② 사택 임차계약 해지 통보 — 계약서상 통보 기한 확인 필요 (통상 ○개월 전)</w:t>
+            </w:r>
+          </w:p>
+          <w:p>
+            <w:pPr>
+              <w:spacing w:after="0" w:line="224"/>
+            </w:pPr>
+            <w:r>
+              <w:rPr>
+                <w:rFonts w:ascii="맑은 고딕" w:cs="맑은 고딕" w:eastAsia="맑은 고딕" w:hAnsi="맑은 고딕"/>
+                <w:sz w:val="17"/>
+                <w:szCs w:val="17"/>
+              </w:rPr>
+              <w:t xml:space="preserve">　③ 현지 정산 — 관리비·공과금 등 미납분 정산 후 증빙 제출</w:t>
+            </w:r>
+          </w:p>
+          <w:p>
+            <w:pPr>
+              <w:spacing w:after="0" w:line="224"/>
+            </w:pPr>
+            <w:r>
+              <w:rPr>
+                <w:rFonts w:ascii="맑은 고딕" w:cs="맑은 고딕" w:eastAsia="맑은 고딕" w:hAnsi="맑은 고딕"/>
+                <w:sz w:val="17"/>
+                <w:szCs w:val="17"/>
+              </w:rPr>
+              <w:t xml:space="preserve">　④ 학자금 정산 서류 — 자녀 학자금 수령자에 한함</w:t>
+            </w:r>
+          </w:p>
+          <w:p>
+            <w:pPr>
+              <w:spacing w:after="0" w:line="224"/>
+            </w:pPr>
+            <w:r>
+              <w:rPr>
+                <w:rFonts w:ascii="맑은 고딕" w:cs="맑은 고딕" w:eastAsia="맑은 고딕" w:hAnsi="맑은 고딕"/>
+                <w:sz w:val="17"/>
+                <w:szCs w:val="17"/>
+              </w:rPr>
+              <w:t xml:space="preserve">　· 근거: 「국외근무직원 인사에 관한 규정」 제○조</w:t>
             </w:r>
           </w:p>
           <w:p>
@@ -2523,7 +2557,7 @@
                 <w:sz w:val="17"/>
                 <w:szCs w:val="17"/>
               </w:rPr>
-              <w:t xml:space="preserve">　· 안내: 담당자를 통해 소관부서에 질의하시기 바랍니다.</w:t>
+              <w:t xml:space="preserve">사택 계약 해지 통보 기한은 국가 및 계약별로 상이하므로 계약서를 우선 확인하시기 바랍니다.</w:t>
             </w:r>
           </w:p>
           <w:p>
@@ -2546,7 +2580,7 @@
                 <w:sz w:val="17"/>
                 <w:szCs w:val="17"/>
               </w:rPr>
-              <w:t xml:space="preserve"> 그럼 일단 계속 받아도 되나요?</w:t>
+              <w:t xml:space="preserve"> 해지 통보를 늦게 하면 어떻게 되나요?</w:t>
             </w:r>
           </w:p>
           <w:p>
@@ -2569,7 +2603,7 @@
                 <w:sz w:val="17"/>
                 <w:szCs w:val="17"/>
               </w:rPr>
-              <w:t xml:space="preserve"> 지급 여부에 대한 판단은 소관부서 확인 사항으로, 본 시스템에서 안내드릴 수 없습니다. 확인 전 수령분에 대한 정산이 발생할 수 있으므로 사전 확인을 권장드립니다.</w:t>
+              <w:t xml:space="preserve"> 계약 조건에 따라 위약금 또는 추가 임차료가 발생할 수 있습니다. 다만 해당 비용의 회사 부담 여부는 개별 판단이 필요한 사항으로, 담당자를 통해 소관부서에 확인하시기 바랍니다.</w:t>
             </w:r>
           </w:p>
         </w:tc>
@@ -2580,7 +2614,7 @@
         </w:trPr>
         <w:tc>
           <w:tcPr>
-            <w:tcW w:type="dxa" w:w="1200"/>
+            <w:tcW w:type="dxa" w:w="1500"/>
             <w:tcMar>
               <w:top w:type="dxa" w:w="36"/>
               <w:left w:type="dxa" w:w="80"/>
@@ -2600,13 +2634,13 @@
                 <w:sz w:val="17"/>
                 <w:szCs w:val="17"/>
               </w:rPr>
-              <w:t xml:space="preserve">조건 확인 (되묻기)</w:t>
+              <w:t xml:space="preserve">가족수당 문의</w:t>
             </w:r>
           </w:p>
         </w:tc>
         <w:tc>
           <w:tcPr>
-            <w:tcW w:type="dxa" w:w="8546"/>
+            <w:tcW w:type="dxa" w:w="8246"/>
             <w:tcMar>
               <w:top w:type="dxa" w:w="36"/>
               <w:left w:type="dxa" w:w="80"/>
@@ -2626,15 +2660,15 @@
                 <w:sz w:val="17"/>
                 <w:szCs w:val="17"/>
               </w:rPr>
-              <w:t xml:space="preserve">(담당자)</w:t>
-            </w:r>
-            <w:r>
-              <w:rPr>
-                <w:rFonts w:ascii="맑은 고딕" w:cs="맑은 고딕" w:eastAsia="맑은 고딕" w:hAnsi="맑은 고딕"/>
-                <w:sz w:val="17"/>
-                <w:szCs w:val="17"/>
-              </w:rPr>
-              <w:t xml:space="preserve"> 주택수당 한도가 얼마인가요?</w:t>
+              <w:t xml:space="preserve">(직원)</w:t>
+            </w:r>
+            <w:r>
+              <w:rPr>
+                <w:rFonts w:ascii="맑은 고딕" w:cs="맑은 고딕" w:eastAsia="맑은 고딕" w:hAnsi="맑은 고딕"/>
+                <w:sz w:val="17"/>
+                <w:szCs w:val="17"/>
+              </w:rPr>
+              <w:t xml:space="preserve"> 배우자가 현지에서 취업했는데 가족수당을 계속 받을 수 있나요?</w:t>
             </w:r>
           </w:p>
           <w:p>
@@ -2657,33 +2691,85 @@
                 <w:sz w:val="17"/>
                 <w:szCs w:val="17"/>
               </w:rPr>
-              <w:t xml:space="preserve"> 주택수당 한도는 근무 국가와 법인격에 따라 기준이 다릅니다. 아래 정보를 알려주시면 해당 기준을 안내드리겠습니다.</w:t>
-            </w:r>
-          </w:p>
-          <w:p>
-            <w:pPr>
-              <w:spacing w:after="0" w:line="224"/>
-            </w:pPr>
-            <w:r>
-              <w:rPr>
-                <w:rFonts w:ascii="맑은 고딕" w:cs="맑은 고딕" w:eastAsia="맑은 고딕" w:hAnsi="맑은 고딕"/>
-                <w:sz w:val="17"/>
-                <w:szCs w:val="17"/>
-              </w:rPr>
-              <w:t xml:space="preserve">　· 근무 국가</w:t>
-            </w:r>
-          </w:p>
-          <w:p>
-            <w:pPr>
-              <w:spacing w:after="0" w:line="224"/>
-            </w:pPr>
-            <w:r>
-              <w:rPr>
-                <w:rFonts w:ascii="맑은 고딕" w:cs="맑은 고딕" w:eastAsia="맑은 고딕" w:hAnsi="맑은 고딕"/>
-                <w:sz w:val="17"/>
-                <w:szCs w:val="17"/>
-              </w:rPr>
-              <w:t xml:space="preserve">　· 법인격 구분 (자회사 / 국외점포)</w:t>
+              <w:t xml:space="preserve"> 해당 사안은 규정을 개별 상황에 적용할지 판단이 필요한 사항으로, 본 시스템에서는 답변드리기 어렵습니다.</w:t>
+            </w:r>
+          </w:p>
+          <w:p>
+            <w:pPr>
+              <w:spacing w:after="0" w:line="224"/>
+            </w:pPr>
+            <w:r>
+              <w:rPr>
+                <w:rFonts w:ascii="맑은 고딕" w:cs="맑은 고딕" w:eastAsia="맑은 고딕" w:hAnsi="맑은 고딕"/>
+                <w:sz w:val="17"/>
+                <w:szCs w:val="17"/>
+              </w:rPr>
+              <w:t xml:space="preserve">참고하실 수 있는 관련 조항은 다음과 같습니다.</w:t>
+            </w:r>
+          </w:p>
+          <w:p>
+            <w:pPr>
+              <w:spacing w:after="0" w:line="224"/>
+            </w:pPr>
+            <w:r>
+              <w:rPr>
+                <w:rFonts w:ascii="맑은 고딕" w:cs="맑은 고딕" w:eastAsia="맑은 고딕" w:hAnsi="맑은 고딕"/>
+                <w:sz w:val="17"/>
+                <w:szCs w:val="17"/>
+              </w:rPr>
+              <w:t xml:space="preserve">　· 「국외근무직원 보수·복지에 관한 규정」 제○조 (가족수당 지급 대상)</w:t>
+            </w:r>
+          </w:p>
+          <w:p>
+            <w:pPr>
+              <w:spacing w:after="0" w:line="224"/>
+            </w:pPr>
+            <w:r>
+              <w:rPr>
+                <w:rFonts w:ascii="맑은 고딕" w:cs="맑은 고딕" w:eastAsia="맑은 고딕" w:hAnsi="맑은 고딕"/>
+                <w:sz w:val="17"/>
+                <w:szCs w:val="17"/>
+              </w:rPr>
+              <w:t xml:space="preserve">　· 같은 규정 제○조 (지급 제외 사유)</w:t>
+            </w:r>
+          </w:p>
+          <w:p>
+            <w:pPr>
+              <w:spacing w:after="0" w:line="224"/>
+            </w:pPr>
+            <w:r>
+              <w:rPr>
+                <w:rFonts w:ascii="맑은 고딕" w:cs="맑은 고딕" w:eastAsia="맑은 고딕" w:hAnsi="맑은 고딕"/>
+                <w:sz w:val="17"/>
+                <w:szCs w:val="17"/>
+              </w:rPr>
+              <w:t xml:space="preserve">배우자의 소득 발생이 지급 제외 사유에 해당하는지는 소관부서의 확인이 필요합니다.</w:t>
+            </w:r>
+          </w:p>
+          <w:p>
+            <w:pPr>
+              <w:spacing w:after="0" w:line="224"/>
+            </w:pPr>
+            <w:r>
+              <w:rPr>
+                <w:rFonts w:ascii="맑은 고딕" w:cs="맑은 고딕" w:eastAsia="맑은 고딕" w:hAnsi="맑은 고딕"/>
+                <w:sz w:val="17"/>
+                <w:szCs w:val="17"/>
+              </w:rPr>
+              <w:t xml:space="preserve">　· 소관: HR·직원만족부</w:t>
+            </w:r>
+          </w:p>
+          <w:p>
+            <w:pPr>
+              <w:spacing w:after="0" w:line="224"/>
+            </w:pPr>
+            <w:r>
+              <w:rPr>
+                <w:rFonts w:ascii="맑은 고딕" w:cs="맑은 고딕" w:eastAsia="맑은 고딕" w:hAnsi="맑은 고딕"/>
+                <w:sz w:val="17"/>
+                <w:szCs w:val="17"/>
+              </w:rPr>
+              <w:t xml:space="preserve">　· 안내: 담당자를 통해 소관부서에 질의하시기 바랍니다.</w:t>
             </w:r>
           </w:p>
           <w:p>
@@ -2698,15 +2784,15 @@
                 <w:sz w:val="17"/>
                 <w:szCs w:val="17"/>
               </w:rPr>
-              <w:t xml:space="preserve">(담당자)</w:t>
-            </w:r>
-            <w:r>
-              <w:rPr>
-                <w:rFonts w:ascii="맑은 고딕" w:cs="맑은 고딕" w:eastAsia="맑은 고딕" w:hAnsi="맑은 고딕"/>
-                <w:sz w:val="17"/>
-                <w:szCs w:val="17"/>
-              </w:rPr>
-              <w:t xml:space="preserve"> 인도네시아 자회사요.</w:t>
+              <w:t xml:space="preserve">(직원)</w:t>
+            </w:r>
+            <w:r>
+              <w:rPr>
+                <w:rFonts w:ascii="맑은 고딕" w:cs="맑은 고딕" w:eastAsia="맑은 고딕" w:hAnsi="맑은 고딕"/>
+                <w:sz w:val="17"/>
+                <w:szCs w:val="17"/>
+              </w:rPr>
+              <w:t xml:space="preserve"> 그럼 일단 계속 받아도 되나요?</w:t>
             </w:r>
           </w:p>
           <w:p>
@@ -2729,59 +2815,7 @@
                 <w:sz w:val="17"/>
                 <w:szCs w:val="17"/>
               </w:rPr>
-              <w:t xml:space="preserve"> 인도네시아 자회사 기준으로 안내드립니다. 「국외근무직원 보수·복지에 관한 규정」 제○조에 따라 주택수당 한도는 직급별로 다음과 같습니다.</w:t>
-            </w:r>
-          </w:p>
-          <w:p>
-            <w:pPr>
-              <w:spacing w:after="0" w:line="224"/>
-            </w:pPr>
-            <w:r>
-              <w:rPr>
-                <w:rFonts w:ascii="맑은 고딕" w:cs="맑은 고딕" w:eastAsia="맑은 고딕" w:hAnsi="맑은 고딕"/>
-                <w:sz w:val="17"/>
-                <w:szCs w:val="17"/>
-              </w:rPr>
-              <w:t xml:space="preserve">　· ○급 이상 — 월 ○○</w:t>
-            </w:r>
-          </w:p>
-          <w:p>
-            <w:pPr>
-              <w:spacing w:after="0" w:line="224"/>
-            </w:pPr>
-            <w:r>
-              <w:rPr>
-                <w:rFonts w:ascii="맑은 고딕" w:cs="맑은 고딕" w:eastAsia="맑은 고딕" w:hAnsi="맑은 고딕"/>
-                <w:sz w:val="17"/>
-                <w:szCs w:val="17"/>
-              </w:rPr>
-              <w:t xml:space="preserve">　· ○급 이하 — 월 ○○</w:t>
-            </w:r>
-          </w:p>
-          <w:p>
-            <w:pPr>
-              <w:spacing w:after="0" w:line="224"/>
-            </w:pPr>
-            <w:r>
-              <w:rPr>
-                <w:rFonts w:ascii="맑은 고딕" w:cs="맑은 고딕" w:eastAsia="맑은 고딕" w:hAnsi="맑은 고딕"/>
-                <w:sz w:val="17"/>
-                <w:szCs w:val="17"/>
-              </w:rPr>
-              <w:t xml:space="preserve">실제 임차료가 한도를 초과하는 경우의 처리는 별도 확인이 필요한 사항입니다.</w:t>
-            </w:r>
-          </w:p>
-          <w:p>
-            <w:pPr>
-              <w:spacing w:after="0" w:line="224"/>
-            </w:pPr>
-            <w:r>
-              <w:rPr>
-                <w:rFonts w:ascii="맑은 고딕" w:cs="맑은 고딕" w:eastAsia="맑은 고딕" w:hAnsi="맑은 고딕"/>
-                <w:sz w:val="17"/>
-                <w:szCs w:val="17"/>
-              </w:rPr>
-              <w:t xml:space="preserve">　· 근거: 제○조 (시행일 2026.○.○) · 소관: HR·직원만족부</w:t>
+              <w:t xml:space="preserve"> 지급 여부에 대한 판단은 소관부서 확인 사항으로 본 시스템에서 안내드릴 수 없습니다. 확인 전 수령분에 대한 정산이 발생할 수 있으므로 사전 확인을 권장드립니다.</w:t>
             </w:r>
           </w:p>
         </w:tc>
@@ -2792,7 +2826,7 @@
         </w:trPr>
         <w:tc>
           <w:tcPr>
-            <w:tcW w:type="dxa" w:w="1200"/>
+            <w:tcW w:type="dxa" w:w="1500"/>
             <w:tcMar>
               <w:top w:type="dxa" w:w="36"/>
               <w:left w:type="dxa" w:w="80"/>
@@ -2812,13 +2846,13 @@
                 <w:sz w:val="17"/>
                 <w:szCs w:val="17"/>
               </w:rPr>
-              <w:t xml:space="preserve">근거 미확인</w:t>
+              <w:t xml:space="preserve">주택수당 문의</w:t>
             </w:r>
           </w:p>
         </w:tc>
         <w:tc>
           <w:tcPr>
-            <w:tcW w:type="dxa" w:w="8546"/>
+            <w:tcW w:type="dxa" w:w="8246"/>
             <w:tcMar>
               <w:top w:type="dxa" w:w="36"/>
               <w:left w:type="dxa" w:w="80"/>
@@ -2846,7 +2880,7 @@
                 <w:sz w:val="17"/>
                 <w:szCs w:val="17"/>
               </w:rPr>
-              <w:t xml:space="preserve"> 현지 차량 리스 비용도 지원되나요?</w:t>
+              <w:t xml:space="preserve"> 주택수당 한도가 얼마인가요?</w:t>
             </w:r>
           </w:p>
           <w:p>
@@ -2869,72 +2903,131 @@
                 <w:sz w:val="17"/>
                 <w:szCs w:val="17"/>
               </w:rPr>
-              <w:t xml:space="preserve"> 현재 등록된 규정과 안내 자료에서 차량 리스 비용 지원에 대한 근거를 찾지 못했습니다. 추정하여 답변드리지 않겠습니다.</w:t>
-            </w:r>
-          </w:p>
-          <w:p>
-            <w:pPr>
-              <w:spacing w:after="0" w:line="224"/>
-            </w:pPr>
-            <w:r>
-              <w:rPr>
-                <w:rFonts w:ascii="맑은 고딕" w:cs="맑은 고딕" w:eastAsia="맑은 고딕" w:hAnsi="맑은 고딕"/>
-                <w:sz w:val="17"/>
-                <w:szCs w:val="17"/>
-              </w:rPr>
-              <w:t xml:space="preserve">검색 대상은 다음과 같았습니다.</w:t>
-            </w:r>
-          </w:p>
-          <w:p>
-            <w:pPr>
-              <w:spacing w:after="0" w:line="224"/>
-            </w:pPr>
-            <w:r>
-              <w:rPr>
-                <w:rFonts w:ascii="맑은 고딕" w:cs="맑은 고딕" w:eastAsia="맑은 고딕" w:hAnsi="맑은 고딕"/>
-                <w:sz w:val="17"/>
-                <w:szCs w:val="17"/>
-              </w:rPr>
-              <w:t xml:space="preserve">　· 「국외근무직원 보수·복지에 관한 규정」</w:t>
-            </w:r>
-          </w:p>
-          <w:p>
-            <w:pPr>
-              <w:spacing w:after="0" w:line="224"/>
-            </w:pPr>
-            <w:r>
-              <w:rPr>
-                <w:rFonts w:ascii="맑은 고딕" w:cs="맑은 고딕" w:eastAsia="맑은 고딕" w:hAnsi="맑은 고딕"/>
-                <w:sz w:val="17"/>
-                <w:szCs w:val="17"/>
-              </w:rPr>
-              <w:t xml:space="preserve">　· 「복지·여비규정」 및 운영지침</w:t>
-            </w:r>
-          </w:p>
-          <w:p>
-            <w:pPr>
-              <w:spacing w:after="0" w:line="224"/>
-            </w:pPr>
-            <w:r>
-              <w:rPr>
-                <w:rFonts w:ascii="맑은 고딕" w:cs="맑은 고딕" w:eastAsia="맑은 고딕" w:hAnsi="맑은 고딕"/>
-                <w:sz w:val="17"/>
-                <w:szCs w:val="17"/>
-              </w:rPr>
-              <w:t xml:space="preserve">　· 국가별 부임 안내서 (인도네시아·캄보디아·홍콩·런던)</w:t>
-            </w:r>
-          </w:p>
-          <w:p>
-            <w:pPr>
-              <w:spacing w:after="0" w:line="224"/>
-            </w:pPr>
-            <w:r>
-              <w:rPr>
-                <w:rFonts w:ascii="맑은 고딕" w:cs="맑은 고딕" w:eastAsia="맑은 고딕" w:hAnsi="맑은 고딕"/>
-                <w:sz w:val="17"/>
-                <w:szCs w:val="17"/>
-              </w:rPr>
-              <w:t xml:space="preserve">근거가 존재하나 미등록 상태일 수 있으므로, 소관부서 확인 후 자료 등록을 권장드립니다.</w:t>
+              <w:t xml:space="preserve"> 주택수당 한도는 근무 국가와 법인격에 따라 기준이 다릅니다. 아래 정보를 알려주시면 해당 기준을 안내드리겠습니다.</w:t>
+            </w:r>
+          </w:p>
+          <w:p>
+            <w:pPr>
+              <w:spacing w:after="0" w:line="224"/>
+            </w:pPr>
+            <w:r>
+              <w:rPr>
+                <w:rFonts w:ascii="맑은 고딕" w:cs="맑은 고딕" w:eastAsia="맑은 고딕" w:hAnsi="맑은 고딕"/>
+                <w:sz w:val="17"/>
+                <w:szCs w:val="17"/>
+              </w:rPr>
+              <w:t xml:space="preserve">　· 근무 국가</w:t>
+            </w:r>
+          </w:p>
+          <w:p>
+            <w:pPr>
+              <w:spacing w:after="0" w:line="224"/>
+            </w:pPr>
+            <w:r>
+              <w:rPr>
+                <w:rFonts w:ascii="맑은 고딕" w:cs="맑은 고딕" w:eastAsia="맑은 고딕" w:hAnsi="맑은 고딕"/>
+                <w:sz w:val="17"/>
+                <w:szCs w:val="17"/>
+              </w:rPr>
+              <w:t xml:space="preserve">　· 법인격 구분 (자회사 / 국외점포)</w:t>
+            </w:r>
+          </w:p>
+          <w:p>
+            <w:pPr>
+              <w:spacing w:after="0" w:line="224"/>
+            </w:pPr>
+            <w:r>
+              <w:rPr>
+                <w:rFonts w:ascii="맑은 고딕" w:cs="맑은 고딕" w:eastAsia="맑은 고딕" w:hAnsi="맑은 고딕"/>
+                <w:b/>
+                <w:bCs/>
+                <w:sz w:val="17"/>
+                <w:szCs w:val="17"/>
+              </w:rPr>
+              <w:t xml:space="preserve">(담당자)</w:t>
+            </w:r>
+            <w:r>
+              <w:rPr>
+                <w:rFonts w:ascii="맑은 고딕" w:cs="맑은 고딕" w:eastAsia="맑은 고딕" w:hAnsi="맑은 고딕"/>
+                <w:sz w:val="17"/>
+                <w:szCs w:val="17"/>
+              </w:rPr>
+              <w:t xml:space="preserve"> 인도네시아 자회사요.</w:t>
+            </w:r>
+          </w:p>
+          <w:p>
+            <w:pPr>
+              <w:spacing w:after="0" w:line="224"/>
+            </w:pPr>
+            <w:r>
+              <w:rPr>
+                <w:rFonts w:ascii="맑은 고딕" w:cs="맑은 고딕" w:eastAsia="맑은 고딕" w:hAnsi="맑은 고딕"/>
+                <w:b/>
+                <w:bCs/>
+                <w:sz w:val="17"/>
+                <w:szCs w:val="17"/>
+              </w:rPr>
+              <w:t xml:space="preserve">(AI)</w:t>
+            </w:r>
+            <w:r>
+              <w:rPr>
+                <w:rFonts w:ascii="맑은 고딕" w:cs="맑은 고딕" w:eastAsia="맑은 고딕" w:hAnsi="맑은 고딕"/>
+                <w:sz w:val="17"/>
+                <w:szCs w:val="17"/>
+              </w:rPr>
+              <w:t xml:space="preserve"> 인도네시아 자회사 기준으로 안내드립니다. 「국외근무직원 보수·복지에 관한 규정」 제○조에 따라 주택수당 한도는 직급별로 다음과 같습니다.</w:t>
+            </w:r>
+          </w:p>
+          <w:p>
+            <w:pPr>
+              <w:spacing w:after="0" w:line="224"/>
+            </w:pPr>
+            <w:r>
+              <w:rPr>
+                <w:rFonts w:ascii="맑은 고딕" w:cs="맑은 고딕" w:eastAsia="맑은 고딕" w:hAnsi="맑은 고딕"/>
+                <w:sz w:val="17"/>
+                <w:szCs w:val="17"/>
+              </w:rPr>
+              <w:t xml:space="preserve">　· ○급 이상 — 월 ○○</w:t>
+            </w:r>
+          </w:p>
+          <w:p>
+            <w:pPr>
+              <w:spacing w:after="0" w:line="224"/>
+            </w:pPr>
+            <w:r>
+              <w:rPr>
+                <w:rFonts w:ascii="맑은 고딕" w:cs="맑은 고딕" w:eastAsia="맑은 고딕" w:hAnsi="맑은 고딕"/>
+                <w:sz w:val="17"/>
+                <w:szCs w:val="17"/>
+              </w:rPr>
+              <w:t xml:space="preserve">　· ○급 이하 — 월 ○○</w:t>
+            </w:r>
+          </w:p>
+          <w:p>
+            <w:pPr>
+              <w:spacing w:after="0" w:line="224"/>
+            </w:pPr>
+            <w:r>
+              <w:rPr>
+                <w:rFonts w:ascii="맑은 고딕" w:cs="맑은 고딕" w:eastAsia="맑은 고딕" w:hAnsi="맑은 고딕"/>
+                <w:sz w:val="17"/>
+                <w:szCs w:val="17"/>
+              </w:rPr>
+              <w:t xml:space="preserve">실제 임차료가 한도를 초과하는 경우의 처리는 별도 확인이 필요한 사항입니다.</w:t>
+            </w:r>
+          </w:p>
+          <w:p>
+            <w:pPr>
+              <w:spacing w:after="0" w:line="224"/>
+            </w:pPr>
+            <w:r>
+              <w:rPr>
+                <w:rFonts w:ascii="맑은 고딕" w:cs="맑은 고딕" w:eastAsia="맑은 고딕" w:hAnsi="맑은 고딕"/>
+                <w:sz w:val="17"/>
+                <w:szCs w:val="17"/>
+              </w:rPr>
+              <w:t xml:space="preserve">　· 근거: 제○조 (시행일 2026.○.○) · 소관: HR·직원만족부</w:t>
             </w:r>
           </w:p>
         </w:tc>
@@ -2945,7 +3038,7 @@
         </w:trPr>
         <w:tc>
           <w:tcPr>
-            <w:tcW w:type="dxa" w:w="1200"/>
+            <w:tcW w:type="dxa" w:w="1500"/>
             <w:tcMar>
               <w:top w:type="dxa" w:w="36"/>
               <w:left w:type="dxa" w:w="80"/>
@@ -2965,13 +3058,13 @@
                 <w:sz w:val="17"/>
                 <w:szCs w:val="17"/>
               </w:rPr>
-              <w:t xml:space="preserve">사례 조회</w:t>
+              <w:t xml:space="preserve">복리후생 지원범위 문의</w:t>
             </w:r>
           </w:p>
         </w:tc>
         <w:tc>
           <w:tcPr>
-            <w:tcW w:type="dxa" w:w="8546"/>
+            <w:tcW w:type="dxa" w:w="8246"/>
             <w:tcMar>
               <w:top w:type="dxa" w:w="36"/>
               <w:left w:type="dxa" w:w="80"/>
@@ -2991,15 +3084,15 @@
                 <w:sz w:val="17"/>
                 <w:szCs w:val="17"/>
               </w:rPr>
-              <w:t xml:space="preserve">(후임 담당자)</w:t>
-            </w:r>
-            <w:r>
-              <w:rPr>
-                <w:rFonts w:ascii="맑은 고딕" w:cs="맑은 고딕" w:eastAsia="맑은 고딕" w:hAnsi="맑은 고딕"/>
-                <w:sz w:val="17"/>
-                <w:szCs w:val="17"/>
-              </w:rPr>
-              <w:t xml:space="preserve"> 작년 캄보디아 학자금 지원 처리 사례를 보여주세요.</w:t>
+              <w:t xml:space="preserve">(담당자)</w:t>
+            </w:r>
+            <w:r>
+              <w:rPr>
+                <w:rFonts w:ascii="맑은 고딕" w:cs="맑은 고딕" w:eastAsia="맑은 고딕" w:hAnsi="맑은 고딕"/>
+                <w:sz w:val="17"/>
+                <w:szCs w:val="17"/>
+              </w:rPr>
+              <w:t xml:space="preserve"> 현지 차량 리스 비용도 지원되나요?</w:t>
             </w:r>
           </w:p>
           <w:p>
@@ -3022,111 +3115,72 @@
                 <w:sz w:val="17"/>
                 <w:szCs w:val="17"/>
               </w:rPr>
-              <w:t xml:space="preserve"> 2025년 캄보디아 학자금 관련 확정 건은 ○건입니다.</w:t>
-            </w:r>
-          </w:p>
-          <w:p>
-            <w:pPr>
-              <w:spacing w:after="0" w:line="224"/>
-            </w:pPr>
-            <w:r>
-              <w:rPr>
-                <w:rFonts w:ascii="맑은 고딕" w:cs="맑은 고딕" w:eastAsia="맑은 고딕" w:hAnsi="맑은 고딕"/>
-                <w:sz w:val="17"/>
-                <w:szCs w:val="17"/>
-              </w:rPr>
-              <w:t xml:space="preserve">　① 2025.○.○ — 국제학교 학비 초과분 처리</w:t>
-            </w:r>
-          </w:p>
-          <w:p>
-            <w:pPr>
-              <w:spacing w:after="0" w:line="224"/>
-            </w:pPr>
-            <w:r>
-              <w:rPr>
-                <w:rFonts w:ascii="맑은 고딕" w:cs="맑은 고딕" w:eastAsia="맑은 고딕" w:hAnsi="맑은 고딕"/>
-                <w:sz w:val="17"/>
-                <w:szCs w:val="17"/>
-              </w:rPr>
-              <w:t xml:space="preserve">　　· 적용 조항: 「보수·복지에 관한 규정」 제○조</w:t>
-            </w:r>
-          </w:p>
-          <w:p>
-            <w:pPr>
-              <w:spacing w:after="0" w:line="224"/>
-            </w:pPr>
-            <w:r>
-              <w:rPr>
-                <w:rFonts w:ascii="맑은 고딕" w:cs="맑은 고딕" w:eastAsia="맑은 고딕" w:hAnsi="맑은 고딕"/>
-                <w:sz w:val="17"/>
-                <w:szCs w:val="17"/>
-              </w:rPr>
-              <w:t xml:space="preserve">　　· 답변 요지: 한도 내 실비 지원, 초과분 본인 부담</w:t>
-            </w:r>
-          </w:p>
-          <w:p>
-            <w:pPr>
-              <w:spacing w:after="0" w:line="224"/>
-            </w:pPr>
-            <w:r>
-              <w:rPr>
-                <w:rFonts w:ascii="맑은 고딕" w:cs="맑은 고딕" w:eastAsia="맑은 고딕" w:hAnsi="맑은 고딕"/>
-                <w:sz w:val="17"/>
-                <w:szCs w:val="17"/>
-              </w:rPr>
-              <w:t xml:space="preserve">　② 2025.○.○ — 학기 중 전학에 따른 정산</w:t>
-            </w:r>
-          </w:p>
-          <w:p>
-            <w:pPr>
-              <w:spacing w:after="0" w:line="224"/>
-            </w:pPr>
-            <w:r>
-              <w:rPr>
-                <w:rFonts w:ascii="맑은 고딕" w:cs="맑은 고딕" w:eastAsia="맑은 고딕" w:hAnsi="맑은 고딕"/>
-                <w:sz w:val="17"/>
-                <w:szCs w:val="17"/>
-              </w:rPr>
-              <w:t xml:space="preserve">　　· 적용 조항: 같은 규정 제○조</w:t>
-            </w:r>
-          </w:p>
-          <w:p>
-            <w:pPr>
-              <w:spacing w:after="0" w:line="224"/>
-            </w:pPr>
-            <w:r>
-              <w:rPr>
-                <w:rFonts w:ascii="맑은 고딕" w:cs="맑은 고딕" w:eastAsia="맑은 고딕" w:hAnsi="맑은 고딕"/>
-                <w:sz w:val="17"/>
-                <w:szCs w:val="17"/>
-              </w:rPr>
-              <w:t xml:space="preserve">　　· 답변 요지: 일할 계산 적용, 증빙 제출 필요</w:t>
-            </w:r>
-          </w:p>
-          <w:p>
-            <w:pPr>
-              <w:spacing w:after="0" w:line="224"/>
-            </w:pPr>
-            <w:r>
-              <w:rPr>
-                <w:rFonts w:ascii="맑은 고딕" w:cs="맑은 고딕" w:eastAsia="맑은 고딕" w:hAnsi="맑은 고딕"/>
-                <w:sz w:val="17"/>
-                <w:szCs w:val="17"/>
-              </w:rPr>
-              <w:t xml:space="preserve">　　· 비고: 예외 처리 건 (소관부서 협의 후 확정)</w:t>
-            </w:r>
-          </w:p>
-          <w:p>
-            <w:pPr>
-              <w:spacing w:after="0" w:line="224"/>
-            </w:pPr>
-            <w:r>
-              <w:rPr>
-                <w:rFonts w:ascii="맑은 고딕" w:cs="맑은 고딕" w:eastAsia="맑은 고딕" w:hAnsi="맑은 고딕"/>
-                <w:sz w:val="17"/>
-                <w:szCs w:val="17"/>
-              </w:rPr>
-              <w:t xml:space="preserve">각 건의 원 질의와 확정일은 상세 보기에서 확인하실 수 있습니다.</w:t>
+              <w:t xml:space="preserve"> 현재 등록된 규정과 안내 자료에서 차량 리스 비용 지원에 대한 근거를 찾지 못했습니다. 추정하여 답변드리지 않겠습니다.</w:t>
+            </w:r>
+          </w:p>
+          <w:p>
+            <w:pPr>
+              <w:spacing w:after="0" w:line="224"/>
+            </w:pPr>
+            <w:r>
+              <w:rPr>
+                <w:rFonts w:ascii="맑은 고딕" w:cs="맑은 고딕" w:eastAsia="맑은 고딕" w:hAnsi="맑은 고딕"/>
+                <w:sz w:val="17"/>
+                <w:szCs w:val="17"/>
+              </w:rPr>
+              <w:t xml:space="preserve">검색 대상은 다음과 같습니다.</w:t>
+            </w:r>
+          </w:p>
+          <w:p>
+            <w:pPr>
+              <w:spacing w:after="0" w:line="224"/>
+            </w:pPr>
+            <w:r>
+              <w:rPr>
+                <w:rFonts w:ascii="맑은 고딕" w:cs="맑은 고딕" w:eastAsia="맑은 고딕" w:hAnsi="맑은 고딕"/>
+                <w:sz w:val="17"/>
+                <w:szCs w:val="17"/>
+              </w:rPr>
+              <w:t xml:space="preserve">　· 「국외근무직원 보수·복지에 관한 규정」</w:t>
+            </w:r>
+          </w:p>
+          <w:p>
+            <w:pPr>
+              <w:spacing w:after="0" w:line="224"/>
+            </w:pPr>
+            <w:r>
+              <w:rPr>
+                <w:rFonts w:ascii="맑은 고딕" w:cs="맑은 고딕" w:eastAsia="맑은 고딕" w:hAnsi="맑은 고딕"/>
+                <w:sz w:val="17"/>
+                <w:szCs w:val="17"/>
+              </w:rPr>
+              <w:t xml:space="preserve">　· 「복지·여비규정」 및 운영지침</w:t>
+            </w:r>
+          </w:p>
+          <w:p>
+            <w:pPr>
+              <w:spacing w:after="0" w:line="224"/>
+            </w:pPr>
+            <w:r>
+              <w:rPr>
+                <w:rFonts w:ascii="맑은 고딕" w:cs="맑은 고딕" w:eastAsia="맑은 고딕" w:hAnsi="맑은 고딕"/>
+                <w:sz w:val="17"/>
+                <w:szCs w:val="17"/>
+              </w:rPr>
+              <w:t xml:space="preserve">　· 국가별 부임 안내서 (인도네시아·캄보디아·홍콩·런던)</w:t>
+            </w:r>
+          </w:p>
+          <w:p>
+            <w:pPr>
+              <w:spacing w:after="0" w:line="224"/>
+            </w:pPr>
+            <w:r>
+              <w:rPr>
+                <w:rFonts w:ascii="맑은 고딕" w:cs="맑은 고딕" w:eastAsia="맑은 고딕" w:hAnsi="맑은 고딕"/>
+                <w:sz w:val="17"/>
+                <w:szCs w:val="17"/>
+              </w:rPr>
+              <w:t xml:space="preserve">근거가 존재하나 미등록 상태일 수 있으므로, 소관부서 확인 후 자료 등록을 권장드립니다.</w:t>
             </w:r>
           </w:p>
         </w:tc>
@@ -3137,7 +3191,7 @@
         </w:trPr>
         <w:tc>
           <w:tcPr>
-            <w:tcW w:type="dxa" w:w="1200"/>
+            <w:tcW w:type="dxa" w:w="1500"/>
             <w:tcMar>
               <w:top w:type="dxa" w:w="36"/>
               <w:left w:type="dxa" w:w="80"/>
@@ -3157,13 +3211,13 @@
                 <w:sz w:val="17"/>
                 <w:szCs w:val="17"/>
               </w:rPr>
-              <w:t xml:space="preserve">부임 준비 확인</w:t>
+              <w:t xml:space="preserve">과거 처리사례 조회</w:t>
             </w:r>
           </w:p>
         </w:tc>
         <w:tc>
           <w:tcPr>
-            <w:tcW w:type="dxa" w:w="8546"/>
+            <w:tcW w:type="dxa" w:w="8246"/>
             <w:tcMar>
               <w:top w:type="dxa" w:w="36"/>
               <w:left w:type="dxa" w:w="80"/>
@@ -3183,6 +3237,198 @@
                 <w:sz w:val="17"/>
                 <w:szCs w:val="17"/>
               </w:rPr>
+              <w:t xml:space="preserve">(후임 담당자)</w:t>
+            </w:r>
+            <w:r>
+              <w:rPr>
+                <w:rFonts w:ascii="맑은 고딕" w:cs="맑은 고딕" w:eastAsia="맑은 고딕" w:hAnsi="맑은 고딕"/>
+                <w:sz w:val="17"/>
+                <w:szCs w:val="17"/>
+              </w:rPr>
+              <w:t xml:space="preserve"> 작년 캄보디아 학자금 지원 처리 사례를 보여주세요.</w:t>
+            </w:r>
+          </w:p>
+          <w:p>
+            <w:pPr>
+              <w:spacing w:after="0" w:line="224"/>
+            </w:pPr>
+            <w:r>
+              <w:rPr>
+                <w:rFonts w:ascii="맑은 고딕" w:cs="맑은 고딕" w:eastAsia="맑은 고딕" w:hAnsi="맑은 고딕"/>
+                <w:b/>
+                <w:bCs/>
+                <w:sz w:val="17"/>
+                <w:szCs w:val="17"/>
+              </w:rPr>
+              <w:t xml:space="preserve">(AI)</w:t>
+            </w:r>
+            <w:r>
+              <w:rPr>
+                <w:rFonts w:ascii="맑은 고딕" w:cs="맑은 고딕" w:eastAsia="맑은 고딕" w:hAnsi="맑은 고딕"/>
+                <w:sz w:val="17"/>
+                <w:szCs w:val="17"/>
+              </w:rPr>
+              <w:t xml:space="preserve"> 2025년 캄보디아 학자금 관련 확정 건은 ○건입니다.</w:t>
+            </w:r>
+          </w:p>
+          <w:p>
+            <w:pPr>
+              <w:spacing w:after="0" w:line="224"/>
+            </w:pPr>
+            <w:r>
+              <w:rPr>
+                <w:rFonts w:ascii="맑은 고딕" w:cs="맑은 고딕" w:eastAsia="맑은 고딕" w:hAnsi="맑은 고딕"/>
+                <w:sz w:val="17"/>
+                <w:szCs w:val="17"/>
+              </w:rPr>
+              <w:t xml:space="preserve">　① 2025.○.○ — 국제학교 학비 초과분 처리</w:t>
+            </w:r>
+          </w:p>
+          <w:p>
+            <w:pPr>
+              <w:spacing w:after="0" w:line="224"/>
+            </w:pPr>
+            <w:r>
+              <w:rPr>
+                <w:rFonts w:ascii="맑은 고딕" w:cs="맑은 고딕" w:eastAsia="맑은 고딕" w:hAnsi="맑은 고딕"/>
+                <w:sz w:val="17"/>
+                <w:szCs w:val="17"/>
+              </w:rPr>
+              <w:t xml:space="preserve">　　· 적용 조항: 「보수·복지에 관한 규정」 제○조</w:t>
+            </w:r>
+          </w:p>
+          <w:p>
+            <w:pPr>
+              <w:spacing w:after="0" w:line="224"/>
+            </w:pPr>
+            <w:r>
+              <w:rPr>
+                <w:rFonts w:ascii="맑은 고딕" w:cs="맑은 고딕" w:eastAsia="맑은 고딕" w:hAnsi="맑은 고딕"/>
+                <w:sz w:val="17"/>
+                <w:szCs w:val="17"/>
+              </w:rPr>
+              <w:t xml:space="preserve">　　· 답변 요지: 한도 내 실비 지원, 초과분 본인 부담</w:t>
+            </w:r>
+          </w:p>
+          <w:p>
+            <w:pPr>
+              <w:spacing w:after="0" w:line="224"/>
+            </w:pPr>
+            <w:r>
+              <w:rPr>
+                <w:rFonts w:ascii="맑은 고딕" w:cs="맑은 고딕" w:eastAsia="맑은 고딕" w:hAnsi="맑은 고딕"/>
+                <w:sz w:val="17"/>
+                <w:szCs w:val="17"/>
+              </w:rPr>
+              <w:t xml:space="preserve">　② 2025.○.○ — 학기 중 전학에 따른 정산</w:t>
+            </w:r>
+          </w:p>
+          <w:p>
+            <w:pPr>
+              <w:spacing w:after="0" w:line="224"/>
+            </w:pPr>
+            <w:r>
+              <w:rPr>
+                <w:rFonts w:ascii="맑은 고딕" w:cs="맑은 고딕" w:eastAsia="맑은 고딕" w:hAnsi="맑은 고딕"/>
+                <w:sz w:val="17"/>
+                <w:szCs w:val="17"/>
+              </w:rPr>
+              <w:t xml:space="preserve">　　· 적용 조항: 같은 규정 제○조</w:t>
+            </w:r>
+          </w:p>
+          <w:p>
+            <w:pPr>
+              <w:spacing w:after="0" w:line="224"/>
+            </w:pPr>
+            <w:r>
+              <w:rPr>
+                <w:rFonts w:ascii="맑은 고딕" w:cs="맑은 고딕" w:eastAsia="맑은 고딕" w:hAnsi="맑은 고딕"/>
+                <w:sz w:val="17"/>
+                <w:szCs w:val="17"/>
+              </w:rPr>
+              <w:t xml:space="preserve">　　· 답변 요지: 일할 계산 적용, 증빙 제출 필요</w:t>
+            </w:r>
+          </w:p>
+          <w:p>
+            <w:pPr>
+              <w:spacing w:after="0" w:line="224"/>
+            </w:pPr>
+            <w:r>
+              <w:rPr>
+                <w:rFonts w:ascii="맑은 고딕" w:cs="맑은 고딕" w:eastAsia="맑은 고딕" w:hAnsi="맑은 고딕"/>
+                <w:sz w:val="17"/>
+                <w:szCs w:val="17"/>
+              </w:rPr>
+              <w:t xml:space="preserve">　　· 비고: 예외 처리 건 (소관부서 협의 후 확정)</w:t>
+            </w:r>
+          </w:p>
+          <w:p>
+            <w:pPr>
+              <w:spacing w:after="0" w:line="224"/>
+            </w:pPr>
+            <w:r>
+              <w:rPr>
+                <w:rFonts w:ascii="맑은 고딕" w:cs="맑은 고딕" w:eastAsia="맑은 고딕" w:hAnsi="맑은 고딕"/>
+                <w:sz w:val="17"/>
+                <w:szCs w:val="17"/>
+              </w:rPr>
+              <w:t xml:space="preserve">각 건의 원 질의와 확정일은 상세 보기에서 확인하실 수 있습니다.</w:t>
+            </w:r>
+          </w:p>
+        </w:tc>
+      </w:tr>
+      <w:tr>
+        <w:trPr>
+          <w:tblHeader w:val="false"/>
+        </w:trPr>
+        <w:tc>
+          <w:tcPr>
+            <w:tcW w:type="dxa" w:w="1500"/>
+            <w:tcMar>
+              <w:top w:type="dxa" w:w="36"/>
+              <w:left w:type="dxa" w:w="80"/>
+              <w:bottom w:type="dxa" w:w="36"/>
+              <w:right w:type="dxa" w:w="80"/>
+            </w:tcMar>
+          </w:tcPr>
+          <w:p>
+            <w:pPr>
+              <w:spacing w:after="0" w:line="224"/>
+            </w:pPr>
+            <w:r>
+              <w:rPr>
+                <w:rFonts w:ascii="맑은 고딕" w:cs="맑은 고딕" w:eastAsia="맑은 고딕" w:hAnsi="맑은 고딕"/>
+                <w:b/>
+                <w:bCs/>
+                <w:sz w:val="17"/>
+                <w:szCs w:val="17"/>
+              </w:rPr>
+              <w:t xml:space="preserve">부임 준비현황 조회</w:t>
+            </w:r>
+          </w:p>
+        </w:tc>
+        <w:tc>
+          <w:tcPr>
+            <w:tcW w:type="dxa" w:w="8246"/>
+            <w:tcMar>
+              <w:top w:type="dxa" w:w="36"/>
+              <w:left w:type="dxa" w:w="80"/>
+              <w:bottom w:type="dxa" w:w="36"/>
+              <w:right w:type="dxa" w:w="80"/>
+            </w:tcMar>
+          </w:tcPr>
+          <w:p>
+            <w:pPr>
+              <w:spacing w:after="0" w:line="224"/>
+            </w:pPr>
+            <w:r>
+              <w:rPr>
+                <w:rFonts w:ascii="맑은 고딕" w:cs="맑은 고딕" w:eastAsia="맑은 고딕" w:hAnsi="맑은 고딕"/>
+                <w:b/>
+                <w:bCs/>
+                <w:sz w:val="17"/>
+                <w:szCs w:val="17"/>
+              </w:rPr>
               <w:t xml:space="preserve">(예비발령자)</w:t>
             </w:r>
             <w:r>
@@ -3442,7 +3688,7 @@
           <w:sz w:val="22"/>
           <w:szCs w:val="22"/>
         </w:rPr>
-        <w:t xml:space="preserve">필수 (1차 버전)</w:t>
+        <w:t xml:space="preserve">필수 (1단계)</w:t>
       </w:r>
     </w:p>
     <w:p>
@@ -3795,7 +4041,7 @@
           <w:sz w:val="22"/>
           <w:szCs w:val="22"/>
         </w:rPr>
-        <w:t xml:space="preserve">권장 (2차 버전)</w:t>
+        <w:t xml:space="preserve">권장 (2단계)</w:t>
       </w:r>
     </w:p>
     <w:p>
@@ -4175,7 +4421,7 @@
           <w:sz w:val="20"/>
           <w:szCs w:val="20"/>
         </w:rPr>
-        <w:t xml:space="preserve"> — 1차 버전은 지정 담당자 한정, 2차 버전에서 대상 확대</w:t>
+        <w:t xml:space="preserve"> — 1단계은 지정 담당자 한정, 2단계에서 대상 확대</w:t>
       </w:r>
     </w:p>
     <w:p>
@@ -5296,15 +5542,15 @@
           <w:sz w:val="20"/>
           <w:szCs w:val="20"/>
         </w:rPr>
-        <w:t xml:space="preserve">담당자 주간 사용일</w:t>
-      </w:r>
-      <w:r>
-        <w:rPr>
-          <w:rFonts w:ascii="맑은 고딕" w:cs="맑은 고딕" w:eastAsia="맑은 고딕" w:hAnsi="맑은 고딕"/>
-          <w:sz w:val="20"/>
-          <w:szCs w:val="20"/>
-        </w:rPr>
-        <w:t xml:space="preserve"> — 주 3일 이상</w:t>
+        <w:t xml:space="preserve">담당자 주간 사용률</w:t>
+      </w:r>
+      <w:r>
+        <w:rPr>
+          <w:rFonts w:ascii="맑은 고딕" w:cs="맑은 고딕" w:eastAsia="맑은 고딕" w:hAnsi="맑은 고딕"/>
+          <w:sz w:val="20"/>
+          <w:szCs w:val="20"/>
+        </w:rPr>
+        <w:t xml:space="preserve"> — 주 3일 이상 (1단계 목표 지표)</w:t>
       </w:r>
     </w:p>
     <w:p>
@@ -5332,7 +5578,7 @@
           <w:sz w:val="20"/>
           <w:szCs w:val="20"/>
         </w:rPr>
-        <w:t xml:space="preserve"> — 2차 버전 기준 30% 이상</w:t>
+        <w:t xml:space="preserve"> — 2단계 기준 30% 이상</w:t>
       </w:r>
     </w:p>
     <w:p>
@@ -5397,7 +5643,7 @@
           <w:sz w:val="22"/>
           <w:szCs w:val="22"/>
         </w:rPr>
-        <w:t xml:space="preserve">1차 버전 범위</w:t>
+        <w:t xml:space="preserve">1단계 범위</w:t>
       </w:r>
     </w:p>
     <w:p>
@@ -5410,7 +5656,7 @@
           <w:sz w:val="20"/>
           <w:szCs w:val="20"/>
         </w:rPr>
-        <w:t xml:space="preserve">대상은 글로벌사업그룹 HR 담당자이며, 범위는 보수·복지 및 인사 규정 질의응답과 사례 축적. 규정의 자동 수집으로 별도 자료 준비가 불요하여 선행하고, 부임 안내는 국가별 자료 정비 선행이 필요하여 2차 버전으로 배치. 1차 운영 기간 중 안내서 정비 병행.</w:t>
+        <w:t xml:space="preserve">대상은 글로벌사업그룹 HR 담당자이며, 범위는 보수·복지 및 인사 규정 질의응답과 사례 축적. 규정의 자동 수집으로 별도 자료 준비가 불요하여 선행하고, 부임 안내는 국가별 자료 정비 선행이 필요하여 2단계으로 배치. 1차 운영 기간 중 안내서 정비 병행.</w:t>
       </w:r>
     </w:p>
     <w:p>
@@ -5534,7 +5780,7 @@
           <w:sz w:val="22"/>
           <w:szCs w:val="22"/>
         </w:rPr>
-        <w:t xml:space="preserve">1차 버전 출시 조건</w:t>
+        <w:t xml:space="preserve">1단계 출시 조건</w:t>
       </w:r>
     </w:p>
     <w:p>
@@ -5641,7 +5887,7 @@
           <w:sz w:val="22"/>
           <w:szCs w:val="22"/>
         </w:rPr>
-        <w:t xml:space="preserve">2차 버전 전환 조건</w:t>
+        <w:t xml:space="preserve">2단계 전환 조건</w:t>
       </w:r>
     </w:p>
     <w:p>
@@ -5936,7 +6182,7 @@
           <w:sz w:val="20"/>
           <w:szCs w:val="20"/>
         </w:rPr>
-        <w:t xml:space="preserve"> — 1차 버전의 담당자 전용 운영을 통한 품질 검증 후 공개, 내부 시스템 접속을 통한 접근 부담 최소화</w:t>
+        <w:t xml:space="preserve"> — 1단계의 담당자 전용 운영을 통한 품질 검증 후 공개, 내부 시스템 접속을 통한 접근 부담 최소화</w:t>
       </w:r>
     </w:p>
     <w:p>
@@ -6263,7 +6509,7 @@
           <w:sz w:val="20"/>
           <w:szCs w:val="20"/>
         </w:rPr>
-        <w:t xml:space="preserve">국외근무직원 직접 공개 (1차 버전)</w:t>
+        <w:t xml:space="preserve">국외근무직원 직접 공개 (1단계)</w:t>
       </w:r>
       <w:r>
         <w:rPr>
@@ -6410,7 +6656,7 @@
           <w:sz w:val="20"/>
           <w:szCs w:val="20"/>
         </w:rPr>
-        <w:t xml:space="preserve"> — 글로벌성장지원부 및 글로벌추진부 소속 1~2명. 1차 버전 주 사용자이자 답변 확정 및 자료 정비 담당</w:t>
+        <w:t xml:space="preserve"> — 글로벌성장지원부 및 글로벌추진부 소속 1~2명. 1단계 주 사용자이자 답변 확정 및 자료 정비 담당</w:t>
       </w:r>
     </w:p>
     <w:p>
@@ -6644,7 +6890,7 @@
           <w:sz w:val="20"/>
           <w:szCs w:val="20"/>
         </w:rPr>
-        <w:t xml:space="preserve">1차 버전</w:t>
+        <w:t xml:space="preserve">1단계</w:t>
       </w:r>
       <w:r>
         <w:rPr>
@@ -6672,7 +6918,7 @@
           <w:sz w:val="20"/>
           <w:szCs w:val="20"/>
         </w:rPr>
-        <w:t xml:space="preserve">2차 버전</w:t>
+        <w:t xml:space="preserve">2단계</w:t>
       </w:r>
       <w:r>
         <w:rPr>
@@ -6721,7 +6967,7 @@
           <w:sz w:val="20"/>
           <w:szCs w:val="20"/>
         </w:rPr>
-        <w:t xml:space="preserve">주요 확인 시점은 사전 검증 통과 판정, 1차 버전 출시 조건 충족, 2차 버전 전환 조건 충족의 3개 지점. 일정상 최대 제약은 </w:t>
+        <w:t xml:space="preserve">주요 확인 시점은 사전 검증 통과 판정, 1단계 출시 조건 충족, 2단계 전환 조건 충족의 3개 지점. 일정상 최대 제약은 </w:t>
       </w:r>
       <w:r>
         <w:rPr>

</xml_diff>

<commit_message>
Define data governance for collection, loading, and management
데이터시스템부 협의 사항을 반영해 데이터 요구사항 항목을 재구성.

데이터 요구사항 (17항):
- 필요 데이터 / 데이터 수집 / 데이터 적재 / 데이터 관리(거버넌스)
  네 단계로 분리
- 수집: 자료별 수집 방식과 주기, 책임 주체, 필수 메타데이터 동반 조건
- 적재: 메타데이터 미충족 자료 반려, 개정 시 버전 이력 보존과 현행본
  한정 검색, 폐지 규정 처리, 원본 보존, 개인정보 적재 금지
- 관리: 데이터별 소유 주체 지정, 역할 기준 갱신 책임, 정비 시점
  정례화, 분기 1회 품질 점검, 단계별 접근 권한, 변경 이력 보존,
  폐기 및 보존 기준
- 데이터 체계를 데이터시스템부와 확정한 후 착수하는 조건 명시

현황 반영:
- 부임 안내서를 정비 필요에서 확보 완료로 수정하고, 연말 정기인사
  시즌을 정비 시점으로 명시
- 자료 관리 주체를 국가별 RM에서 본점 담당자로 정정

연계 반영:
- 개발 착수 조건 최상단에 데이터 거버넌스 확정 추가
- 위험 항목에 거버넌스 미확정 착수에 따른 재작업 우려 신설
- 이해관계자에 데이터시스템부 추가
- 사전 검증 단계 활동에 데이터시스템부 협의 추가
- 미해결 사항에 거버넌스 기준 확정 추가

기타: 단계 표기 일괄 변경 과정에서 발생한 조사 오류 수정

Co-Authored-By: Claude Opus 5 <noreply@anthropic.com>
Claude-Session: https://claude.ai/code/session_01Ekn86cpQq9yULpsy9iFqKx
</commit_message>
<xml_diff>
--- a/prds/국외근무직원-HR-에이전트-PRD.docx
+++ b/prds/국외근무직원-HR-에이전트-PRD.docx
@@ -75,7 +75,7 @@
           <w:sz w:val="20"/>
           <w:szCs w:val="20"/>
         </w:rPr>
-        <w:t xml:space="preserve">버전 / Version: v0.5 (초안)</w:t>
+        <w:t xml:space="preserve">버전 / Version: v0.6 (초안)</w:t>
       </w:r>
     </w:p>
     <w:p>
@@ -439,7 +439,7 @@
           <w:sz w:val="20"/>
           <w:szCs w:val="20"/>
         </w:rPr>
-        <w:t xml:space="preserve">1단계은 </w:t>
+        <w:t xml:space="preserve">1단계는 </w:t>
       </w:r>
       <w:r>
         <w:rPr>
@@ -4421,7 +4421,7 @@
           <w:sz w:val="20"/>
           <w:szCs w:val="20"/>
         </w:rPr>
-        <w:t xml:space="preserve"> — 1단계은 지정 담당자 한정, 2단계에서 대상 확대</w:t>
+        <w:t xml:space="preserve"> — 1단계는 지정 담당자 한정, 2단계에서 대상 확대</w:t>
       </w:r>
     </w:p>
     <w:p>
@@ -4638,468 +4638,6 @@
           <w:szCs w:val="25"/>
         </w:rPr>
         <w:t xml:space="preserve">17. 데이터 요구사항 / Data Requirements</w:t>
-      </w:r>
-    </w:p>
-    <w:p>
-      <w:pPr>
-        <w:pStyle w:val="Heading2"/>
-        <w:spacing w:after="70" w:before="180"/>
-      </w:pPr>
-      <w:r>
-        <w:rPr>
-          <w:rFonts w:ascii="맑은 고딕" w:cs="맑은 고딕" w:eastAsia="맑은 고딕" w:hAnsi="맑은 고딕"/>
-          <w:b/>
-          <w:bCs/>
-          <w:color w:val="1F4E79"/>
-          <w:sz w:val="22"/>
-          <w:szCs w:val="22"/>
-        </w:rPr>
-        <w:t xml:space="preserve">필요 데이터</w:t>
-      </w:r>
-    </w:p>
-    <w:p>
-      <w:pPr>
-        <w:pStyle w:val="ListParagraph"/>
-        <w:numPr>
-          <w:ilvl w:val="0"/>
-          <w:numId w:val="2"/>
-        </w:numPr>
-        <w:spacing w:after="30" w:line="264"/>
-      </w:pPr>
-      <w:r>
-        <w:rPr>
-          <w:rFonts w:ascii="맑은 고딕" w:cs="맑은 고딕" w:eastAsia="맑은 고딕" w:hAnsi="맑은 고딕"/>
-          <w:b/>
-          <w:bCs/>
-          <w:sz w:val="20"/>
-          <w:szCs w:val="20"/>
-        </w:rPr>
-        <w:t xml:space="preserve">국외근무 관련 규정·지침</w:t>
-      </w:r>
-      <w:r>
-        <w:rPr>
-          <w:rFonts w:ascii="맑은 고딕" w:cs="맑은 고딕" w:eastAsia="맑은 고딕" w:hAnsi="맑은 고딕"/>
-          <w:sz w:val="20"/>
-          <w:szCs w:val="20"/>
-        </w:rPr>
-        <w:t xml:space="preserve"> — 사내 규정 자동 수집 체계 연동, 소관은 HR·직원만족부. 확보 완료</w:t>
-      </w:r>
-    </w:p>
-    <w:p>
-      <w:pPr>
-        <w:pStyle w:val="ListParagraph"/>
-        <w:numPr>
-          <w:ilvl w:val="0"/>
-          <w:numId w:val="2"/>
-        </w:numPr>
-        <w:spacing w:after="30" w:line="264"/>
-      </w:pPr>
-      <w:r>
-        <w:rPr>
-          <w:rFonts w:ascii="맑은 고딕" w:cs="맑은 고딕" w:eastAsia="맑은 고딕" w:hAnsi="맑은 고딕"/>
-          <w:b/>
-          <w:bCs/>
-          <w:sz w:val="20"/>
-          <w:szCs w:val="20"/>
-        </w:rPr>
-        <w:t xml:space="preserve">부임 안내서 (자회사)</w:t>
-      </w:r>
-      <w:r>
-        <w:rPr>
-          <w:rFonts w:ascii="맑은 고딕" w:cs="맑은 고딕" w:eastAsia="맑은 고딕" w:hAnsi="맑은 고딕"/>
-          <w:sz w:val="20"/>
-          <w:szCs w:val="20"/>
-        </w:rPr>
-        <w:t xml:space="preserve"> — 글로벌성장지원부 및 국가별 RM 작성·관리. 정비 필요</w:t>
-      </w:r>
-    </w:p>
-    <w:p>
-      <w:pPr>
-        <w:pStyle w:val="ListParagraph"/>
-        <w:numPr>
-          <w:ilvl w:val="0"/>
-          <w:numId w:val="2"/>
-        </w:numPr>
-        <w:spacing w:after="30" w:line="264"/>
-      </w:pPr>
-      <w:r>
-        <w:rPr>
-          <w:rFonts w:ascii="맑은 고딕" w:cs="맑은 고딕" w:eastAsia="맑은 고딕" w:hAnsi="맑은 고딕"/>
-          <w:b/>
-          <w:bCs/>
-          <w:sz w:val="20"/>
-          <w:szCs w:val="20"/>
-        </w:rPr>
-        <w:t xml:space="preserve">부임 안내서 (국외점포)</w:t>
-      </w:r>
-      <w:r>
-        <w:rPr>
-          <w:rFonts w:ascii="맑은 고딕" w:cs="맑은 고딕" w:eastAsia="맑은 고딕" w:hAnsi="맑은 고딕"/>
-          <w:sz w:val="20"/>
-          <w:szCs w:val="20"/>
-        </w:rPr>
-        <w:t xml:space="preserve"> — 글로벌추진부 및 국가별 RM 작성·관리. 정비 필요</w:t>
-      </w:r>
-    </w:p>
-    <w:p>
-      <w:pPr>
-        <w:pStyle w:val="ListParagraph"/>
-        <w:numPr>
-          <w:ilvl w:val="0"/>
-          <w:numId w:val="2"/>
-        </w:numPr>
-        <w:spacing w:after="30" w:line="264"/>
-      </w:pPr>
-      <w:r>
-        <w:rPr>
-          <w:rFonts w:ascii="맑은 고딕" w:cs="맑은 고딕" w:eastAsia="맑은 고딕" w:hAnsi="맑은 고딕"/>
-          <w:b/>
-          <w:bCs/>
-          <w:sz w:val="20"/>
-          <w:szCs w:val="20"/>
-        </w:rPr>
-        <w:t xml:space="preserve">국가별 HR 사례</w:t>
-      </w:r>
-      <w:r>
-        <w:rPr>
-          <w:rFonts w:ascii="맑은 고딕" w:cs="맑은 고딕" w:eastAsia="맑은 고딕" w:hAnsi="맑은 고딕"/>
-          <w:sz w:val="20"/>
-          <w:szCs w:val="20"/>
-        </w:rPr>
-        <w:t xml:space="preserve"> — 양 부서 공동 정리. 정비 필요</w:t>
-      </w:r>
-    </w:p>
-    <w:p>
-      <w:pPr>
-        <w:pStyle w:val="ListParagraph"/>
-        <w:numPr>
-          <w:ilvl w:val="0"/>
-          <w:numId w:val="2"/>
-        </w:numPr>
-        <w:spacing w:after="30" w:line="264"/>
-      </w:pPr>
-      <w:r>
-        <w:rPr>
-          <w:rFonts w:ascii="맑은 고딕" w:cs="맑은 고딕" w:eastAsia="맑은 고딕" w:hAnsi="맑은 고딕"/>
-          <w:b/>
-          <w:bCs/>
-          <w:sz w:val="20"/>
-          <w:szCs w:val="20"/>
-        </w:rPr>
-        <w:t xml:space="preserve">제출 서류 양식</w:t>
-      </w:r>
-      <w:r>
-        <w:rPr>
-          <w:rFonts w:ascii="맑은 고딕" w:cs="맑은 고딕" w:eastAsia="맑은 고딕" w:hAnsi="맑은 고딕"/>
-          <w:sz w:val="20"/>
-          <w:szCs w:val="20"/>
-        </w:rPr>
-        <w:t xml:space="preserve"> — 각 부서 등록·갱신. 정비 필요</w:t>
-      </w:r>
-    </w:p>
-    <w:p>
-      <w:pPr>
-        <w:pStyle w:val="ListParagraph"/>
-        <w:numPr>
-          <w:ilvl w:val="0"/>
-          <w:numId w:val="2"/>
-        </w:numPr>
-        <w:spacing w:after="30" w:line="264"/>
-      </w:pPr>
-      <w:r>
-        <w:rPr>
-          <w:rFonts w:ascii="맑은 고딕" w:cs="맑은 고딕" w:eastAsia="맑은 고딕" w:hAnsi="맑은 고딕"/>
-          <w:b/>
-          <w:bCs/>
-          <w:sz w:val="20"/>
-          <w:szCs w:val="20"/>
-        </w:rPr>
-        <w:t xml:space="preserve">처리 사례</w:t>
-      </w:r>
-      <w:r>
-        <w:rPr>
-          <w:rFonts w:ascii="맑은 고딕" w:cs="맑은 고딕" w:eastAsia="맑은 고딕" w:hAnsi="맑은 고딕"/>
-          <w:sz w:val="20"/>
-          <w:szCs w:val="20"/>
-        </w:rPr>
-        <w:t xml:space="preserve"> — 담당자 확정 시 시스템 자동 축적</w:t>
-      </w:r>
-    </w:p>
-    <w:p>
-      <w:pPr>
-        <w:pStyle w:val="ListParagraph"/>
-        <w:numPr>
-          <w:ilvl w:val="0"/>
-          <w:numId w:val="2"/>
-        </w:numPr>
-        <w:spacing w:after="30" w:line="264"/>
-      </w:pPr>
-      <w:r>
-        <w:rPr>
-          <w:rFonts w:ascii="맑은 고딕" w:cs="맑은 고딕" w:eastAsia="맑은 고딕" w:hAnsi="맑은 고딕"/>
-          <w:b/>
-          <w:bCs/>
-          <w:sz w:val="20"/>
-          <w:szCs w:val="20"/>
-        </w:rPr>
-        <w:t xml:space="preserve">평가용 문항</w:t>
-      </w:r>
-      <w:r>
-        <w:rPr>
-          <w:rFonts w:ascii="맑은 고딕" w:cs="맑은 고딕" w:eastAsia="맑은 고딕" w:hAnsi="맑은 고딕"/>
-          <w:sz w:val="20"/>
-          <w:szCs w:val="20"/>
-        </w:rPr>
-        <w:t xml:space="preserve"> — 답변 정확도 측정 목적, 담당자 협업 작성 필요</w:t>
-      </w:r>
-    </w:p>
-    <w:p>
-      <w:pPr>
-        <w:pStyle w:val="Heading2"/>
-        <w:spacing w:after="70" w:before="180"/>
-      </w:pPr>
-      <w:r>
-        <w:rPr>
-          <w:rFonts w:ascii="맑은 고딕" w:cs="맑은 고딕" w:eastAsia="맑은 고딕" w:hAnsi="맑은 고딕"/>
-          <w:b/>
-          <w:bCs/>
-          <w:color w:val="1F4E79"/>
-          <w:sz w:val="22"/>
-          <w:szCs w:val="22"/>
-        </w:rPr>
-        <w:t xml:space="preserve">필수 항목</w:t>
-      </w:r>
-    </w:p>
-    <w:p>
-      <w:pPr>
-        <w:spacing w:after="80" w:line="264"/>
-      </w:pPr>
-      <w:r>
-        <w:rPr>
-          <w:rFonts w:ascii="맑은 고딕" w:cs="맑은 고딕" w:eastAsia="맑은 고딕" w:hAnsi="맑은 고딕"/>
-          <w:sz w:val="20"/>
-          <w:szCs w:val="20"/>
-        </w:rPr>
-        <w:t xml:space="preserve">전체 규정 문서는 아래 정보의 보유가 필수이며, 미보유 문서는 검색 대상에서 제외.</w:t>
-      </w:r>
-    </w:p>
-    <w:p>
-      <w:pPr>
-        <w:pStyle w:val="ListParagraph"/>
-        <w:numPr>
-          <w:ilvl w:val="0"/>
-          <w:numId w:val="2"/>
-        </w:numPr>
-        <w:spacing w:after="30" w:line="264"/>
-      </w:pPr>
-      <w:r>
-        <w:rPr>
-          <w:rFonts w:ascii="맑은 고딕" w:cs="맑은 고딕" w:eastAsia="맑은 고딕" w:hAnsi="맑은 고딕"/>
-          <w:b/>
-          <w:bCs/>
-          <w:sz w:val="20"/>
-          <w:szCs w:val="20"/>
-        </w:rPr>
-        <w:t xml:space="preserve">시행일 및 버전</w:t>
-      </w:r>
-      <w:r>
-        <w:rPr>
-          <w:rFonts w:ascii="맑은 고딕" w:cs="맑은 고딕" w:eastAsia="맑은 고딕" w:hAnsi="맑은 고딕"/>
-          <w:sz w:val="20"/>
-          <w:szCs w:val="20"/>
-        </w:rPr>
-        <w:t xml:space="preserve"> — 현행 규정 판별 및 개정 전 규정 구분 용도</w:t>
-      </w:r>
-    </w:p>
-    <w:p>
-      <w:pPr>
-        <w:pStyle w:val="ListParagraph"/>
-        <w:numPr>
-          <w:ilvl w:val="0"/>
-          <w:numId w:val="2"/>
-        </w:numPr>
-        <w:spacing w:after="30" w:line="264"/>
-      </w:pPr>
-      <w:r>
-        <w:rPr>
-          <w:rFonts w:ascii="맑은 고딕" w:cs="맑은 고딕" w:eastAsia="맑은 고딕" w:hAnsi="맑은 고딕"/>
-          <w:b/>
-          <w:bCs/>
-          <w:sz w:val="20"/>
-          <w:szCs w:val="20"/>
-        </w:rPr>
-        <w:t xml:space="preserve">소관부서</w:t>
-      </w:r>
-      <w:r>
-        <w:rPr>
-          <w:rFonts w:ascii="맑은 고딕" w:cs="맑은 고딕" w:eastAsia="맑은 고딕" w:hAnsi="맑은 고딕"/>
-          <w:sz w:val="20"/>
-          <w:szCs w:val="20"/>
-        </w:rPr>
-        <w:t xml:space="preserve"> — 답변 시 소관 표시 및 연결 대상 분기 용도</w:t>
-      </w:r>
-    </w:p>
-    <w:p>
-      <w:pPr>
-        <w:pStyle w:val="ListParagraph"/>
-        <w:numPr>
-          <w:ilvl w:val="0"/>
-          <w:numId w:val="2"/>
-        </w:numPr>
-        <w:spacing w:after="30" w:line="264"/>
-      </w:pPr>
-      <w:r>
-        <w:rPr>
-          <w:rFonts w:ascii="맑은 고딕" w:cs="맑은 고딕" w:eastAsia="맑은 고딕" w:hAnsi="맑은 고딕"/>
-          <w:b/>
-          <w:bCs/>
-          <w:sz w:val="20"/>
-          <w:szCs w:val="20"/>
-        </w:rPr>
-        <w:t xml:space="preserve">적용 국가</w:t>
-      </w:r>
-      <w:r>
-        <w:rPr>
-          <w:rFonts w:ascii="맑은 고딕" w:cs="맑은 고딕" w:eastAsia="맑은 고딕" w:hAnsi="맑은 고딕"/>
-          <w:sz w:val="20"/>
-          <w:szCs w:val="20"/>
-        </w:rPr>
-        <w:t xml:space="preserve"> — 국가별 답변 분기 용도</w:t>
-      </w:r>
-    </w:p>
-    <w:p>
-      <w:pPr>
-        <w:pStyle w:val="ListParagraph"/>
-        <w:numPr>
-          <w:ilvl w:val="0"/>
-          <w:numId w:val="2"/>
-        </w:numPr>
-        <w:spacing w:after="30" w:line="264"/>
-      </w:pPr>
-      <w:r>
-        <w:rPr>
-          <w:rFonts w:ascii="맑은 고딕" w:cs="맑은 고딕" w:eastAsia="맑은 고딕" w:hAnsi="맑은 고딕"/>
-          <w:b/>
-          <w:bCs/>
-          <w:sz w:val="20"/>
-          <w:szCs w:val="20"/>
-        </w:rPr>
-        <w:t xml:space="preserve">적용 법인격</w:t>
-      </w:r>
-      <w:r>
-        <w:rPr>
-          <w:rFonts w:ascii="맑은 고딕" w:cs="맑은 고딕" w:eastAsia="맑은 고딕" w:hAnsi="맑은 고딕"/>
-          <w:sz w:val="20"/>
-          <w:szCs w:val="20"/>
-        </w:rPr>
-        <w:t xml:space="preserve"> — 자회사 및 국외점포 간 규정 차이 반영 용도</w:t>
-      </w:r>
-    </w:p>
-    <w:p>
-      <w:pPr>
-        <w:pStyle w:val="Heading2"/>
-        <w:spacing w:after="70" w:before="180"/>
-      </w:pPr>
-      <w:r>
-        <w:rPr>
-          <w:rFonts w:ascii="맑은 고딕" w:cs="맑은 고딕" w:eastAsia="맑은 고딕" w:hAnsi="맑은 고딕"/>
-          <w:b/>
-          <w:bCs/>
-          <w:color w:val="1F4E79"/>
-          <w:sz w:val="22"/>
-          <w:szCs w:val="22"/>
-        </w:rPr>
-        <w:t xml:space="preserve">관리 방안</w:t>
-      </w:r>
-    </w:p>
-    <w:p>
-      <w:pPr>
-        <w:pStyle w:val="ListParagraph"/>
-        <w:numPr>
-          <w:ilvl w:val="0"/>
-          <w:numId w:val="2"/>
-        </w:numPr>
-        <w:spacing w:after="30" w:line="264"/>
-      </w:pPr>
-      <w:r>
-        <w:rPr>
-          <w:rFonts w:ascii="맑은 고딕" w:cs="맑은 고딕" w:eastAsia="맑은 고딕" w:hAnsi="맑은 고딕"/>
-          <w:sz w:val="20"/>
-          <w:szCs w:val="20"/>
-        </w:rPr>
-        <w:t xml:space="preserve">규정·지침은 자동 수집 체계 연동, 개정 반영 주기 및 폐지 규정 제외 여부의 사전 확인 필요</w:t>
-      </w:r>
-    </w:p>
-    <w:p>
-      <w:pPr>
-        <w:pStyle w:val="ListParagraph"/>
-        <w:numPr>
-          <w:ilvl w:val="0"/>
-          <w:numId w:val="2"/>
-        </w:numPr>
-        <w:spacing w:after="30" w:line="264"/>
-      </w:pPr>
-      <w:r>
-        <w:rPr>
-          <w:rFonts w:ascii="맑은 고딕" w:cs="맑은 고딕" w:eastAsia="맑은 고딕" w:hAnsi="맑은 고딕"/>
-          <w:sz w:val="20"/>
-          <w:szCs w:val="20"/>
-        </w:rPr>
-        <w:t xml:space="preserve">안내서 및 양식은 부서 소유 관리, 인사발령 대응을 위한 </w:t>
-      </w:r>
-      <w:r>
-        <w:rPr>
-          <w:rFonts w:ascii="맑은 고딕" w:cs="맑은 고딕" w:eastAsia="맑은 고딕" w:hAnsi="맑은 고딕"/>
-          <w:b/>
-          <w:bCs/>
-          <w:sz w:val="20"/>
-          <w:szCs w:val="20"/>
-        </w:rPr>
-        <w:t xml:space="preserve">역할 기준 갱신 담당 지정</w:t>
-      </w:r>
-      <w:r>
-        <w:rPr>
-          <w:rFonts w:ascii="맑은 고딕" w:cs="맑은 고딕" w:eastAsia="맑은 고딕" w:hAnsi="맑은 고딕"/>
-          <w:sz w:val="20"/>
-          <w:szCs w:val="20"/>
-        </w:rPr>
-        <w:t xml:space="preserve"> 필요</w:t>
-      </w:r>
-    </w:p>
-    <w:p>
-      <w:pPr>
-        <w:pStyle w:val="ListParagraph"/>
-        <w:numPr>
-          <w:ilvl w:val="0"/>
-          <w:numId w:val="2"/>
-        </w:numPr>
-        <w:spacing w:after="30" w:line="264"/>
-      </w:pPr>
-      <w:r>
-        <w:rPr>
-          <w:rFonts w:ascii="맑은 고딕" w:cs="맑은 고딕" w:eastAsia="맑은 고딕" w:hAnsi="맑은 고딕"/>
-          <w:sz w:val="20"/>
-          <w:szCs w:val="20"/>
-        </w:rPr>
-        <w:t xml:space="preserve">사례는 담당자 확정 시 자동 축적 및 후속 답변 활용</w:t>
-      </w:r>
-    </w:p>
-    <w:p>
-      <w:pPr>
-        <w:pStyle w:val="ListParagraph"/>
-        <w:numPr>
-          <w:ilvl w:val="0"/>
-          <w:numId w:val="2"/>
-        </w:numPr>
-        <w:spacing w:after="30" w:line="264"/>
-      </w:pPr>
-      <w:r>
-        <w:rPr>
-          <w:rFonts w:ascii="맑은 고딕" w:cs="맑은 고딕" w:eastAsia="맑은 고딕" w:hAnsi="맑은 고딕"/>
-          <w:sz w:val="20"/>
-          <w:szCs w:val="20"/>
-        </w:rPr>
-        <w:t xml:space="preserve">개인정보의 수집 및 저장 금지</w:t>
       </w:r>
     </w:p>
     <w:p>
@@ -5114,92 +4652,24 @@
       <w:r>
         <w:rPr>
           <w:rFonts w:ascii="맑은 고딕" w:cs="맑은 고딕" w:eastAsia="맑은 고딕" w:hAnsi="맑은 고딕"/>
+          <w:b/>
+          <w:bCs/>
           <w:i w:val="false"/>
           <w:iCs w:val="false"/>
           <w:sz w:val="20"/>
           <w:szCs w:val="20"/>
         </w:rPr>
-        <w:t xml:space="preserve">규정은 자동 수집되나 안내서·양식·사례는 담당 부서의 직접 정비 필요. </w:t>
-      </w:r>
-      <w:r>
-        <w:rPr>
-          <w:rFonts w:ascii="맑은 고딕" w:cs="맑은 고딕" w:eastAsia="맑은 고딕" w:hAnsi="맑은 고딕"/>
-          <w:b/>
-          <w:bCs/>
+        <w:t xml:space="preserve">데이터 수집·적재·관리 체계를 데이터시스템부와 사전 협의하여 확정한 후 구축에 착수.</w:t>
+      </w:r>
+      <w:r>
+        <w:rPr>
+          <w:rFonts w:ascii="맑은 고딕" w:cs="맑은 고딕" w:eastAsia="맑은 고딕" w:hAnsi="맑은 고딕"/>
           <w:i w:val="false"/>
           <w:iCs w:val="false"/>
           <w:sz w:val="20"/>
           <w:szCs w:val="20"/>
         </w:rPr>
-        <w:t xml:space="preserve">자료 정비가 본 과제의 최우선 선행 과제이며, 인사발령 이전 완료를 위한 산출물 기준 관리 요구.</w:t>
-      </w:r>
-    </w:p>
-    <w:p>
-      <w:pPr>
-        <w:pBdr>
-          <w:bottom w:val="single" w:color="BFBFBF" w:sz="6" w:space="2"/>
-        </w:pBdr>
-        <w:spacing w:after="100" w:before="100"/>
-      </w:pPr>
-      <w:r>
-        <w:rPr>
-          <w:sz w:val="2"/>
-          <w:szCs w:val="2"/>
-        </w:rPr>
-        <w:t xml:space="preserve"/>
-      </w:r>
-    </w:p>
-    <w:p>
-      <w:pPr>
-        <w:pStyle w:val="Heading1"/>
-        <w:pBdr>
-          <w:bottom w:val="single" w:color="BFBFBF" w:sz="6" w:space="6"/>
-        </w:pBdr>
-        <w:spacing w:after="140" w:before="0"/>
-      </w:pPr>
-      <w:r>
-        <w:rPr>
-          <w:rFonts w:ascii="맑은 고딕" w:cs="맑은 고딕" w:eastAsia="맑은 고딕" w:hAnsi="맑은 고딕"/>
-          <w:b/>
-          <w:bCs/>
-          <w:color w:val="1F4E79"/>
-          <w:sz w:val="30"/>
-          <w:szCs w:val="30"/>
-        </w:rPr>
-        <w:t xml:space="preserve">VI. 성공 측정</w:t>
-      </w:r>
-    </w:p>
-    <w:p>
-      <w:pPr>
-        <w:pStyle w:val="Heading1"/>
-        <w:pBdr>
-          <w:bottom w:val="single" w:color="BFBFBF" w:sz="6" w:space="6"/>
-        </w:pBdr>
-        <w:spacing w:after="100" w:before="240"/>
-      </w:pPr>
-      <w:r>
-        <w:rPr>
-          <w:rFonts w:ascii="맑은 고딕" w:cs="맑은 고딕" w:eastAsia="맑은 고딕" w:hAnsi="맑은 고딕"/>
-          <w:b/>
-          <w:bCs/>
-          <w:color w:val="1F4E79"/>
-          <w:sz w:val="25"/>
-          <w:szCs w:val="25"/>
-        </w:rPr>
-        <w:t xml:space="preserve">19. 성공 지표 (KPIs) / Success Metrics</w:t>
-      </w:r>
-    </w:p>
-    <w:p>
-      <w:pPr>
-        <w:spacing w:after="80" w:line="264"/>
-      </w:pPr>
-      <w:r>
-        <w:rPr>
-          <w:rFonts w:ascii="맑은 고딕" w:cs="맑은 고딕" w:eastAsia="맑은 고딕" w:hAnsi="맑은 고딕"/>
-          <w:sz w:val="20"/>
-          <w:szCs w:val="20"/>
-        </w:rPr>
-        <w:t xml:space="preserve">사용자 규모가 크지 않아 통계적 비교가 어려우므로, 도입 전후 비교와 평가 문항 측정의 병행 필요.</w:t>
+        <w:t xml:space="preserve"> 체계 미확정 상태에서 자료를 축적할 경우 재작업 발생 우려.</w:t>
       </w:r>
     </w:p>
     <w:p>
@@ -5216,119 +4686,193 @@
           <w:sz w:val="22"/>
           <w:szCs w:val="22"/>
         </w:rPr>
-        <w:t xml:space="preserve">업무 성과</w:t>
-      </w:r>
-    </w:p>
-    <w:p>
-      <w:pPr>
-        <w:pStyle w:val="ListParagraph"/>
-        <w:numPr>
-          <w:ilvl w:val="0"/>
-          <w:numId w:val="2"/>
-        </w:numPr>
-        <w:spacing w:after="30" w:line="264"/>
-      </w:pPr>
-      <w:r>
-        <w:rPr>
-          <w:rFonts w:ascii="맑은 고딕" w:cs="맑은 고딕" w:eastAsia="맑은 고딕" w:hAnsi="맑은 고딕"/>
-          <w:b/>
-          <w:bCs/>
-          <w:sz w:val="20"/>
-          <w:szCs w:val="20"/>
-        </w:rPr>
-        <w:t xml:space="preserve">담당자 수신 문의 건수</w:t>
-      </w:r>
-      <w:r>
-        <w:rPr>
-          <w:rFonts w:ascii="맑은 고딕" w:cs="맑은 고딕" w:eastAsia="맑은 고딕" w:hAnsi="맑은 고딕"/>
-          <w:sz w:val="20"/>
-          <w:szCs w:val="20"/>
-        </w:rPr>
-        <w:t xml:space="preserve"> — 도입 전 대비 40% 감소 목표, 문의 채널 기록 기준 집계</w:t>
-      </w:r>
-    </w:p>
-    <w:p>
-      <w:pPr>
-        <w:pStyle w:val="ListParagraph"/>
-        <w:numPr>
-          <w:ilvl w:val="0"/>
-          <w:numId w:val="2"/>
-        </w:numPr>
-        <w:spacing w:after="30" w:line="264"/>
-      </w:pPr>
-      <w:r>
-        <w:rPr>
-          <w:rFonts w:ascii="맑은 고딕" w:cs="맑은 고딕" w:eastAsia="맑은 고딕" w:hAnsi="맑은 고딕"/>
-          <w:b/>
-          <w:bCs/>
-          <w:sz w:val="20"/>
-          <w:szCs w:val="20"/>
-        </w:rPr>
-        <w:t xml:space="preserve">담당자 개입 없이 해결된 비율</w:t>
-      </w:r>
-      <w:r>
-        <w:rPr>
-          <w:rFonts w:ascii="맑은 고딕" w:cs="맑은 고딕" w:eastAsia="맑은 고딕" w:hAnsi="맑은 고딕"/>
-          <w:sz w:val="20"/>
-          <w:szCs w:val="20"/>
-        </w:rPr>
-        <w:t xml:space="preserve"> — 60% 목표, 사용 기록 기준 집계</w:t>
-      </w:r>
-    </w:p>
-    <w:p>
-      <w:pPr>
-        <w:pStyle w:val="ListParagraph"/>
-        <w:numPr>
-          <w:ilvl w:val="0"/>
-          <w:numId w:val="2"/>
-        </w:numPr>
-        <w:spacing w:after="30" w:line="264"/>
-      </w:pPr>
-      <w:r>
-        <w:rPr>
-          <w:rFonts w:ascii="맑은 고딕" w:cs="맑은 고딕" w:eastAsia="맑은 고딕" w:hAnsi="맑은 고딕"/>
-          <w:b/>
-          <w:bCs/>
-          <w:sz w:val="20"/>
-          <w:szCs w:val="20"/>
-        </w:rPr>
-        <w:t xml:space="preserve">정기인사 시기 문의 건수</w:t>
-      </w:r>
-      <w:r>
-        <w:rPr>
-          <w:rFonts w:ascii="맑은 고딕" w:cs="맑은 고딕" w:eastAsia="맑은 고딕" w:hAnsi="맑은 고딕"/>
-          <w:sz w:val="20"/>
-          <w:szCs w:val="20"/>
-        </w:rPr>
-        <w:t xml:space="preserve"> — 전년 동기 대비 40% 감소 목표</w:t>
-      </w:r>
-    </w:p>
-    <w:p>
-      <w:pPr>
-        <w:pStyle w:val="ListParagraph"/>
-        <w:numPr>
-          <w:ilvl w:val="0"/>
-          <w:numId w:val="2"/>
-        </w:numPr>
-        <w:spacing w:after="30" w:line="264"/>
-      </w:pPr>
-      <w:r>
-        <w:rPr>
-          <w:rFonts w:ascii="맑은 고딕" w:cs="맑은 고딕" w:eastAsia="맑은 고딕" w:hAnsi="맑은 고딕"/>
-          <w:b/>
-          <w:bCs/>
-          <w:sz w:val="20"/>
-          <w:szCs w:val="20"/>
-        </w:rPr>
-        <w:t xml:space="preserve">문의 1건당 담당자 소요시간</w:t>
-      </w:r>
-      <w:r>
-        <w:rPr>
-          <w:rFonts w:ascii="맑은 고딕" w:cs="맑은 고딕" w:eastAsia="맑은 고딕" w:hAnsi="맑은 고딕"/>
-          <w:sz w:val="20"/>
-          <w:szCs w:val="20"/>
-        </w:rPr>
-        <w:t xml:space="preserve"> — 도입 전 대비 30% 단축 목표</w:t>
+        <w:t xml:space="preserve">필요 데이터</w:t>
+      </w:r>
+    </w:p>
+    <w:p>
+      <w:pPr>
+        <w:pStyle w:val="ListParagraph"/>
+        <w:numPr>
+          <w:ilvl w:val="0"/>
+          <w:numId w:val="2"/>
+        </w:numPr>
+        <w:spacing w:after="30" w:line="264"/>
+      </w:pPr>
+      <w:r>
+        <w:rPr>
+          <w:rFonts w:ascii="맑은 고딕" w:cs="맑은 고딕" w:eastAsia="맑은 고딕" w:hAnsi="맑은 고딕"/>
+          <w:b/>
+          <w:bCs/>
+          <w:sz w:val="20"/>
+          <w:szCs w:val="20"/>
+        </w:rPr>
+        <w:t xml:space="preserve">국외근무 관련 규정·지침</w:t>
+      </w:r>
+      <w:r>
+        <w:rPr>
+          <w:rFonts w:ascii="맑은 고딕" w:cs="맑은 고딕" w:eastAsia="맑은 고딕" w:hAnsi="맑은 고딕"/>
+          <w:sz w:val="20"/>
+          <w:szCs w:val="20"/>
+        </w:rPr>
+        <w:t xml:space="preserve"> — 소관은 HR·직원만족부. 사내 규정 자동 수집 체계로 확보 완료</w:t>
+      </w:r>
+    </w:p>
+    <w:p>
+      <w:pPr>
+        <w:pStyle w:val="ListParagraph"/>
+        <w:numPr>
+          <w:ilvl w:val="0"/>
+          <w:numId w:val="2"/>
+        </w:numPr>
+        <w:spacing w:after="30" w:line="264"/>
+      </w:pPr>
+      <w:r>
+        <w:rPr>
+          <w:rFonts w:ascii="맑은 고딕" w:cs="맑은 고딕" w:eastAsia="맑은 고딕" w:hAnsi="맑은 고딕"/>
+          <w:b/>
+          <w:bCs/>
+          <w:sz w:val="20"/>
+          <w:szCs w:val="20"/>
+        </w:rPr>
+        <w:t xml:space="preserve">부임 안내서 (자회사·국외점포)</w:t>
+      </w:r>
+      <w:r>
+        <w:rPr>
+          <w:rFonts w:ascii="맑은 고딕" w:cs="맑은 고딕" w:eastAsia="맑은 고딕" w:hAnsi="맑은 고딕"/>
+          <w:sz w:val="20"/>
+          <w:szCs w:val="20"/>
+        </w:rPr>
+        <w:t xml:space="preserve"> — 본점 담당자 작성·관리. </w:t>
+      </w:r>
+      <w:r>
+        <w:rPr>
+          <w:rFonts w:ascii="맑은 고딕" w:cs="맑은 고딕" w:eastAsia="맑은 고딕" w:hAnsi="맑은 고딕"/>
+          <w:b/>
+          <w:bCs/>
+          <w:sz w:val="20"/>
+          <w:szCs w:val="20"/>
+        </w:rPr>
+        <w:t xml:space="preserve">확보 완료</w:t>
+      </w:r>
+      <w:r>
+        <w:rPr>
+          <w:rFonts w:ascii="맑은 고딕" w:cs="맑은 고딕" w:eastAsia="맑은 고딕" w:hAnsi="맑은 고딕"/>
+          <w:sz w:val="20"/>
+          <w:szCs w:val="20"/>
+        </w:rPr>
+        <w:t xml:space="preserve">, 연말 정기인사 시즌 정비 필요</w:t>
+      </w:r>
+    </w:p>
+    <w:p>
+      <w:pPr>
+        <w:pStyle w:val="ListParagraph"/>
+        <w:numPr>
+          <w:ilvl w:val="0"/>
+          <w:numId w:val="2"/>
+        </w:numPr>
+        <w:spacing w:after="30" w:line="264"/>
+      </w:pPr>
+      <w:r>
+        <w:rPr>
+          <w:rFonts w:ascii="맑은 고딕" w:cs="맑은 고딕" w:eastAsia="맑은 고딕" w:hAnsi="맑은 고딕"/>
+          <w:b/>
+          <w:bCs/>
+          <w:sz w:val="20"/>
+          <w:szCs w:val="20"/>
+        </w:rPr>
+        <w:t xml:space="preserve">제출 서류 양식</w:t>
+      </w:r>
+      <w:r>
+        <w:rPr>
+          <w:rFonts w:ascii="맑은 고딕" w:cs="맑은 고딕" w:eastAsia="맑은 고딕" w:hAnsi="맑은 고딕"/>
+          <w:sz w:val="20"/>
+          <w:szCs w:val="20"/>
+        </w:rPr>
+        <w:t xml:space="preserve"> — 본점 담당자 등록·갱신. 양식 개정 시 교체 필요</w:t>
+      </w:r>
+    </w:p>
+    <w:p>
+      <w:pPr>
+        <w:pStyle w:val="ListParagraph"/>
+        <w:numPr>
+          <w:ilvl w:val="0"/>
+          <w:numId w:val="2"/>
+        </w:numPr>
+        <w:spacing w:after="30" w:line="264"/>
+      </w:pPr>
+      <w:r>
+        <w:rPr>
+          <w:rFonts w:ascii="맑은 고딕" w:cs="맑은 고딕" w:eastAsia="맑은 고딕" w:hAnsi="맑은 고딕"/>
+          <w:b/>
+          <w:bCs/>
+          <w:sz w:val="20"/>
+          <w:szCs w:val="20"/>
+        </w:rPr>
+        <w:t xml:space="preserve">국가별 HR 사례</w:t>
+      </w:r>
+      <w:r>
+        <w:rPr>
+          <w:rFonts w:ascii="맑은 고딕" w:cs="맑은 고딕" w:eastAsia="맑은 고딕" w:hAnsi="맑은 고딕"/>
+          <w:sz w:val="20"/>
+          <w:szCs w:val="20"/>
+        </w:rPr>
+        <w:t xml:space="preserve"> — 본점 담당자 정리 후 등록. 정비 필요</w:t>
+      </w:r>
+    </w:p>
+    <w:p>
+      <w:pPr>
+        <w:pStyle w:val="ListParagraph"/>
+        <w:numPr>
+          <w:ilvl w:val="0"/>
+          <w:numId w:val="2"/>
+        </w:numPr>
+        <w:spacing w:after="30" w:line="264"/>
+      </w:pPr>
+      <w:r>
+        <w:rPr>
+          <w:rFonts w:ascii="맑은 고딕" w:cs="맑은 고딕" w:eastAsia="맑은 고딕" w:hAnsi="맑은 고딕"/>
+          <w:b/>
+          <w:bCs/>
+          <w:sz w:val="20"/>
+          <w:szCs w:val="20"/>
+        </w:rPr>
+        <w:t xml:space="preserve">과거 처리 사례</w:t>
+      </w:r>
+      <w:r>
+        <w:rPr>
+          <w:rFonts w:ascii="맑은 고딕" w:cs="맑은 고딕" w:eastAsia="맑은 고딕" w:hAnsi="맑은 고딕"/>
+          <w:sz w:val="20"/>
+          <w:szCs w:val="20"/>
+        </w:rPr>
+        <w:t xml:space="preserve"> — 담당자 답변 확정 시 시스템 자동 축적</w:t>
+      </w:r>
+    </w:p>
+    <w:p>
+      <w:pPr>
+        <w:pStyle w:val="ListParagraph"/>
+        <w:numPr>
+          <w:ilvl w:val="0"/>
+          <w:numId w:val="2"/>
+        </w:numPr>
+        <w:spacing w:after="30" w:line="264"/>
+      </w:pPr>
+      <w:r>
+        <w:rPr>
+          <w:rFonts w:ascii="맑은 고딕" w:cs="맑은 고딕" w:eastAsia="맑은 고딕" w:hAnsi="맑은 고딕"/>
+          <w:b/>
+          <w:bCs/>
+          <w:sz w:val="20"/>
+          <w:szCs w:val="20"/>
+        </w:rPr>
+        <w:t xml:space="preserve">평가용 문항</w:t>
+      </w:r>
+      <w:r>
+        <w:rPr>
+          <w:rFonts w:ascii="맑은 고딕" w:cs="맑은 고딕" w:eastAsia="맑은 고딕" w:hAnsi="맑은 고딕"/>
+          <w:sz w:val="20"/>
+          <w:szCs w:val="20"/>
+        </w:rPr>
+        <w:t xml:space="preserve"> — 답변 정확도 측정 목적, 담당자 협업 작성 필요</w:t>
       </w:r>
     </w:p>
     <w:p>
@@ -5345,147 +4889,505 @@
           <w:sz w:val="22"/>
           <w:szCs w:val="22"/>
         </w:rPr>
-        <w:t xml:space="preserve">답변 품질</w:t>
-      </w:r>
-    </w:p>
-    <w:p>
-      <w:pPr>
-        <w:pStyle w:val="ListParagraph"/>
-        <w:numPr>
-          <w:ilvl w:val="0"/>
-          <w:numId w:val="2"/>
-        </w:numPr>
-        <w:spacing w:after="30" w:line="264"/>
-      </w:pPr>
-      <w:r>
-        <w:rPr>
-          <w:rFonts w:ascii="맑은 고딕" w:cs="맑은 고딕" w:eastAsia="맑은 고딕" w:hAnsi="맑은 고딕"/>
-          <w:b/>
-          <w:bCs/>
-          <w:sz w:val="20"/>
-          <w:szCs w:val="20"/>
-        </w:rPr>
-        <w:t xml:space="preserve">평가 문항 정답률</w:t>
-      </w:r>
-      <w:r>
-        <w:rPr>
-          <w:rFonts w:ascii="맑은 고딕" w:cs="맑은 고딕" w:eastAsia="맑은 고딕" w:hAnsi="맑은 고딕"/>
-          <w:sz w:val="20"/>
-          <w:szCs w:val="20"/>
-        </w:rPr>
-        <w:t xml:space="preserve"> — 90% 이상, 배포 전 및 이후 분기별 측정</w:t>
-      </w:r>
-    </w:p>
-    <w:p>
-      <w:pPr>
-        <w:pStyle w:val="ListParagraph"/>
-        <w:numPr>
-          <w:ilvl w:val="0"/>
-          <w:numId w:val="2"/>
-        </w:numPr>
-        <w:spacing w:after="30" w:line="264"/>
-      </w:pPr>
-      <w:r>
-        <w:rPr>
-          <w:rFonts w:ascii="맑은 고딕" w:cs="맑은 고딕" w:eastAsia="맑은 고딕" w:hAnsi="맑은 고딕"/>
-          <w:b/>
-          <w:bCs/>
-          <w:sz w:val="20"/>
-          <w:szCs w:val="20"/>
-        </w:rPr>
-        <w:t xml:space="preserve">출처 정확도</w:t>
-      </w:r>
-      <w:r>
-        <w:rPr>
-          <w:rFonts w:ascii="맑은 고딕" w:cs="맑은 고딕" w:eastAsia="맑은 고딕" w:hAnsi="맑은 고딕"/>
-          <w:sz w:val="20"/>
-          <w:szCs w:val="20"/>
-        </w:rPr>
-        <w:t xml:space="preserve"> — 95% 이상, 인용 조항과 실제 근거 조항의 일치율</w:t>
-      </w:r>
-    </w:p>
-    <w:p>
-      <w:pPr>
-        <w:pStyle w:val="ListParagraph"/>
-        <w:numPr>
-          <w:ilvl w:val="0"/>
-          <w:numId w:val="2"/>
-        </w:numPr>
-        <w:spacing w:after="30" w:line="264"/>
-      </w:pPr>
-      <w:r>
-        <w:rPr>
-          <w:rFonts w:ascii="맑은 고딕" w:cs="맑은 고딕" w:eastAsia="맑은 고딕" w:hAnsi="맑은 고딕"/>
-          <w:b/>
-          <w:bCs/>
-          <w:sz w:val="20"/>
-          <w:szCs w:val="20"/>
-        </w:rPr>
-        <w:t xml:space="preserve">해석 사안 판별률</w:t>
-      </w:r>
-      <w:r>
-        <w:rPr>
-          <w:rFonts w:ascii="맑은 고딕" w:cs="맑은 고딕" w:eastAsia="맑은 고딕" w:hAnsi="맑은 고딕"/>
-          <w:sz w:val="20"/>
-          <w:szCs w:val="20"/>
-        </w:rPr>
-        <w:t xml:space="preserve"> — 95% 이상, 해석 필요 문항의 정상 판별 비율</w:t>
-      </w:r>
-    </w:p>
-    <w:p>
-      <w:pPr>
-        <w:pStyle w:val="ListParagraph"/>
-        <w:numPr>
-          <w:ilvl w:val="0"/>
-          <w:numId w:val="2"/>
-        </w:numPr>
-        <w:spacing w:after="30" w:line="264"/>
-      </w:pPr>
-      <w:r>
-        <w:rPr>
-          <w:rFonts w:ascii="맑은 고딕" w:cs="맑은 고딕" w:eastAsia="맑은 고딕" w:hAnsi="맑은 고딕"/>
-          <w:b/>
-          <w:bCs/>
-          <w:sz w:val="20"/>
-          <w:szCs w:val="20"/>
-        </w:rPr>
-        <w:t xml:space="preserve">담당자 수정 정도</w:t>
-      </w:r>
-      <w:r>
-        <w:rPr>
-          <w:rFonts w:ascii="맑은 고딕" w:cs="맑은 고딕" w:eastAsia="맑은 고딕" w:hAnsi="맑은 고딕"/>
-          <w:sz w:val="20"/>
-          <w:szCs w:val="20"/>
-        </w:rPr>
-        <w:t xml:space="preserve"> — 20% 이하, 원 답변 대비 확정본 변경 비율의 자동 집계</w:t>
-      </w:r>
-    </w:p>
-    <w:p>
-      <w:pPr>
-        <w:pStyle w:val="ListParagraph"/>
-        <w:numPr>
-          <w:ilvl w:val="0"/>
-          <w:numId w:val="2"/>
-        </w:numPr>
-        <w:spacing w:after="30" w:line="264"/>
-      </w:pPr>
-      <w:r>
-        <w:rPr>
-          <w:rFonts w:ascii="맑은 고딕" w:cs="맑은 고딕" w:eastAsia="맑은 고딕" w:hAnsi="맑은 고딕"/>
-          <w:b/>
-          <w:bCs/>
-          <w:sz w:val="20"/>
-          <w:szCs w:val="20"/>
-        </w:rPr>
-        <w:t xml:space="preserve">근거 없는 답변 건수</w:t>
-      </w:r>
-      <w:r>
-        <w:rPr>
-          <w:rFonts w:ascii="맑은 고딕" w:cs="맑은 고딕" w:eastAsia="맑은 고딕" w:hAnsi="맑은 고딕"/>
-          <w:sz w:val="20"/>
-          <w:szCs w:val="20"/>
-        </w:rPr>
-        <w:t xml:space="preserve"> — 0건, 월 1회 답변 기록 표본 점검</w:t>
+        <w:t xml:space="preserve">데이터 수집</w:t>
+      </w:r>
+    </w:p>
+    <w:p>
+      <w:pPr>
+        <w:pStyle w:val="ListParagraph"/>
+        <w:numPr>
+          <w:ilvl w:val="0"/>
+          <w:numId w:val="2"/>
+        </w:numPr>
+        <w:spacing w:after="30" w:line="264"/>
+      </w:pPr>
+      <w:r>
+        <w:rPr>
+          <w:rFonts w:ascii="맑은 고딕" w:cs="맑은 고딕" w:eastAsia="맑은 고딕" w:hAnsi="맑은 고딕"/>
+          <w:b/>
+          <w:bCs/>
+          <w:sz w:val="20"/>
+          <w:szCs w:val="20"/>
+        </w:rPr>
+        <w:t xml:space="preserve">규정·지침</w:t>
+      </w:r>
+      <w:r>
+        <w:rPr>
+          <w:rFonts w:ascii="맑은 고딕" w:cs="맑은 고딕" w:eastAsia="맑은 고딕" w:hAnsi="맑은 고딕"/>
+          <w:sz w:val="20"/>
+          <w:szCs w:val="20"/>
+        </w:rPr>
+        <w:t xml:space="preserve"> — 사내 자동 수집 체계 연동으로 개정 시 자동 반영. 수집 주기 및 폐지 규정 제외 방식의 사전 확인 필요</w:t>
+      </w:r>
+    </w:p>
+    <w:p>
+      <w:pPr>
+        <w:pStyle w:val="ListParagraph"/>
+        <w:numPr>
+          <w:ilvl w:val="0"/>
+          <w:numId w:val="2"/>
+        </w:numPr>
+        <w:spacing w:after="30" w:line="264"/>
+      </w:pPr>
+      <w:r>
+        <w:rPr>
+          <w:rFonts w:ascii="맑은 고딕" w:cs="맑은 고딕" w:eastAsia="맑은 고딕" w:hAnsi="맑은 고딕"/>
+          <w:b/>
+          <w:bCs/>
+          <w:sz w:val="20"/>
+          <w:szCs w:val="20"/>
+        </w:rPr>
+        <w:t xml:space="preserve">부임 안내서 및 서류 양식</w:t>
+      </w:r>
+      <w:r>
+        <w:rPr>
+          <w:rFonts w:ascii="맑은 고딕" w:cs="맑은 고딕" w:eastAsia="맑은 고딕" w:hAnsi="맑은 고딕"/>
+          <w:sz w:val="20"/>
+          <w:szCs w:val="20"/>
+        </w:rPr>
+        <w:t xml:space="preserve"> — 본점 담당자가 정리 후 등록. </w:t>
+      </w:r>
+      <w:r>
+        <w:rPr>
+          <w:rFonts w:ascii="맑은 고딕" w:cs="맑은 고딕" w:eastAsia="맑은 고딕" w:hAnsi="맑은 고딕"/>
+          <w:b/>
+          <w:bCs/>
+          <w:sz w:val="20"/>
+          <w:szCs w:val="20"/>
+        </w:rPr>
+        <w:t xml:space="preserve">연말 정기인사 시즌에 정비 시점 정례화</w:t>
+      </w:r>
+    </w:p>
+    <w:p>
+      <w:pPr>
+        <w:pStyle w:val="ListParagraph"/>
+        <w:numPr>
+          <w:ilvl w:val="0"/>
+          <w:numId w:val="2"/>
+        </w:numPr>
+        <w:spacing w:after="30" w:line="264"/>
+      </w:pPr>
+      <w:r>
+        <w:rPr>
+          <w:rFonts w:ascii="맑은 고딕" w:cs="맑은 고딕" w:eastAsia="맑은 고딕" w:hAnsi="맑은 고딕"/>
+          <w:b/>
+          <w:bCs/>
+          <w:sz w:val="20"/>
+          <w:szCs w:val="20"/>
+        </w:rPr>
+        <w:t xml:space="preserve">HR 사례</w:t>
+      </w:r>
+      <w:r>
+        <w:rPr>
+          <w:rFonts w:ascii="맑은 고딕" w:cs="맑은 고딕" w:eastAsia="맑은 고딕" w:hAnsi="맑은 고딕"/>
+          <w:sz w:val="20"/>
+          <w:szCs w:val="20"/>
+        </w:rPr>
+        <w:t xml:space="preserve"> — 국외점포 및 자회사 자료를 본점 담당자가 취합·정리 후 등록</w:t>
+      </w:r>
+    </w:p>
+    <w:p>
+      <w:pPr>
+        <w:pStyle w:val="ListParagraph"/>
+        <w:numPr>
+          <w:ilvl w:val="0"/>
+          <w:numId w:val="2"/>
+        </w:numPr>
+        <w:spacing w:after="30" w:line="264"/>
+      </w:pPr>
+      <w:r>
+        <w:rPr>
+          <w:rFonts w:ascii="맑은 고딕" w:cs="맑은 고딕" w:eastAsia="맑은 고딕" w:hAnsi="맑은 고딕"/>
+          <w:b/>
+          <w:bCs/>
+          <w:sz w:val="20"/>
+          <w:szCs w:val="20"/>
+        </w:rPr>
+        <w:t xml:space="preserve">처리 사례</w:t>
+      </w:r>
+      <w:r>
+        <w:rPr>
+          <w:rFonts w:ascii="맑은 고딕" w:cs="맑은 고딕" w:eastAsia="맑은 고딕" w:hAnsi="맑은 고딕"/>
+          <w:sz w:val="20"/>
+          <w:szCs w:val="20"/>
+        </w:rPr>
+        <w:t xml:space="preserve"> — 담당자 답변 확정 시점에 시스템이 자동 수집</w:t>
+      </w:r>
+    </w:p>
+    <w:p>
+      <w:pPr>
+        <w:pStyle w:val="ListParagraph"/>
+        <w:numPr>
+          <w:ilvl w:val="0"/>
+          <w:numId w:val="2"/>
+        </w:numPr>
+        <w:spacing w:after="30" w:line="264"/>
+      </w:pPr>
+      <w:r>
+        <w:rPr>
+          <w:rFonts w:ascii="맑은 고딕" w:cs="맑은 고딕" w:eastAsia="맑은 고딕" w:hAnsi="맑은 고딕"/>
+          <w:b/>
+          <w:bCs/>
+          <w:sz w:val="20"/>
+          <w:szCs w:val="20"/>
+        </w:rPr>
+        <w:t xml:space="preserve">평가용 문항</w:t>
+      </w:r>
+      <w:r>
+        <w:rPr>
+          <w:rFonts w:ascii="맑은 고딕" w:cs="맑은 고딕" w:eastAsia="맑은 고딕" w:hAnsi="맑은 고딕"/>
+          <w:sz w:val="20"/>
+          <w:szCs w:val="20"/>
+        </w:rPr>
+        <w:t xml:space="preserve"> — 담당자 협업으로 작성, 분기별 갱신</w:t>
+      </w:r>
+    </w:p>
+    <w:p>
+      <w:pPr>
+        <w:pStyle w:val="ListParagraph"/>
+        <w:numPr>
+          <w:ilvl w:val="0"/>
+          <w:numId w:val="2"/>
+        </w:numPr>
+        <w:spacing w:after="30" w:line="264"/>
+      </w:pPr>
+      <w:r>
+        <w:rPr>
+          <w:rFonts w:ascii="맑은 고딕" w:cs="맑은 고딕" w:eastAsia="맑은 고딕" w:hAnsi="맑은 고딕"/>
+          <w:sz w:val="20"/>
+          <w:szCs w:val="20"/>
+        </w:rPr>
+        <w:t xml:space="preserve">전체 수집 자료에 </w:t>
+      </w:r>
+      <w:r>
+        <w:rPr>
+          <w:rFonts w:ascii="맑은 고딕" w:cs="맑은 고딕" w:eastAsia="맑은 고딕" w:hAnsi="맑은 고딕"/>
+          <w:b/>
+          <w:bCs/>
+          <w:sz w:val="20"/>
+          <w:szCs w:val="20"/>
+        </w:rPr>
+        <w:t xml:space="preserve">시행일·소관부서·적용 국가·적용 법인격</w:t>
+      </w:r>
+      <w:r>
+        <w:rPr>
+          <w:rFonts w:ascii="맑은 고딕" w:cs="맑은 고딕" w:eastAsia="맑은 고딕" w:hAnsi="맑은 고딕"/>
+          <w:sz w:val="20"/>
+          <w:szCs w:val="20"/>
+        </w:rPr>
+        <w:t xml:space="preserve">의 동반 필수</w:t>
+      </w:r>
+    </w:p>
+    <w:p>
+      <w:pPr>
+        <w:pStyle w:val="Heading2"/>
+        <w:spacing w:after="70" w:before="180"/>
+      </w:pPr>
+      <w:r>
+        <w:rPr>
+          <w:rFonts w:ascii="맑은 고딕" w:cs="맑은 고딕" w:eastAsia="맑은 고딕" w:hAnsi="맑은 고딕"/>
+          <w:b/>
+          <w:bCs/>
+          <w:color w:val="1F4E79"/>
+          <w:sz w:val="22"/>
+          <w:szCs w:val="22"/>
+        </w:rPr>
+        <w:t xml:space="preserve">데이터 적재</w:t>
+      </w:r>
+    </w:p>
+    <w:p>
+      <w:pPr>
+        <w:pStyle w:val="ListParagraph"/>
+        <w:numPr>
+          <w:ilvl w:val="0"/>
+          <w:numId w:val="2"/>
+        </w:numPr>
+        <w:spacing w:after="30" w:line="264"/>
+      </w:pPr>
+      <w:r>
+        <w:rPr>
+          <w:rFonts w:ascii="맑은 고딕" w:cs="맑은 고딕" w:eastAsia="맑은 고딕" w:hAnsi="맑은 고딕"/>
+          <w:sz w:val="20"/>
+          <w:szCs w:val="20"/>
+        </w:rPr>
+        <w:t xml:space="preserve">적재 전 필수 메타데이터 충족 여부 검증, </w:t>
+      </w:r>
+      <w:r>
+        <w:rPr>
+          <w:rFonts w:ascii="맑은 고딕" w:cs="맑은 고딕" w:eastAsia="맑은 고딕" w:hAnsi="맑은 고딕"/>
+          <w:b/>
+          <w:bCs/>
+          <w:sz w:val="20"/>
+          <w:szCs w:val="20"/>
+        </w:rPr>
+        <w:t xml:space="preserve">미충족 자료는 반려 및 검색 대상 제외</w:t>
+      </w:r>
+    </w:p>
+    <w:p>
+      <w:pPr>
+        <w:pStyle w:val="ListParagraph"/>
+        <w:numPr>
+          <w:ilvl w:val="0"/>
+          <w:numId w:val="2"/>
+        </w:numPr>
+        <w:spacing w:after="30" w:line="264"/>
+      </w:pPr>
+      <w:r>
+        <w:rPr>
+          <w:rFonts w:ascii="맑은 고딕" w:cs="맑은 고딕" w:eastAsia="맑은 고딕" w:hAnsi="맑은 고딕"/>
+          <w:sz w:val="20"/>
+          <w:szCs w:val="20"/>
+        </w:rPr>
+        <w:t xml:space="preserve">규정 개정 시 신규 버전 적재 및 기존 버전 이력 보존, </w:t>
+      </w:r>
+      <w:r>
+        <w:rPr>
+          <w:rFonts w:ascii="맑은 고딕" w:cs="맑은 고딕" w:eastAsia="맑은 고딕" w:hAnsi="맑은 고딕"/>
+          <w:b/>
+          <w:bCs/>
+          <w:sz w:val="20"/>
+          <w:szCs w:val="20"/>
+        </w:rPr>
+        <w:t xml:space="preserve">현행본만 검색 대상에 포함</w:t>
+      </w:r>
+    </w:p>
+    <w:p>
+      <w:pPr>
+        <w:pStyle w:val="ListParagraph"/>
+        <w:numPr>
+          <w:ilvl w:val="0"/>
+          <w:numId w:val="2"/>
+        </w:numPr>
+        <w:spacing w:after="30" w:line="264"/>
+      </w:pPr>
+      <w:r>
+        <w:rPr>
+          <w:rFonts w:ascii="맑은 고딕" w:cs="맑은 고딕" w:eastAsia="맑은 고딕" w:hAnsi="맑은 고딕"/>
+          <w:sz w:val="20"/>
+          <w:szCs w:val="20"/>
+        </w:rPr>
+        <w:t xml:space="preserve">폐지 규정은 검색 대상에서 자동 제외하되, 과거 사례의 근거 확인 목적으로 이력 보존</w:t>
+      </w:r>
+    </w:p>
+    <w:p>
+      <w:pPr>
+        <w:pStyle w:val="ListParagraph"/>
+        <w:numPr>
+          <w:ilvl w:val="0"/>
+          <w:numId w:val="2"/>
+        </w:numPr>
+        <w:spacing w:after="30" w:line="264"/>
+      </w:pPr>
+      <w:r>
+        <w:rPr>
+          <w:rFonts w:ascii="맑은 고딕" w:cs="맑은 고딕" w:eastAsia="맑은 고딕" w:hAnsi="맑은 고딕"/>
+          <w:sz w:val="20"/>
+          <w:szCs w:val="20"/>
+        </w:rPr>
+        <w:t xml:space="preserve">원본 문서 보존 및 답변 근거의 원문 대조 가능성 확보</w:t>
+      </w:r>
+    </w:p>
+    <w:p>
+      <w:pPr>
+        <w:pStyle w:val="ListParagraph"/>
+        <w:numPr>
+          <w:ilvl w:val="0"/>
+          <w:numId w:val="2"/>
+        </w:numPr>
+        <w:spacing w:after="30" w:line="264"/>
+      </w:pPr>
+      <w:r>
+        <w:rPr>
+          <w:rFonts w:ascii="맑은 고딕" w:cs="맑은 고딕" w:eastAsia="맑은 고딕" w:hAnsi="맑은 고딕"/>
+          <w:b/>
+          <w:bCs/>
+          <w:sz w:val="20"/>
+          <w:szCs w:val="20"/>
+        </w:rPr>
+        <w:t xml:space="preserve">개인정보 포함 데이터의 적재 금지</w:t>
+      </w:r>
+    </w:p>
+    <w:p>
+      <w:pPr>
+        <w:pStyle w:val="Heading2"/>
+        <w:spacing w:after="70" w:before="180"/>
+      </w:pPr>
+      <w:r>
+        <w:rPr>
+          <w:rFonts w:ascii="맑은 고딕" w:cs="맑은 고딕" w:eastAsia="맑은 고딕" w:hAnsi="맑은 고딕"/>
+          <w:b/>
+          <w:bCs/>
+          <w:color w:val="1F4E79"/>
+          <w:sz w:val="22"/>
+          <w:szCs w:val="22"/>
+        </w:rPr>
+        <w:t xml:space="preserve">데이터 관리 (거버넌스)</w:t>
+      </w:r>
+    </w:p>
+    <w:p>
+      <w:pPr>
+        <w:pStyle w:val="ListParagraph"/>
+        <w:numPr>
+          <w:ilvl w:val="0"/>
+          <w:numId w:val="2"/>
+        </w:numPr>
+        <w:spacing w:after="30" w:line="264"/>
+      </w:pPr>
+      <w:r>
+        <w:rPr>
+          <w:rFonts w:ascii="맑은 고딕" w:cs="맑은 고딕" w:eastAsia="맑은 고딕" w:hAnsi="맑은 고딕"/>
+          <w:b/>
+          <w:bCs/>
+          <w:sz w:val="20"/>
+          <w:szCs w:val="20"/>
+        </w:rPr>
+        <w:t xml:space="preserve">데이터별 소유 주체 지정</w:t>
+      </w:r>
+      <w:r>
+        <w:rPr>
+          <w:rFonts w:ascii="맑은 고딕" w:cs="맑은 고딕" w:eastAsia="맑은 고딕" w:hAnsi="맑은 고딕"/>
+          <w:sz w:val="20"/>
+          <w:szCs w:val="20"/>
+        </w:rPr>
+        <w:t xml:space="preserve"> — 규정·지침은 HR·직원만족부, 안내서·양식·사례는 글로벌사업그룹, 처리 사례는 시스템</w:t>
+      </w:r>
+    </w:p>
+    <w:p>
+      <w:pPr>
+        <w:pStyle w:val="ListParagraph"/>
+        <w:numPr>
+          <w:ilvl w:val="0"/>
+          <w:numId w:val="2"/>
+        </w:numPr>
+        <w:spacing w:after="30" w:line="264"/>
+      </w:pPr>
+      <w:r>
+        <w:rPr>
+          <w:rFonts w:ascii="맑은 고딕" w:cs="맑은 고딕" w:eastAsia="맑은 고딕" w:hAnsi="맑은 고딕"/>
+          <w:sz w:val="20"/>
+          <w:szCs w:val="20"/>
+        </w:rPr>
+        <w:t xml:space="preserve">갱신 책임을 개인이 아닌 </w:t>
+      </w:r>
+      <w:r>
+        <w:rPr>
+          <w:rFonts w:ascii="맑은 고딕" w:cs="맑은 고딕" w:eastAsia="맑은 고딕" w:hAnsi="맑은 고딕"/>
+          <w:b/>
+          <w:bCs/>
+          <w:sz w:val="20"/>
+          <w:szCs w:val="20"/>
+        </w:rPr>
+        <w:t xml:space="preserve">역할 기준으로 지정</w:t>
+      </w:r>
+      <w:r>
+        <w:rPr>
+          <w:rFonts w:ascii="맑은 고딕" w:cs="맑은 고딕" w:eastAsia="맑은 고딕" w:hAnsi="맑은 고딕"/>
+          <w:sz w:val="20"/>
+          <w:szCs w:val="20"/>
+        </w:rPr>
+        <w:t xml:space="preserve">하여 인사발령 시 자동 승계</w:t>
+      </w:r>
+    </w:p>
+    <w:p>
+      <w:pPr>
+        <w:pStyle w:val="ListParagraph"/>
+        <w:numPr>
+          <w:ilvl w:val="0"/>
+          <w:numId w:val="2"/>
+        </w:numPr>
+        <w:spacing w:after="30" w:line="264"/>
+      </w:pPr>
+      <w:r>
+        <w:rPr>
+          <w:rFonts w:ascii="맑은 고딕" w:cs="맑은 고딕" w:eastAsia="맑은 고딕" w:hAnsi="맑은 고딕"/>
+          <w:b/>
+          <w:bCs/>
+          <w:sz w:val="20"/>
+          <w:szCs w:val="20"/>
+        </w:rPr>
+        <w:t xml:space="preserve">연말 정기인사 시즌을 자료 정비 시점으로 정례화</w:t>
+      </w:r>
+    </w:p>
+    <w:p>
+      <w:pPr>
+        <w:pStyle w:val="ListParagraph"/>
+        <w:numPr>
+          <w:ilvl w:val="0"/>
+          <w:numId w:val="2"/>
+        </w:numPr>
+        <w:spacing w:after="30" w:line="264"/>
+      </w:pPr>
+      <w:r>
+        <w:rPr>
+          <w:rFonts w:ascii="맑은 고딕" w:cs="맑은 고딕" w:eastAsia="맑은 고딕" w:hAnsi="맑은 고딕"/>
+          <w:b/>
+          <w:bCs/>
+          <w:sz w:val="20"/>
+          <w:szCs w:val="20"/>
+        </w:rPr>
+        <w:t xml:space="preserve">분기 1회 데이터 품질 점검</w:t>
+      </w:r>
+      <w:r>
+        <w:rPr>
+          <w:rFonts w:ascii="맑은 고딕" w:cs="맑은 고딕" w:eastAsia="맑은 고딕" w:hAnsi="맑은 고딕"/>
+          <w:sz w:val="20"/>
+          <w:szCs w:val="20"/>
+        </w:rPr>
+        <w:t xml:space="preserve"> — 최신성, 메타데이터 충족, 중복·누락 여부 확인</w:t>
+      </w:r>
+    </w:p>
+    <w:p>
+      <w:pPr>
+        <w:pStyle w:val="ListParagraph"/>
+        <w:numPr>
+          <w:ilvl w:val="0"/>
+          <w:numId w:val="2"/>
+        </w:numPr>
+        <w:spacing w:after="30" w:line="264"/>
+      </w:pPr>
+      <w:r>
+        <w:rPr>
+          <w:rFonts w:ascii="맑은 고딕" w:cs="맑은 고딕" w:eastAsia="맑은 고딕" w:hAnsi="맑은 고딕"/>
+          <w:sz w:val="20"/>
+          <w:szCs w:val="20"/>
+        </w:rPr>
+        <w:t xml:space="preserve">접근 권한의 단계별 구분 — 1단계는 담당자 한정, 2단계에서 국외근무직원 확대</w:t>
+      </w:r>
+    </w:p>
+    <w:p>
+      <w:pPr>
+        <w:pStyle w:val="ListParagraph"/>
+        <w:numPr>
+          <w:ilvl w:val="0"/>
+          <w:numId w:val="2"/>
+        </w:numPr>
+        <w:spacing w:after="30" w:line="264"/>
+      </w:pPr>
+      <w:r>
+        <w:rPr>
+          <w:rFonts w:ascii="맑은 고딕" w:cs="맑은 고딕" w:eastAsia="맑은 고딕" w:hAnsi="맑은 고딕"/>
+          <w:sz w:val="20"/>
+          <w:szCs w:val="20"/>
+        </w:rPr>
+        <w:t xml:space="preserve">데이터 등록·수정 주체 및 변경 이력의 기록·보존</w:t>
+      </w:r>
+    </w:p>
+    <w:p>
+      <w:pPr>
+        <w:pStyle w:val="ListParagraph"/>
+        <w:numPr>
+          <w:ilvl w:val="0"/>
+          <w:numId w:val="2"/>
+        </w:numPr>
+        <w:spacing w:after="30" w:line="264"/>
+      </w:pPr>
+      <w:r>
+        <w:rPr>
+          <w:rFonts w:ascii="맑은 고딕" w:cs="맑은 고딕" w:eastAsia="맑은 고딕" w:hAnsi="맑은 고딕"/>
+          <w:sz w:val="20"/>
+          <w:szCs w:val="20"/>
+        </w:rPr>
+        <w:t xml:space="preserve">데이터 폐기 및 보존 기준의 사전 정의</w:t>
       </w:r>
     </w:p>
     <w:p>
@@ -5505,13 +5407,43 @@
           <w:sz w:val="20"/>
           <w:szCs w:val="20"/>
         </w:rPr>
-        <w:t xml:space="preserve">답변 품질 지표는 사용자 규모와 무관한 측정이 가능하여, 초기 단계에서 활용 가능한 정량 근거에 해당.</w:t>
-      </w:r>
-    </w:p>
-    <w:p>
-      <w:pPr>
-        <w:pStyle w:val="Heading2"/>
-        <w:spacing w:after="70" w:before="180"/>
+        <w:t xml:space="preserve">규정은 자동 수집되나 안내서·양식·사례는 본점 담당자의 직접 정비 필요. </w:t>
+      </w:r>
+      <w:r>
+        <w:rPr>
+          <w:rFonts w:ascii="맑은 고딕" w:cs="맑은 고딕" w:eastAsia="맑은 고딕" w:hAnsi="맑은 고딕"/>
+          <w:b/>
+          <w:bCs/>
+          <w:i w:val="false"/>
+          <w:iCs w:val="false"/>
+          <w:sz w:val="20"/>
+          <w:szCs w:val="20"/>
+        </w:rPr>
+        <w:t xml:space="preserve">자료 정비 시점을 연말 정기인사 시즌으로 정례화하고, 산출물 기준으로 관리 요구.</w:t>
+      </w:r>
+    </w:p>
+    <w:p>
+      <w:pPr>
+        <w:pBdr>
+          <w:bottom w:val="single" w:color="BFBFBF" w:sz="6" w:space="2"/>
+        </w:pBdr>
+        <w:spacing w:after="100" w:before="100"/>
+      </w:pPr>
+      <w:r>
+        <w:rPr>
+          <w:sz w:val="2"/>
+          <w:szCs w:val="2"/>
+        </w:rPr>
+        <w:t xml:space="preserve"/>
+      </w:r>
+    </w:p>
+    <w:p>
+      <w:pPr>
+        <w:pStyle w:val="Heading1"/>
+        <w:pBdr>
+          <w:bottom w:val="single" w:color="BFBFBF" w:sz="6" w:space="6"/>
+        </w:pBdr>
+        <w:spacing w:after="140" w:before="0"/>
       </w:pPr>
       <w:r>
         <w:rPr>
@@ -5519,94 +5451,10 @@
           <w:b/>
           <w:bCs/>
           <w:color w:val="1F4E79"/>
-          <w:sz w:val="22"/>
-          <w:szCs w:val="22"/>
-        </w:rPr>
-        <w:t xml:space="preserve">활용도</w:t>
-      </w:r>
-    </w:p>
-    <w:p>
-      <w:pPr>
-        <w:pStyle w:val="ListParagraph"/>
-        <w:numPr>
-          <w:ilvl w:val="0"/>
-          <w:numId w:val="2"/>
-        </w:numPr>
-        <w:spacing w:after="30" w:line="264"/>
-      </w:pPr>
-      <w:r>
-        <w:rPr>
-          <w:rFonts w:ascii="맑은 고딕" w:cs="맑은 고딕" w:eastAsia="맑은 고딕" w:hAnsi="맑은 고딕"/>
-          <w:b/>
-          <w:bCs/>
-          <w:sz w:val="20"/>
-          <w:szCs w:val="20"/>
-        </w:rPr>
-        <w:t xml:space="preserve">담당자 주간 사용률</w:t>
-      </w:r>
-      <w:r>
-        <w:rPr>
-          <w:rFonts w:ascii="맑은 고딕" w:cs="맑은 고딕" w:eastAsia="맑은 고딕" w:hAnsi="맑은 고딕"/>
-          <w:sz w:val="20"/>
-          <w:szCs w:val="20"/>
-        </w:rPr>
-        <w:t xml:space="preserve"> — 주 3일 이상 (1단계 목표 지표)</w:t>
-      </w:r>
-    </w:p>
-    <w:p>
-      <w:pPr>
-        <w:pStyle w:val="ListParagraph"/>
-        <w:numPr>
-          <w:ilvl w:val="0"/>
-          <w:numId w:val="2"/>
-        </w:numPr>
-        <w:spacing w:after="30" w:line="264"/>
-      </w:pPr>
-      <w:r>
-        <w:rPr>
-          <w:rFonts w:ascii="맑은 고딕" w:cs="맑은 고딕" w:eastAsia="맑은 고딕" w:hAnsi="맑은 고딕"/>
-          <w:b/>
-          <w:bCs/>
-          <w:sz w:val="20"/>
-          <w:szCs w:val="20"/>
-        </w:rPr>
-        <w:t xml:space="preserve">국외근무직원 월 사용자 비율</w:t>
-      </w:r>
-      <w:r>
-        <w:rPr>
-          <w:rFonts w:ascii="맑은 고딕" w:cs="맑은 고딕" w:eastAsia="맑은 고딕" w:hAnsi="맑은 고딕"/>
-          <w:sz w:val="20"/>
-          <w:szCs w:val="20"/>
-        </w:rPr>
-        <w:t xml:space="preserve"> — 2단계 기준 30% 이상</w:t>
-      </w:r>
-    </w:p>
-    <w:p>
-      <w:pPr>
-        <w:pStyle w:val="ListParagraph"/>
-        <w:numPr>
-          <w:ilvl w:val="0"/>
-          <w:numId w:val="2"/>
-        </w:numPr>
-        <w:spacing w:after="30" w:line="264"/>
-      </w:pPr>
-      <w:r>
-        <w:rPr>
-          <w:rFonts w:ascii="맑은 고딕" w:cs="맑은 고딕" w:eastAsia="맑은 고딕" w:hAnsi="맑은 고딕"/>
-          <w:b/>
-          <w:bCs/>
-          <w:sz w:val="20"/>
-          <w:szCs w:val="20"/>
-        </w:rPr>
-        <w:t xml:space="preserve">재문의 비율</w:t>
-      </w:r>
-      <w:r>
-        <w:rPr>
-          <w:rFonts w:ascii="맑은 고딕" w:cs="맑은 고딕" w:eastAsia="맑은 고딕" w:hAnsi="맑은 고딕"/>
-          <w:sz w:val="20"/>
-          <w:szCs w:val="20"/>
-        </w:rPr>
-        <w:t xml:space="preserve"> — 20% 이하, 동일 사용자의 동일 주제 7일 내 재질의 비율</w:t>
+          <w:sz w:val="30"/>
+          <w:szCs w:val="30"/>
+        </w:rPr>
+        <w:t xml:space="preserve">VI. 성공 측정</w:t>
       </w:r>
     </w:p>
     <w:p>
@@ -5626,7 +5474,20 @@
           <w:sz w:val="25"/>
           <w:szCs w:val="25"/>
         </w:rPr>
-        <w:t xml:space="preserve">20. 출시 기준 / Release Criteria</w:t>
+        <w:t xml:space="preserve">19. 성공 지표 (KPIs) / Success Metrics</w:t>
+      </w:r>
+    </w:p>
+    <w:p>
+      <w:pPr>
+        <w:spacing w:after="80" w:line="264"/>
+      </w:pPr>
+      <w:r>
+        <w:rPr>
+          <w:rFonts w:ascii="맑은 고딕" w:cs="맑은 고딕" w:eastAsia="맑은 고딕" w:hAnsi="맑은 고딕"/>
+          <w:sz w:val="20"/>
+          <w:szCs w:val="20"/>
+        </w:rPr>
+        <w:t xml:space="preserve">사용자 규모가 크지 않아 통계적 비교가 어려우므로, 도입 전후 비교와 평가 문항 측정의 병행 필요.</w:t>
       </w:r>
     </w:p>
     <w:p>
@@ -5643,20 +5504,119 @@
           <w:sz w:val="22"/>
           <w:szCs w:val="22"/>
         </w:rPr>
-        <w:t xml:space="preserve">1단계 범위</w:t>
-      </w:r>
-    </w:p>
-    <w:p>
-      <w:pPr>
-        <w:spacing w:after="80" w:line="264"/>
-      </w:pPr>
-      <w:r>
-        <w:rPr>
-          <w:rFonts w:ascii="맑은 고딕" w:cs="맑은 고딕" w:eastAsia="맑은 고딕" w:hAnsi="맑은 고딕"/>
-          <w:sz w:val="20"/>
-          <w:szCs w:val="20"/>
-        </w:rPr>
-        <w:t xml:space="preserve">대상은 글로벌사업그룹 HR 담당자이며, 범위는 보수·복지 및 인사 규정 질의응답과 사례 축적. 규정의 자동 수집으로 별도 자료 준비가 불요하여 선행하고, 부임 안내는 국가별 자료 정비 선행이 필요하여 2단계으로 배치. 1차 운영 기간 중 안내서 정비 병행.</w:t>
+        <w:t xml:space="preserve">업무 성과</w:t>
+      </w:r>
+    </w:p>
+    <w:p>
+      <w:pPr>
+        <w:pStyle w:val="ListParagraph"/>
+        <w:numPr>
+          <w:ilvl w:val="0"/>
+          <w:numId w:val="2"/>
+        </w:numPr>
+        <w:spacing w:after="30" w:line="264"/>
+      </w:pPr>
+      <w:r>
+        <w:rPr>
+          <w:rFonts w:ascii="맑은 고딕" w:cs="맑은 고딕" w:eastAsia="맑은 고딕" w:hAnsi="맑은 고딕"/>
+          <w:b/>
+          <w:bCs/>
+          <w:sz w:val="20"/>
+          <w:szCs w:val="20"/>
+        </w:rPr>
+        <w:t xml:space="preserve">담당자 수신 문의 건수</w:t>
+      </w:r>
+      <w:r>
+        <w:rPr>
+          <w:rFonts w:ascii="맑은 고딕" w:cs="맑은 고딕" w:eastAsia="맑은 고딕" w:hAnsi="맑은 고딕"/>
+          <w:sz w:val="20"/>
+          <w:szCs w:val="20"/>
+        </w:rPr>
+        <w:t xml:space="preserve"> — 도입 전 대비 40% 감소 목표, 문의 채널 기록 기준 집계</w:t>
+      </w:r>
+    </w:p>
+    <w:p>
+      <w:pPr>
+        <w:pStyle w:val="ListParagraph"/>
+        <w:numPr>
+          <w:ilvl w:val="0"/>
+          <w:numId w:val="2"/>
+        </w:numPr>
+        <w:spacing w:after="30" w:line="264"/>
+      </w:pPr>
+      <w:r>
+        <w:rPr>
+          <w:rFonts w:ascii="맑은 고딕" w:cs="맑은 고딕" w:eastAsia="맑은 고딕" w:hAnsi="맑은 고딕"/>
+          <w:b/>
+          <w:bCs/>
+          <w:sz w:val="20"/>
+          <w:szCs w:val="20"/>
+        </w:rPr>
+        <w:t xml:space="preserve">담당자 개입 없이 해결된 비율</w:t>
+      </w:r>
+      <w:r>
+        <w:rPr>
+          <w:rFonts w:ascii="맑은 고딕" w:cs="맑은 고딕" w:eastAsia="맑은 고딕" w:hAnsi="맑은 고딕"/>
+          <w:sz w:val="20"/>
+          <w:szCs w:val="20"/>
+        </w:rPr>
+        <w:t xml:space="preserve"> — 60% 목표, 사용 기록 기준 집계</w:t>
+      </w:r>
+    </w:p>
+    <w:p>
+      <w:pPr>
+        <w:pStyle w:val="ListParagraph"/>
+        <w:numPr>
+          <w:ilvl w:val="0"/>
+          <w:numId w:val="2"/>
+        </w:numPr>
+        <w:spacing w:after="30" w:line="264"/>
+      </w:pPr>
+      <w:r>
+        <w:rPr>
+          <w:rFonts w:ascii="맑은 고딕" w:cs="맑은 고딕" w:eastAsia="맑은 고딕" w:hAnsi="맑은 고딕"/>
+          <w:b/>
+          <w:bCs/>
+          <w:sz w:val="20"/>
+          <w:szCs w:val="20"/>
+        </w:rPr>
+        <w:t xml:space="preserve">정기인사 시기 문의 건수</w:t>
+      </w:r>
+      <w:r>
+        <w:rPr>
+          <w:rFonts w:ascii="맑은 고딕" w:cs="맑은 고딕" w:eastAsia="맑은 고딕" w:hAnsi="맑은 고딕"/>
+          <w:sz w:val="20"/>
+          <w:szCs w:val="20"/>
+        </w:rPr>
+        <w:t xml:space="preserve"> — 전년 동기 대비 40% 감소 목표</w:t>
+      </w:r>
+    </w:p>
+    <w:p>
+      <w:pPr>
+        <w:pStyle w:val="ListParagraph"/>
+        <w:numPr>
+          <w:ilvl w:val="0"/>
+          <w:numId w:val="2"/>
+        </w:numPr>
+        <w:spacing w:after="30" w:line="264"/>
+      </w:pPr>
+      <w:r>
+        <w:rPr>
+          <w:rFonts w:ascii="맑은 고딕" w:cs="맑은 고딕" w:eastAsia="맑은 고딕" w:hAnsi="맑은 고딕"/>
+          <w:b/>
+          <w:bCs/>
+          <w:sz w:val="20"/>
+          <w:szCs w:val="20"/>
+        </w:rPr>
+        <w:t xml:space="preserve">문의 1건당 담당자 소요시간</w:t>
+      </w:r>
+      <w:r>
+        <w:rPr>
+          <w:rFonts w:ascii="맑은 고딕" w:cs="맑은 고딕" w:eastAsia="맑은 고딕" w:hAnsi="맑은 고딕"/>
+          <w:sz w:val="20"/>
+          <w:szCs w:val="20"/>
+        </w:rPr>
+        <w:t xml:space="preserve"> — 도입 전 대비 30% 단축 목표</w:t>
       </w:r>
     </w:p>
     <w:p>
@@ -5673,7 +5633,355 @@
           <w:sz w:val="22"/>
           <w:szCs w:val="22"/>
         </w:rPr>
+        <w:t xml:space="preserve">답변 품질</w:t>
+      </w:r>
+    </w:p>
+    <w:p>
+      <w:pPr>
+        <w:pStyle w:val="ListParagraph"/>
+        <w:numPr>
+          <w:ilvl w:val="0"/>
+          <w:numId w:val="2"/>
+        </w:numPr>
+        <w:spacing w:after="30" w:line="264"/>
+      </w:pPr>
+      <w:r>
+        <w:rPr>
+          <w:rFonts w:ascii="맑은 고딕" w:cs="맑은 고딕" w:eastAsia="맑은 고딕" w:hAnsi="맑은 고딕"/>
+          <w:b/>
+          <w:bCs/>
+          <w:sz w:val="20"/>
+          <w:szCs w:val="20"/>
+        </w:rPr>
+        <w:t xml:space="preserve">평가 문항 정답률</w:t>
+      </w:r>
+      <w:r>
+        <w:rPr>
+          <w:rFonts w:ascii="맑은 고딕" w:cs="맑은 고딕" w:eastAsia="맑은 고딕" w:hAnsi="맑은 고딕"/>
+          <w:sz w:val="20"/>
+          <w:szCs w:val="20"/>
+        </w:rPr>
+        <w:t xml:space="preserve"> — 90% 이상, 배포 전 및 이후 분기별 측정</w:t>
+      </w:r>
+    </w:p>
+    <w:p>
+      <w:pPr>
+        <w:pStyle w:val="ListParagraph"/>
+        <w:numPr>
+          <w:ilvl w:val="0"/>
+          <w:numId w:val="2"/>
+        </w:numPr>
+        <w:spacing w:after="30" w:line="264"/>
+      </w:pPr>
+      <w:r>
+        <w:rPr>
+          <w:rFonts w:ascii="맑은 고딕" w:cs="맑은 고딕" w:eastAsia="맑은 고딕" w:hAnsi="맑은 고딕"/>
+          <w:b/>
+          <w:bCs/>
+          <w:sz w:val="20"/>
+          <w:szCs w:val="20"/>
+        </w:rPr>
+        <w:t xml:space="preserve">출처 정확도</w:t>
+      </w:r>
+      <w:r>
+        <w:rPr>
+          <w:rFonts w:ascii="맑은 고딕" w:cs="맑은 고딕" w:eastAsia="맑은 고딕" w:hAnsi="맑은 고딕"/>
+          <w:sz w:val="20"/>
+          <w:szCs w:val="20"/>
+        </w:rPr>
+        <w:t xml:space="preserve"> — 95% 이상, 인용 조항과 실제 근거 조항의 일치율</w:t>
+      </w:r>
+    </w:p>
+    <w:p>
+      <w:pPr>
+        <w:pStyle w:val="ListParagraph"/>
+        <w:numPr>
+          <w:ilvl w:val="0"/>
+          <w:numId w:val="2"/>
+        </w:numPr>
+        <w:spacing w:after="30" w:line="264"/>
+      </w:pPr>
+      <w:r>
+        <w:rPr>
+          <w:rFonts w:ascii="맑은 고딕" w:cs="맑은 고딕" w:eastAsia="맑은 고딕" w:hAnsi="맑은 고딕"/>
+          <w:b/>
+          <w:bCs/>
+          <w:sz w:val="20"/>
+          <w:szCs w:val="20"/>
+        </w:rPr>
+        <w:t xml:space="preserve">해석 사안 판별률</w:t>
+      </w:r>
+      <w:r>
+        <w:rPr>
+          <w:rFonts w:ascii="맑은 고딕" w:cs="맑은 고딕" w:eastAsia="맑은 고딕" w:hAnsi="맑은 고딕"/>
+          <w:sz w:val="20"/>
+          <w:szCs w:val="20"/>
+        </w:rPr>
+        <w:t xml:space="preserve"> — 95% 이상, 해석 필요 문항의 정상 판별 비율</w:t>
+      </w:r>
+    </w:p>
+    <w:p>
+      <w:pPr>
+        <w:pStyle w:val="ListParagraph"/>
+        <w:numPr>
+          <w:ilvl w:val="0"/>
+          <w:numId w:val="2"/>
+        </w:numPr>
+        <w:spacing w:after="30" w:line="264"/>
+      </w:pPr>
+      <w:r>
+        <w:rPr>
+          <w:rFonts w:ascii="맑은 고딕" w:cs="맑은 고딕" w:eastAsia="맑은 고딕" w:hAnsi="맑은 고딕"/>
+          <w:b/>
+          <w:bCs/>
+          <w:sz w:val="20"/>
+          <w:szCs w:val="20"/>
+        </w:rPr>
+        <w:t xml:space="preserve">담당자 수정 정도</w:t>
+      </w:r>
+      <w:r>
+        <w:rPr>
+          <w:rFonts w:ascii="맑은 고딕" w:cs="맑은 고딕" w:eastAsia="맑은 고딕" w:hAnsi="맑은 고딕"/>
+          <w:sz w:val="20"/>
+          <w:szCs w:val="20"/>
+        </w:rPr>
+        <w:t xml:space="preserve"> — 20% 이하, 원 답변 대비 확정본 변경 비율의 자동 집계</w:t>
+      </w:r>
+    </w:p>
+    <w:p>
+      <w:pPr>
+        <w:pStyle w:val="ListParagraph"/>
+        <w:numPr>
+          <w:ilvl w:val="0"/>
+          <w:numId w:val="2"/>
+        </w:numPr>
+        <w:spacing w:after="30" w:line="264"/>
+      </w:pPr>
+      <w:r>
+        <w:rPr>
+          <w:rFonts w:ascii="맑은 고딕" w:cs="맑은 고딕" w:eastAsia="맑은 고딕" w:hAnsi="맑은 고딕"/>
+          <w:b/>
+          <w:bCs/>
+          <w:sz w:val="20"/>
+          <w:szCs w:val="20"/>
+        </w:rPr>
+        <w:t xml:space="preserve">근거 없는 답변 건수</w:t>
+      </w:r>
+      <w:r>
+        <w:rPr>
+          <w:rFonts w:ascii="맑은 고딕" w:cs="맑은 고딕" w:eastAsia="맑은 고딕" w:hAnsi="맑은 고딕"/>
+          <w:sz w:val="20"/>
+          <w:szCs w:val="20"/>
+        </w:rPr>
+        <w:t xml:space="preserve"> — 0건, 월 1회 답변 기록 표본 점검</w:t>
+      </w:r>
+    </w:p>
+    <w:p>
+      <w:pPr>
+        <w:pBdr>
+          <w:left w:val="single" w:color="E0A800" w:sz="18" w:space="8"/>
+        </w:pBdr>
+        <w:shd w:fill="FFF8E1" w:val="clear"/>
+        <w:spacing w:after="90" w:line="264"/>
+        <w:ind w:left="260"/>
+      </w:pPr>
+      <w:r>
+        <w:rPr>
+          <w:rFonts w:ascii="맑은 고딕" w:cs="맑은 고딕" w:eastAsia="맑은 고딕" w:hAnsi="맑은 고딕"/>
+          <w:i w:val="false"/>
+          <w:iCs w:val="false"/>
+          <w:sz w:val="20"/>
+          <w:szCs w:val="20"/>
+        </w:rPr>
+        <w:t xml:space="preserve">답변 품질 지표는 사용자 규모와 무관한 측정이 가능하여, 초기 단계에서 활용 가능한 정량 근거에 해당.</w:t>
+      </w:r>
+    </w:p>
+    <w:p>
+      <w:pPr>
+        <w:pStyle w:val="Heading2"/>
+        <w:spacing w:after="70" w:before="180"/>
+      </w:pPr>
+      <w:r>
+        <w:rPr>
+          <w:rFonts w:ascii="맑은 고딕" w:cs="맑은 고딕" w:eastAsia="맑은 고딕" w:hAnsi="맑은 고딕"/>
+          <w:b/>
+          <w:bCs/>
+          <w:color w:val="1F4E79"/>
+          <w:sz w:val="22"/>
+          <w:szCs w:val="22"/>
+        </w:rPr>
+        <w:t xml:space="preserve">활용도</w:t>
+      </w:r>
+    </w:p>
+    <w:p>
+      <w:pPr>
+        <w:pStyle w:val="ListParagraph"/>
+        <w:numPr>
+          <w:ilvl w:val="0"/>
+          <w:numId w:val="2"/>
+        </w:numPr>
+        <w:spacing w:after="30" w:line="264"/>
+      </w:pPr>
+      <w:r>
+        <w:rPr>
+          <w:rFonts w:ascii="맑은 고딕" w:cs="맑은 고딕" w:eastAsia="맑은 고딕" w:hAnsi="맑은 고딕"/>
+          <w:b/>
+          <w:bCs/>
+          <w:sz w:val="20"/>
+          <w:szCs w:val="20"/>
+        </w:rPr>
+        <w:t xml:space="preserve">담당자 주간 사용률</w:t>
+      </w:r>
+      <w:r>
+        <w:rPr>
+          <w:rFonts w:ascii="맑은 고딕" w:cs="맑은 고딕" w:eastAsia="맑은 고딕" w:hAnsi="맑은 고딕"/>
+          <w:sz w:val="20"/>
+          <w:szCs w:val="20"/>
+        </w:rPr>
+        <w:t xml:space="preserve"> — 주 3일 이상 (1단계 목표 지표)</w:t>
+      </w:r>
+    </w:p>
+    <w:p>
+      <w:pPr>
+        <w:pStyle w:val="ListParagraph"/>
+        <w:numPr>
+          <w:ilvl w:val="0"/>
+          <w:numId w:val="2"/>
+        </w:numPr>
+        <w:spacing w:after="30" w:line="264"/>
+      </w:pPr>
+      <w:r>
+        <w:rPr>
+          <w:rFonts w:ascii="맑은 고딕" w:cs="맑은 고딕" w:eastAsia="맑은 고딕" w:hAnsi="맑은 고딕"/>
+          <w:b/>
+          <w:bCs/>
+          <w:sz w:val="20"/>
+          <w:szCs w:val="20"/>
+        </w:rPr>
+        <w:t xml:space="preserve">국외근무직원 월 사용자 비율</w:t>
+      </w:r>
+      <w:r>
+        <w:rPr>
+          <w:rFonts w:ascii="맑은 고딕" w:cs="맑은 고딕" w:eastAsia="맑은 고딕" w:hAnsi="맑은 고딕"/>
+          <w:sz w:val="20"/>
+          <w:szCs w:val="20"/>
+        </w:rPr>
+        <w:t xml:space="preserve"> — 2단계 기준 30% 이상</w:t>
+      </w:r>
+    </w:p>
+    <w:p>
+      <w:pPr>
+        <w:pStyle w:val="ListParagraph"/>
+        <w:numPr>
+          <w:ilvl w:val="0"/>
+          <w:numId w:val="2"/>
+        </w:numPr>
+        <w:spacing w:after="30" w:line="264"/>
+      </w:pPr>
+      <w:r>
+        <w:rPr>
+          <w:rFonts w:ascii="맑은 고딕" w:cs="맑은 고딕" w:eastAsia="맑은 고딕" w:hAnsi="맑은 고딕"/>
+          <w:b/>
+          <w:bCs/>
+          <w:sz w:val="20"/>
+          <w:szCs w:val="20"/>
+        </w:rPr>
+        <w:t xml:space="preserve">재문의 비율</w:t>
+      </w:r>
+      <w:r>
+        <w:rPr>
+          <w:rFonts w:ascii="맑은 고딕" w:cs="맑은 고딕" w:eastAsia="맑은 고딕" w:hAnsi="맑은 고딕"/>
+          <w:sz w:val="20"/>
+          <w:szCs w:val="20"/>
+        </w:rPr>
+        <w:t xml:space="preserve"> — 20% 이하, 동일 사용자의 동일 주제 7일 내 재질의 비율</w:t>
+      </w:r>
+    </w:p>
+    <w:p>
+      <w:pPr>
+        <w:pStyle w:val="Heading1"/>
+        <w:pBdr>
+          <w:bottom w:val="single" w:color="BFBFBF" w:sz="6" w:space="6"/>
+        </w:pBdr>
+        <w:spacing w:after="100" w:before="240"/>
+      </w:pPr>
+      <w:r>
+        <w:rPr>
+          <w:rFonts w:ascii="맑은 고딕" w:cs="맑은 고딕" w:eastAsia="맑은 고딕" w:hAnsi="맑은 고딕"/>
+          <w:b/>
+          <w:bCs/>
+          <w:color w:val="1F4E79"/>
+          <w:sz w:val="25"/>
+          <w:szCs w:val="25"/>
+        </w:rPr>
+        <w:t xml:space="preserve">20. 출시 기준 / Release Criteria</w:t>
+      </w:r>
+    </w:p>
+    <w:p>
+      <w:pPr>
+        <w:pStyle w:val="Heading2"/>
+        <w:spacing w:after="70" w:before="180"/>
+      </w:pPr>
+      <w:r>
+        <w:rPr>
+          <w:rFonts w:ascii="맑은 고딕" w:cs="맑은 고딕" w:eastAsia="맑은 고딕" w:hAnsi="맑은 고딕"/>
+          <w:b/>
+          <w:bCs/>
+          <w:color w:val="1F4E79"/>
+          <w:sz w:val="22"/>
+          <w:szCs w:val="22"/>
+        </w:rPr>
+        <w:t xml:space="preserve">1단계 범위</w:t>
+      </w:r>
+    </w:p>
+    <w:p>
+      <w:pPr>
+        <w:spacing w:after="80" w:line="264"/>
+      </w:pPr>
+      <w:r>
+        <w:rPr>
+          <w:rFonts w:ascii="맑은 고딕" w:cs="맑은 고딕" w:eastAsia="맑은 고딕" w:hAnsi="맑은 고딕"/>
+          <w:sz w:val="20"/>
+          <w:szCs w:val="20"/>
+        </w:rPr>
+        <w:t xml:space="preserve">대상은 글로벌사업그룹 HR 담당자이며, 범위는 보수·복지 및 인사 규정 질의응답과 사례 축적. 규정의 자동 수집으로 별도 자료 준비가 불요하여 선행하고, 부임 안내는 국가별 자료 정비 선행이 필요하여 2단계으로 배치. 1차 운영 기간 중 안내서 정비 병행.</w:t>
+      </w:r>
+    </w:p>
+    <w:p>
+      <w:pPr>
+        <w:pStyle w:val="Heading2"/>
+        <w:spacing w:after="70" w:before="180"/>
+      </w:pPr>
+      <w:r>
+        <w:rPr>
+          <w:rFonts w:ascii="맑은 고딕" w:cs="맑은 고딕" w:eastAsia="맑은 고딕" w:hAnsi="맑은 고딕"/>
+          <w:b/>
+          <w:bCs/>
+          <w:color w:val="1F4E79"/>
+          <w:sz w:val="22"/>
+          <w:szCs w:val="22"/>
+        </w:rPr>
         <w:t xml:space="preserve">개발 착수 조건</w:t>
+      </w:r>
+    </w:p>
+    <w:p>
+      <w:pPr>
+        <w:pStyle w:val="ListParagraph"/>
+        <w:numPr>
+          <w:ilvl w:val="0"/>
+          <w:numId w:val="2"/>
+        </w:numPr>
+        <w:spacing w:after="30" w:line="264"/>
+      </w:pPr>
+      <w:r>
+        <w:rPr>
+          <w:rFonts w:ascii="맑은 고딕" w:cs="맑은 고딕" w:eastAsia="맑은 고딕" w:hAnsi="맑은 고딕"/>
+          <w:b/>
+          <w:bCs/>
+          <w:sz w:val="20"/>
+          <w:szCs w:val="20"/>
+        </w:rPr>
+        <w:t xml:space="preserve">데이터시스템부와 데이터 수집·적재·관리 체계 협의 및 확정 완료</w:t>
       </w:r>
     </w:p>
     <w:p>
@@ -6034,6 +6342,34 @@
           <w:sz w:val="20"/>
           <w:szCs w:val="20"/>
         </w:rPr>
+        <w:t xml:space="preserve">데이터 거버넌스 미확정 상태 착수</w:t>
+      </w:r>
+      <w:r>
+        <w:rPr>
+          <w:rFonts w:ascii="맑은 고딕" w:cs="맑은 고딕" w:eastAsia="맑은 고딕" w:hAnsi="맑은 고딕"/>
+          <w:sz w:val="20"/>
+          <w:szCs w:val="20"/>
+        </w:rPr>
+        <w:t xml:space="preserve"> — 수집·적재·관리 기준 없이 자료를 축적할 경우 구조 변경에 따른 재작업 발생 우려. 착수 전 데이터시스템부 협의를 통한 체계 확정으로 완화</w:t>
+      </w:r>
+    </w:p>
+    <w:p>
+      <w:pPr>
+        <w:pStyle w:val="ListParagraph"/>
+        <w:numPr>
+          <w:ilvl w:val="0"/>
+          <w:numId w:val="2"/>
+        </w:numPr>
+        <w:spacing w:after="30" w:line="264"/>
+      </w:pPr>
+      <w:r>
+        <w:rPr>
+          <w:rFonts w:ascii="맑은 고딕" w:cs="맑은 고딕" w:eastAsia="맑은 고딕" w:hAnsi="맑은 고딕"/>
+          <w:b/>
+          <w:bCs/>
+          <w:sz w:val="20"/>
+          <w:szCs w:val="20"/>
+        </w:rPr>
         <w:t xml:space="preserve">자료 정비 지연</w:t>
       </w:r>
       <w:r>
@@ -6042,7 +6378,7 @@
           <w:sz w:val="20"/>
           <w:szCs w:val="20"/>
         </w:rPr>
-        <w:t xml:space="preserve"> — 담당 부서의 본업 병행에 따른 지연 우려. 산출물 기준 관리 및 인사발령 이전 마감 설정, 착수 전 1개국분 확보를 통한 일정 현실성 검증으로 완화</w:t>
+        <w:t xml:space="preserve"> — 본점 담당자의 본업 병행에 따른 지연 우려. 연말 정기인사 시즌을 정비 시점으로 정례화하고 산출물 기준으로 관리하여 완화</w:t>
       </w:r>
     </w:p>
     <w:p>
@@ -6760,6 +7096,34 @@
           <w:sz w:val="20"/>
           <w:szCs w:val="20"/>
         </w:rPr>
+        <w:t xml:space="preserve">데이터시스템부</w:t>
+      </w:r>
+      <w:r>
+        <w:rPr>
+          <w:rFonts w:ascii="맑은 고딕" w:cs="맑은 고딕" w:eastAsia="맑은 고딕" w:hAnsi="맑은 고딕"/>
+          <w:sz w:val="20"/>
+          <w:szCs w:val="20"/>
+        </w:rPr>
+        <w:t xml:space="preserve"> — 데이터 수집·적재·관리 체계의 기준 협의 및 확정. 착수 전 협의 필수</w:t>
+      </w:r>
+    </w:p>
+    <w:p>
+      <w:pPr>
+        <w:pStyle w:val="ListParagraph"/>
+        <w:numPr>
+          <w:ilvl w:val="0"/>
+          <w:numId w:val="2"/>
+        </w:numPr>
+        <w:spacing w:after="30" w:line="264"/>
+      </w:pPr>
+      <w:r>
+        <w:rPr>
+          <w:rFonts w:ascii="맑은 고딕" w:cs="맑은 고딕" w:eastAsia="맑은 고딕" w:hAnsi="맑은 고딕"/>
+          <w:b/>
+          <w:bCs/>
+          <w:sz w:val="20"/>
+          <w:szCs w:val="20"/>
+        </w:rPr>
         <w:t xml:space="preserve">구축 담당</w:t>
       </w:r>
       <w:r>
@@ -6870,7 +7234,25 @@
           <w:sz w:val="20"/>
           <w:szCs w:val="20"/>
         </w:rPr>
-        <w:t xml:space="preserve"> — 문의 30건 분류, 평가 문항 작성, 소관부서 협의, 자동 수집 체계 확인, 부임 안내서 1개국분 확보</w:t>
+        <w:t xml:space="preserve"> — </w:t>
+      </w:r>
+      <w:r>
+        <w:rPr>
+          <w:rFonts w:ascii="맑은 고딕" w:cs="맑은 고딕" w:eastAsia="맑은 고딕" w:hAnsi="맑은 고딕"/>
+          <w:b/>
+          <w:bCs/>
+          <w:sz w:val="20"/>
+          <w:szCs w:val="20"/>
+        </w:rPr>
+        <w:t xml:space="preserve">데이터시스템부와 데이터 거버넌스 협의</w:t>
+      </w:r>
+      <w:r>
+        <w:rPr>
+          <w:rFonts w:ascii="맑은 고딕" w:cs="맑은 고딕" w:eastAsia="맑은 고딕" w:hAnsi="맑은 고딕"/>
+          <w:sz w:val="20"/>
+          <w:szCs w:val="20"/>
+        </w:rPr>
+        <w:t xml:space="preserve">, 문의 30건 분류, 평가 문항 작성, 소관부서 협의, 자동 수집 체계 확인</w:t>
       </w:r>
     </w:p>
     <w:p>
@@ -7131,6 +7513,34 @@
           <w:szCs w:val="25"/>
         </w:rPr>
         <w:t xml:space="preserve">부록 — 미해결 사항</w:t>
+      </w:r>
+    </w:p>
+    <w:p>
+      <w:pPr>
+        <w:pStyle w:val="ListParagraph"/>
+        <w:numPr>
+          <w:ilvl w:val="0"/>
+          <w:numId w:val="2"/>
+        </w:numPr>
+        <w:spacing w:after="30" w:line="264"/>
+      </w:pPr>
+      <w:r>
+        <w:rPr>
+          <w:rFonts w:ascii="맑은 고딕" w:cs="맑은 고딕" w:eastAsia="맑은 고딕" w:hAnsi="맑은 고딕"/>
+          <w:b/>
+          <w:bCs/>
+          <w:sz w:val="20"/>
+          <w:szCs w:val="20"/>
+        </w:rPr>
+        <w:t xml:space="preserve">데이터 거버넌스 기준</w:t>
+      </w:r>
+      <w:r>
+        <w:rPr>
+          <w:rFonts w:ascii="맑은 고딕" w:cs="맑은 고딕" w:eastAsia="맑은 고딕" w:hAnsi="맑은 고딕"/>
+          <w:sz w:val="20"/>
+          <w:szCs w:val="20"/>
+        </w:rPr>
+        <w:t xml:space="preserve"> — 데이터시스템부와 수집·적재·관리 체계 협의 후 확정 필요. 착수 선행 조건</w:t>
       </w:r>
     </w:p>
     <w:p>

</xml_diff>

<commit_message>
Correct data governance ownership and remove unconfirmed items
세 가지 수정사항 반영.

데이터 거버넌스 주체 정정:
- 데이터시스템부와의 협의 사항이 아니라, 데이터의 추후 관리 주체를
  누가 맡을지에 대한 글로벌사업그룹 내부 논의 사항으로 정정
- 데이터 수집은 이미 진행 중인 활동이므로 거버넌스 확정을 착수
  전제조건으로 거는 표현을 제거
- 개발 착수 조건에서 데이터시스템부 협의 항목 삭제
- 위험 항목을 데이터 관리 주체 미지정으로 재정의
- 이해관계자에서 데이터시스템부 항목 삭제
- 일정(사전 검증)에서 데이터 거버넌스 협의 항목 삭제
- 미해결 사항을 데이터 관리 주체 지정으로 재정의

미확정 항목 제거:
- 제외 범위에서 항공·숙박 예약 시스템 연동 항목 삭제
- 국외출장 관리 항목의 확장 가능성에 대한 추정 서술 삭제

위험 항목 구체화:
- 답변 가능 비율 미달 위험을 사전 조사 도구(문의 기록 30건)와
  연결하고, 60~70퍼센트 구간과 60퍼센트 미만 구간별 대응을 구체적으로
  명시

Co-Authored-By: Claude Opus 5 <noreply@anthropic.com>
Claude-Session: https://claude.ai/code/session_01Ekn86cpQq9yULpsy9iFqKx
</commit_message>
<xml_diff>
--- a/prds/국외근무직원-HR-에이전트-PRD.docx
+++ b/prds/국외근무직원-HR-에이전트-PRD.docx
@@ -75,7 +75,7 @@
           <w:sz w:val="20"/>
           <w:szCs w:val="20"/>
         </w:rPr>
-        <w:t xml:space="preserve">버전 / Version: v0.6 (초안)</w:t>
+        <w:t xml:space="preserve">버전 / Version: v0.7 (초안)</w:t>
       </w:r>
     </w:p>
     <w:p>
@@ -4652,24 +4652,34 @@
       <w:r>
         <w:rPr>
           <w:rFonts w:ascii="맑은 고딕" w:cs="맑은 고딕" w:eastAsia="맑은 고딕" w:hAnsi="맑은 고딕"/>
-          <w:b/>
-          <w:bCs/>
           <w:i w:val="false"/>
           <w:iCs w:val="false"/>
           <w:sz w:val="20"/>
           <w:szCs w:val="20"/>
         </w:rPr>
-        <w:t xml:space="preserve">데이터 수집·적재·관리 체계를 데이터시스템부와 사전 협의하여 확정한 후 구축에 착수.</w:t>
-      </w:r>
-      <w:r>
-        <w:rPr>
-          <w:rFonts w:ascii="맑은 고딕" w:cs="맑은 고딕" w:eastAsia="맑은 고딕" w:hAnsi="맑은 고딕"/>
+        <w:t xml:space="preserve">데이터 수집은 현재 진행 중. </w:t>
+      </w:r>
+      <w:r>
+        <w:rPr>
+          <w:rFonts w:ascii="맑은 고딕" w:cs="맑은 고딕" w:eastAsia="맑은 고딕" w:hAnsi="맑은 고딕"/>
+          <w:b/>
+          <w:bCs/>
           <w:i w:val="false"/>
           <w:iCs w:val="false"/>
           <w:sz w:val="20"/>
           <w:szCs w:val="20"/>
         </w:rPr>
-        <w:t xml:space="preserve"> 체계 미확정 상태에서 자료를 축적할 경우 재작업 발생 우려.</w:t>
+        <w:t xml:space="preserve">데이터의 추후 관리 주체 지정은 글로벌사업그룹 내부에서 별도 논의 필요</w:t>
+      </w:r>
+      <w:r>
+        <w:rPr>
+          <w:rFonts w:ascii="맑은 고딕" w:cs="맑은 고딕" w:eastAsia="맑은 고딕" w:hAnsi="맑은 고딕"/>
+          <w:i w:val="false"/>
+          <w:iCs w:val="false"/>
+          <w:sz w:val="20"/>
+          <w:szCs w:val="20"/>
+        </w:rPr>
+        <w:t xml:space="preserve"> (누가 계속 관리할지).</w:t>
       </w:r>
     </w:p>
     <w:p>
@@ -5249,7 +5259,17 @@
           <w:sz w:val="20"/>
           <w:szCs w:val="20"/>
         </w:rPr>
-        <w:t xml:space="preserve"> — 규정·지침은 HR·직원만족부, 안내서·양식·사례는 글로벌사업그룹, 처리 사례는 시스템</w:t>
+        <w:t xml:space="preserve"> — 규정·지침은 HR·직원만족부 소관. 안내서·양식·사례 등 나머지 데이터의 관리 주체는 </w:t>
+      </w:r>
+      <w:r>
+        <w:rPr>
+          <w:rFonts w:ascii="맑은 고딕" w:cs="맑은 고딕" w:eastAsia="맑은 고딕" w:hAnsi="맑은 고딕"/>
+          <w:b/>
+          <w:bCs/>
+          <w:sz w:val="20"/>
+          <w:szCs w:val="20"/>
+        </w:rPr>
+        <w:t xml:space="preserve">글로벌사업그룹 내부 논의를 통해 추후 지정</w:t>
       </w:r>
     </w:p>
     <w:p>
@@ -5976,26 +5996,6 @@
       <w:r>
         <w:rPr>
           <w:rFonts w:ascii="맑은 고딕" w:cs="맑은 고딕" w:eastAsia="맑은 고딕" w:hAnsi="맑은 고딕"/>
-          <w:b/>
-          <w:bCs/>
-          <w:sz w:val="20"/>
-          <w:szCs w:val="20"/>
-        </w:rPr>
-        <w:t xml:space="preserve">데이터시스템부와 데이터 수집·적재·관리 체계 협의 및 확정 완료</w:t>
-      </w:r>
-    </w:p>
-    <w:p>
-      <w:pPr>
-        <w:pStyle w:val="ListParagraph"/>
-        <w:numPr>
-          <w:ilvl w:val="0"/>
-          <w:numId w:val="2"/>
-        </w:numPr>
-        <w:spacing w:after="30" w:line="264"/>
-      </w:pPr>
-      <w:r>
-        <w:rPr>
-          <w:rFonts w:ascii="맑은 고딕" w:cs="맑은 고딕" w:eastAsia="맑은 고딕" w:hAnsi="맑은 고딕"/>
           <w:sz w:val="20"/>
           <w:szCs w:val="20"/>
         </w:rPr>
@@ -6342,15 +6342,15 @@
           <w:sz w:val="20"/>
           <w:szCs w:val="20"/>
         </w:rPr>
-        <w:t xml:space="preserve">데이터 거버넌스 미확정 상태 착수</w:t>
-      </w:r>
-      <w:r>
-        <w:rPr>
-          <w:rFonts w:ascii="맑은 고딕" w:cs="맑은 고딕" w:eastAsia="맑은 고딕" w:hAnsi="맑은 고딕"/>
-          <w:sz w:val="20"/>
-          <w:szCs w:val="20"/>
-        </w:rPr>
-        <w:t xml:space="preserve"> — 수집·적재·관리 기준 없이 자료를 축적할 경우 구조 변경에 따른 재작업 발생 우려. 착수 전 데이터시스템부 협의를 통한 체계 확정으로 완화</w:t>
+        <w:t xml:space="preserve">데이터 관리 주체 미지정</w:t>
+      </w:r>
+      <w:r>
+        <w:rPr>
+          <w:rFonts w:ascii="맑은 고딕" w:cs="맑은 고딕" w:eastAsia="맑은 고딕" w:hAnsi="맑은 고딕"/>
+          <w:sz w:val="20"/>
+          <w:szCs w:val="20"/>
+        </w:rPr>
+        <w:t xml:space="preserve"> — 안내서·양식·사례 등의 추후 관리 책임자가 정해지지 않을 경우 인사발령 이후 자료 최신성 유지가 어려울 위험. 글로벌사업그룹 내부 논의를 통해 역할 기준 관리 주체 지정으로 완화</w:t>
       </w:r>
     </w:p>
     <w:p>
@@ -6462,7 +6462,43 @@
           <w:sz w:val="20"/>
           <w:szCs w:val="20"/>
         </w:rPr>
-        <w:t xml:space="preserve"> — 착수 전 문의 30건 분류를 통한 사전 검증 수행, 60% 미만 시 범위 재검토 또는 중단</w:t>
+        <w:t xml:space="preserve"> — 「문의 기록 30건」 사전 조사에서 규정 인용·절차 안내로 답변 가능한 비율이 60% 미만으로 측정될 위험. 완화책은 처리 방식(규정 인용/절차 안내/해석 판단)별 실측 후 구간별 대응: </w:t>
+      </w:r>
+      <w:r>
+        <w:rPr>
+          <w:rFonts w:ascii="맑은 고딕" w:cs="맑은 고딕" w:eastAsia="맑은 고딕" w:hAnsi="맑은 고딕"/>
+          <w:b/>
+          <w:bCs/>
+          <w:sz w:val="20"/>
+          <w:szCs w:val="20"/>
+        </w:rPr>
+        <w:t xml:space="preserve">60~70%</w:t>
+      </w:r>
+      <w:r>
+        <w:rPr>
+          <w:rFonts w:ascii="맑은 고딕" w:cs="맑은 고딕" w:eastAsia="맑은 고딕" w:hAnsi="맑은 고딕"/>
+          <w:sz w:val="20"/>
+          <w:szCs w:val="20"/>
+        </w:rPr>
+        <w:t xml:space="preserve"> 구간은 해석 판단 비중이 높은 문의 유형을 특정해 해당 유형만 범위에서 제외하고 나머지로 범위를 축소해 진행, </w:t>
+      </w:r>
+      <w:r>
+        <w:rPr>
+          <w:rFonts w:ascii="맑은 고딕" w:cs="맑은 고딕" w:eastAsia="맑은 고딕" w:hAnsi="맑은 고딕"/>
+          <w:b/>
+          <w:bCs/>
+          <w:sz w:val="20"/>
+          <w:szCs w:val="20"/>
+        </w:rPr>
+        <w:t xml:space="preserve">60% 미만</w:t>
+      </w:r>
+      <w:r>
+        <w:rPr>
+          <w:rFonts w:ascii="맑은 고딕" w:cs="맑은 고딕" w:eastAsia="맑은 고딕" w:hAnsi="맑은 고딕"/>
+          <w:sz w:val="20"/>
+          <w:szCs w:val="20"/>
+        </w:rPr>
+        <w:t xml:space="preserve">은 규정 질의응답 방식의 효과가 제한적이라고 판단해 착수를 보류하고 접근 방식 재검토</w:t>
       </w:r>
     </w:p>
     <w:p>
@@ -6797,35 +6833,7 @@
           <w:sz w:val="20"/>
           <w:szCs w:val="20"/>
         </w:rPr>
-        <w:t xml:space="preserve"> — 향후 검토 대상. 여비 규정 질의응답은 자료 추가만으로 확장 가능</w:t>
-      </w:r>
-    </w:p>
-    <w:p>
-      <w:pPr>
-        <w:pStyle w:val="ListParagraph"/>
-        <w:numPr>
-          <w:ilvl w:val="0"/>
-          <w:numId w:val="2"/>
-        </w:numPr>
-        <w:spacing w:after="30" w:line="264"/>
-      </w:pPr>
-      <w:r>
-        <w:rPr>
-          <w:rFonts w:ascii="맑은 고딕" w:cs="맑은 고딕" w:eastAsia="맑은 고딕" w:hAnsi="맑은 고딕"/>
-          <w:b/>
-          <w:bCs/>
-          <w:sz w:val="20"/>
-          <w:szCs w:val="20"/>
-        </w:rPr>
-        <w:t xml:space="preserve">항공·숙박 예약 시스템 연동</w:t>
-      </w:r>
-      <w:r>
-        <w:rPr>
-          <w:rFonts w:ascii="맑은 고딕" w:cs="맑은 고딕" w:eastAsia="맑은 고딕" w:hAnsi="맑은 고딕"/>
-          <w:sz w:val="20"/>
-          <w:szCs w:val="20"/>
-        </w:rPr>
-        <w:t xml:space="preserve"> — 외부 시스템 연동 필요로 별도 과제 분리</w:t>
+        <w:t xml:space="preserve"> — 향후 별도 검토 대상, 본 과제의 범위 밖</w:t>
       </w:r>
     </w:p>
     <w:p>
@@ -7096,34 +7104,6 @@
           <w:sz w:val="20"/>
           <w:szCs w:val="20"/>
         </w:rPr>
-        <w:t xml:space="preserve">데이터시스템부</w:t>
-      </w:r>
-      <w:r>
-        <w:rPr>
-          <w:rFonts w:ascii="맑은 고딕" w:cs="맑은 고딕" w:eastAsia="맑은 고딕" w:hAnsi="맑은 고딕"/>
-          <w:sz w:val="20"/>
-          <w:szCs w:val="20"/>
-        </w:rPr>
-        <w:t xml:space="preserve"> — 데이터 수집·적재·관리 체계의 기준 협의 및 확정. 착수 전 협의 필수</w:t>
-      </w:r>
-    </w:p>
-    <w:p>
-      <w:pPr>
-        <w:pStyle w:val="ListParagraph"/>
-        <w:numPr>
-          <w:ilvl w:val="0"/>
-          <w:numId w:val="2"/>
-        </w:numPr>
-        <w:spacing w:after="30" w:line="264"/>
-      </w:pPr>
-      <w:r>
-        <w:rPr>
-          <w:rFonts w:ascii="맑은 고딕" w:cs="맑은 고딕" w:eastAsia="맑은 고딕" w:hAnsi="맑은 고딕"/>
-          <w:b/>
-          <w:bCs/>
-          <w:sz w:val="20"/>
-          <w:szCs w:val="20"/>
-        </w:rPr>
         <w:t xml:space="preserve">구축 담당</w:t>
       </w:r>
       <w:r>
@@ -7234,25 +7214,7 @@
           <w:sz w:val="20"/>
           <w:szCs w:val="20"/>
         </w:rPr>
-        <w:t xml:space="preserve"> — </w:t>
-      </w:r>
-      <w:r>
-        <w:rPr>
-          <w:rFonts w:ascii="맑은 고딕" w:cs="맑은 고딕" w:eastAsia="맑은 고딕" w:hAnsi="맑은 고딕"/>
-          <w:b/>
-          <w:bCs/>
-          <w:sz w:val="20"/>
-          <w:szCs w:val="20"/>
-        </w:rPr>
-        <w:t xml:space="preserve">데이터시스템부와 데이터 거버넌스 협의</w:t>
-      </w:r>
-      <w:r>
-        <w:rPr>
-          <w:rFonts w:ascii="맑은 고딕" w:cs="맑은 고딕" w:eastAsia="맑은 고딕" w:hAnsi="맑은 고딕"/>
-          <w:sz w:val="20"/>
-          <w:szCs w:val="20"/>
-        </w:rPr>
-        <w:t xml:space="preserve">, 문의 30건 분류, 평가 문항 작성, 소관부서 협의, 자동 수집 체계 확인</w:t>
+        <w:t xml:space="preserve"> — 문의 30건 분류, 평가 문항 작성, 소관부서 협의, 자동 수집 체계 확인</w:t>
       </w:r>
     </w:p>
     <w:p>
@@ -7532,15 +7494,15 @@
           <w:sz w:val="20"/>
           <w:szCs w:val="20"/>
         </w:rPr>
-        <w:t xml:space="preserve">데이터 거버넌스 기준</w:t>
-      </w:r>
-      <w:r>
-        <w:rPr>
-          <w:rFonts w:ascii="맑은 고딕" w:cs="맑은 고딕" w:eastAsia="맑은 고딕" w:hAnsi="맑은 고딕"/>
-          <w:sz w:val="20"/>
-          <w:szCs w:val="20"/>
-        </w:rPr>
-        <w:t xml:space="preserve"> — 데이터시스템부와 수집·적재·관리 체계 협의 후 확정 필요. 착수 선행 조건</w:t>
+        <w:t xml:space="preserve">데이터 관리 주체 지정</w:t>
+      </w:r>
+      <w:r>
+        <w:rPr>
+          <w:rFonts w:ascii="맑은 고딕" w:cs="맑은 고딕" w:eastAsia="맑은 고딕" w:hAnsi="맑은 고딕"/>
+          <w:sz w:val="20"/>
+          <w:szCs w:val="20"/>
+        </w:rPr>
+        <w:t xml:space="preserve"> — 안내서·양식·사례 등의 추후 관리 책임을 글로벌사업그룹 내부 논의를 통해 지정 필요</w:t>
       </w:r>
     </w:p>
     <w:p>

</xml_diff>

<commit_message>
Align success metrics with stage 1 goals
성공 지표를 목표 항목과 동일한 축으로 재정렬하고 1단계로 한정.

목표(7항):
- 1단계 목표에 해석 필요 질의 판별률 95퍼센트 이상을 신설.
  제안 솔루션의 핵심 설계인 답변 범위 구분이 정상 동작하는지를
  측정하는 항목이 목표에 누락되어 있었음. 정답률만으로는 해석이
  필요한 질의에 답변해버리는 실패를 식별할 수 없음
- 주간 사용률을 담당자 전원 기준으로 명시

성공 지표(19항):
- 1단계 기간에 한정 적용하고, 2단계 지표는 1단계 실측 후 설정하도록
  변경. 업무 성과 항목(문의 건수, 개입 없이 해결 비율, 소요시간 등)은
  배포 이후에만 측정 가능하므로 제외
- 구성을 활용률과 답변 품질 두 축으로 재편하고 각 축을 목표 항목과
  연결. 각 축에 주지표와 보조지표를 구분 표기
- 활용률: 개인별 충족 여부로 판정하도록 명시하고, 접속만 하는 경우와
  실무 활용의 구분, 정착 여부 확인, 소수 인원에 따른 정성 확인 병행을
  보조지표로 추가
- 답변 품질: 정답률과 판별률을 주지표로, 출처 정확도와 근거 없는 답변
  건수, 담당자 수정 정도를 보조지표로 배치

용어 정리: 해석 사안 판별을 해석 필요 질의 판별로 통일, 담당자 인원
표기를 1~2명으로 일관화

Co-Authored-By: Claude Opus 5 <noreply@anthropic.com>
Claude-Session: https://claude.ai/code/session_01Ekn86cpQq9yULpsy9iFqKx
</commit_message>
<xml_diff>
--- a/prds/국외근무직원-HR-에이전트-PRD.docx
+++ b/prds/국외근무직원-HR-에이전트-PRD.docx
@@ -75,7 +75,7 @@
           <w:sz w:val="20"/>
           <w:szCs w:val="20"/>
         </w:rPr>
-        <w:t xml:space="preserve">버전 / Version: v0.7 (초안)</w:t>
+        <w:t xml:space="preserve">버전 / Version: v0.8 (초안)</w:t>
       </w:r>
     </w:p>
     <w:p>
@@ -516,7 +516,7 @@
           <w:sz w:val="22"/>
           <w:szCs w:val="22"/>
         </w:rPr>
-        <w:t xml:space="preserve">1단계 — 담당자 전용 운영 (사용률·정확도 검증)</w:t>
+        <w:t xml:space="preserve">1단계 — 담당자 전용 운영 (활용률·답변 품질 검증)</w:t>
       </w:r>
     </w:p>
     <w:p>
@@ -534,7 +534,25 @@
           <w:sz w:val="20"/>
           <w:szCs w:val="20"/>
         </w:rPr>
-        <w:t xml:space="preserve">담당자 주간 사용률 </w:t>
+        <w:t xml:space="preserve">담당자 </w:t>
+      </w:r>
+      <w:r>
+        <w:rPr>
+          <w:rFonts w:ascii="맑은 고딕" w:cs="맑은 고딕" w:eastAsia="맑은 고딕" w:hAnsi="맑은 고딕"/>
+          <w:b/>
+          <w:bCs/>
+          <w:sz w:val="20"/>
+          <w:szCs w:val="20"/>
+        </w:rPr>
+        <w:t xml:space="preserve">전원</w:t>
+      </w:r>
+      <w:r>
+        <w:rPr>
+          <w:rFonts w:ascii="맑은 고딕" w:cs="맑은 고딕" w:eastAsia="맑은 고딕" w:hAnsi="맑은 고딕"/>
+          <w:sz w:val="20"/>
+          <w:szCs w:val="20"/>
+        </w:rPr>
+        <w:t xml:space="preserve">의 주간 사용률 </w:t>
       </w:r>
       <w:r>
         <w:rPr>
@@ -559,7 +577,7 @@
           <w:sz w:val="19"/>
           <w:szCs w:val="19"/>
         </w:rPr>
-        <w:t xml:space="preserve">(계산식) 담당자가 1회 이상 사용한 일수 ÷ 주간 근무일수 × 100</w:t>
+        <w:t xml:space="preserve">(계산식) 담당자별 1회 이상 사용한 일수 ÷ 주간 근무일수 × 100</w:t>
       </w:r>
     </w:p>
     <w:p>
@@ -602,7 +620,50 @@
           <w:sz w:val="19"/>
           <w:szCs w:val="19"/>
         </w:rPr>
-        <w:t xml:space="preserve">(계산식) 평가 문항 중 정답 처리 문항 수 ÷ 전체 평가 문항 수 × 100</w:t>
+        <w:t xml:space="preserve">(계산식) 정답 처리 문항 수 ÷ 전체 평가 문항 수 × 100</w:t>
+      </w:r>
+    </w:p>
+    <w:p>
+      <w:pPr>
+        <w:pStyle w:val="ListParagraph"/>
+        <w:numPr>
+          <w:ilvl w:val="0"/>
+          <w:numId w:val="2"/>
+        </w:numPr>
+        <w:spacing w:after="0" w:line="264"/>
+      </w:pPr>
+      <w:r>
+        <w:rPr>
+          <w:rFonts w:ascii="맑은 고딕" w:cs="맑은 고딕" w:eastAsia="맑은 고딕" w:hAnsi="맑은 고딕"/>
+          <w:sz w:val="20"/>
+          <w:szCs w:val="20"/>
+        </w:rPr>
+        <w:t xml:space="preserve">해석 필요 질의의 판별률 </w:t>
+      </w:r>
+      <w:r>
+        <w:rPr>
+          <w:rFonts w:ascii="맑은 고딕" w:cs="맑은 고딕" w:eastAsia="맑은 고딕" w:hAnsi="맑은 고딕"/>
+          <w:b/>
+          <w:bCs/>
+          <w:sz w:val="20"/>
+          <w:szCs w:val="20"/>
+        </w:rPr>
+        <w:t xml:space="preserve">95% 이상 확보</w:t>
+      </w:r>
+    </w:p>
+    <w:p>
+      <w:pPr>
+        <w:spacing w:after="130" w:before="0" w:line="252"/>
+        <w:ind w:left="300"/>
+      </w:pPr>
+      <w:r>
+        <w:rPr>
+          <w:rFonts w:ascii="맑은 고딕" w:cs="맑은 고딕" w:eastAsia="맑은 고딕" w:hAnsi="맑은 고딕"/>
+          <w:color w:val="595959"/>
+          <w:sz w:val="19"/>
+          <w:szCs w:val="19"/>
+        </w:rPr>
+        <w:t xml:space="preserve">(계산식) 답변 보류 및 소관부서 연결이 정상 수행된 문항 수 ÷ 전체 해석 필요 문항 수 × 100</w:t>
       </w:r>
     </w:p>
     <w:p>
@@ -4245,15 +4306,15 @@
           <w:sz w:val="20"/>
           <w:szCs w:val="20"/>
         </w:rPr>
-        <w:t xml:space="preserve">해석 사안 판별</w:t>
-      </w:r>
-      <w:r>
-        <w:rPr>
-          <w:rFonts w:ascii="맑은 고딕" w:cs="맑은 고딕" w:eastAsia="맑은 고딕" w:hAnsi="맑은 고딕"/>
-          <w:sz w:val="20"/>
-          <w:szCs w:val="20"/>
-        </w:rPr>
-        <w:t xml:space="preserve"> — 해석 필요 질의의 판별률 95% 이상 요구</w:t>
+        <w:t xml:space="preserve">해석 필요 질의 판별</w:t>
+      </w:r>
+      <w:r>
+        <w:rPr>
+          <w:rFonts w:ascii="맑은 고딕" w:cs="맑은 고딕" w:eastAsia="맑은 고딕" w:hAnsi="맑은 고딕"/>
+          <w:sz w:val="20"/>
+          <w:szCs w:val="20"/>
+        </w:rPr>
+        <w:t xml:space="preserve"> — 답변 보류 및 소관부서 연결의 정상 수행 비율 95% 이상 요구</w:t>
       </w:r>
     </w:p>
     <w:p>
@@ -5507,7 +5568,25 @@
           <w:sz w:val="20"/>
           <w:szCs w:val="20"/>
         </w:rPr>
-        <w:t xml:space="preserve">사용자 규모가 크지 않아 통계적 비교가 어려우므로, 도입 전후 비교와 평가 문항 측정의 병행 필요.</w:t>
+        <w:t xml:space="preserve">본 지표는 </w:t>
+      </w:r>
+      <w:r>
+        <w:rPr>
+          <w:rFonts w:ascii="맑은 고딕" w:cs="맑은 고딕" w:eastAsia="맑은 고딕" w:hAnsi="맑은 고딕"/>
+          <w:b/>
+          <w:bCs/>
+          <w:sz w:val="20"/>
+          <w:szCs w:val="20"/>
+        </w:rPr>
+        <w:t xml:space="preserve">1단계(담당자 전용 운영) 기간에 한정 적용</w:t>
+      </w:r>
+      <w:r>
+        <w:rPr>
+          <w:rFonts w:ascii="맑은 고딕" w:cs="맑은 고딕" w:eastAsia="맑은 고딕" w:hAnsi="맑은 고딕"/>
+          <w:sz w:val="20"/>
+          <w:szCs w:val="20"/>
+        </w:rPr>
+        <w:t xml:space="preserve">하며, 7항의 1단계 목표를 측정 단위로 세분한 것. 2단계 지표는 1단계 종료 시점의 실측값을 기준으로 별도 설정.</w:t>
       </w:r>
     </w:p>
     <w:p>
@@ -5524,119 +5603,175 @@
           <w:sz w:val="22"/>
           <w:szCs w:val="22"/>
         </w:rPr>
-        <w:t xml:space="preserve">업무 성과</w:t>
-      </w:r>
-    </w:p>
-    <w:p>
-      <w:pPr>
-        <w:pStyle w:val="ListParagraph"/>
-        <w:numPr>
-          <w:ilvl w:val="0"/>
-          <w:numId w:val="2"/>
-        </w:numPr>
-        <w:spacing w:after="30" w:line="264"/>
-      </w:pPr>
-      <w:r>
-        <w:rPr>
-          <w:rFonts w:ascii="맑은 고딕" w:cs="맑은 고딕" w:eastAsia="맑은 고딕" w:hAnsi="맑은 고딕"/>
-          <w:b/>
-          <w:bCs/>
-          <w:sz w:val="20"/>
-          <w:szCs w:val="20"/>
-        </w:rPr>
-        <w:t xml:space="preserve">담당자 수신 문의 건수</w:t>
-      </w:r>
-      <w:r>
-        <w:rPr>
-          <w:rFonts w:ascii="맑은 고딕" w:cs="맑은 고딕" w:eastAsia="맑은 고딕" w:hAnsi="맑은 고딕"/>
-          <w:sz w:val="20"/>
-          <w:szCs w:val="20"/>
-        </w:rPr>
-        <w:t xml:space="preserve"> — 도입 전 대비 40% 감소 목표, 문의 채널 기록 기준 집계</w:t>
-      </w:r>
-    </w:p>
-    <w:p>
-      <w:pPr>
-        <w:pStyle w:val="ListParagraph"/>
-        <w:numPr>
-          <w:ilvl w:val="0"/>
-          <w:numId w:val="2"/>
-        </w:numPr>
-        <w:spacing w:after="30" w:line="264"/>
-      </w:pPr>
-      <w:r>
-        <w:rPr>
-          <w:rFonts w:ascii="맑은 고딕" w:cs="맑은 고딕" w:eastAsia="맑은 고딕" w:hAnsi="맑은 고딕"/>
-          <w:b/>
-          <w:bCs/>
-          <w:sz w:val="20"/>
-          <w:szCs w:val="20"/>
-        </w:rPr>
-        <w:t xml:space="preserve">담당자 개입 없이 해결된 비율</w:t>
-      </w:r>
-      <w:r>
-        <w:rPr>
-          <w:rFonts w:ascii="맑은 고딕" w:cs="맑은 고딕" w:eastAsia="맑은 고딕" w:hAnsi="맑은 고딕"/>
-          <w:sz w:val="20"/>
-          <w:szCs w:val="20"/>
-        </w:rPr>
-        <w:t xml:space="preserve"> — 60% 목표, 사용 기록 기준 집계</w:t>
-      </w:r>
-    </w:p>
-    <w:p>
-      <w:pPr>
-        <w:pStyle w:val="ListParagraph"/>
-        <w:numPr>
-          <w:ilvl w:val="0"/>
-          <w:numId w:val="2"/>
-        </w:numPr>
-        <w:spacing w:after="30" w:line="264"/>
-      </w:pPr>
-      <w:r>
-        <w:rPr>
-          <w:rFonts w:ascii="맑은 고딕" w:cs="맑은 고딕" w:eastAsia="맑은 고딕" w:hAnsi="맑은 고딕"/>
-          <w:b/>
-          <w:bCs/>
-          <w:sz w:val="20"/>
-          <w:szCs w:val="20"/>
-        </w:rPr>
-        <w:t xml:space="preserve">정기인사 시기 문의 건수</w:t>
-      </w:r>
-      <w:r>
-        <w:rPr>
-          <w:rFonts w:ascii="맑은 고딕" w:cs="맑은 고딕" w:eastAsia="맑은 고딕" w:hAnsi="맑은 고딕"/>
-          <w:sz w:val="20"/>
-          <w:szCs w:val="20"/>
-        </w:rPr>
-        <w:t xml:space="preserve"> — 전년 동기 대비 40% 감소 목표</w:t>
-      </w:r>
-    </w:p>
-    <w:p>
-      <w:pPr>
-        <w:pStyle w:val="ListParagraph"/>
-        <w:numPr>
-          <w:ilvl w:val="0"/>
-          <w:numId w:val="2"/>
-        </w:numPr>
-        <w:spacing w:after="30" w:line="264"/>
-      </w:pPr>
-      <w:r>
-        <w:rPr>
-          <w:rFonts w:ascii="맑은 고딕" w:cs="맑은 고딕" w:eastAsia="맑은 고딕" w:hAnsi="맑은 고딕"/>
-          <w:b/>
-          <w:bCs/>
-          <w:sz w:val="20"/>
-          <w:szCs w:val="20"/>
-        </w:rPr>
-        <w:t xml:space="preserve">문의 1건당 담당자 소요시간</w:t>
-      </w:r>
-      <w:r>
-        <w:rPr>
-          <w:rFonts w:ascii="맑은 고딕" w:cs="맑은 고딕" w:eastAsia="맑은 고딕" w:hAnsi="맑은 고딕"/>
-          <w:sz w:val="20"/>
-          <w:szCs w:val="20"/>
-        </w:rPr>
-        <w:t xml:space="preserve"> — 도입 전 대비 30% 단축 목표</w:t>
+        <w:t xml:space="preserve">활용률 — 담당자가 실제로 사용하는가 (목표 1 연계)</w:t>
+      </w:r>
+    </w:p>
+    <w:p>
+      <w:pPr>
+        <w:pStyle w:val="ListParagraph"/>
+        <w:numPr>
+          <w:ilvl w:val="0"/>
+          <w:numId w:val="2"/>
+        </w:numPr>
+        <w:spacing w:after="30" w:line="264"/>
+      </w:pPr>
+      <w:r>
+        <w:rPr>
+          <w:rFonts w:ascii="맑은 고딕" w:cs="맑은 고딕" w:eastAsia="맑은 고딕" w:hAnsi="맑은 고딕"/>
+          <w:b/>
+          <w:bCs/>
+          <w:sz w:val="20"/>
+          <w:szCs w:val="20"/>
+        </w:rPr>
+        <w:t xml:space="preserve">주간 사용률</w:t>
+      </w:r>
+      <w:r>
+        <w:rPr>
+          <w:rFonts w:ascii="맑은 고딕" w:cs="맑은 고딕" w:eastAsia="맑은 고딕" w:hAnsi="맑은 고딕"/>
+          <w:sz w:val="20"/>
+          <w:szCs w:val="20"/>
+        </w:rPr>
+        <w:t xml:space="preserve"> (주지표) — 담당자 </w:t>
+      </w:r>
+      <w:r>
+        <w:rPr>
+          <w:rFonts w:ascii="맑은 고딕" w:cs="맑은 고딕" w:eastAsia="맑은 고딕" w:hAnsi="맑은 고딕"/>
+          <w:b/>
+          <w:bCs/>
+          <w:sz w:val="20"/>
+          <w:szCs w:val="20"/>
+        </w:rPr>
+        <w:t xml:space="preserve">전원이 각각</w:t>
+      </w:r>
+      <w:r>
+        <w:rPr>
+          <w:rFonts w:ascii="맑은 고딕" w:cs="맑은 고딕" w:eastAsia="맑은 고딕" w:hAnsi="맑은 고딕"/>
+          <w:sz w:val="20"/>
+          <w:szCs w:val="20"/>
+        </w:rPr>
+        <w:t xml:space="preserve"> 주 3일 이상 사용. 대상 인원이 1~2명으로 평균값의 의미가 없어 </w:t>
+      </w:r>
+      <w:r>
+        <w:rPr>
+          <w:rFonts w:ascii="맑은 고딕" w:cs="맑은 고딕" w:eastAsia="맑은 고딕" w:hAnsi="맑은 고딕"/>
+          <w:b/>
+          <w:bCs/>
+          <w:sz w:val="20"/>
+          <w:szCs w:val="20"/>
+        </w:rPr>
+        <w:t xml:space="preserve">개인별 충족 여부로 판정</w:t>
+      </w:r>
+    </w:p>
+    <w:p>
+      <w:pPr>
+        <w:pStyle w:val="ListParagraph"/>
+        <w:numPr>
+          <w:ilvl w:val="0"/>
+          <w:numId w:val="2"/>
+        </w:numPr>
+        <w:spacing w:after="30" w:line="264"/>
+      </w:pPr>
+      <w:r>
+        <w:rPr>
+          <w:rFonts w:ascii="맑은 고딕" w:cs="맑은 고딕" w:eastAsia="맑은 고딕" w:hAnsi="맑은 고딕"/>
+          <w:b/>
+          <w:bCs/>
+          <w:sz w:val="20"/>
+          <w:szCs w:val="20"/>
+        </w:rPr>
+        <w:t xml:space="preserve">1인당 주간 질의 건수</w:t>
+      </w:r>
+      <w:r>
+        <w:rPr>
+          <w:rFonts w:ascii="맑은 고딕" w:cs="맑은 고딕" w:eastAsia="맑은 고딕" w:hAnsi="맑은 고딕"/>
+          <w:sz w:val="20"/>
+          <w:szCs w:val="20"/>
+        </w:rPr>
+        <w:t xml:space="preserve"> — 주 5건 이상. 접속만 하고 실제 질의는 하지 않는 경우의 식별 목적</w:t>
+      </w:r>
+    </w:p>
+    <w:p>
+      <w:pPr>
+        <w:pStyle w:val="ListParagraph"/>
+        <w:numPr>
+          <w:ilvl w:val="0"/>
+          <w:numId w:val="2"/>
+        </w:numPr>
+        <w:spacing w:after="30" w:line="264"/>
+      </w:pPr>
+      <w:r>
+        <w:rPr>
+          <w:rFonts w:ascii="맑은 고딕" w:cs="맑은 고딕" w:eastAsia="맑은 고딕" w:hAnsi="맑은 고딕"/>
+          <w:b/>
+          <w:bCs/>
+          <w:sz w:val="20"/>
+          <w:szCs w:val="20"/>
+        </w:rPr>
+        <w:t xml:space="preserve">실무 반영률</w:t>
+      </w:r>
+      <w:r>
+        <w:rPr>
+          <w:rFonts w:ascii="맑은 고딕" w:cs="맑은 고딕" w:eastAsia="맑은 고딕" w:hAnsi="맑은 고딕"/>
+          <w:sz w:val="20"/>
+          <w:szCs w:val="20"/>
+        </w:rPr>
+        <w:t xml:space="preserve"> — 60% 이상. 시험 삼아 사용한 경우와 실제 문의 응대에 활용한 경우의 구분 목적</w:t>
+      </w:r>
+    </w:p>
+    <w:p>
+      <w:pPr>
+        <w:pStyle w:val="ListParagraph"/>
+        <w:numPr>
+          <w:ilvl w:val="0"/>
+          <w:numId w:val="2"/>
+        </w:numPr>
+        <w:spacing w:after="30" w:line="264"/>
+      </w:pPr>
+      <w:r>
+        <w:rPr>
+          <w:rFonts w:ascii="맑은 고딕" w:cs="맑은 고딕" w:eastAsia="맑은 고딕" w:hAnsi="맑은 고딕"/>
+          <w:b/>
+          <w:bCs/>
+          <w:sz w:val="20"/>
+          <w:szCs w:val="20"/>
+        </w:rPr>
+        <w:t xml:space="preserve">연속 사용 주 수</w:t>
+      </w:r>
+      <w:r>
+        <w:rPr>
+          <w:rFonts w:ascii="맑은 고딕" w:cs="맑은 고딕" w:eastAsia="맑은 고딕" w:hAnsi="맑은 고딕"/>
+          <w:sz w:val="20"/>
+          <w:szCs w:val="20"/>
+        </w:rPr>
+        <w:t xml:space="preserve"> — 4주 연속 유지. 도입 초기의 일시적 관심과 실제 정착의 구분 목적</w:t>
+      </w:r>
+    </w:p>
+    <w:p>
+      <w:pPr>
+        <w:pStyle w:val="ListParagraph"/>
+        <w:numPr>
+          <w:ilvl w:val="0"/>
+          <w:numId w:val="2"/>
+        </w:numPr>
+        <w:spacing w:after="30" w:line="264"/>
+      </w:pPr>
+      <w:r>
+        <w:rPr>
+          <w:rFonts w:ascii="맑은 고딕" w:cs="맑은 고딕" w:eastAsia="맑은 고딕" w:hAnsi="맑은 고딕"/>
+          <w:b/>
+          <w:bCs/>
+          <w:sz w:val="20"/>
+          <w:szCs w:val="20"/>
+        </w:rPr>
+        <w:t xml:space="preserve">사용 소감 청취</w:t>
+      </w:r>
+      <w:r>
+        <w:rPr>
+          <w:rFonts w:ascii="맑은 고딕" w:cs="맑은 고딕" w:eastAsia="맑은 고딕" w:hAnsi="맑은 고딕"/>
+          <w:sz w:val="20"/>
+          <w:szCs w:val="20"/>
+        </w:rPr>
+        <w:t xml:space="preserve"> — 격주 1회 담당자 면담. 대상 인원이 소수로 정량 판단이 어려워 정성 확인 병행 필요</w:t>
       </w:r>
     </w:p>
     <w:p>
@@ -5653,7 +5788,7 @@
           <w:sz w:val="22"/>
           <w:szCs w:val="22"/>
         </w:rPr>
-        <w:t xml:space="preserve">답변 품질</w:t>
+        <w:t xml:space="preserve">답변 품질 — 답이 맞고, 답하지 말아야 할 것을 가리는가 (목표 2·3 연계)</w:t>
       </w:r>
     </w:p>
     <w:p>
@@ -5681,7 +5816,35 @@
           <w:sz w:val="20"/>
           <w:szCs w:val="20"/>
         </w:rPr>
-        <w:t xml:space="preserve"> — 90% 이상, 배포 전 및 이후 분기별 측정</w:t>
+        <w:t xml:space="preserve"> (주지표) — 90% 이상. 배포 전 및 이후 분기별 측정</w:t>
+      </w:r>
+    </w:p>
+    <w:p>
+      <w:pPr>
+        <w:pStyle w:val="ListParagraph"/>
+        <w:numPr>
+          <w:ilvl w:val="0"/>
+          <w:numId w:val="2"/>
+        </w:numPr>
+        <w:spacing w:after="30" w:line="264"/>
+      </w:pPr>
+      <w:r>
+        <w:rPr>
+          <w:rFonts w:ascii="맑은 고딕" w:cs="맑은 고딕" w:eastAsia="맑은 고딕" w:hAnsi="맑은 고딕"/>
+          <w:b/>
+          <w:bCs/>
+          <w:sz w:val="20"/>
+          <w:szCs w:val="20"/>
+        </w:rPr>
+        <w:t xml:space="preserve">해석 필요 질의 판별률</w:t>
+      </w:r>
+      <w:r>
+        <w:rPr>
+          <w:rFonts w:ascii="맑은 고딕" w:cs="맑은 고딕" w:eastAsia="맑은 고딕" w:hAnsi="맑은 고딕"/>
+          <w:sz w:val="20"/>
+          <w:szCs w:val="20"/>
+        </w:rPr>
+        <w:t xml:space="preserve"> (주지표) — 95% 이상. 답변 보류 및 소관부서 연결의 정상 수행 비율</w:t>
       </w:r>
     </w:p>
     <w:p>
@@ -5709,35 +5872,53 @@
           <w:sz w:val="20"/>
           <w:szCs w:val="20"/>
         </w:rPr>
-        <w:t xml:space="preserve"> — 95% 이상, 인용 조항과 실제 근거 조항의 일치율</w:t>
-      </w:r>
-    </w:p>
-    <w:p>
-      <w:pPr>
-        <w:pStyle w:val="ListParagraph"/>
-        <w:numPr>
-          <w:ilvl w:val="0"/>
-          <w:numId w:val="2"/>
-        </w:numPr>
-        <w:spacing w:after="30" w:line="264"/>
-      </w:pPr>
-      <w:r>
-        <w:rPr>
-          <w:rFonts w:ascii="맑은 고딕" w:cs="맑은 고딕" w:eastAsia="맑은 고딕" w:hAnsi="맑은 고딕"/>
-          <w:b/>
-          <w:bCs/>
-          <w:sz w:val="20"/>
-          <w:szCs w:val="20"/>
-        </w:rPr>
-        <w:t xml:space="preserve">해석 사안 판별률</w:t>
-      </w:r>
-      <w:r>
-        <w:rPr>
-          <w:rFonts w:ascii="맑은 고딕" w:cs="맑은 고딕" w:eastAsia="맑은 고딕" w:hAnsi="맑은 고딕"/>
-          <w:sz w:val="20"/>
-          <w:szCs w:val="20"/>
-        </w:rPr>
-        <w:t xml:space="preserve"> — 95% 이상, 해석 필요 문항의 정상 판별 비율</w:t>
+        <w:t xml:space="preserve"> — 95% 이상. 인용 조항과 실제 근거 조항의 일치율. </w:t>
+      </w:r>
+      <w:r>
+        <w:rPr>
+          <w:rFonts w:ascii="맑은 고딕" w:cs="맑은 고딕" w:eastAsia="맑은 고딕" w:hAnsi="맑은 고딕"/>
+          <w:b/>
+          <w:bCs/>
+          <w:sz w:val="20"/>
+          <w:szCs w:val="20"/>
+        </w:rPr>
+        <w:t xml:space="preserve">답변 내용이 맞아도 근거 조항이 틀린 경우</w:t>
+      </w:r>
+      <w:r>
+        <w:rPr>
+          <w:rFonts w:ascii="맑은 고딕" w:cs="맑은 고딕" w:eastAsia="맑은 고딕" w:hAnsi="맑은 고딕"/>
+          <w:sz w:val="20"/>
+          <w:szCs w:val="20"/>
+        </w:rPr>
+        <w:t xml:space="preserve">의 식별 목적</w:t>
+      </w:r>
+    </w:p>
+    <w:p>
+      <w:pPr>
+        <w:pStyle w:val="ListParagraph"/>
+        <w:numPr>
+          <w:ilvl w:val="0"/>
+          <w:numId w:val="2"/>
+        </w:numPr>
+        <w:spacing w:after="30" w:line="264"/>
+      </w:pPr>
+      <w:r>
+        <w:rPr>
+          <w:rFonts w:ascii="맑은 고딕" w:cs="맑은 고딕" w:eastAsia="맑은 고딕" w:hAnsi="맑은 고딕"/>
+          <w:b/>
+          <w:bCs/>
+          <w:sz w:val="20"/>
+          <w:szCs w:val="20"/>
+        </w:rPr>
+        <w:t xml:space="preserve">근거 없는 답변 건수</w:t>
+      </w:r>
+      <w:r>
+        <w:rPr>
+          <w:rFonts w:ascii="맑은 고딕" w:cs="맑은 고딕" w:eastAsia="맑은 고딕" w:hAnsi="맑은 고딕"/>
+          <w:sz w:val="20"/>
+          <w:szCs w:val="20"/>
+        </w:rPr>
+        <w:t xml:space="preserve"> — 0건. 월 1회 답변 기록 표본 점검</w:t>
       </w:r>
     </w:p>
     <w:p>
@@ -5765,35 +5946,17 @@
           <w:sz w:val="20"/>
           <w:szCs w:val="20"/>
         </w:rPr>
-        <w:t xml:space="preserve"> — 20% 이하, 원 답변 대비 확정본 변경 비율의 자동 집계</w:t>
-      </w:r>
-    </w:p>
-    <w:p>
-      <w:pPr>
-        <w:pStyle w:val="ListParagraph"/>
-        <w:numPr>
-          <w:ilvl w:val="0"/>
-          <w:numId w:val="2"/>
-        </w:numPr>
-        <w:spacing w:after="30" w:line="264"/>
-      </w:pPr>
-      <w:r>
-        <w:rPr>
-          <w:rFonts w:ascii="맑은 고딕" w:cs="맑은 고딕" w:eastAsia="맑은 고딕" w:hAnsi="맑은 고딕"/>
-          <w:b/>
-          <w:bCs/>
-          <w:sz w:val="20"/>
-          <w:szCs w:val="20"/>
-        </w:rPr>
-        <w:t xml:space="preserve">근거 없는 답변 건수</w:t>
-      </w:r>
-      <w:r>
-        <w:rPr>
-          <w:rFonts w:ascii="맑은 고딕" w:cs="맑은 고딕" w:eastAsia="맑은 고딕" w:hAnsi="맑은 고딕"/>
-          <w:sz w:val="20"/>
-          <w:szCs w:val="20"/>
-        </w:rPr>
-        <w:t xml:space="preserve"> — 0건, 월 1회 답변 기록 표본 점검</w:t>
+        <w:t xml:space="preserve"> — 20% 이하. 원 답변 대비 확정본의 변경 비율을 자동 집계. 평가 문항 외 </w:t>
+      </w:r>
+      <w:r>
+        <w:rPr>
+          <w:rFonts w:ascii="맑은 고딕" w:cs="맑은 고딕" w:eastAsia="맑은 고딕" w:hAnsi="맑은 고딕"/>
+          <w:b/>
+          <w:bCs/>
+          <w:sz w:val="20"/>
+          <w:szCs w:val="20"/>
+        </w:rPr>
+        <w:t xml:space="preserve">유일한 실사용 기반 품질 신호</w:t>
       </w:r>
     </w:p>
     <w:p>
@@ -5813,108 +5976,29 @@
           <w:sz w:val="20"/>
           <w:szCs w:val="20"/>
         </w:rPr>
-        <w:t xml:space="preserve">답변 품질 지표는 사용자 규모와 무관한 측정이 가능하여, 초기 단계에서 활용 가능한 정량 근거에 해당.</w:t>
-      </w:r>
-    </w:p>
-    <w:p>
-      <w:pPr>
-        <w:pStyle w:val="Heading2"/>
-        <w:spacing w:after="70" w:before="180"/>
-      </w:pPr>
-      <w:r>
-        <w:rPr>
-          <w:rFonts w:ascii="맑은 고딕" w:cs="맑은 고딕" w:eastAsia="맑은 고딕" w:hAnsi="맑은 고딕"/>
-          <w:b/>
-          <w:bCs/>
-          <w:color w:val="1F4E79"/>
-          <w:sz w:val="22"/>
-          <w:szCs w:val="22"/>
-        </w:rPr>
-        <w:t xml:space="preserve">활용도</w:t>
-      </w:r>
-    </w:p>
-    <w:p>
-      <w:pPr>
-        <w:pStyle w:val="ListParagraph"/>
-        <w:numPr>
-          <w:ilvl w:val="0"/>
-          <w:numId w:val="2"/>
-        </w:numPr>
-        <w:spacing w:after="30" w:line="264"/>
-      </w:pPr>
-      <w:r>
-        <w:rPr>
-          <w:rFonts w:ascii="맑은 고딕" w:cs="맑은 고딕" w:eastAsia="맑은 고딕" w:hAnsi="맑은 고딕"/>
-          <w:b/>
-          <w:bCs/>
-          <w:sz w:val="20"/>
-          <w:szCs w:val="20"/>
-        </w:rPr>
-        <w:t xml:space="preserve">담당자 주간 사용률</w:t>
-      </w:r>
-      <w:r>
-        <w:rPr>
-          <w:rFonts w:ascii="맑은 고딕" w:cs="맑은 고딕" w:eastAsia="맑은 고딕" w:hAnsi="맑은 고딕"/>
-          <w:sz w:val="20"/>
-          <w:szCs w:val="20"/>
-        </w:rPr>
-        <w:t xml:space="preserve"> — 주 3일 이상 (1단계 목표 지표)</w:t>
-      </w:r>
-    </w:p>
-    <w:p>
-      <w:pPr>
-        <w:pStyle w:val="ListParagraph"/>
-        <w:numPr>
-          <w:ilvl w:val="0"/>
-          <w:numId w:val="2"/>
-        </w:numPr>
-        <w:spacing w:after="30" w:line="264"/>
-      </w:pPr>
-      <w:r>
-        <w:rPr>
-          <w:rFonts w:ascii="맑은 고딕" w:cs="맑은 고딕" w:eastAsia="맑은 고딕" w:hAnsi="맑은 고딕"/>
-          <w:b/>
-          <w:bCs/>
-          <w:sz w:val="20"/>
-          <w:szCs w:val="20"/>
-        </w:rPr>
-        <w:t xml:space="preserve">국외근무직원 월 사용자 비율</w:t>
-      </w:r>
-      <w:r>
-        <w:rPr>
-          <w:rFonts w:ascii="맑은 고딕" w:cs="맑은 고딕" w:eastAsia="맑은 고딕" w:hAnsi="맑은 고딕"/>
-          <w:sz w:val="20"/>
-          <w:szCs w:val="20"/>
-        </w:rPr>
-        <w:t xml:space="preserve"> — 2단계 기준 30% 이상</w:t>
-      </w:r>
-    </w:p>
-    <w:p>
-      <w:pPr>
-        <w:pStyle w:val="ListParagraph"/>
-        <w:numPr>
-          <w:ilvl w:val="0"/>
-          <w:numId w:val="2"/>
-        </w:numPr>
-        <w:spacing w:after="30" w:line="264"/>
-      </w:pPr>
-      <w:r>
-        <w:rPr>
-          <w:rFonts w:ascii="맑은 고딕" w:cs="맑은 고딕" w:eastAsia="맑은 고딕" w:hAnsi="맑은 고딕"/>
-          <w:b/>
-          <w:bCs/>
-          <w:sz w:val="20"/>
-          <w:szCs w:val="20"/>
-        </w:rPr>
-        <w:t xml:space="preserve">재문의 비율</w:t>
-      </w:r>
-      <w:r>
-        <w:rPr>
-          <w:rFonts w:ascii="맑은 고딕" w:cs="맑은 고딕" w:eastAsia="맑은 고딕" w:hAnsi="맑은 고딕"/>
-          <w:sz w:val="20"/>
-          <w:szCs w:val="20"/>
-        </w:rPr>
-        <w:t xml:space="preserve"> — 20% 이하, 동일 사용자의 동일 주제 7일 내 재질의 비율</w:t>
+        <w:t xml:space="preserve">담당자 1~2명 규모에서는 활용률의 통계적 해석이 어려우므로, </w:t>
+      </w:r>
+      <w:r>
+        <w:rPr>
+          <w:rFonts w:ascii="맑은 고딕" w:cs="맑은 고딕" w:eastAsia="맑은 고딕" w:hAnsi="맑은 고딕"/>
+          <w:b/>
+          <w:bCs/>
+          <w:i w:val="false"/>
+          <w:iCs w:val="false"/>
+          <w:sz w:val="20"/>
+          <w:szCs w:val="20"/>
+        </w:rPr>
+        <w:t xml:space="preserve">답변 품질 지표가 1단계 판정의 주 근거</w:t>
+      </w:r>
+      <w:r>
+        <w:rPr>
+          <w:rFonts w:ascii="맑은 고딕" w:cs="맑은 고딕" w:eastAsia="맑은 고딕" w:hAnsi="맑은 고딕"/>
+          <w:i w:val="false"/>
+          <w:iCs w:val="false"/>
+          <w:sz w:val="20"/>
+          <w:szCs w:val="20"/>
+        </w:rPr>
+        <w:t xml:space="preserve">에 해당.</w:t>
       </w:r>
     </w:p>
     <w:p>
@@ -6142,7 +6226,7 @@
           <w:sz w:val="20"/>
           <w:szCs w:val="20"/>
         </w:rPr>
-        <w:t xml:space="preserve">해석 사안 판별률 95% 이상 달성</w:t>
+        <w:t xml:space="preserve">해석 필요 질의 판별률 95% 이상 달성</w:t>
       </w:r>
     </w:p>
     <w:p>
@@ -6213,7 +6297,7 @@
           <w:sz w:val="20"/>
           <w:szCs w:val="20"/>
         </w:rPr>
-        <w:t xml:space="preserve">담당자의 주 3일 이상 자발적 사용 확인</w:t>
+        <w:t xml:space="preserve">담당자 전원의 주 3일 이상 자발적 사용 확인</w:t>
       </w:r>
     </w:p>
     <w:p>

</xml_diff>

<commit_message>
Add concrete schedule and publish artifact preview
일정 구체화, 성공 지표 축소, 미리보기용 아티팩트 추가.

일정(24항):
- 단계 기준 표기를 실제 날짜 기준으로 전환
- 8/14 초기 구축 및 핵심 FAQ 반영, 8/21 스테이징 개발 완료,
  9월 4주간 1단계 운영, 9월 말 결과 판정, 11월 2단계 확대
- 11월 정기인사 발령과 예비발령자 공개 시점이 겹쳐 안내서 정비와
  공개가 같은 시기에 몰릴 우려를 별도 명시

성공 지표(19항):
- 활용률과 답변 품질을 각 3개 항목으로 축소 (총 6개)
- 활용률에서 실무 반영률과 연속 사용 주 수 제외. 측정 방법이
  정의되지 않았거나 주간 사용률과 중복되는 항목
- 답변 품질에서 출처 정확도와 근거 없는 답변 건수를 제외하고,
  16항 비기능 요구사항의 상시 충족 조건으로 관리하도록 명시

단계 시점 반영:
- 2단계를 11월 정기인사 시즌 시작으로 명시하고 예비발령자를 우선
  공개 대상으로 지정. 국외근무직원은 순차 확대
- 자료 정비 시점 표기를 연말에서 11월로 구체화
- 담당자 인원 표기를 2명으로 통일

데이터 요구사항:
- 현업 담당자 제공 핵심 FAQ를 필요 데이터 및 수집 항목에 신설하고
  초기 구축 최우선 반영 대상으로 명시
- 출시 기준을 초기 구축(8/14), 운영 개시(8/21), 2단계 전환(9월 말)
  시점 기준으로 재구성

산출물:
- 미리보기용 아티팩트 HTML 및 생성 스크립트 추가. 목차, 단계 구분
  표시, 유스케이스 대화 렌더링, 일정 타임라인 적용

Co-Authored-By: Claude Opus 5 <noreply@anthropic.com>
Claude-Session: https://claude.ai/code/session_01Ekn86cpQq9yULpsy9iFqKx
</commit_message>
<xml_diff>
--- a/prds/국외근무직원-HR-에이전트-PRD.docx
+++ b/prds/국외근무직원-HR-에이전트-PRD.docx
@@ -75,7 +75,7 @@
           <w:sz w:val="20"/>
           <w:szCs w:val="20"/>
         </w:rPr>
-        <w:t xml:space="preserve">버전 / Version: v0.8 (초안)</w:t>
+        <w:t xml:space="preserve">버전 / Version: v0.9 (초안)</w:t>
       </w:r>
     </w:p>
     <w:p>
@@ -245,7 +245,7 @@
           <w:sz w:val="20"/>
           <w:szCs w:val="20"/>
         </w:rPr>
-        <w:t xml:space="preserve">현재 국외근무직원 약 120명의 관련 문의가 글로벌사업그룹 HR 담당자 1~2명에게 집중되어 있으며, 동일 질문의 반복 발생과 답변 미기록으로 인한 재작업이 상시 발생. 본 에이전트는 해당 문의를 시스템이 1차로 수용하여 근거 기반 답변 즉시 제공</w:t>
+        <w:t xml:space="preserve">현재 국외근무직원 약 120명의 관련 문의가 글로벌사업그룹 HR 담당자 2명에게 집중되어 있으며, 동일 질문의 반복 발생과 답변 미기록으로 인한 재작업이 상시 발생. 본 에이전트는 해당 문의를 시스템이 1차로 수용하여 근거 기반 답변 즉시 제공</w:t>
       </w:r>
     </w:p>
     <w:p>
@@ -516,7 +516,7 @@
           <w:sz w:val="22"/>
           <w:szCs w:val="22"/>
         </w:rPr>
-        <w:t xml:space="preserve">1단계 — 담당자 전용 운영 (활용률·답변 품질 검증)</w:t>
+        <w:t xml:space="preserve">1단계 — 담당자 전용 운영 (9월, 활용률·답변 품질 검증)</w:t>
       </w:r>
     </w:p>
     <w:p>
@@ -680,7 +680,7 @@
           <w:sz w:val="22"/>
           <w:szCs w:val="22"/>
         </w:rPr>
-        <w:t xml:space="preserve">2단계 — 국외근무직원 대상 배포 (업무 부담 경감)</w:t>
+        <w:t xml:space="preserve">2단계 — 예비발령자 대상 확대 (11월 정기인사 시즌, 업무 부담 경감)</w:t>
       </w:r>
     </w:p>
     <w:p>
@@ -886,7 +886,7 @@
           <w:sz w:val="20"/>
           <w:szCs w:val="20"/>
         </w:rPr>
-        <w:t xml:space="preserve"> — 본부에서 국외 HR 업무를 담당하는 1~2명. 문의 응대 및 규정 확인을 상시 수행하는 1단계의 유일한 사용자</w:t>
+        <w:t xml:space="preserve"> — 본부에서 국외 HR 업무를 담당하는 2명. 문의 응대 및 규정 확인을 상시 수행하는 1단계의 유일한 사용자</w:t>
       </w:r>
     </w:p>
     <w:p>
@@ -931,7 +931,7 @@
           <w:sz w:val="22"/>
           <w:szCs w:val="22"/>
         </w:rPr>
-        <w:t xml:space="preserve">2단계 사용자 (부가 사용자)</w:t>
+        <w:t xml:space="preserve">2단계 사용자 (부가 사용자, 11월 정기인사 시즌부터)</w:t>
       </w:r>
     </w:p>
     <w:p>
@@ -959,7 +959,17 @@
           <w:sz w:val="20"/>
           <w:szCs w:val="20"/>
         </w:rPr>
-        <w:t xml:space="preserve"> — 국외 부임이 확정되어 준비 중인 직원. 준비 항목 및 제출 서류 확인 수요가 발령 시점에 집중</w:t>
+        <w:t xml:space="preserve"> — 국외 부임이 확정되어 준비 중인 직원. 11월 정기인사 발령 직후 준비 항목 및 제출 서류 확인 수요 집중. </w:t>
+      </w:r>
+      <w:r>
+        <w:rPr>
+          <w:rFonts w:ascii="맑은 고딕" w:cs="맑은 고딕" w:eastAsia="맑은 고딕" w:hAnsi="맑은 고딕"/>
+          <w:b/>
+          <w:bCs/>
+          <w:sz w:val="20"/>
+          <w:szCs w:val="20"/>
+        </w:rPr>
+        <w:t xml:space="preserve">2단계 우선 공개 대상</w:t>
       </w:r>
     </w:p>
     <w:p>
@@ -987,7 +997,7 @@
           <w:sz w:val="20"/>
           <w:szCs w:val="20"/>
         </w:rPr>
-        <w:t xml:space="preserve"> — 현지 근무 중인 약 120명. 보수·복지 규정의 개별 적용 여부에 대한 산발적 문의 발생</w:t>
+        <w:t xml:space="preserve"> — 현지 근무 중인 약 120명. 보수·복지 규정의 개별 적용 여부에 대한 산발적 문의 발생. 운영 상황에 따라 순차 확대</w:t>
       </w:r>
     </w:p>
     <w:p>
@@ -1073,7 +1083,7 @@
           <w:sz w:val="20"/>
           <w:szCs w:val="20"/>
         </w:rPr>
-        <w:t xml:space="preserve">국외근무직원 약 120명의 문의가 HR 담당자 1~2명에게 집중되어 응대 부담 가중</w:t>
+        <w:t xml:space="preserve">국외근무직원 약 120명의 문의가 HR 담당자 2명에게 집중되어 응대 부담 가중</w:t>
       </w:r>
     </w:p>
     <w:p>
@@ -4777,6 +4787,44 @@
           <w:sz w:val="20"/>
           <w:szCs w:val="20"/>
         </w:rPr>
+        <w:t xml:space="preserve">핵심 FAQ</w:t>
+      </w:r>
+      <w:r>
+        <w:rPr>
+          <w:rFonts w:ascii="맑은 고딕" w:cs="맑은 고딕" w:eastAsia="맑은 고딕" w:hAnsi="맑은 고딕"/>
+          <w:sz w:val="20"/>
+          <w:szCs w:val="20"/>
+        </w:rPr>
+        <w:t xml:space="preserve"> — 현업 담당자가 선정한 최우선 문의 항목. </w:t>
+      </w:r>
+      <w:r>
+        <w:rPr>
+          <w:rFonts w:ascii="맑은 고딕" w:cs="맑은 고딕" w:eastAsia="맑은 고딕" w:hAnsi="맑은 고딕"/>
+          <w:b/>
+          <w:bCs/>
+          <w:sz w:val="20"/>
+          <w:szCs w:val="20"/>
+        </w:rPr>
+        <w:t xml:space="preserve">8/14 제공 예정이며 초기 구축에 최우선 반영 필수</w:t>
+      </w:r>
+    </w:p>
+    <w:p>
+      <w:pPr>
+        <w:pStyle w:val="ListParagraph"/>
+        <w:numPr>
+          <w:ilvl w:val="0"/>
+          <w:numId w:val="2"/>
+        </w:numPr>
+        <w:spacing w:after="30" w:line="264"/>
+      </w:pPr>
+      <w:r>
+        <w:rPr>
+          <w:rFonts w:ascii="맑은 고딕" w:cs="맑은 고딕" w:eastAsia="맑은 고딕" w:hAnsi="맑은 고딕"/>
+          <w:b/>
+          <w:bCs/>
+          <w:sz w:val="20"/>
+          <w:szCs w:val="20"/>
+        </w:rPr>
         <w:t xml:space="preserve">국외근무 관련 규정·지침</w:t>
       </w:r>
       <w:r>
@@ -4831,7 +4879,7 @@
           <w:sz w:val="20"/>
           <w:szCs w:val="20"/>
         </w:rPr>
-        <w:t xml:space="preserve">, 연말 정기인사 시즌 정비 필요</w:t>
+        <w:t xml:space="preserve">, 11월 정기인사 시즌 정비 필요</w:t>
       </w:r>
     </w:p>
     <w:p>
@@ -4980,6 +5028,34 @@
           <w:sz w:val="20"/>
           <w:szCs w:val="20"/>
         </w:rPr>
+        <w:t xml:space="preserve">핵심 FAQ</w:t>
+      </w:r>
+      <w:r>
+        <w:rPr>
+          <w:rFonts w:ascii="맑은 고딕" w:cs="맑은 고딕" w:eastAsia="맑은 고딕" w:hAnsi="맑은 고딕"/>
+          <w:sz w:val="20"/>
+          <w:szCs w:val="20"/>
+        </w:rPr>
+        <w:t xml:space="preserve"> — 현업 담당자가 선정하여 8/14까지 제공. 초기 구축 시점에 최우선 반영</w:t>
+      </w:r>
+    </w:p>
+    <w:p>
+      <w:pPr>
+        <w:pStyle w:val="ListParagraph"/>
+        <w:numPr>
+          <w:ilvl w:val="0"/>
+          <w:numId w:val="2"/>
+        </w:numPr>
+        <w:spacing w:after="30" w:line="264"/>
+      </w:pPr>
+      <w:r>
+        <w:rPr>
+          <w:rFonts w:ascii="맑은 고딕" w:cs="맑은 고딕" w:eastAsia="맑은 고딕" w:hAnsi="맑은 고딕"/>
+          <w:b/>
+          <w:bCs/>
+          <w:sz w:val="20"/>
+          <w:szCs w:val="20"/>
+        </w:rPr>
         <w:t xml:space="preserve">규정·지침</w:t>
       </w:r>
       <w:r>
@@ -5026,7 +5102,7 @@
           <w:sz w:val="20"/>
           <w:szCs w:val="20"/>
         </w:rPr>
-        <w:t xml:space="preserve">연말 정기인사 시즌에 정비 시점 정례화</w:t>
+        <w:t xml:space="preserve">11월 정기인사 시즌에 정비 시점 정례화</w:t>
       </w:r>
     </w:p>
     <w:p>
@@ -5386,7 +5462,7 @@
           <w:sz w:val="20"/>
           <w:szCs w:val="20"/>
         </w:rPr>
-        <w:t xml:space="preserve">연말 정기인사 시즌을 자료 정비 시점으로 정례화</w:t>
+        <w:t xml:space="preserve">11월 정기인사 시즌을 자료 정비 시점으로 정례화</w:t>
       </w:r>
     </w:p>
     <w:p>
@@ -5500,7 +5576,7 @@
           <w:sz w:val="20"/>
           <w:szCs w:val="20"/>
         </w:rPr>
-        <w:t xml:space="preserve">자료 정비 시점을 연말 정기인사 시즌으로 정례화하고, 산출물 기준으로 관리 요구.</w:t>
+        <w:t xml:space="preserve">자료 정비 시점을 11월 정기인사 시즌으로 정례화하고, 산출물 기준으로 관리 요구.</w:t>
       </w:r>
     </w:p>
     <w:p>
@@ -5578,7 +5654,7 @@
           <w:sz w:val="20"/>
           <w:szCs w:val="20"/>
         </w:rPr>
-        <w:t xml:space="preserve">1단계(담당자 전용 운영) 기간에 한정 적용</w:t>
+        <w:t xml:space="preserve">1단계(9월, 담당자 전용 운영) 기간에 한정 적용</w:t>
       </w:r>
       <w:r>
         <w:rPr>
@@ -5649,7 +5725,7 @@
           <w:sz w:val="20"/>
           <w:szCs w:val="20"/>
         </w:rPr>
-        <w:t xml:space="preserve"> 주 3일 이상 사용. 대상 인원이 1~2명으로 평균값의 의미가 없어 </w:t>
+        <w:t xml:space="preserve"> 주 3일 이상 사용. 대상 인원이 2명으로 평균값의 의미가 없어 </w:t>
       </w:r>
       <w:r>
         <w:rPr>
@@ -5707,62 +5783,6 @@
           <w:sz w:val="20"/>
           <w:szCs w:val="20"/>
         </w:rPr>
-        <w:t xml:space="preserve">실무 반영률</w:t>
-      </w:r>
-      <w:r>
-        <w:rPr>
-          <w:rFonts w:ascii="맑은 고딕" w:cs="맑은 고딕" w:eastAsia="맑은 고딕" w:hAnsi="맑은 고딕"/>
-          <w:sz w:val="20"/>
-          <w:szCs w:val="20"/>
-        </w:rPr>
-        <w:t xml:space="preserve"> — 60% 이상. 시험 삼아 사용한 경우와 실제 문의 응대에 활용한 경우의 구분 목적</w:t>
-      </w:r>
-    </w:p>
-    <w:p>
-      <w:pPr>
-        <w:pStyle w:val="ListParagraph"/>
-        <w:numPr>
-          <w:ilvl w:val="0"/>
-          <w:numId w:val="2"/>
-        </w:numPr>
-        <w:spacing w:after="30" w:line="264"/>
-      </w:pPr>
-      <w:r>
-        <w:rPr>
-          <w:rFonts w:ascii="맑은 고딕" w:cs="맑은 고딕" w:eastAsia="맑은 고딕" w:hAnsi="맑은 고딕"/>
-          <w:b/>
-          <w:bCs/>
-          <w:sz w:val="20"/>
-          <w:szCs w:val="20"/>
-        </w:rPr>
-        <w:t xml:space="preserve">연속 사용 주 수</w:t>
-      </w:r>
-      <w:r>
-        <w:rPr>
-          <w:rFonts w:ascii="맑은 고딕" w:cs="맑은 고딕" w:eastAsia="맑은 고딕" w:hAnsi="맑은 고딕"/>
-          <w:sz w:val="20"/>
-          <w:szCs w:val="20"/>
-        </w:rPr>
-        <w:t xml:space="preserve"> — 4주 연속 유지. 도입 초기의 일시적 관심과 실제 정착의 구분 목적</w:t>
-      </w:r>
-    </w:p>
-    <w:p>
-      <w:pPr>
-        <w:pStyle w:val="ListParagraph"/>
-        <w:numPr>
-          <w:ilvl w:val="0"/>
-          <w:numId w:val="2"/>
-        </w:numPr>
-        <w:spacing w:after="30" w:line="264"/>
-      </w:pPr>
-      <w:r>
-        <w:rPr>
-          <w:rFonts w:ascii="맑은 고딕" w:cs="맑은 고딕" w:eastAsia="맑은 고딕" w:hAnsi="맑은 고딕"/>
-          <w:b/>
-          <w:bCs/>
-          <w:sz w:val="20"/>
-          <w:szCs w:val="20"/>
-        </w:rPr>
         <w:t xml:space="preserve">사용 소감 청취</w:t>
       </w:r>
       <w:r>
@@ -5771,7 +5791,17 @@
           <w:sz w:val="20"/>
           <w:szCs w:val="20"/>
         </w:rPr>
-        <w:t xml:space="preserve"> — 격주 1회 담당자 면담. 대상 인원이 소수로 정량 판단이 어려워 정성 확인 병행 필요</w:t>
+        <w:t xml:space="preserve"> — 격주 1회 담당자 면담. 대상 인원이 소수로 정량 판단이 어려워 </w:t>
+      </w:r>
+      <w:r>
+        <w:rPr>
+          <w:rFonts w:ascii="맑은 고딕" w:cs="맑은 고딕" w:eastAsia="맑은 고딕" w:hAnsi="맑은 고딕"/>
+          <w:b/>
+          <w:bCs/>
+          <w:sz w:val="20"/>
+          <w:szCs w:val="20"/>
+        </w:rPr>
+        <w:t xml:space="preserve">정성 확인 병행 필요</w:t>
       </w:r>
     </w:p>
     <w:p>
@@ -5816,7 +5846,7 @@
           <w:sz w:val="20"/>
           <w:szCs w:val="20"/>
         </w:rPr>
-        <w:t xml:space="preserve"> (주지표) — 90% 이상. 배포 전 및 이후 분기별 측정</w:t>
+        <w:t xml:space="preserve"> (주지표) — 90% 이상. 운영 시작 전 및 이후 월 1회 측정</w:t>
       </w:r>
     </w:p>
     <w:p>
@@ -5864,80 +5894,6 @@
           <w:sz w:val="20"/>
           <w:szCs w:val="20"/>
         </w:rPr>
-        <w:t xml:space="preserve">출처 정확도</w:t>
-      </w:r>
-      <w:r>
-        <w:rPr>
-          <w:rFonts w:ascii="맑은 고딕" w:cs="맑은 고딕" w:eastAsia="맑은 고딕" w:hAnsi="맑은 고딕"/>
-          <w:sz w:val="20"/>
-          <w:szCs w:val="20"/>
-        </w:rPr>
-        <w:t xml:space="preserve"> — 95% 이상. 인용 조항과 실제 근거 조항의 일치율. </w:t>
-      </w:r>
-      <w:r>
-        <w:rPr>
-          <w:rFonts w:ascii="맑은 고딕" w:cs="맑은 고딕" w:eastAsia="맑은 고딕" w:hAnsi="맑은 고딕"/>
-          <w:b/>
-          <w:bCs/>
-          <w:sz w:val="20"/>
-          <w:szCs w:val="20"/>
-        </w:rPr>
-        <w:t xml:space="preserve">답변 내용이 맞아도 근거 조항이 틀린 경우</w:t>
-      </w:r>
-      <w:r>
-        <w:rPr>
-          <w:rFonts w:ascii="맑은 고딕" w:cs="맑은 고딕" w:eastAsia="맑은 고딕" w:hAnsi="맑은 고딕"/>
-          <w:sz w:val="20"/>
-          <w:szCs w:val="20"/>
-        </w:rPr>
-        <w:t xml:space="preserve">의 식별 목적</w:t>
-      </w:r>
-    </w:p>
-    <w:p>
-      <w:pPr>
-        <w:pStyle w:val="ListParagraph"/>
-        <w:numPr>
-          <w:ilvl w:val="0"/>
-          <w:numId w:val="2"/>
-        </w:numPr>
-        <w:spacing w:after="30" w:line="264"/>
-      </w:pPr>
-      <w:r>
-        <w:rPr>
-          <w:rFonts w:ascii="맑은 고딕" w:cs="맑은 고딕" w:eastAsia="맑은 고딕" w:hAnsi="맑은 고딕"/>
-          <w:b/>
-          <w:bCs/>
-          <w:sz w:val="20"/>
-          <w:szCs w:val="20"/>
-        </w:rPr>
-        <w:t xml:space="preserve">근거 없는 답변 건수</w:t>
-      </w:r>
-      <w:r>
-        <w:rPr>
-          <w:rFonts w:ascii="맑은 고딕" w:cs="맑은 고딕" w:eastAsia="맑은 고딕" w:hAnsi="맑은 고딕"/>
-          <w:sz w:val="20"/>
-          <w:szCs w:val="20"/>
-        </w:rPr>
-        <w:t xml:space="preserve"> — 0건. 월 1회 답변 기록 표본 점검</w:t>
-      </w:r>
-    </w:p>
-    <w:p>
-      <w:pPr>
-        <w:pStyle w:val="ListParagraph"/>
-        <w:numPr>
-          <w:ilvl w:val="0"/>
-          <w:numId w:val="2"/>
-        </w:numPr>
-        <w:spacing w:after="30" w:line="264"/>
-      </w:pPr>
-      <w:r>
-        <w:rPr>
-          <w:rFonts w:ascii="맑은 고딕" w:cs="맑은 고딕" w:eastAsia="맑은 고딕" w:hAnsi="맑은 고딕"/>
-          <w:b/>
-          <w:bCs/>
-          <w:sz w:val="20"/>
-          <w:szCs w:val="20"/>
-        </w:rPr>
         <w:t xml:space="preserve">담당자 수정 정도</w:t>
       </w:r>
       <w:r>
@@ -5957,6 +5913,48 @@
           <w:szCs w:val="20"/>
         </w:rPr>
         <w:t xml:space="preserve">유일한 실사용 기반 품질 신호</w:t>
+      </w:r>
+    </w:p>
+    <w:p>
+      <w:pPr>
+        <w:pBdr>
+          <w:left w:val="single" w:color="E0A800" w:sz="18" w:space="8"/>
+        </w:pBdr>
+        <w:shd w:fill="FFF8E1" w:val="clear"/>
+        <w:spacing w:after="20" w:line="264"/>
+        <w:ind w:left="260"/>
+      </w:pPr>
+      <w:r>
+        <w:rPr>
+          <w:rFonts w:ascii="맑은 고딕" w:cs="맑은 고딕" w:eastAsia="맑은 고딕" w:hAnsi="맑은 고딕"/>
+          <w:i w:val="false"/>
+          <w:iCs w:val="false"/>
+          <w:sz w:val="20"/>
+          <w:szCs w:val="20"/>
+        </w:rPr>
+        <w:t xml:space="preserve">담당자 2명 규모에서는 활용률의 통계적 해석이 어려우므로, </w:t>
+      </w:r>
+      <w:r>
+        <w:rPr>
+          <w:rFonts w:ascii="맑은 고딕" w:cs="맑은 고딕" w:eastAsia="맑은 고딕" w:hAnsi="맑은 고딕"/>
+          <w:b/>
+          <w:bCs/>
+          <w:i w:val="false"/>
+          <w:iCs w:val="false"/>
+          <w:sz w:val="20"/>
+          <w:szCs w:val="20"/>
+        </w:rPr>
+        <w:t xml:space="preserve">답변 품질 지표가 1단계 판정의 주 근거</w:t>
+      </w:r>
+      <w:r>
+        <w:rPr>
+          <w:rFonts w:ascii="맑은 고딕" w:cs="맑은 고딕" w:eastAsia="맑은 고딕" w:hAnsi="맑은 고딕"/>
+          <w:i w:val="false"/>
+          <w:iCs w:val="false"/>
+          <w:sz w:val="20"/>
+          <w:szCs w:val="20"/>
+        </w:rPr>
+        <w:t xml:space="preserve">에 해당.</w:t>
       </w:r>
     </w:p>
     <w:p>
@@ -5976,29 +5974,7 @@
           <w:sz w:val="20"/>
           <w:szCs w:val="20"/>
         </w:rPr>
-        <w:t xml:space="preserve">담당자 1~2명 규모에서는 활용률의 통계적 해석이 어려우므로, </w:t>
-      </w:r>
-      <w:r>
-        <w:rPr>
-          <w:rFonts w:ascii="맑은 고딕" w:cs="맑은 고딕" w:eastAsia="맑은 고딕" w:hAnsi="맑은 고딕"/>
-          <w:b/>
-          <w:bCs/>
-          <w:i w:val="false"/>
-          <w:iCs w:val="false"/>
-          <w:sz w:val="20"/>
-          <w:szCs w:val="20"/>
-        </w:rPr>
-        <w:t xml:space="preserve">답변 품질 지표가 1단계 판정의 주 근거</w:t>
-      </w:r>
-      <w:r>
-        <w:rPr>
-          <w:rFonts w:ascii="맑은 고딕" w:cs="맑은 고딕" w:eastAsia="맑은 고딕" w:hAnsi="맑은 고딕"/>
-          <w:i w:val="false"/>
-          <w:iCs w:val="false"/>
-          <w:sz w:val="20"/>
-          <w:szCs w:val="20"/>
-        </w:rPr>
-        <w:t xml:space="preserve">에 해당.</w:t>
+        <w:t xml:space="preserve">출처 정확도 및 근거 없는 답변 건수는 16항 비기능 요구사항의 상시 충족 조건으로 관리.</w:t>
       </w:r>
     </w:p>
     <w:p>
@@ -6048,7 +6024,7 @@
           <w:sz w:val="20"/>
           <w:szCs w:val="20"/>
         </w:rPr>
-        <w:t xml:space="preserve">대상은 글로벌사업그룹 HR 담당자이며, 범위는 보수·복지 및 인사 규정 질의응답과 사례 축적. 규정의 자동 수집으로 별도 자료 준비가 불요하여 선행하고, 부임 안내는 국가별 자료 정비 선행이 필요하여 2단계으로 배치. 1차 운영 기간 중 안내서 정비 병행.</w:t>
+        <w:t xml:space="preserve">대상은 글로벌사업그룹 HR 담당자이며, 범위는 보수·복지 및 인사 규정 질의응답과 사례 축적. 규정의 자동 수집으로 별도 자료 준비가 불요하여 선행하고, 부임 안내는 국가별 자료 정비 선행이 필요하여 2단계으로 배치. 1단계 운영 기간 중 안내서 정비 병행.</w:t>
       </w:r>
     </w:p>
     <w:p>
@@ -6065,7 +6041,27 @@
           <w:sz w:val="22"/>
           <w:szCs w:val="22"/>
         </w:rPr>
-        <w:t xml:space="preserve">개발 착수 조건</w:t>
+        <w:t xml:space="preserve">초기 구축 조건 (~8/14)</w:t>
+      </w:r>
+    </w:p>
+    <w:p>
+      <w:pPr>
+        <w:pStyle w:val="ListParagraph"/>
+        <w:numPr>
+          <w:ilvl w:val="0"/>
+          <w:numId w:val="2"/>
+        </w:numPr>
+        <w:spacing w:after="30" w:line="264"/>
+      </w:pPr>
+      <w:r>
+        <w:rPr>
+          <w:rFonts w:ascii="맑은 고딕" w:cs="맑은 고딕" w:eastAsia="맑은 고딕" w:hAnsi="맑은 고딕"/>
+          <w:b/>
+          <w:bCs/>
+          <w:sz w:val="20"/>
+          <w:szCs w:val="20"/>
+        </w:rPr>
+        <w:t xml:space="preserve">현업 담당자 제공 핵심 FAQ의 반영 완료</w:t>
       </w:r>
     </w:p>
     <w:p>
@@ -6172,7 +6168,7 @@
           <w:sz w:val="22"/>
           <w:szCs w:val="22"/>
         </w:rPr>
-        <w:t xml:space="preserve">1단계 출시 조건</w:t>
+        <w:t xml:space="preserve">1단계 운영 개시 조건 (~8/21)</w:t>
       </w:r>
     </w:p>
     <w:p>
@@ -6279,7 +6275,7 @@
           <w:sz w:val="22"/>
           <w:szCs w:val="22"/>
         </w:rPr>
-        <w:t xml:space="preserve">2단계 전환 조건</w:t>
+        <w:t xml:space="preserve">2단계 전환 조건 (9월 말 판정)</w:t>
       </w:r>
     </w:p>
     <w:p>
@@ -6462,7 +6458,7 @@
           <w:sz w:val="20"/>
           <w:szCs w:val="20"/>
         </w:rPr>
-        <w:t xml:space="preserve"> — 본점 담당자의 본업 병행에 따른 지연 우려. 연말 정기인사 시즌을 정비 시점으로 정례화하고 산출물 기준으로 관리하여 완화</w:t>
+        <w:t xml:space="preserve"> — 본점 담당자의 본업 병행에 따른 지연 우려. 11월 정기인사 시즌을 정비 시점으로 정례화하고 산출물 기준으로 관리하여 완화</w:t>
       </w:r>
     </w:p>
     <w:p>
@@ -7084,7 +7080,7 @@
           <w:sz w:val="20"/>
           <w:szCs w:val="20"/>
         </w:rPr>
-        <w:t xml:space="preserve"> — 글로벌성장지원부 및 글로벌추진부 소속 1~2명. 1단계 주 사용자이자 답변 확정 및 자료 정비 담당</w:t>
+        <w:t xml:space="preserve"> — 글로벌성장지원부 및 글로벌추진부 소속 2명. 1단계 주 사용자이자 답변 확정 및 자료 정비 담당</w:t>
       </w:r>
     </w:p>
     <w:p>
@@ -7270,119 +7266,157 @@
           <w:sz w:val="20"/>
           <w:szCs w:val="20"/>
         </w:rPr>
-        <w:t xml:space="preserve">정확한 일자 대신 단계 기준 관리이며, 각 단계는 선행 단계의 출시 조건 충족을 전제.</w:t>
-      </w:r>
-    </w:p>
-    <w:p>
-      <w:pPr>
-        <w:pStyle w:val="ListParagraph"/>
-        <w:numPr>
-          <w:ilvl w:val="0"/>
-          <w:numId w:val="2"/>
-        </w:numPr>
-        <w:spacing w:after="30" w:line="264"/>
-      </w:pPr>
-      <w:r>
-        <w:rPr>
-          <w:rFonts w:ascii="맑은 고딕" w:cs="맑은 고딕" w:eastAsia="맑은 고딕" w:hAnsi="맑은 고딕"/>
-          <w:b/>
-          <w:bCs/>
-          <w:sz w:val="20"/>
-          <w:szCs w:val="20"/>
-        </w:rPr>
-        <w:t xml:space="preserve">사전 검증 (2~4주)</w:t>
-      </w:r>
-      <w:r>
-        <w:rPr>
-          <w:rFonts w:ascii="맑은 고딕" w:cs="맑은 고딕" w:eastAsia="맑은 고딕" w:hAnsi="맑은 고딕"/>
-          <w:sz w:val="20"/>
-          <w:szCs w:val="20"/>
-        </w:rPr>
-        <w:t xml:space="preserve"> — 문의 30건 분류, 평가 문항 작성, 소관부서 협의, 자동 수집 체계 확인</w:t>
-      </w:r>
-    </w:p>
-    <w:p>
-      <w:pPr>
-        <w:pStyle w:val="ListParagraph"/>
-        <w:numPr>
-          <w:ilvl w:val="0"/>
-          <w:numId w:val="2"/>
-        </w:numPr>
-        <w:spacing w:after="30" w:line="264"/>
-      </w:pPr>
-      <w:r>
-        <w:rPr>
-          <w:rFonts w:ascii="맑은 고딕" w:cs="맑은 고딕" w:eastAsia="맑은 고딕" w:hAnsi="맑은 고딕"/>
-          <w:b/>
-          <w:bCs/>
-          <w:sz w:val="20"/>
-          <w:szCs w:val="20"/>
-        </w:rPr>
-        <w:t xml:space="preserve">1단계</w:t>
-      </w:r>
-      <w:r>
-        <w:rPr>
-          <w:rFonts w:ascii="맑은 고딕" w:cs="맑은 고딕" w:eastAsia="맑은 고딕" w:hAnsi="맑은 고딕"/>
-          <w:sz w:val="20"/>
-          <w:szCs w:val="20"/>
-        </w:rPr>
-        <w:t xml:space="preserve"> — 규정 질의응답 및 사례 축적의 담당자 전용 구축·운영, 안내서 정비 병행</w:t>
-      </w:r>
-    </w:p>
-    <w:p>
-      <w:pPr>
-        <w:pStyle w:val="ListParagraph"/>
-        <w:numPr>
-          <w:ilvl w:val="0"/>
-          <w:numId w:val="2"/>
-        </w:numPr>
-        <w:spacing w:after="30" w:line="264"/>
-      </w:pPr>
-      <w:r>
-        <w:rPr>
-          <w:rFonts w:ascii="맑은 고딕" w:cs="맑은 고딕" w:eastAsia="맑은 고딕" w:hAnsi="맑은 고딕"/>
-          <w:b/>
-          <w:bCs/>
-          <w:sz w:val="20"/>
-          <w:szCs w:val="20"/>
-        </w:rPr>
-        <w:t xml:space="preserve">2단계</w:t>
-      </w:r>
-      <w:r>
-        <w:rPr>
-          <w:rFonts w:ascii="맑은 고딕" w:cs="맑은 고딕" w:eastAsia="맑은 고딕" w:hAnsi="맑은 고딕"/>
-          <w:sz w:val="20"/>
-          <w:szCs w:val="20"/>
-        </w:rPr>
-        <w:t xml:space="preserve"> — 부임·복귀 안내, 서류 양식 제공, 국외근무직원 및 예비발령자 대상 공개</w:t>
-      </w:r>
-    </w:p>
-    <w:p>
-      <w:pPr>
-        <w:pStyle w:val="ListParagraph"/>
-        <w:numPr>
-          <w:ilvl w:val="0"/>
-          <w:numId w:val="2"/>
-        </w:numPr>
-        <w:spacing w:after="30" w:line="264"/>
-      </w:pPr>
-      <w:r>
-        <w:rPr>
-          <w:rFonts w:ascii="맑은 고딕" w:cs="맑은 고딕" w:eastAsia="맑은 고딕" w:hAnsi="맑은 고딕"/>
-          <w:b/>
-          <w:bCs/>
-          <w:sz w:val="20"/>
-          <w:szCs w:val="20"/>
-        </w:rPr>
-        <w:t xml:space="preserve">향후</w:t>
-      </w:r>
-      <w:r>
-        <w:rPr>
-          <w:rFonts w:ascii="맑은 고딕" w:cs="맑은 고딕" w:eastAsia="맑은 고딕" w:hAnsi="맑은 고딕"/>
-          <w:sz w:val="20"/>
-          <w:szCs w:val="20"/>
-        </w:rPr>
-        <w:t xml:space="preserve"> — 출장 관리 등 인접 업무로의 확장 검토</w:t>
+        <w:t xml:space="preserve">각 단계는 선행 단계의 출시 조건 충족을 전제로 진행.</w:t>
+      </w:r>
+    </w:p>
+    <w:p>
+      <w:pPr>
+        <w:pStyle w:val="ListParagraph"/>
+        <w:numPr>
+          <w:ilvl w:val="0"/>
+          <w:numId w:val="2"/>
+        </w:numPr>
+        <w:spacing w:after="30" w:line="264"/>
+      </w:pPr>
+      <w:r>
+        <w:rPr>
+          <w:rFonts w:ascii="맑은 고딕" w:cs="맑은 고딕" w:eastAsia="맑은 고딕" w:hAnsi="맑은 고딕"/>
+          <w:b/>
+          <w:bCs/>
+          <w:sz w:val="20"/>
+          <w:szCs w:val="20"/>
+        </w:rPr>
+        <w:t xml:space="preserve">초기 구축 (~8/14)</w:t>
+      </w:r>
+      <w:r>
+        <w:rPr>
+          <w:rFonts w:ascii="맑은 고딕" w:cs="맑은 고딕" w:eastAsia="맑은 고딕" w:hAnsi="맑은 고딕"/>
+          <w:sz w:val="20"/>
+          <w:szCs w:val="20"/>
+        </w:rPr>
+        <w:t xml:space="preserve"> — 기확보 데이터 기반 에이전트 1차 제작. </w:t>
+      </w:r>
+      <w:r>
+        <w:rPr>
+          <w:rFonts w:ascii="맑은 고딕" w:cs="맑은 고딕" w:eastAsia="맑은 고딕" w:hAnsi="맑은 고딕"/>
+          <w:b/>
+          <w:bCs/>
+          <w:sz w:val="20"/>
+          <w:szCs w:val="20"/>
+        </w:rPr>
+        <w:t xml:space="preserve">현업 담당자 제공 핵심 FAQ의 최우선 반영 필수</w:t>
+      </w:r>
+    </w:p>
+    <w:p>
+      <w:pPr>
+        <w:pStyle w:val="ListParagraph"/>
+        <w:numPr>
+          <w:ilvl w:val="0"/>
+          <w:numId w:val="2"/>
+        </w:numPr>
+        <w:spacing w:after="30" w:line="264"/>
+      </w:pPr>
+      <w:r>
+        <w:rPr>
+          <w:rFonts w:ascii="맑은 고딕" w:cs="맑은 고딕" w:eastAsia="맑은 고딕" w:hAnsi="맑은 고딕"/>
+          <w:b/>
+          <w:bCs/>
+          <w:sz w:val="20"/>
+          <w:szCs w:val="20"/>
+        </w:rPr>
+        <w:t xml:space="preserve">스테이징 개발 완료 (~8/21)</w:t>
+      </w:r>
+      <w:r>
+        <w:rPr>
+          <w:rFonts w:ascii="맑은 고딕" w:cs="맑은 고딕" w:eastAsia="맑은 고딕" w:hAnsi="맑은 고딕"/>
+          <w:sz w:val="20"/>
+          <w:szCs w:val="20"/>
+        </w:rPr>
+        <w:t xml:space="preserve"> — 데이터 지속 업데이트 병행, 1단계 운영 환경 준비</w:t>
+      </w:r>
+    </w:p>
+    <w:p>
+      <w:pPr>
+        <w:pStyle w:val="ListParagraph"/>
+        <w:numPr>
+          <w:ilvl w:val="0"/>
+          <w:numId w:val="2"/>
+        </w:numPr>
+        <w:spacing w:after="30" w:line="264"/>
+      </w:pPr>
+      <w:r>
+        <w:rPr>
+          <w:rFonts w:ascii="맑은 고딕" w:cs="맑은 고딕" w:eastAsia="맑은 고딕" w:hAnsi="맑은 고딕"/>
+          <w:b/>
+          <w:bCs/>
+          <w:sz w:val="20"/>
+          <w:szCs w:val="20"/>
+        </w:rPr>
+        <w:t xml:space="preserve">1단계 운영 (9월, 4주간)</w:t>
+      </w:r>
+      <w:r>
+        <w:rPr>
+          <w:rFonts w:ascii="맑은 고딕" w:cs="맑은 고딕" w:eastAsia="맑은 고딕" w:hAnsi="맑은 고딕"/>
+          <w:sz w:val="20"/>
+          <w:szCs w:val="20"/>
+        </w:rPr>
+        <w:t xml:space="preserve"> — 글로벌사업그룹 HR 담당자 2명 대상 시범 운영. 사용 피드백 수렴 및 개선 반복</w:t>
+      </w:r>
+    </w:p>
+    <w:p>
+      <w:pPr>
+        <w:pStyle w:val="ListParagraph"/>
+        <w:numPr>
+          <w:ilvl w:val="0"/>
+          <w:numId w:val="2"/>
+        </w:numPr>
+        <w:spacing w:after="30" w:line="264"/>
+      </w:pPr>
+      <w:r>
+        <w:rPr>
+          <w:rFonts w:ascii="맑은 고딕" w:cs="맑은 고딕" w:eastAsia="맑은 고딕" w:hAnsi="맑은 고딕"/>
+          <w:b/>
+          <w:bCs/>
+          <w:sz w:val="20"/>
+          <w:szCs w:val="20"/>
+        </w:rPr>
+        <w:t xml:space="preserve">1단계 결과 판정 (9월 말)</w:t>
+      </w:r>
+      <w:r>
+        <w:rPr>
+          <w:rFonts w:ascii="맑은 고딕" w:cs="맑은 고딕" w:eastAsia="맑은 고딕" w:hAnsi="맑은 고딕"/>
+          <w:sz w:val="20"/>
+          <w:szCs w:val="20"/>
+        </w:rPr>
+        <w:t xml:space="preserve"> — 활용률 및 답변 품질 지표 측정, 2단계 전환 여부 결정</w:t>
+      </w:r>
+    </w:p>
+    <w:p>
+      <w:pPr>
+        <w:pStyle w:val="ListParagraph"/>
+        <w:numPr>
+          <w:ilvl w:val="0"/>
+          <w:numId w:val="2"/>
+        </w:numPr>
+        <w:spacing w:after="30" w:line="264"/>
+      </w:pPr>
+      <w:r>
+        <w:rPr>
+          <w:rFonts w:ascii="맑은 고딕" w:cs="맑은 고딕" w:eastAsia="맑은 고딕" w:hAnsi="맑은 고딕"/>
+          <w:b/>
+          <w:bCs/>
+          <w:sz w:val="20"/>
+          <w:szCs w:val="20"/>
+        </w:rPr>
+        <w:t xml:space="preserve">2단계 확대 (11월 정기인사 시즌)</w:t>
+      </w:r>
+      <w:r>
+        <w:rPr>
+          <w:rFonts w:ascii="맑은 고딕" w:cs="맑은 고딕" w:eastAsia="맑은 고딕" w:hAnsi="맑은 고딕"/>
+          <w:sz w:val="20"/>
+          <w:szCs w:val="20"/>
+        </w:rPr>
+        <w:t xml:space="preserve"> — 예비발령자 대상 공개. 국외근무직원 확대는 운영 상황에 따라 순차 적용</w:t>
       </w:r>
     </w:p>
     <w:p>
@@ -7395,25 +7429,121 @@
           <w:sz w:val="20"/>
           <w:szCs w:val="20"/>
         </w:rPr>
-        <w:t xml:space="preserve">주요 확인 시점은 사전 검증 통과 판정, 1단계 출시 조건 충족, 2단계 전환 조건 충족의 3개 지점. 일정상 최대 제약은 </w:t>
-      </w:r>
-      <w:r>
-        <w:rPr>
-          <w:rFonts w:ascii="맑은 고딕" w:cs="맑은 고딕" w:eastAsia="맑은 고딕" w:hAnsi="맑은 고딕"/>
-          <w:b/>
-          <w:bCs/>
-          <w:sz w:val="20"/>
-          <w:szCs w:val="20"/>
-        </w:rPr>
-        <w:t xml:space="preserve">정기인사 이전의 자료 정비 완료</w:t>
-      </w:r>
-      <w:r>
-        <w:rPr>
-          <w:rFonts w:ascii="맑은 고딕" w:cs="맑은 고딕" w:eastAsia="맑은 고딕" w:hAnsi="맑은 고딕"/>
-          <w:sz w:val="20"/>
-          <w:szCs w:val="20"/>
-        </w:rPr>
-        <w:t xml:space="preserve">.</w:t>
+        <w:t xml:space="preserve">주요 확인 시점은 </w:t>
+      </w:r>
+      <w:r>
+        <w:rPr>
+          <w:rFonts w:ascii="맑은 고딕" w:cs="맑은 고딕" w:eastAsia="맑은 고딕" w:hAnsi="맑은 고딕"/>
+          <w:b/>
+          <w:bCs/>
+          <w:sz w:val="20"/>
+          <w:szCs w:val="20"/>
+        </w:rPr>
+        <w:t xml:space="preserve">8/14 핵심 FAQ 반영 완료</w:t>
+      </w:r>
+      <w:r>
+        <w:rPr>
+          <w:rFonts w:ascii="맑은 고딕" w:cs="맑은 고딕" w:eastAsia="맑은 고딕" w:hAnsi="맑은 고딕"/>
+          <w:sz w:val="20"/>
+          <w:szCs w:val="20"/>
+        </w:rPr>
+        <w:t xml:space="preserve">, </w:t>
+      </w:r>
+      <w:r>
+        <w:rPr>
+          <w:rFonts w:ascii="맑은 고딕" w:cs="맑은 고딕" w:eastAsia="맑은 고딕" w:hAnsi="맑은 고딕"/>
+          <w:b/>
+          <w:bCs/>
+          <w:sz w:val="20"/>
+          <w:szCs w:val="20"/>
+        </w:rPr>
+        <w:t xml:space="preserve">8/21 스테이징 개발 완료</w:t>
+      </w:r>
+      <w:r>
+        <w:rPr>
+          <w:rFonts w:ascii="맑은 고딕" w:cs="맑은 고딕" w:eastAsia="맑은 고딕" w:hAnsi="맑은 고딕"/>
+          <w:sz w:val="20"/>
+          <w:szCs w:val="20"/>
+        </w:rPr>
+        <w:t xml:space="preserve">, </w:t>
+      </w:r>
+      <w:r>
+        <w:rPr>
+          <w:rFonts w:ascii="맑은 고딕" w:cs="맑은 고딕" w:eastAsia="맑은 고딕" w:hAnsi="맑은 고딕"/>
+          <w:b/>
+          <w:bCs/>
+          <w:sz w:val="20"/>
+          <w:szCs w:val="20"/>
+        </w:rPr>
+        <w:t xml:space="preserve">9월 말 1단계 판정</w:t>
+      </w:r>
+      <w:r>
+        <w:rPr>
+          <w:rFonts w:ascii="맑은 고딕" w:cs="맑은 고딕" w:eastAsia="맑은 고딕" w:hAnsi="맑은 고딕"/>
+          <w:sz w:val="20"/>
+          <w:szCs w:val="20"/>
+        </w:rPr>
+        <w:t xml:space="preserve">, </w:t>
+      </w:r>
+      <w:r>
+        <w:rPr>
+          <w:rFonts w:ascii="맑은 고딕" w:cs="맑은 고딕" w:eastAsia="맑은 고딕" w:hAnsi="맑은 고딕"/>
+          <w:b/>
+          <w:bCs/>
+          <w:sz w:val="20"/>
+          <w:szCs w:val="20"/>
+        </w:rPr>
+        <w:t xml:space="preserve">11월 2단계 확대</w:t>
+      </w:r>
+      <w:r>
+        <w:rPr>
+          <w:rFonts w:ascii="맑은 고딕" w:cs="맑은 고딕" w:eastAsia="맑은 고딕" w:hAnsi="맑은 고딕"/>
+          <w:sz w:val="20"/>
+          <w:szCs w:val="20"/>
+        </w:rPr>
+        <w:t xml:space="preserve">의 4개 지점.</w:t>
+      </w:r>
+    </w:p>
+    <w:p>
+      <w:pPr>
+        <w:pBdr>
+          <w:left w:val="single" w:color="E0A800" w:sz="18" w:space="8"/>
+        </w:pBdr>
+        <w:shd w:fill="FFF8E1" w:val="clear"/>
+        <w:spacing w:after="90" w:line="264"/>
+        <w:ind w:left="260"/>
+      </w:pPr>
+      <w:r>
+        <w:rPr>
+          <w:rFonts w:ascii="맑은 고딕" w:cs="맑은 고딕" w:eastAsia="맑은 고딕" w:hAnsi="맑은 고딕"/>
+          <w:i w:val="false"/>
+          <w:iCs w:val="false"/>
+          <w:sz w:val="20"/>
+          <w:szCs w:val="20"/>
+        </w:rPr>
+        <w:t xml:space="preserve">⚠️ 11월 정기인사 발령과 예비발령자 공개 시점이 동일하여, </w:t>
+      </w:r>
+      <w:r>
+        <w:rPr>
+          <w:rFonts w:ascii="맑은 고딕" w:cs="맑은 고딕" w:eastAsia="맑은 고딕" w:hAnsi="맑은 고딕"/>
+          <w:b/>
+          <w:bCs/>
+          <w:i w:val="false"/>
+          <w:iCs w:val="false"/>
+          <w:sz w:val="20"/>
+          <w:szCs w:val="20"/>
+        </w:rPr>
+        <w:t xml:space="preserve">발령 직후 부임 안내서 정비와 공개가 같은 시기에 몰릴 우려</w:t>
+      </w:r>
+      <w:r>
+        <w:rPr>
+          <w:rFonts w:ascii="맑은 고딕" w:cs="맑은 고딕" w:eastAsia="맑은 고딕" w:hAnsi="맑은 고딕"/>
+          <w:i w:val="false"/>
+          <w:iCs w:val="false"/>
+          <w:sz w:val="20"/>
+          <w:szCs w:val="20"/>
+        </w:rPr>
+        <w:t xml:space="preserve">. 안내서 정비를 발령 전 준비 가능한 범위까지 선행할 필요.</w:t>
       </w:r>
     </w:p>
     <w:p>

</xml_diff>

<commit_message>
Replace use cases with actual regulation content
유스케이스를 실제 규정 수치와 절차가 반영된 12건으로 교체.

유스케이스(14항):
- 기존 7건의 예시 기반 대화를 실제 내용 12건으로 전면 교체
- 부임 준비, 비자, 부임일 연기, 건강보험, 주택 임차, 학자금, 요양비,
  출장 결재, 현지직원 채용, 직급 호칭, 급여 수당, 항공권
- 제출 서류 목록, 임차 한도, 수당 지급액, 지원 비율, 전결 기준 등
  실제 규정 수치 반영

누락 기능 보완:
- 유스케이스 대부분이 답변 후 체크리스트, 안내서, 신청서, 기준표
  생성으로 이어지나 기존 문서에는 해당 기능이 없어 신규 추가
- 주요 기능 및 제품 요약에 산출물 생성 항목 추가
- 기능 요구사항에 산출물 생성 제안 및 사용자 선택 시 생성, 생성물의
  근거 조항과 생성 시점 병기, 담당자 확정 전 초안 상태 유지 요건 추가

기타: 문서 개요의 버전 표기 복구

Co-Authored-By: Claude Opus 5 <noreply@anthropic.com>
Claude-Session: https://claude.ai/code/session_01Ekn86cpQq9yULpsy9iFqKx
</commit_message>
<xml_diff>
--- a/prds/국외근무직원-HR-에이전트-PRD.docx
+++ b/prds/국외근무직원-HR-에이전트-PRD.docx
@@ -75,7 +75,7 @@
           <w:sz w:val="20"/>
           <w:szCs w:val="20"/>
         </w:rPr>
-        <w:t xml:space="preserve">버전 / Version: v0.9 (초안)</w:t>
+        <w:t xml:space="preserve">버전 / Version: v1.0 (초안)</w:t>
       </w:r>
     </w:p>
     <w:p>
@@ -371,6 +371,34 @@
           <w:szCs w:val="20"/>
         </w:rPr>
         <w:t xml:space="preserve"> — 부임 전 제출 서류 등 국가별·용도별 최신 양식 직접 제공</w:t>
+      </w:r>
+    </w:p>
+    <w:p>
+      <w:pPr>
+        <w:pStyle w:val="ListParagraph"/>
+        <w:numPr>
+          <w:ilvl w:val="0"/>
+          <w:numId w:val="2"/>
+        </w:numPr>
+        <w:spacing w:after="30" w:line="264"/>
+      </w:pPr>
+      <w:r>
+        <w:rPr>
+          <w:rFonts w:ascii="맑은 고딕" w:cs="맑은 고딕" w:eastAsia="맑은 고딕" w:hAnsi="맑은 고딕"/>
+          <w:b/>
+          <w:bCs/>
+          <w:sz w:val="20"/>
+          <w:szCs w:val="20"/>
+        </w:rPr>
+        <w:t xml:space="preserve">산출물 생성</w:t>
+      </w:r>
+      <w:r>
+        <w:rPr>
+          <w:rFonts w:ascii="맑은 고딕" w:cs="맑은 고딕" w:eastAsia="맑은 고딕" w:hAnsi="맑은 고딕"/>
+          <w:sz w:val="20"/>
+          <w:szCs w:val="20"/>
+        </w:rPr>
+        <w:t xml:space="preserve"> — 답변 기반 체크리스트·안내서·신청서 등 실행 문서 생성</w:t>
       </w:r>
     </w:p>
     <w:p>
@@ -1821,6 +1849,34 @@
           <w:szCs w:val="20"/>
         </w:rPr>
         <w:t xml:space="preserve"> — 부임 전 제출 서류 등 국가별·용도별 최신 양식의 직접 제공</w:t>
+      </w:r>
+    </w:p>
+    <w:p>
+      <w:pPr>
+        <w:pStyle w:val="ListParagraph"/>
+        <w:numPr>
+          <w:ilvl w:val="0"/>
+          <w:numId w:val="2"/>
+        </w:numPr>
+        <w:spacing w:after="30" w:line="264"/>
+      </w:pPr>
+      <w:r>
+        <w:rPr>
+          <w:rFonts w:ascii="맑은 고딕" w:cs="맑은 고딕" w:eastAsia="맑은 고딕" w:hAnsi="맑은 고딕"/>
+          <w:b/>
+          <w:bCs/>
+          <w:sz w:val="20"/>
+          <w:szCs w:val="20"/>
+        </w:rPr>
+        <w:t xml:space="preserve">산출물 생성</w:t>
+      </w:r>
+      <w:r>
+        <w:rPr>
+          <w:rFonts w:ascii="맑은 고딕" w:cs="맑은 고딕" w:eastAsia="맑은 고딕" w:hAnsi="맑은 고딕"/>
+          <w:sz w:val="20"/>
+          <w:szCs w:val="20"/>
+        </w:rPr>
+        <w:t xml:space="preserve"> — 답변 내용을 기반으로 체크리스트·안내서·신청서·기준표 등 실행 문서 생성</w:t>
       </w:r>
     </w:p>
     <w:p>
@@ -1968,8 +2024,8 @@
         </w:tblBorders>
       </w:tblPr>
       <w:tblGrid>
-        <w:gridCol w:w="1500"/>
-        <w:gridCol w:w="8246"/>
+        <w:gridCol w:w="841"/>
+        <w:gridCol w:w="8905"/>
       </w:tblGrid>
       <w:tr>
         <w:trPr>
@@ -1977,7 +2033,7 @@
         </w:trPr>
         <w:tc>
           <w:tcPr>
-            <w:tcW w:type="dxa" w:w="1500"/>
+            <w:tcW w:type="dxa" w:w="841"/>
             <w:shd w:fill="E8EEF4" w:val="clear"/>
             <w:tcMar>
               <w:top w:type="dxa" w:w="36"/>
@@ -2004,7 +2060,7 @@
         </w:tc>
         <w:tc>
           <w:tcPr>
-            <w:tcW w:type="dxa" w:w="8246"/>
+            <w:tcW w:type="dxa" w:w="8905"/>
             <w:shd w:fill="E8EEF4" w:val="clear"/>
             <w:tcMar>
               <w:top w:type="dxa" w:w="36"/>
@@ -2036,7 +2092,7 @@
         </w:trPr>
         <w:tc>
           <w:tcPr>
-            <w:tcW w:type="dxa" w:w="1500"/>
+            <w:tcW w:type="dxa" w:w="841"/>
             <w:tcMar>
               <w:top w:type="dxa" w:w="36"/>
               <w:left w:type="dxa" w:w="80"/>
@@ -2056,13 +2112,13 @@
                 <w:sz w:val="17"/>
                 <w:szCs w:val="17"/>
               </w:rPr>
-              <w:t xml:space="preserve">부임여비 문의</w:t>
+              <w:t xml:space="preserve">부임 준비</w:t>
             </w:r>
           </w:p>
         </w:tc>
         <w:tc>
           <w:tcPr>
-            <w:tcW w:type="dxa" w:w="8246"/>
+            <w:tcW w:type="dxa" w:w="8905"/>
             <w:tcMar>
               <w:top w:type="dxa" w:w="36"/>
               <w:left w:type="dxa" w:w="80"/>
@@ -2090,7 +2146,7 @@
                 <w:sz w:val="17"/>
                 <w:szCs w:val="17"/>
               </w:rPr>
-              <w:t xml:space="preserve"> 홍콩 부임여비는 어떻게 되나요?</w:t>
+              <w:t xml:space="preserve"> 인도네시아 부임 준비사항 알려줘</w:t>
             </w:r>
           </w:p>
           <w:p>
@@ -2113,7 +2169,7 @@
                 <w:sz w:val="17"/>
                 <w:szCs w:val="17"/>
               </w:rPr>
-              <w:t xml:space="preserve"> 홍콩지점 부임 기준으로 안내드립니다. 「복지·여비규정」 제○조 및 「복지·여비운영지침」 제○조에 따라 부임여비는 다음 항목으로 구성됩니다.</w:t>
+              <w:t xml:space="preserve"> 인도네시아 부임 예정 직원이 제출해야 할 서류를 조회했습니다.</w:t>
             </w:r>
           </w:p>
           <w:p>
@@ -2126,7 +2182,7 @@
                 <w:sz w:val="17"/>
                 <w:szCs w:val="17"/>
               </w:rPr>
-              <w:t xml:space="preserve">　① 체재비 — 부임 초기 ○일간, 1일 ○○ 지급</w:t>
+              <w:t xml:space="preserve">　① 서약서　② 급여환입 출금동의서　③ 건강검진 서류　④ 여권 사본　⑤ 노트북 S/N·MAC주소</w:t>
             </w:r>
           </w:p>
           <w:p>
@@ -2136,10 +2192,20 @@
             <w:r>
               <w:rPr>
                 <w:rFonts w:ascii="맑은 고딕" w:cs="맑은 고딕" w:eastAsia="맑은 고딕" w:hAnsi="맑은 고딕"/>
-                <w:sz w:val="17"/>
-                <w:szCs w:val="17"/>
-              </w:rPr>
-              <w:t xml:space="preserve">　② 이전료 — 직급별 정액 ○○ 지급</w:t>
+                <w:b/>
+                <w:bCs/>
+                <w:sz w:val="17"/>
+                <w:szCs w:val="17"/>
+              </w:rPr>
+              <w:t xml:space="preserve">(AI)</w:t>
+            </w:r>
+            <w:r>
+              <w:rPr>
+                <w:rFonts w:ascii="맑은 고딕" w:cs="맑은 고딕" w:eastAsia="맑은 고딕" w:hAnsi="맑은 고딕"/>
+                <w:sz w:val="17"/>
+                <w:szCs w:val="17"/>
+              </w:rPr>
+              <w:t xml:space="preserve"> 부임 준비 체크리스트를 생성해드릴까요?　[+ 체크리스트 생성]</w:t>
             </w:r>
           </w:p>
           <w:p>
@@ -2149,10 +2215,20 @@
             <w:r>
               <w:rPr>
                 <w:rFonts w:ascii="맑은 고딕" w:cs="맑은 고딕" w:eastAsia="맑은 고딕" w:hAnsi="맑은 고딕"/>
-                <w:sz w:val="17"/>
-                <w:szCs w:val="17"/>
-              </w:rPr>
-              <w:t xml:space="preserve">　③ 가족부임비 — 동반가족이 있는 경우 1인당 ○○ 지급</w:t>
+                <w:b/>
+                <w:bCs/>
+                <w:sz w:val="17"/>
+                <w:szCs w:val="17"/>
+              </w:rPr>
+              <w:t xml:space="preserve">(직원)</w:t>
+            </w:r>
+            <w:r>
+              <w:rPr>
+                <w:rFonts w:ascii="맑은 고딕" w:cs="맑은 고딕" w:eastAsia="맑은 고딕" w:hAnsi="맑은 고딕"/>
+                <w:sz w:val="17"/>
+                <w:szCs w:val="17"/>
+              </w:rPr>
+              <w:t xml:space="preserve"> 체크리스트 생성 버튼 클릭</w:t>
             </w:r>
           </w:p>
           <w:p>
@@ -2162,73 +2238,11 @@
             <w:r>
               <w:rPr>
                 <w:rFonts w:ascii="맑은 고딕" w:cs="맑은 고딕" w:eastAsia="맑은 고딕" w:hAnsi="맑은 고딕"/>
-                <w:sz w:val="17"/>
-                <w:szCs w:val="17"/>
-              </w:rPr>
-              <w:t xml:space="preserve">　· 근거: 「복지·여비규정」 제○조 (시행일 2026.○.○)</w:t>
-            </w:r>
-          </w:p>
-          <w:p>
-            <w:pPr>
-              <w:spacing w:after="0" w:line="224"/>
-            </w:pPr>
-            <w:r>
-              <w:rPr>
-                <w:rFonts w:ascii="맑은 고딕" w:cs="맑은 고딕" w:eastAsia="맑은 고딕" w:hAnsi="맑은 고딕"/>
-                <w:sz w:val="17"/>
-                <w:szCs w:val="17"/>
-              </w:rPr>
-              <w:t xml:space="preserve">　· 소관: HR·직원만족부</w:t>
-            </w:r>
-          </w:p>
-          <w:p>
-            <w:pPr>
-              <w:spacing w:after="0" w:line="224"/>
-            </w:pPr>
-            <w:r>
-              <w:rPr>
-                <w:rFonts w:ascii="맑은 고딕" w:cs="맑은 고딕" w:eastAsia="맑은 고딕" w:hAnsi="맑은 고딕"/>
-                <w:sz w:val="17"/>
-                <w:szCs w:val="17"/>
-              </w:rPr>
-              <w:t xml:space="preserve">본 안내는 규정 원문 인용이며, 개별 적용 여부는 담당자 확인이 필요합니다.</w:t>
-            </w:r>
-          </w:p>
-          <w:p>
-            <w:pPr>
-              <w:spacing w:after="0" w:line="224"/>
-            </w:pPr>
-            <w:r>
-              <w:rPr>
-                <w:rFonts w:ascii="맑은 고딕" w:cs="맑은 고딕" w:eastAsia="맑은 고딕" w:hAnsi="맑은 고딕"/>
                 <w:b/>
                 <w:bCs/>
                 <w:sz w:val="17"/>
                 <w:szCs w:val="17"/>
               </w:rPr>
-              <w:t xml:space="preserve">(직원)</w:t>
-            </w:r>
-            <w:r>
-              <w:rPr>
-                <w:rFonts w:ascii="맑은 고딕" w:cs="맑은 고딕" w:eastAsia="맑은 고딕" w:hAnsi="맑은 고딕"/>
-                <w:sz w:val="17"/>
-                <w:szCs w:val="17"/>
-              </w:rPr>
-              <w:t xml:space="preserve"> 가족을 동반하면 얼마나 달라지나요?</w:t>
-            </w:r>
-          </w:p>
-          <w:p>
-            <w:pPr>
-              <w:spacing w:after="0" w:line="224"/>
-            </w:pPr>
-            <w:r>
-              <w:rPr>
-                <w:rFonts w:ascii="맑은 고딕" w:cs="맑은 고딕" w:eastAsia="맑은 고딕" w:hAnsi="맑은 고딕"/>
-                <w:b/>
-                <w:bCs/>
-                <w:sz w:val="17"/>
-                <w:szCs w:val="17"/>
-              </w:rPr>
               <w:t xml:space="preserve">(AI)</w:t>
             </w:r>
             <w:r>
@@ -2237,7 +2251,7 @@
                 <w:sz w:val="17"/>
                 <w:szCs w:val="17"/>
               </w:rPr>
-              <w:t xml:space="preserve"> 동반가족 1인당 가족부임비 ○○이 추가 지급되며, 체재비는 본인 기준으로 산정됩니다. 다만 동반가족의 인정 범위는 개별 확인이 필요한 사항이므로 담당자 문의를 권장드립니다.</w:t>
+              <w:t xml:space="preserve"> 부임 준비 체크리스트 화면 생성</w:t>
             </w:r>
           </w:p>
         </w:tc>
@@ -2248,7 +2262,7 @@
         </w:trPr>
         <w:tc>
           <w:tcPr>
-            <w:tcW w:type="dxa" w:w="1500"/>
+            <w:tcW w:type="dxa" w:w="841"/>
             <w:tcMar>
               <w:top w:type="dxa" w:w="36"/>
               <w:left w:type="dxa" w:w="80"/>
@@ -2268,13 +2282,13 @@
                 <w:sz w:val="17"/>
                 <w:szCs w:val="17"/>
               </w:rPr>
-              <w:t xml:space="preserve">부임 제출서류 문의</w:t>
+              <w:t xml:space="preserve">비자</w:t>
             </w:r>
           </w:p>
         </w:tc>
         <w:tc>
           <w:tcPr>
-            <w:tcW w:type="dxa" w:w="8246"/>
+            <w:tcW w:type="dxa" w:w="8905"/>
             <w:tcMar>
               <w:top w:type="dxa" w:w="36"/>
               <w:left w:type="dxa" w:w="80"/>
@@ -2294,15 +2308,15 @@
                 <w:sz w:val="17"/>
                 <w:szCs w:val="17"/>
               </w:rPr>
-              <w:t xml:space="preserve">(예비발령자)</w:t>
-            </w:r>
-            <w:r>
-              <w:rPr>
-                <w:rFonts w:ascii="맑은 고딕" w:cs="맑은 고딕" w:eastAsia="맑은 고딕" w:hAnsi="맑은 고딕"/>
-                <w:sz w:val="17"/>
-                <w:szCs w:val="17"/>
-              </w:rPr>
-              <w:t xml:space="preserve"> 인도네시아 부임 전에 제출할 서류가 무엇인가요?</w:t>
+              <w:t xml:space="preserve">(직원)</w:t>
+            </w:r>
+            <w:r>
+              <w:rPr>
+                <w:rFonts w:ascii="맑은 고딕" w:cs="맑은 고딕" w:eastAsia="맑은 고딕" w:hAnsi="맑은 고딕"/>
+                <w:sz w:val="17"/>
+                <w:szCs w:val="17"/>
+              </w:rPr>
+              <w:t xml:space="preserve"> 인도네시아 비자 발급 절차 알려줘</w:t>
             </w:r>
           </w:p>
           <w:p>
@@ -2325,7 +2339,7 @@
                 <w:sz w:val="17"/>
                 <w:szCs w:val="17"/>
               </w:rPr>
-              <w:t xml:space="preserve"> 인도네시아 자회사 부임 기준 제출 서류는 다음과 같습니다.</w:t>
+              <w:t xml:space="preserve"> 예비발령 후 비자 발급 서류를 글로벌성장지원부에 제출하고, 현지 입국 후 KITAS 비자 발급을 진행합니다. (발급 소요 약 2주)</w:t>
             </w:r>
           </w:p>
           <w:p>
@@ -2335,10 +2349,20 @@
             <w:r>
               <w:rPr>
                 <w:rFonts w:ascii="맑은 고딕" w:cs="맑은 고딕" w:eastAsia="맑은 고딕" w:hAnsi="맑은 고딕"/>
-                <w:sz w:val="17"/>
-                <w:szCs w:val="17"/>
-              </w:rPr>
-              <w:t xml:space="preserve">　① 부임 신고서 — 발령일 ○일 전까지 [양식 내려받기]</w:t>
+                <w:b/>
+                <w:bCs/>
+                <w:sz w:val="17"/>
+                <w:szCs w:val="17"/>
+              </w:rPr>
+              <w:t xml:space="preserve">(AI)</w:t>
+            </w:r>
+            <w:r>
+              <w:rPr>
+                <w:rFonts w:ascii="맑은 고딕" w:cs="맑은 고딕" w:eastAsia="맑은 고딕" w:hAnsi="맑은 고딕"/>
+                <w:sz w:val="17"/>
+                <w:szCs w:val="17"/>
+              </w:rPr>
+              <w:t xml:space="preserve"> 비자 준비 안내서를 생성해드릴까요?　[+ 안내서 생성]</w:t>
             </w:r>
           </w:p>
           <w:p>
@@ -2348,10 +2372,20 @@
             <w:r>
               <w:rPr>
                 <w:rFonts w:ascii="맑은 고딕" w:cs="맑은 고딕" w:eastAsia="맑은 고딕" w:hAnsi="맑은 고딕"/>
-                <w:sz w:val="17"/>
-                <w:szCs w:val="17"/>
-              </w:rPr>
-              <w:t xml:space="preserve">　② 가족관계증명서 — 동반가족이 있는 경우에 한함</w:t>
+                <w:b/>
+                <w:bCs/>
+                <w:sz w:val="17"/>
+                <w:szCs w:val="17"/>
+              </w:rPr>
+              <w:t xml:space="preserve">(직원)</w:t>
+            </w:r>
+            <w:r>
+              <w:rPr>
+                <w:rFonts w:ascii="맑은 고딕" w:cs="맑은 고딕" w:eastAsia="맑은 고딕" w:hAnsi="맑은 고딕"/>
+                <w:sz w:val="17"/>
+                <w:szCs w:val="17"/>
+              </w:rPr>
+              <w:t xml:space="preserve"> 안내서 생성 버튼 클릭</w:t>
             </w:r>
           </w:p>
           <w:p>
@@ -2361,86 +2395,11 @@
             <w:r>
               <w:rPr>
                 <w:rFonts w:ascii="맑은 고딕" w:cs="맑은 고딕" w:eastAsia="맑은 고딕" w:hAnsi="맑은 고딕"/>
-                <w:sz w:val="17"/>
-                <w:szCs w:val="17"/>
-              </w:rPr>
-              <w:t xml:space="preserve">　③ 건강진단 결과서 — 지정 병원 발급분, 발급일 ○개월 이내</w:t>
-            </w:r>
-          </w:p>
-          <w:p>
-            <w:pPr>
-              <w:spacing w:after="0" w:line="224"/>
-            </w:pPr>
-            <w:r>
-              <w:rPr>
-                <w:rFonts w:ascii="맑은 고딕" w:cs="맑은 고딕" w:eastAsia="맑은 고딕" w:hAnsi="맑은 고딕"/>
-                <w:sz w:val="17"/>
-                <w:szCs w:val="17"/>
-              </w:rPr>
-              <w:t xml:space="preserve">　④ 사택 임차 관련 서류 — 현지 계약 체결 후 제출</w:t>
-            </w:r>
-          </w:p>
-          <w:p>
-            <w:pPr>
-              <w:spacing w:after="0" w:line="224"/>
-            </w:pPr>
-            <w:r>
-              <w:rPr>
-                <w:rFonts w:ascii="맑은 고딕" w:cs="맑은 고딕" w:eastAsia="맑은 고딕" w:hAnsi="맑은 고딕"/>
-                <w:sz w:val="17"/>
-                <w:szCs w:val="17"/>
-              </w:rPr>
-              <w:t xml:space="preserve">①~③은 부임 전, ④는 부임 후 ○일 이내 제출 대상입니다.</w:t>
-            </w:r>
-          </w:p>
-          <w:p>
-            <w:pPr>
-              <w:spacing w:after="0" w:line="224"/>
-            </w:pPr>
-            <w:r>
-              <w:rPr>
-                <w:rFonts w:ascii="맑은 고딕" w:cs="맑은 고딕" w:eastAsia="맑은 고딕" w:hAnsi="맑은 고딕"/>
-                <w:sz w:val="17"/>
-                <w:szCs w:val="17"/>
-              </w:rPr>
-              <w:t xml:space="preserve">제출처는 글로벌성장지원부이며, 서류 누락 시 부임 절차가 지연될 수 있습니다.</w:t>
-            </w:r>
-          </w:p>
-          <w:p>
-            <w:pPr>
-              <w:spacing w:after="0" w:line="224"/>
-            </w:pPr>
-            <w:r>
-              <w:rPr>
-                <w:rFonts w:ascii="맑은 고딕" w:cs="맑은 고딕" w:eastAsia="맑은 고딕" w:hAnsi="맑은 고딕"/>
                 <w:b/>
                 <w:bCs/>
                 <w:sz w:val="17"/>
                 <w:szCs w:val="17"/>
               </w:rPr>
-              <w:t xml:space="preserve">(예비발령자)</w:t>
-            </w:r>
-            <w:r>
-              <w:rPr>
-                <w:rFonts w:ascii="맑은 고딕" w:cs="맑은 고딕" w:eastAsia="맑은 고딕" w:hAnsi="맑은 고딕"/>
-                <w:sz w:val="17"/>
-                <w:szCs w:val="17"/>
-              </w:rPr>
-              <w:t xml:space="preserve"> 건강진단은 아무 병원에서나 받아도 되나요?</w:t>
-            </w:r>
-          </w:p>
-          <w:p>
-            <w:pPr>
-              <w:spacing w:after="0" w:line="224"/>
-            </w:pPr>
-            <w:r>
-              <w:rPr>
-                <w:rFonts w:ascii="맑은 고딕" w:cs="맑은 고딕" w:eastAsia="맑은 고딕" w:hAnsi="맑은 고딕"/>
-                <w:b/>
-                <w:bCs/>
-                <w:sz w:val="17"/>
-                <w:szCs w:val="17"/>
-              </w:rPr>
               <w:t xml:space="preserve">(AI)</w:t>
             </w:r>
             <w:r>
@@ -2449,7 +2408,7 @@
                 <w:sz w:val="17"/>
                 <w:szCs w:val="17"/>
               </w:rPr>
-              <w:t xml:space="preserve"> 지정 병원 발급분만 인정됩니다. 지정 병원 목록은 [부임 안내서]에서 확인하실 수 있으며, 부득이하게 다른 기관을 이용해야 하는 경우 담당자 사전 협의가 필요합니다.</w:t>
+              <w:t xml:space="preserve"> 비자 준비 안내서 화면 생성</w:t>
             </w:r>
           </w:p>
         </w:tc>
@@ -2460,7 +2419,7 @@
         </w:trPr>
         <w:tc>
           <w:tcPr>
-            <w:tcW w:type="dxa" w:w="1500"/>
+            <w:tcW w:type="dxa" w:w="841"/>
             <w:tcMar>
               <w:top w:type="dxa" w:w="36"/>
               <w:left w:type="dxa" w:w="80"/>
@@ -2480,13 +2439,13 @@
                 <w:sz w:val="17"/>
                 <w:szCs w:val="17"/>
               </w:rPr>
-              <w:t xml:space="preserve">복귀 절차 문의</w:t>
+              <w:t xml:space="preserve">부임일 연기</w:t>
             </w:r>
           </w:p>
         </w:tc>
         <w:tc>
           <w:tcPr>
-            <w:tcW w:type="dxa" w:w="8246"/>
+            <w:tcW w:type="dxa" w:w="8905"/>
             <w:tcMar>
               <w:top w:type="dxa" w:w="36"/>
               <w:left w:type="dxa" w:w="80"/>
@@ -2514,7 +2473,7 @@
                 <w:sz w:val="17"/>
                 <w:szCs w:val="17"/>
               </w:rPr>
-              <w:t xml:space="preserve"> 다음 달에 복귀하는데 무엇을 준비해야 하나요?</w:t>
+              <w:t xml:space="preserve"> 비자 발급이 늦어지는데 부임일 연기 가능해?</w:t>
             </w:r>
           </w:p>
           <w:p>
@@ -2537,7 +2496,7 @@
                 <w:sz w:val="17"/>
                 <w:szCs w:val="17"/>
               </w:rPr>
-              <w:t xml:space="preserve"> 복귀 준비 항목은 다음과 같습니다.</w:t>
+              <w:t xml:space="preserve"> VISA·체류허가 발급 지연은 규정상 연기 신청 가능 사유입니다. 부점장급은 경영지원그룹대표, 기타직원은 인사담당 부서장 승인이 필요합니다.</w:t>
             </w:r>
           </w:p>
           <w:p>
@@ -2547,10 +2506,20 @@
             <w:r>
               <w:rPr>
                 <w:rFonts w:ascii="맑은 고딕" w:cs="맑은 고딕" w:eastAsia="맑은 고딕" w:hAnsi="맑은 고딕"/>
-                <w:sz w:val="17"/>
-                <w:szCs w:val="17"/>
-              </w:rPr>
-              <w:t xml:space="preserve">　① 복귀 신고서 제출 — 복귀일 ○일 전까지 [양식 내려받기]</w:t>
+                <w:b/>
+                <w:bCs/>
+                <w:sz w:val="17"/>
+                <w:szCs w:val="17"/>
+              </w:rPr>
+              <w:t xml:space="preserve">(AI)</w:t>
+            </w:r>
+            <w:r>
+              <w:rPr>
+                <w:rFonts w:ascii="맑은 고딕" w:cs="맑은 고딕" w:eastAsia="맑은 고딕" w:hAnsi="맑은 고딕"/>
+                <w:sz w:val="17"/>
+                <w:szCs w:val="17"/>
+              </w:rPr>
+              <w:t xml:space="preserve"> 연기 신청서를 생성해드릴까요?　[+ 신청서 생성]</w:t>
             </w:r>
           </w:p>
           <w:p>
@@ -2560,10 +2529,20 @@
             <w:r>
               <w:rPr>
                 <w:rFonts w:ascii="맑은 고딕" w:cs="맑은 고딕" w:eastAsia="맑은 고딕" w:hAnsi="맑은 고딕"/>
-                <w:sz w:val="17"/>
-                <w:szCs w:val="17"/>
-              </w:rPr>
-              <w:t xml:space="preserve">　② 사택 임차계약 해지 통보 — 계약서상 통보 기한 확인 필요 (통상 ○개월 전)</w:t>
+                <w:b/>
+                <w:bCs/>
+                <w:sz w:val="17"/>
+                <w:szCs w:val="17"/>
+              </w:rPr>
+              <w:t xml:space="preserve">(직원)</w:t>
+            </w:r>
+            <w:r>
+              <w:rPr>
+                <w:rFonts w:ascii="맑은 고딕" w:cs="맑은 고딕" w:eastAsia="맑은 고딕" w:hAnsi="맑은 고딕"/>
+                <w:sz w:val="17"/>
+                <w:szCs w:val="17"/>
+              </w:rPr>
+              <w:t xml:space="preserve"> 신청서 생성 버튼 클릭</w:t>
             </w:r>
           </w:p>
           <w:p>
@@ -2573,99 +2552,11 @@
             <w:r>
               <w:rPr>
                 <w:rFonts w:ascii="맑은 고딕" w:cs="맑은 고딕" w:eastAsia="맑은 고딕" w:hAnsi="맑은 고딕"/>
-                <w:sz w:val="17"/>
-                <w:szCs w:val="17"/>
-              </w:rPr>
-              <w:t xml:space="preserve">　③ 현지 정산 — 관리비·공과금 등 미납분 정산 후 증빙 제출</w:t>
-            </w:r>
-          </w:p>
-          <w:p>
-            <w:pPr>
-              <w:spacing w:after="0" w:line="224"/>
-            </w:pPr>
-            <w:r>
-              <w:rPr>
-                <w:rFonts w:ascii="맑은 고딕" w:cs="맑은 고딕" w:eastAsia="맑은 고딕" w:hAnsi="맑은 고딕"/>
-                <w:sz w:val="17"/>
-                <w:szCs w:val="17"/>
-              </w:rPr>
-              <w:t xml:space="preserve">　④ 학자금 정산 서류 — 자녀 학자금 수령자에 한함</w:t>
-            </w:r>
-          </w:p>
-          <w:p>
-            <w:pPr>
-              <w:spacing w:after="0" w:line="224"/>
-            </w:pPr>
-            <w:r>
-              <w:rPr>
-                <w:rFonts w:ascii="맑은 고딕" w:cs="맑은 고딕" w:eastAsia="맑은 고딕" w:hAnsi="맑은 고딕"/>
-                <w:sz w:val="17"/>
-                <w:szCs w:val="17"/>
-              </w:rPr>
-              <w:t xml:space="preserve">　· 근거: 「국외근무직원 인사에 관한 규정」 제○조</w:t>
-            </w:r>
-          </w:p>
-          <w:p>
-            <w:pPr>
-              <w:spacing w:after="0" w:line="224"/>
-            </w:pPr>
-            <w:r>
-              <w:rPr>
-                <w:rFonts w:ascii="맑은 고딕" w:cs="맑은 고딕" w:eastAsia="맑은 고딕" w:hAnsi="맑은 고딕"/>
-                <w:sz w:val="17"/>
-                <w:szCs w:val="17"/>
-              </w:rPr>
-              <w:t xml:space="preserve">　· 소관: HR·직원만족부</w:t>
-            </w:r>
-          </w:p>
-          <w:p>
-            <w:pPr>
-              <w:spacing w:after="0" w:line="224"/>
-            </w:pPr>
-            <w:r>
-              <w:rPr>
-                <w:rFonts w:ascii="맑은 고딕" w:cs="맑은 고딕" w:eastAsia="맑은 고딕" w:hAnsi="맑은 고딕"/>
-                <w:sz w:val="17"/>
-                <w:szCs w:val="17"/>
-              </w:rPr>
-              <w:t xml:space="preserve">사택 계약 해지 통보 기한은 국가 및 계약별로 상이하므로 계약서를 우선 확인하시기 바랍니다.</w:t>
-            </w:r>
-          </w:p>
-          <w:p>
-            <w:pPr>
-              <w:spacing w:after="0" w:line="224"/>
-            </w:pPr>
-            <w:r>
-              <w:rPr>
-                <w:rFonts w:ascii="맑은 고딕" w:cs="맑은 고딕" w:eastAsia="맑은 고딕" w:hAnsi="맑은 고딕"/>
                 <w:b/>
                 <w:bCs/>
                 <w:sz w:val="17"/>
                 <w:szCs w:val="17"/>
               </w:rPr>
-              <w:t xml:space="preserve">(직원)</w:t>
-            </w:r>
-            <w:r>
-              <w:rPr>
-                <w:rFonts w:ascii="맑은 고딕" w:cs="맑은 고딕" w:eastAsia="맑은 고딕" w:hAnsi="맑은 고딕"/>
-                <w:sz w:val="17"/>
-                <w:szCs w:val="17"/>
-              </w:rPr>
-              <w:t xml:space="preserve"> 해지 통보를 늦게 하면 어떻게 되나요?</w:t>
-            </w:r>
-          </w:p>
-          <w:p>
-            <w:pPr>
-              <w:spacing w:after="0" w:line="224"/>
-            </w:pPr>
-            <w:r>
-              <w:rPr>
-                <w:rFonts w:ascii="맑은 고딕" w:cs="맑은 고딕" w:eastAsia="맑은 고딕" w:hAnsi="맑은 고딕"/>
-                <w:b/>
-                <w:bCs/>
-                <w:sz w:val="17"/>
-                <w:szCs w:val="17"/>
-              </w:rPr>
               <w:t xml:space="preserve">(AI)</w:t>
             </w:r>
             <w:r>
@@ -2674,7 +2565,7 @@
                 <w:sz w:val="17"/>
                 <w:szCs w:val="17"/>
               </w:rPr>
-              <w:t xml:space="preserve"> 계약 조건에 따라 위약금 또는 추가 임차료가 발생할 수 있습니다. 다만 해당 비용의 회사 부담 여부는 개별 판단이 필요한 사항으로, 담당자를 통해 소관부서에 확인하시기 바랍니다.</w:t>
+              <w:t xml:space="preserve"> 부임일 연기 신청서 화면 생성</w:t>
             </w:r>
           </w:p>
         </w:tc>
@@ -2685,7 +2576,7 @@
         </w:trPr>
         <w:tc>
           <w:tcPr>
-            <w:tcW w:type="dxa" w:w="1500"/>
+            <w:tcW w:type="dxa" w:w="841"/>
             <w:tcMar>
               <w:top w:type="dxa" w:w="36"/>
               <w:left w:type="dxa" w:w="80"/>
@@ -2705,13 +2596,13 @@
                 <w:sz w:val="17"/>
                 <w:szCs w:val="17"/>
               </w:rPr>
-              <w:t xml:space="preserve">가족수당 문의</w:t>
+              <w:t xml:space="preserve">건강보험</w:t>
             </w:r>
           </w:p>
         </w:tc>
         <w:tc>
           <w:tcPr>
-            <w:tcW w:type="dxa" w:w="8246"/>
+            <w:tcW w:type="dxa" w:w="8905"/>
             <w:tcMar>
               <w:top w:type="dxa" w:w="36"/>
               <w:left w:type="dxa" w:w="80"/>
@@ -2739,7 +2630,7 @@
                 <w:sz w:val="17"/>
                 <w:szCs w:val="17"/>
               </w:rPr>
-              <w:t xml:space="preserve"> 배우자가 현지에서 취업했는데 가족수당을 계속 받을 수 있나요?</w:t>
+              <w:t xml:space="preserve"> 해외근무 건강보험료 감면 신청하려면?</w:t>
             </w:r>
           </w:p>
           <w:p>
@@ -2762,7 +2653,7 @@
                 <w:sz w:val="17"/>
                 <w:szCs w:val="17"/>
               </w:rPr>
-              <w:t xml:space="preserve"> 해당 사안은 규정을 개별 상황에 적용할지 판단이 필요한 사항으로, 본 시스템에서는 답변드리기 어렵습니다.</w:t>
+              <w:t xml:space="preserve"> 출국 후 감면요청, 입국 시 감면해제 절차를 조회했습니다. 국내 피부양자가 없으면 전액, 있으면 반액 감면됩니다.</w:t>
             </w:r>
           </w:p>
           <w:p>
@@ -2772,10 +2663,20 @@
             <w:r>
               <w:rPr>
                 <w:rFonts w:ascii="맑은 고딕" w:cs="맑은 고딕" w:eastAsia="맑은 고딕" w:hAnsi="맑은 고딕"/>
-                <w:sz w:val="17"/>
-                <w:szCs w:val="17"/>
-              </w:rPr>
-              <w:t xml:space="preserve">참고하실 수 있는 관련 조항은 다음과 같습니다.</w:t>
+                <w:b/>
+                <w:bCs/>
+                <w:sz w:val="17"/>
+                <w:szCs w:val="17"/>
+              </w:rPr>
+              <w:t xml:space="preserve">(AI)</w:t>
+            </w:r>
+            <w:r>
+              <w:rPr>
+                <w:rFonts w:ascii="맑은 고딕" w:cs="맑은 고딕" w:eastAsia="맑은 고딕" w:hAnsi="맑은 고딕"/>
+                <w:sz w:val="17"/>
+                <w:szCs w:val="17"/>
+              </w:rPr>
+              <w:t xml:space="preserve"> 감면 신청서를 생성해드릴까요?　[+ 신청서 생성]</w:t>
             </w:r>
           </w:p>
           <w:p>
@@ -2785,10 +2686,20 @@
             <w:r>
               <w:rPr>
                 <w:rFonts w:ascii="맑은 고딕" w:cs="맑은 고딕" w:eastAsia="맑은 고딕" w:hAnsi="맑은 고딕"/>
-                <w:sz w:val="17"/>
-                <w:szCs w:val="17"/>
-              </w:rPr>
-              <w:t xml:space="preserve">　· 「국외근무직원 보수·복지에 관한 규정」 제○조 (가족수당 지급 대상)</w:t>
+                <w:b/>
+                <w:bCs/>
+                <w:sz w:val="17"/>
+                <w:szCs w:val="17"/>
+              </w:rPr>
+              <w:t xml:space="preserve">(직원)</w:t>
+            </w:r>
+            <w:r>
+              <w:rPr>
+                <w:rFonts w:ascii="맑은 고딕" w:cs="맑은 고딕" w:eastAsia="맑은 고딕" w:hAnsi="맑은 고딕"/>
+                <w:sz w:val="17"/>
+                <w:szCs w:val="17"/>
+              </w:rPr>
+              <w:t xml:space="preserve"> 신청서 생성 버튼 클릭</w:t>
             </w:r>
           </w:p>
           <w:p>
@@ -2798,86 +2709,11 @@
             <w:r>
               <w:rPr>
                 <w:rFonts w:ascii="맑은 고딕" w:cs="맑은 고딕" w:eastAsia="맑은 고딕" w:hAnsi="맑은 고딕"/>
-                <w:sz w:val="17"/>
-                <w:szCs w:val="17"/>
-              </w:rPr>
-              <w:t xml:space="preserve">　· 같은 규정 제○조 (지급 제외 사유)</w:t>
-            </w:r>
-          </w:p>
-          <w:p>
-            <w:pPr>
-              <w:spacing w:after="0" w:line="224"/>
-            </w:pPr>
-            <w:r>
-              <w:rPr>
-                <w:rFonts w:ascii="맑은 고딕" w:cs="맑은 고딕" w:eastAsia="맑은 고딕" w:hAnsi="맑은 고딕"/>
-                <w:sz w:val="17"/>
-                <w:szCs w:val="17"/>
-              </w:rPr>
-              <w:t xml:space="preserve">배우자의 소득 발생이 지급 제외 사유에 해당하는지는 소관부서의 확인이 필요합니다.</w:t>
-            </w:r>
-          </w:p>
-          <w:p>
-            <w:pPr>
-              <w:spacing w:after="0" w:line="224"/>
-            </w:pPr>
-            <w:r>
-              <w:rPr>
-                <w:rFonts w:ascii="맑은 고딕" w:cs="맑은 고딕" w:eastAsia="맑은 고딕" w:hAnsi="맑은 고딕"/>
-                <w:sz w:val="17"/>
-                <w:szCs w:val="17"/>
-              </w:rPr>
-              <w:t xml:space="preserve">　· 소관: HR·직원만족부</w:t>
-            </w:r>
-          </w:p>
-          <w:p>
-            <w:pPr>
-              <w:spacing w:after="0" w:line="224"/>
-            </w:pPr>
-            <w:r>
-              <w:rPr>
-                <w:rFonts w:ascii="맑은 고딕" w:cs="맑은 고딕" w:eastAsia="맑은 고딕" w:hAnsi="맑은 고딕"/>
-                <w:sz w:val="17"/>
-                <w:szCs w:val="17"/>
-              </w:rPr>
-              <w:t xml:space="preserve">　· 안내: 담당자를 통해 소관부서에 질의하시기 바랍니다.</w:t>
-            </w:r>
-          </w:p>
-          <w:p>
-            <w:pPr>
-              <w:spacing w:after="0" w:line="224"/>
-            </w:pPr>
-            <w:r>
-              <w:rPr>
-                <w:rFonts w:ascii="맑은 고딕" w:cs="맑은 고딕" w:eastAsia="맑은 고딕" w:hAnsi="맑은 고딕"/>
                 <w:b/>
                 <w:bCs/>
                 <w:sz w:val="17"/>
                 <w:szCs w:val="17"/>
               </w:rPr>
-              <w:t xml:space="preserve">(직원)</w:t>
-            </w:r>
-            <w:r>
-              <w:rPr>
-                <w:rFonts w:ascii="맑은 고딕" w:cs="맑은 고딕" w:eastAsia="맑은 고딕" w:hAnsi="맑은 고딕"/>
-                <w:sz w:val="17"/>
-                <w:szCs w:val="17"/>
-              </w:rPr>
-              <w:t xml:space="preserve"> 그럼 일단 계속 받아도 되나요?</w:t>
-            </w:r>
-          </w:p>
-          <w:p>
-            <w:pPr>
-              <w:spacing w:after="0" w:line="224"/>
-            </w:pPr>
-            <w:r>
-              <w:rPr>
-                <w:rFonts w:ascii="맑은 고딕" w:cs="맑은 고딕" w:eastAsia="맑은 고딕" w:hAnsi="맑은 고딕"/>
-                <w:b/>
-                <w:bCs/>
-                <w:sz w:val="17"/>
-                <w:szCs w:val="17"/>
-              </w:rPr>
               <w:t xml:space="preserve">(AI)</w:t>
             </w:r>
             <w:r>
@@ -2886,7 +2722,7 @@
                 <w:sz w:val="17"/>
                 <w:szCs w:val="17"/>
               </w:rPr>
-              <w:t xml:space="preserve"> 지급 여부에 대한 판단은 소관부서 확인 사항으로 본 시스템에서 안내드릴 수 없습니다. 확인 전 수령분에 대한 정산이 발생할 수 있으므로 사전 확인을 권장드립니다.</w:t>
+              <w:t xml:space="preserve"> 건강보험 감면 신청서 화면 생성</w:t>
             </w:r>
           </w:p>
         </w:tc>
@@ -2897,7 +2733,7 @@
         </w:trPr>
         <w:tc>
           <w:tcPr>
-            <w:tcW w:type="dxa" w:w="1500"/>
+            <w:tcW w:type="dxa" w:w="841"/>
             <w:tcMar>
               <w:top w:type="dxa" w:w="36"/>
               <w:left w:type="dxa" w:w="80"/>
@@ -2917,13 +2753,13 @@
                 <w:sz w:val="17"/>
                 <w:szCs w:val="17"/>
               </w:rPr>
-              <w:t xml:space="preserve">주택수당 문의</w:t>
+              <w:t xml:space="preserve">주택 임차</w:t>
             </w:r>
           </w:p>
         </w:tc>
         <w:tc>
           <w:tcPr>
-            <w:tcW w:type="dxa" w:w="8246"/>
+            <w:tcW w:type="dxa" w:w="8905"/>
             <w:tcMar>
               <w:top w:type="dxa" w:w="36"/>
               <w:left w:type="dxa" w:w="80"/>
@@ -2943,15 +2779,15 @@
                 <w:sz w:val="17"/>
                 <w:szCs w:val="17"/>
               </w:rPr>
-              <w:t xml:space="preserve">(담당자)</w:t>
-            </w:r>
-            <w:r>
-              <w:rPr>
-                <w:rFonts w:ascii="맑은 고딕" w:cs="맑은 고딕" w:eastAsia="맑은 고딕" w:hAnsi="맑은 고딕"/>
-                <w:sz w:val="17"/>
-                <w:szCs w:val="17"/>
-              </w:rPr>
-              <w:t xml:space="preserve"> 주택수당 한도가 얼마인가요?</w:t>
+              <w:t xml:space="preserve">(직원)</w:t>
+            </w:r>
+            <w:r>
+              <w:rPr>
+                <w:rFonts w:ascii="맑은 고딕" w:cs="맑은 고딕" w:eastAsia="맑은 고딕" w:hAnsi="맑은 고딕"/>
+                <w:sz w:val="17"/>
+                <w:szCs w:val="17"/>
+              </w:rPr>
+              <w:t xml:space="preserve"> 캄보디아 임차사택 지원 기준 알려줘</w:t>
             </w:r>
           </w:p>
           <w:p>
@@ -2974,7 +2810,7 @@
                 <w:sz w:val="17"/>
                 <w:szCs w:val="17"/>
               </w:rPr>
-              <w:t xml:space="preserve"> 주택수당 한도는 근무 국가와 법인격에 따라 기준이 다릅니다. 아래 정보를 알려주시면 해당 기준을 안내드리겠습니다.</w:t>
+              <w:t xml:space="preserve"> 캄보디아 임차금액 한도(월당)는 부점장 USD 5,000, 팀원 USD 4,500이며, 신규 계약 전에는 한도 내 호텔·레지던스 단기 입주가 가능합니다.</w:t>
             </w:r>
           </w:p>
           <w:p>
@@ -2984,10 +2820,20 @@
             <w:r>
               <w:rPr>
                 <w:rFonts w:ascii="맑은 고딕" w:cs="맑은 고딕" w:eastAsia="맑은 고딕" w:hAnsi="맑은 고딕"/>
-                <w:sz w:val="17"/>
-                <w:szCs w:val="17"/>
-              </w:rPr>
-              <w:t xml:space="preserve">　· 근무 국가</w:t>
+                <w:b/>
+                <w:bCs/>
+                <w:sz w:val="17"/>
+                <w:szCs w:val="17"/>
+              </w:rPr>
+              <w:t xml:space="preserve">(AI)</w:t>
+            </w:r>
+            <w:r>
+              <w:rPr>
+                <w:rFonts w:ascii="맑은 고딕" w:cs="맑은 고딕" w:eastAsia="맑은 고딕" w:hAnsi="맑은 고딕"/>
+                <w:sz w:val="17"/>
+                <w:szCs w:val="17"/>
+              </w:rPr>
+              <w:t xml:space="preserve"> 주택임차 안내서를 생성해드릴까요?　[+ 안내서 생성]</w:t>
             </w:r>
           </w:p>
           <w:p>
@@ -2997,10 +2843,20 @@
             <w:r>
               <w:rPr>
                 <w:rFonts w:ascii="맑은 고딕" w:cs="맑은 고딕" w:eastAsia="맑은 고딕" w:hAnsi="맑은 고딕"/>
-                <w:sz w:val="17"/>
-                <w:szCs w:val="17"/>
-              </w:rPr>
-              <w:t xml:space="preserve">　· 법인격 구분 (자회사 / 국외점포)</w:t>
+                <w:b/>
+                <w:bCs/>
+                <w:sz w:val="17"/>
+                <w:szCs w:val="17"/>
+              </w:rPr>
+              <w:t xml:space="preserve">(직원)</w:t>
+            </w:r>
+            <w:r>
+              <w:rPr>
+                <w:rFonts w:ascii="맑은 고딕" w:cs="맑은 고딕" w:eastAsia="맑은 고딕" w:hAnsi="맑은 고딕"/>
+                <w:sz w:val="17"/>
+                <w:szCs w:val="17"/>
+              </w:rPr>
+              <w:t xml:space="preserve"> 안내서 생성 버튼 클릭</w:t>
             </w:r>
           </w:p>
           <w:p>
@@ -3015,29 +2871,6 @@
                 <w:sz w:val="17"/>
                 <w:szCs w:val="17"/>
               </w:rPr>
-              <w:t xml:space="preserve">(담당자)</w:t>
-            </w:r>
-            <w:r>
-              <w:rPr>
-                <w:rFonts w:ascii="맑은 고딕" w:cs="맑은 고딕" w:eastAsia="맑은 고딕" w:hAnsi="맑은 고딕"/>
-                <w:sz w:val="17"/>
-                <w:szCs w:val="17"/>
-              </w:rPr>
-              <w:t xml:space="preserve"> 인도네시아 자회사요.</w:t>
-            </w:r>
-          </w:p>
-          <w:p>
-            <w:pPr>
-              <w:spacing w:after="0" w:line="224"/>
-            </w:pPr>
-            <w:r>
-              <w:rPr>
-                <w:rFonts w:ascii="맑은 고딕" w:cs="맑은 고딕" w:eastAsia="맑은 고딕" w:hAnsi="맑은 고딕"/>
-                <w:b/>
-                <w:bCs/>
-                <w:sz w:val="17"/>
-                <w:szCs w:val="17"/>
-              </w:rPr>
               <w:t xml:space="preserve">(AI)</w:t>
             </w:r>
             <w:r>
@@ -3046,59 +2879,7 @@
                 <w:sz w:val="17"/>
                 <w:szCs w:val="17"/>
               </w:rPr>
-              <w:t xml:space="preserve"> 인도네시아 자회사 기준으로 안내드립니다. 「국외근무직원 보수·복지에 관한 규정」 제○조에 따라 주택수당 한도는 직급별로 다음과 같습니다.</w:t>
-            </w:r>
-          </w:p>
-          <w:p>
-            <w:pPr>
-              <w:spacing w:after="0" w:line="224"/>
-            </w:pPr>
-            <w:r>
-              <w:rPr>
-                <w:rFonts w:ascii="맑은 고딕" w:cs="맑은 고딕" w:eastAsia="맑은 고딕" w:hAnsi="맑은 고딕"/>
-                <w:sz w:val="17"/>
-                <w:szCs w:val="17"/>
-              </w:rPr>
-              <w:t xml:space="preserve">　· ○급 이상 — 월 ○○</w:t>
-            </w:r>
-          </w:p>
-          <w:p>
-            <w:pPr>
-              <w:spacing w:after="0" w:line="224"/>
-            </w:pPr>
-            <w:r>
-              <w:rPr>
-                <w:rFonts w:ascii="맑은 고딕" w:cs="맑은 고딕" w:eastAsia="맑은 고딕" w:hAnsi="맑은 고딕"/>
-                <w:sz w:val="17"/>
-                <w:szCs w:val="17"/>
-              </w:rPr>
-              <w:t xml:space="preserve">　· ○급 이하 — 월 ○○</w:t>
-            </w:r>
-          </w:p>
-          <w:p>
-            <w:pPr>
-              <w:spacing w:after="0" w:line="224"/>
-            </w:pPr>
-            <w:r>
-              <w:rPr>
-                <w:rFonts w:ascii="맑은 고딕" w:cs="맑은 고딕" w:eastAsia="맑은 고딕" w:hAnsi="맑은 고딕"/>
-                <w:sz w:val="17"/>
-                <w:szCs w:val="17"/>
-              </w:rPr>
-              <w:t xml:space="preserve">실제 임차료가 한도를 초과하는 경우의 처리는 별도 확인이 필요한 사항입니다.</w:t>
-            </w:r>
-          </w:p>
-          <w:p>
-            <w:pPr>
-              <w:spacing w:after="0" w:line="224"/>
-            </w:pPr>
-            <w:r>
-              <w:rPr>
-                <w:rFonts w:ascii="맑은 고딕" w:cs="맑은 고딕" w:eastAsia="맑은 고딕" w:hAnsi="맑은 고딕"/>
-                <w:sz w:val="17"/>
-                <w:szCs w:val="17"/>
-              </w:rPr>
-              <w:t xml:space="preserve">　· 근거: 제○조 (시행일 2026.○.○) · 소관: HR·직원만족부</w:t>
+              <w:t xml:space="preserve"> 주택임차 안내서 화면 생성</w:t>
             </w:r>
           </w:p>
         </w:tc>
@@ -3109,7 +2890,7 @@
         </w:trPr>
         <w:tc>
           <w:tcPr>
-            <w:tcW w:type="dxa" w:w="1500"/>
+            <w:tcW w:type="dxa" w:w="841"/>
             <w:tcMar>
               <w:top w:type="dxa" w:w="36"/>
               <w:left w:type="dxa" w:w="80"/>
@@ -3129,13 +2910,13 @@
                 <w:sz w:val="17"/>
                 <w:szCs w:val="17"/>
               </w:rPr>
-              <w:t xml:space="preserve">복리후생 지원범위 문의</w:t>
+              <w:t xml:space="preserve">학자금</w:t>
             </w:r>
           </w:p>
         </w:tc>
         <w:tc>
           <w:tcPr>
-            <w:tcW w:type="dxa" w:w="8246"/>
+            <w:tcW w:type="dxa" w:w="8905"/>
             <w:tcMar>
               <w:top w:type="dxa" w:w="36"/>
               <w:left w:type="dxa" w:w="80"/>
@@ -3155,15 +2936,15 @@
                 <w:sz w:val="17"/>
                 <w:szCs w:val="17"/>
               </w:rPr>
-              <w:t xml:space="preserve">(담당자)</w:t>
-            </w:r>
-            <w:r>
-              <w:rPr>
-                <w:rFonts w:ascii="맑은 고딕" w:cs="맑은 고딕" w:eastAsia="맑은 고딕" w:hAnsi="맑은 고딕"/>
-                <w:sz w:val="17"/>
-                <w:szCs w:val="17"/>
-              </w:rPr>
-              <w:t xml:space="preserve"> 현지 차량 리스 비용도 지원되나요?</w:t>
+              <w:t xml:space="preserve">(직원)</w:t>
+            </w:r>
+            <w:r>
+              <w:rPr>
+                <w:rFonts w:ascii="맑은 고딕" w:cs="맑은 고딕" w:eastAsia="맑은 고딕" w:hAnsi="맑은 고딕"/>
+                <w:sz w:val="17"/>
+                <w:szCs w:val="17"/>
+              </w:rPr>
+              <w:t xml:space="preserve"> 자녀 학자금은 어떻게 지원돼?</w:t>
             </w:r>
           </w:p>
           <w:p>
@@ -3186,7 +2967,7 @@
                 <w:sz w:val="17"/>
                 <w:szCs w:val="17"/>
               </w:rPr>
-              <w:t xml:space="preserve"> 현재 등록된 규정과 안내 자료에서 차량 리스 비용 지원에 대한 근거를 찾지 못했습니다. 추정하여 답변드리지 않겠습니다.</w:t>
+              <w:t xml:space="preserve"> 초·중·고·대학생 자녀 대상 등록금 100% 범위 내(자녀 1인당 월평균 지원금액 이내) 지원되며, 초과 시 초과액의 50%(인도 75%) 범위 내 추가 지원이 가능합니다.</w:t>
             </w:r>
           </w:p>
           <w:p>
@@ -3196,10 +2977,20 @@
             <w:r>
               <w:rPr>
                 <w:rFonts w:ascii="맑은 고딕" w:cs="맑은 고딕" w:eastAsia="맑은 고딕" w:hAnsi="맑은 고딕"/>
-                <w:sz w:val="17"/>
-                <w:szCs w:val="17"/>
-              </w:rPr>
-              <w:t xml:space="preserve">검색 대상은 다음과 같습니다.</w:t>
+                <w:b/>
+                <w:bCs/>
+                <w:sz w:val="17"/>
+                <w:szCs w:val="17"/>
+              </w:rPr>
+              <w:t xml:space="preserve">(AI)</w:t>
+            </w:r>
+            <w:r>
+              <w:rPr>
+                <w:rFonts w:ascii="맑은 고딕" w:cs="맑은 고딕" w:eastAsia="맑은 고딕" w:hAnsi="맑은 고딕"/>
+                <w:sz w:val="17"/>
+                <w:szCs w:val="17"/>
+              </w:rPr>
+              <w:t xml:space="preserve"> 학자금 안내서를 생성해드릴까요?　[+ 안내서 생성]</w:t>
             </w:r>
           </w:p>
           <w:p>
@@ -3209,10 +3000,20 @@
             <w:r>
               <w:rPr>
                 <w:rFonts w:ascii="맑은 고딕" w:cs="맑은 고딕" w:eastAsia="맑은 고딕" w:hAnsi="맑은 고딕"/>
-                <w:sz w:val="17"/>
-                <w:szCs w:val="17"/>
-              </w:rPr>
-              <w:t xml:space="preserve">　· 「국외근무직원 보수·복지에 관한 규정」</w:t>
+                <w:b/>
+                <w:bCs/>
+                <w:sz w:val="17"/>
+                <w:szCs w:val="17"/>
+              </w:rPr>
+              <w:t xml:space="preserve">(직원)</w:t>
+            </w:r>
+            <w:r>
+              <w:rPr>
+                <w:rFonts w:ascii="맑은 고딕" w:cs="맑은 고딕" w:eastAsia="맑은 고딕" w:hAnsi="맑은 고딕"/>
+                <w:sz w:val="17"/>
+                <w:szCs w:val="17"/>
+              </w:rPr>
+              <w:t xml:space="preserve"> 안내서 생성 버튼 클릭</w:t>
             </w:r>
           </w:p>
           <w:p>
@@ -3222,36 +3023,20 @@
             <w:r>
               <w:rPr>
                 <w:rFonts w:ascii="맑은 고딕" w:cs="맑은 고딕" w:eastAsia="맑은 고딕" w:hAnsi="맑은 고딕"/>
-                <w:sz w:val="17"/>
-                <w:szCs w:val="17"/>
-              </w:rPr>
-              <w:t xml:space="preserve">　· 「복지·여비규정」 및 운영지침</w:t>
-            </w:r>
-          </w:p>
-          <w:p>
-            <w:pPr>
-              <w:spacing w:after="0" w:line="224"/>
-            </w:pPr>
-            <w:r>
-              <w:rPr>
-                <w:rFonts w:ascii="맑은 고딕" w:cs="맑은 고딕" w:eastAsia="맑은 고딕" w:hAnsi="맑은 고딕"/>
-                <w:sz w:val="17"/>
-                <w:szCs w:val="17"/>
-              </w:rPr>
-              <w:t xml:space="preserve">　· 국가별 부임 안내서 (인도네시아·캄보디아·홍콩·런던)</w:t>
-            </w:r>
-          </w:p>
-          <w:p>
-            <w:pPr>
-              <w:spacing w:after="0" w:line="224"/>
-            </w:pPr>
-            <w:r>
-              <w:rPr>
-                <w:rFonts w:ascii="맑은 고딕" w:cs="맑은 고딕" w:eastAsia="맑은 고딕" w:hAnsi="맑은 고딕"/>
-                <w:sz w:val="17"/>
-                <w:szCs w:val="17"/>
-              </w:rPr>
-              <w:t xml:space="preserve">근거가 존재하나 미등록 상태일 수 있으므로, 소관부서 확인 후 자료 등록을 권장드립니다.</w:t>
+                <w:b/>
+                <w:bCs/>
+                <w:sz w:val="17"/>
+                <w:szCs w:val="17"/>
+              </w:rPr>
+              <w:t xml:space="preserve">(AI)</w:t>
+            </w:r>
+            <w:r>
+              <w:rPr>
+                <w:rFonts w:ascii="맑은 고딕" w:cs="맑은 고딕" w:eastAsia="맑은 고딕" w:hAnsi="맑은 고딕"/>
+                <w:sz w:val="17"/>
+                <w:szCs w:val="17"/>
+              </w:rPr>
+              <w:t xml:space="preserve"> 학자금 안내서 화면 생성</w:t>
             </w:r>
           </w:p>
         </w:tc>
@@ -3262,7 +3047,7 @@
         </w:trPr>
         <w:tc>
           <w:tcPr>
-            <w:tcW w:type="dxa" w:w="1500"/>
+            <w:tcW w:type="dxa" w:w="841"/>
             <w:tcMar>
               <w:top w:type="dxa" w:w="36"/>
               <w:left w:type="dxa" w:w="80"/>
@@ -3282,13 +3067,13 @@
                 <w:sz w:val="17"/>
                 <w:szCs w:val="17"/>
               </w:rPr>
-              <w:t xml:space="preserve">과거 처리사례 조회</w:t>
+              <w:t xml:space="preserve">요양비</w:t>
             </w:r>
           </w:p>
         </w:tc>
         <w:tc>
           <w:tcPr>
-            <w:tcW w:type="dxa" w:w="8246"/>
+            <w:tcW w:type="dxa" w:w="8905"/>
             <w:tcMar>
               <w:top w:type="dxa" w:w="36"/>
               <w:left w:type="dxa" w:w="80"/>
@@ -3308,15 +3093,15 @@
                 <w:sz w:val="17"/>
                 <w:szCs w:val="17"/>
               </w:rPr>
-              <w:t xml:space="preserve">(후임 담당자)</w:t>
-            </w:r>
-            <w:r>
-              <w:rPr>
-                <w:rFonts w:ascii="맑은 고딕" w:cs="맑은 고딕" w:eastAsia="맑은 고딕" w:hAnsi="맑은 고딕"/>
-                <w:sz w:val="17"/>
-                <w:szCs w:val="17"/>
-              </w:rPr>
-              <w:t xml:space="preserve"> 작년 캄보디아 학자금 지원 처리 사례를 보여주세요.</w:t>
+              <w:t xml:space="preserve">(직원)</w:t>
+            </w:r>
+            <w:r>
+              <w:rPr>
+                <w:rFonts w:ascii="맑은 고딕" w:cs="맑은 고딕" w:eastAsia="맑은 고딕" w:hAnsi="맑은 고딕"/>
+                <w:sz w:val="17"/>
+                <w:szCs w:val="17"/>
+              </w:rPr>
+              <w:t xml:space="preserve"> 의료비(요양비) 지원 기준 알려줘</w:t>
             </w:r>
           </w:p>
           <w:p>
@@ -3339,7 +3124,7 @@
                 <w:sz w:val="17"/>
                 <w:szCs w:val="17"/>
               </w:rPr>
-              <w:t xml:space="preserve"> 2025년 캄보디아 학자금 관련 확정 건은 ○건입니다.</w:t>
+              <w:t xml:space="preserve"> 요양비 지급한도를 조회했습니다. 입원 시 직원 실비 90%·가족 80%, 외래 시 직원 80%·가족 70% 지원됩니다.</w:t>
             </w:r>
           </w:p>
           <w:p>
@@ -3349,10 +3134,20 @@
             <w:r>
               <w:rPr>
                 <w:rFonts w:ascii="맑은 고딕" w:cs="맑은 고딕" w:eastAsia="맑은 고딕" w:hAnsi="맑은 고딕"/>
-                <w:sz w:val="17"/>
-                <w:szCs w:val="17"/>
-              </w:rPr>
-              <w:t xml:space="preserve">　① 2025.○.○ — 국제학교 학비 초과분 처리</w:t>
+                <w:b/>
+                <w:bCs/>
+                <w:sz w:val="17"/>
+                <w:szCs w:val="17"/>
+              </w:rPr>
+              <w:t xml:space="preserve">(AI)</w:t>
+            </w:r>
+            <w:r>
+              <w:rPr>
+                <w:rFonts w:ascii="맑은 고딕" w:cs="맑은 고딕" w:eastAsia="맑은 고딕" w:hAnsi="맑은 고딕"/>
+                <w:sz w:val="17"/>
+                <w:szCs w:val="17"/>
+              </w:rPr>
+              <w:t xml:space="preserve"> 요양비 안내서를 생성해드릴까요?　[+ 안내서 생성]</w:t>
             </w:r>
           </w:p>
           <w:p>
@@ -3362,10 +3157,20 @@
             <w:r>
               <w:rPr>
                 <w:rFonts w:ascii="맑은 고딕" w:cs="맑은 고딕" w:eastAsia="맑은 고딕" w:hAnsi="맑은 고딕"/>
-                <w:sz w:val="17"/>
-                <w:szCs w:val="17"/>
-              </w:rPr>
-              <w:t xml:space="preserve">　　· 적용 조항: 「보수·복지에 관한 규정」 제○조</w:t>
+                <w:b/>
+                <w:bCs/>
+                <w:sz w:val="17"/>
+                <w:szCs w:val="17"/>
+              </w:rPr>
+              <w:t xml:space="preserve">(직원)</w:t>
+            </w:r>
+            <w:r>
+              <w:rPr>
+                <w:rFonts w:ascii="맑은 고딕" w:cs="맑은 고딕" w:eastAsia="맑은 고딕" w:hAnsi="맑은 고딕"/>
+                <w:sz w:val="17"/>
+                <w:szCs w:val="17"/>
+              </w:rPr>
+              <w:t xml:space="preserve"> 안내서 생성 버튼 클릭</w:t>
             </w:r>
           </w:p>
           <w:p>
@@ -3375,75 +3180,20 @@
             <w:r>
               <w:rPr>
                 <w:rFonts w:ascii="맑은 고딕" w:cs="맑은 고딕" w:eastAsia="맑은 고딕" w:hAnsi="맑은 고딕"/>
-                <w:sz w:val="17"/>
-                <w:szCs w:val="17"/>
-              </w:rPr>
-              <w:t xml:space="preserve">　　· 답변 요지: 한도 내 실비 지원, 초과분 본인 부담</w:t>
-            </w:r>
-          </w:p>
-          <w:p>
-            <w:pPr>
-              <w:spacing w:after="0" w:line="224"/>
-            </w:pPr>
-            <w:r>
-              <w:rPr>
-                <w:rFonts w:ascii="맑은 고딕" w:cs="맑은 고딕" w:eastAsia="맑은 고딕" w:hAnsi="맑은 고딕"/>
-                <w:sz w:val="17"/>
-                <w:szCs w:val="17"/>
-              </w:rPr>
-              <w:t xml:space="preserve">　② 2025.○.○ — 학기 중 전학에 따른 정산</w:t>
-            </w:r>
-          </w:p>
-          <w:p>
-            <w:pPr>
-              <w:spacing w:after="0" w:line="224"/>
-            </w:pPr>
-            <w:r>
-              <w:rPr>
-                <w:rFonts w:ascii="맑은 고딕" w:cs="맑은 고딕" w:eastAsia="맑은 고딕" w:hAnsi="맑은 고딕"/>
-                <w:sz w:val="17"/>
-                <w:szCs w:val="17"/>
-              </w:rPr>
-              <w:t xml:space="preserve">　　· 적용 조항: 같은 규정 제○조</w:t>
-            </w:r>
-          </w:p>
-          <w:p>
-            <w:pPr>
-              <w:spacing w:after="0" w:line="224"/>
-            </w:pPr>
-            <w:r>
-              <w:rPr>
-                <w:rFonts w:ascii="맑은 고딕" w:cs="맑은 고딕" w:eastAsia="맑은 고딕" w:hAnsi="맑은 고딕"/>
-                <w:sz w:val="17"/>
-                <w:szCs w:val="17"/>
-              </w:rPr>
-              <w:t xml:space="preserve">　　· 답변 요지: 일할 계산 적용, 증빙 제출 필요</w:t>
-            </w:r>
-          </w:p>
-          <w:p>
-            <w:pPr>
-              <w:spacing w:after="0" w:line="224"/>
-            </w:pPr>
-            <w:r>
-              <w:rPr>
-                <w:rFonts w:ascii="맑은 고딕" w:cs="맑은 고딕" w:eastAsia="맑은 고딕" w:hAnsi="맑은 고딕"/>
-                <w:sz w:val="17"/>
-                <w:szCs w:val="17"/>
-              </w:rPr>
-              <w:t xml:space="preserve">　　· 비고: 예외 처리 건 (소관부서 협의 후 확정)</w:t>
-            </w:r>
-          </w:p>
-          <w:p>
-            <w:pPr>
-              <w:spacing w:after="0" w:line="224"/>
-            </w:pPr>
-            <w:r>
-              <w:rPr>
-                <w:rFonts w:ascii="맑은 고딕" w:cs="맑은 고딕" w:eastAsia="맑은 고딕" w:hAnsi="맑은 고딕"/>
-                <w:sz w:val="17"/>
-                <w:szCs w:val="17"/>
-              </w:rPr>
-              <w:t xml:space="preserve">각 건의 원 질의와 확정일은 상세 보기에서 확인하실 수 있습니다.</w:t>
+                <w:b/>
+                <w:bCs/>
+                <w:sz w:val="17"/>
+                <w:szCs w:val="17"/>
+              </w:rPr>
+              <w:t xml:space="preserve">(AI)</w:t>
+            </w:r>
+            <w:r>
+              <w:rPr>
+                <w:rFonts w:ascii="맑은 고딕" w:cs="맑은 고딕" w:eastAsia="맑은 고딕" w:hAnsi="맑은 고딕"/>
+                <w:sz w:val="17"/>
+                <w:szCs w:val="17"/>
+              </w:rPr>
+              <w:t xml:space="preserve"> 요양비 안내서 화면 생성</w:t>
             </w:r>
           </w:p>
         </w:tc>
@@ -3454,7 +3204,7 @@
         </w:trPr>
         <w:tc>
           <w:tcPr>
-            <w:tcW w:type="dxa" w:w="1500"/>
+            <w:tcW w:type="dxa" w:w="841"/>
             <w:tcMar>
               <w:top w:type="dxa" w:w="36"/>
               <w:left w:type="dxa" w:w="80"/>
@@ -3474,13 +3224,13 @@
                 <w:sz w:val="17"/>
                 <w:szCs w:val="17"/>
               </w:rPr>
-              <w:t xml:space="preserve">부임 준비현황 조회</w:t>
+              <w:t xml:space="preserve">출장 결재</w:t>
             </w:r>
           </w:p>
         </w:tc>
         <w:tc>
           <w:tcPr>
-            <w:tcW w:type="dxa" w:w="8246"/>
+            <w:tcW w:type="dxa" w:w="8905"/>
             <w:tcMar>
               <w:top w:type="dxa" w:w="36"/>
               <w:left w:type="dxa" w:w="80"/>
@@ -3500,15 +3250,15 @@
                 <w:sz w:val="17"/>
                 <w:szCs w:val="17"/>
               </w:rPr>
-              <w:t xml:space="preserve">(예비발령자)</w:t>
-            </w:r>
-            <w:r>
-              <w:rPr>
-                <w:rFonts w:ascii="맑은 고딕" w:cs="맑은 고딕" w:eastAsia="맑은 고딕" w:hAnsi="맑은 고딕"/>
-                <w:sz w:val="17"/>
-                <w:szCs w:val="17"/>
-              </w:rPr>
-              <w:t xml:space="preserve"> 부임까지 남은 준비 항목을 알려주세요.</w:t>
+              <w:t xml:space="preserve">(직원)</w:t>
+            </w:r>
+            <w:r>
+              <w:rPr>
+                <w:rFonts w:ascii="맑은 고딕" w:cs="맑은 고딕" w:eastAsia="맑은 고딕" w:hAnsi="맑은 고딕"/>
+                <w:sz w:val="17"/>
+                <w:szCs w:val="17"/>
+              </w:rPr>
+              <w:t xml:space="preserve"> 베트남 출장 가려는데 누구 결재해?</w:t>
             </w:r>
           </w:p>
           <w:p>
@@ -3531,7 +3281,7 @@
                 <w:sz w:val="17"/>
                 <w:szCs w:val="17"/>
               </w:rPr>
-              <w:t xml:space="preserve"> 인도네시아 부임(가족 동반) 기준 준비 항목 ○건 중 ○건이 완료되었습니다.</w:t>
+              <w:t xml:space="preserve"> 현재 근무지와 직급을 입력해주세요.</w:t>
             </w:r>
           </w:p>
           <w:p>
@@ -3546,7 +3296,15 @@
                 <w:sz w:val="17"/>
                 <w:szCs w:val="17"/>
               </w:rPr>
-              <w:t xml:space="preserve">미완료 항목</w:t>
+              <w:t xml:space="preserve">(직원)</w:t>
+            </w:r>
+            <w:r>
+              <w:rPr>
+                <w:rFonts w:ascii="맑은 고딕" w:cs="맑은 고딕" w:eastAsia="맑은 고딕" w:hAnsi="맑은 고딕"/>
+                <w:sz w:val="17"/>
+                <w:szCs w:val="17"/>
+              </w:rPr>
+              <w:t xml:space="preserve"> 근무지·직급 입력</w:t>
             </w:r>
           </w:p>
           <w:p>
@@ -3556,10 +3314,20 @@
             <w:r>
               <w:rPr>
                 <w:rFonts w:ascii="맑은 고딕" w:cs="맑은 고딕" w:eastAsia="맑은 고딕" w:hAnsi="맑은 고딕"/>
-                <w:sz w:val="17"/>
-                <w:szCs w:val="17"/>
-              </w:rPr>
-              <w:t xml:space="preserve">　· 건강진단 결과서 제출 — 기한 ○월 ○일 (○일 남음)</w:t>
+                <w:b/>
+                <w:bCs/>
+                <w:sz w:val="17"/>
+                <w:szCs w:val="17"/>
+              </w:rPr>
+              <w:t xml:space="preserve">(AI)</w:t>
+            </w:r>
+            <w:r>
+              <w:rPr>
+                <w:rFonts w:ascii="맑은 고딕" w:cs="맑은 고딕" w:eastAsia="맑은 고딕" w:hAnsi="맑은 고딕"/>
+                <w:sz w:val="17"/>
+                <w:szCs w:val="17"/>
+              </w:rPr>
+              <w:t xml:space="preserve"> 임지국외 출장 기준, 부점장급·Unit장은 소속 본부본부장, 기타직원은 3일 이내 담당 부점장·Unit장, 4일 이상 소속 본부부서장 전결입니다.</w:t>
             </w:r>
           </w:p>
           <w:p>
@@ -3569,10 +3337,85 @@
             <w:r>
               <w:rPr>
                 <w:rFonts w:ascii="맑은 고딕" w:cs="맑은 고딕" w:eastAsia="맑은 고딕" w:hAnsi="맑은 고딕"/>
-                <w:sz w:val="17"/>
-                <w:szCs w:val="17"/>
-              </w:rPr>
-              <w:t xml:space="preserve">　· 가족관계증명서 제출 — 기한 ○월 ○일 (○일 남음)</w:t>
+                <w:b/>
+                <w:bCs/>
+                <w:sz w:val="17"/>
+                <w:szCs w:val="17"/>
+              </w:rPr>
+              <w:t xml:space="preserve">(AI)</w:t>
+            </w:r>
+            <w:r>
+              <w:rPr>
+                <w:rFonts w:ascii="맑은 고딕" w:cs="맑은 고딕" w:eastAsia="맑은 고딕" w:hAnsi="맑은 고딕"/>
+                <w:sz w:val="17"/>
+                <w:szCs w:val="17"/>
+              </w:rPr>
+              <w:t xml:space="preserve"> 결재요청 문서를 생성해드릴까요?　[+ 문서 생성]</w:t>
+            </w:r>
+          </w:p>
+        </w:tc>
+      </w:tr>
+      <w:tr>
+        <w:trPr>
+          <w:tblHeader w:val="false"/>
+        </w:trPr>
+        <w:tc>
+          <w:tcPr>
+            <w:tcW w:type="dxa" w:w="841"/>
+            <w:tcMar>
+              <w:top w:type="dxa" w:w="36"/>
+              <w:left w:type="dxa" w:w="80"/>
+              <w:bottom w:type="dxa" w:w="36"/>
+              <w:right w:type="dxa" w:w="80"/>
+            </w:tcMar>
+          </w:tcPr>
+          <w:p>
+            <w:pPr>
+              <w:spacing w:after="0" w:line="224"/>
+            </w:pPr>
+            <w:r>
+              <w:rPr>
+                <w:rFonts w:ascii="맑은 고딕" w:cs="맑은 고딕" w:eastAsia="맑은 고딕" w:hAnsi="맑은 고딕"/>
+                <w:b/>
+                <w:bCs/>
+                <w:sz w:val="17"/>
+                <w:szCs w:val="17"/>
+              </w:rPr>
+              <w:t xml:space="preserve">현지직원 채용</w:t>
+            </w:r>
+          </w:p>
+        </w:tc>
+        <w:tc>
+          <w:tcPr>
+            <w:tcW w:type="dxa" w:w="8905"/>
+            <w:tcMar>
+              <w:top w:type="dxa" w:w="36"/>
+              <w:left w:type="dxa" w:w="80"/>
+              <w:bottom w:type="dxa" w:w="36"/>
+              <w:right w:type="dxa" w:w="80"/>
+            </w:tcMar>
+          </w:tcPr>
+          <w:p>
+            <w:pPr>
+              <w:spacing w:after="0" w:line="224"/>
+            </w:pPr>
+            <w:r>
+              <w:rPr>
+                <w:rFonts w:ascii="맑은 고딕" w:cs="맑은 고딕" w:eastAsia="맑은 고딕" w:hAnsi="맑은 고딕"/>
+                <w:b/>
+                <w:bCs/>
+                <w:sz w:val="17"/>
+                <w:szCs w:val="17"/>
+              </w:rPr>
+              <w:t xml:space="preserve">(부점장)</w:t>
+            </w:r>
+            <w:r>
+              <w:rPr>
+                <w:rFonts w:ascii="맑은 고딕" w:cs="맑은 고딕" w:eastAsia="맑은 고딕" w:hAnsi="맑은 고딕"/>
+                <w:sz w:val="17"/>
+                <w:szCs w:val="17"/>
+              </w:rPr>
+              <w:t xml:space="preserve"> 현지직원 채용 절차 알려줘</w:t>
             </w:r>
           </w:p>
           <w:p>
@@ -3582,10 +3425,20 @@
             <w:r>
               <w:rPr>
                 <w:rFonts w:ascii="맑은 고딕" w:cs="맑은 고딕" w:eastAsia="맑은 고딕" w:hAnsi="맑은 고딕"/>
-                <w:sz w:val="17"/>
-                <w:szCs w:val="17"/>
-              </w:rPr>
-              <w:t xml:space="preserve">　· 현지 비자 신청 — 기한 ○월 ○일</w:t>
+                <w:b/>
+                <w:bCs/>
+                <w:sz w:val="17"/>
+                <w:szCs w:val="17"/>
+              </w:rPr>
+              <w:t xml:space="preserve">(AI)</w:t>
+            </w:r>
+            <w:r>
+              <w:rPr>
+                <w:rFonts w:ascii="맑은 고딕" w:cs="맑은 고딕" w:eastAsia="맑은 고딕" w:hAnsi="맑은 고딕"/>
+                <w:sz w:val="17"/>
+                <w:szCs w:val="17"/>
+              </w:rPr>
+              <w:t xml:space="preserve"> 해외채용 현지직원은 국외점포장 전결로 채용하며(General Manager급은 담당 임원 사전협의), 구비서류는 ① 이력서 ② 학력증명서 ③ 고용계약서 ④ 기타 현지법상 필요서류입니다.</w:t>
             </w:r>
           </w:p>
           <w:p>
@@ -3600,7 +3453,80 @@
                 <w:sz w:val="17"/>
                 <w:szCs w:val="17"/>
               </w:rPr>
-              <w:t xml:space="preserve">완료 항목</w:t>
+              <w:t xml:space="preserve">(AI)</w:t>
+            </w:r>
+            <w:r>
+              <w:rPr>
+                <w:rFonts w:ascii="맑은 고딕" w:cs="맑은 고딕" w:eastAsia="맑은 고딕" w:hAnsi="맑은 고딕"/>
+                <w:sz w:val="17"/>
+                <w:szCs w:val="17"/>
+              </w:rPr>
+              <w:t xml:space="preserve"> 채용 체크리스트를 생성해드릴까요?　[+ 체크리스트 생성]</w:t>
+            </w:r>
+          </w:p>
+        </w:tc>
+      </w:tr>
+      <w:tr>
+        <w:trPr>
+          <w:tblHeader w:val="false"/>
+        </w:trPr>
+        <w:tc>
+          <w:tcPr>
+            <w:tcW w:type="dxa" w:w="841"/>
+            <w:tcMar>
+              <w:top w:type="dxa" w:w="36"/>
+              <w:left w:type="dxa" w:w="80"/>
+              <w:bottom w:type="dxa" w:w="36"/>
+              <w:right w:type="dxa" w:w="80"/>
+            </w:tcMar>
+          </w:tcPr>
+          <w:p>
+            <w:pPr>
+              <w:spacing w:after="0" w:line="224"/>
+            </w:pPr>
+            <w:r>
+              <w:rPr>
+                <w:rFonts w:ascii="맑은 고딕" w:cs="맑은 고딕" w:eastAsia="맑은 고딕" w:hAnsi="맑은 고딕"/>
+                <w:b/>
+                <w:bCs/>
+                <w:sz w:val="17"/>
+                <w:szCs w:val="17"/>
+              </w:rPr>
+              <w:t xml:space="preserve">직급 호칭</w:t>
+            </w:r>
+          </w:p>
+        </w:tc>
+        <w:tc>
+          <w:tcPr>
+            <w:tcW w:type="dxa" w:w="8905"/>
+            <w:tcMar>
+              <w:top w:type="dxa" w:w="36"/>
+              <w:left w:type="dxa" w:w="80"/>
+              <w:bottom w:type="dxa" w:w="36"/>
+              <w:right w:type="dxa" w:w="80"/>
+            </w:tcMar>
+          </w:tcPr>
+          <w:p>
+            <w:pPr>
+              <w:spacing w:after="0" w:line="224"/>
+            </w:pPr>
+            <w:r>
+              <w:rPr>
+                <w:rFonts w:ascii="맑은 고딕" w:cs="맑은 고딕" w:eastAsia="맑은 고딕" w:hAnsi="맑은 고딕"/>
+                <w:b/>
+                <w:bCs/>
+                <w:sz w:val="17"/>
+                <w:szCs w:val="17"/>
+              </w:rPr>
+              <w:t xml:space="preserve">(부점장)</w:t>
+            </w:r>
+            <w:r>
+              <w:rPr>
+                <w:rFonts w:ascii="맑은 고딕" w:cs="맑은 고딕" w:eastAsia="맑은 고딕" w:hAnsi="맑은 고딕"/>
+                <w:sz w:val="17"/>
+                <w:szCs w:val="17"/>
+              </w:rPr>
+              <w:t xml:space="preserve"> 현지직원 G5는 호칭이 뭐야?</w:t>
             </w:r>
           </w:p>
           <w:p>
@@ -3610,10 +3536,20 @@
             <w:r>
               <w:rPr>
                 <w:rFonts w:ascii="맑은 고딕" w:cs="맑은 고딕" w:eastAsia="맑은 고딕" w:hAnsi="맑은 고딕"/>
-                <w:sz w:val="17"/>
-                <w:szCs w:val="17"/>
-              </w:rPr>
-              <w:t xml:space="preserve">　· 부임 신고서 제출 (○월 ○일 완료)</w:t>
+                <w:b/>
+                <w:bCs/>
+                <w:sz w:val="17"/>
+                <w:szCs w:val="17"/>
+              </w:rPr>
+              <w:t xml:space="preserve">(AI)</w:t>
+            </w:r>
+            <w:r>
+              <w:rPr>
+                <w:rFonts w:ascii="맑은 고딕" w:cs="맑은 고딕" w:eastAsia="맑은 고딕" w:hAnsi="맑은 고딕"/>
+                <w:sz w:val="17"/>
+                <w:szCs w:val="17"/>
+              </w:rPr>
+              <w:t xml:space="preserve"> G5는 Senior Manager 직위로, 부지점장(Deputy General Manager) 또는 팀장(Senior Manager / Team Head) 호칭이 부여됩니다.</w:t>
             </w:r>
           </w:p>
           <w:p>
@@ -3623,10 +3559,85 @@
             <w:r>
               <w:rPr>
                 <w:rFonts w:ascii="맑은 고딕" w:cs="맑은 고딕" w:eastAsia="맑은 고딕" w:hAnsi="맑은 고딕"/>
-                <w:sz w:val="17"/>
-                <w:szCs w:val="17"/>
-              </w:rPr>
-              <w:t xml:space="preserve">기한이 임박한 항목은 건강진단 결과서이며, 지정 병원 예약에 통상 ○일이 소요됩니다.</w:t>
+                <w:b/>
+                <w:bCs/>
+                <w:sz w:val="17"/>
+                <w:szCs w:val="17"/>
+              </w:rPr>
+              <w:t xml:space="preserve">(AI)</w:t>
+            </w:r>
+            <w:r>
+              <w:rPr>
+                <w:rFonts w:ascii="맑은 고딕" w:cs="맑은 고딕" w:eastAsia="맑은 고딕" w:hAnsi="맑은 고딕"/>
+                <w:sz w:val="17"/>
+                <w:szCs w:val="17"/>
+              </w:rPr>
+              <w:t xml:space="preserve"> 직급·호칭 기준표를 생성해드릴까요?　[+ 기준표 생성]</w:t>
+            </w:r>
+          </w:p>
+        </w:tc>
+      </w:tr>
+      <w:tr>
+        <w:trPr>
+          <w:tblHeader w:val="false"/>
+        </w:trPr>
+        <w:tc>
+          <w:tcPr>
+            <w:tcW w:type="dxa" w:w="841"/>
+            <w:tcMar>
+              <w:top w:type="dxa" w:w="36"/>
+              <w:left w:type="dxa" w:w="80"/>
+              <w:bottom w:type="dxa" w:w="36"/>
+              <w:right w:type="dxa" w:w="80"/>
+            </w:tcMar>
+          </w:tcPr>
+          <w:p>
+            <w:pPr>
+              <w:spacing w:after="0" w:line="224"/>
+            </w:pPr>
+            <w:r>
+              <w:rPr>
+                <w:rFonts w:ascii="맑은 고딕" w:cs="맑은 고딕" w:eastAsia="맑은 고딕" w:hAnsi="맑은 고딕"/>
+                <w:b/>
+                <w:bCs/>
+                <w:sz w:val="17"/>
+                <w:szCs w:val="17"/>
+              </w:rPr>
+              <w:t xml:space="preserve">급여 수당</w:t>
+            </w:r>
+          </w:p>
+        </w:tc>
+        <w:tc>
+          <w:tcPr>
+            <w:tcW w:type="dxa" w:w="8905"/>
+            <w:tcMar>
+              <w:top w:type="dxa" w:w="36"/>
+              <w:left w:type="dxa" w:w="80"/>
+              <w:bottom w:type="dxa" w:w="36"/>
+              <w:right w:type="dxa" w:w="80"/>
+            </w:tcMar>
+          </w:tcPr>
+          <w:p>
+            <w:pPr>
+              <w:spacing w:after="0" w:line="224"/>
+            </w:pPr>
+            <w:r>
+              <w:rPr>
+                <w:rFonts w:ascii="맑은 고딕" w:cs="맑은 고딕" w:eastAsia="맑은 고딕" w:hAnsi="맑은 고딕"/>
+                <w:b/>
+                <w:bCs/>
+                <w:sz w:val="17"/>
+                <w:szCs w:val="17"/>
+              </w:rPr>
+              <w:t xml:space="preserve">(직원)</w:t>
+            </w:r>
+            <w:r>
+              <w:rPr>
+                <w:rFonts w:ascii="맑은 고딕" w:cs="맑은 고딕" w:eastAsia="맑은 고딕" w:hAnsi="맑은 고딕"/>
+                <w:sz w:val="17"/>
+                <w:szCs w:val="17"/>
+              </w:rPr>
+              <w:t xml:space="preserve"> 인도네시아 국외근무수당 얼마야?</w:t>
             </w:r>
           </w:p>
           <w:p>
@@ -3641,15 +3652,15 @@
                 <w:sz w:val="17"/>
                 <w:szCs w:val="17"/>
               </w:rPr>
-              <w:t xml:space="preserve">(예비발령자)</w:t>
-            </w:r>
-            <w:r>
-              <w:rPr>
-                <w:rFonts w:ascii="맑은 고딕" w:cs="맑은 고딕" w:eastAsia="맑은 고딕" w:hAnsi="맑은 고딕"/>
-                <w:sz w:val="17"/>
-                <w:szCs w:val="17"/>
-              </w:rPr>
-              <w:t xml:space="preserve"> 비자는 어디에 신청하나요?</w:t>
+              <w:t xml:space="preserve">(AI)</w:t>
+            </w:r>
+            <w:r>
+              <w:rPr>
+                <w:rFonts w:ascii="맑은 고딕" w:cs="맑은 고딕" w:eastAsia="맑은 고딕" w:hAnsi="맑은 고딕"/>
+                <w:sz w:val="17"/>
+                <w:szCs w:val="17"/>
+              </w:rPr>
+              <w:t xml:space="preserve"> 인도네시아 자카르타 국외근무수당(월 지급액)은 L4 USD 1,098, L3 USD 984, L2 USD 904, L1 USD 825입니다. (급여 = 국내연봉 + 국외근무수당 + 조정수당)</w:t>
             </w:r>
           </w:p>
           <w:p>
@@ -3672,7 +3683,118 @@
                 <w:sz w:val="17"/>
                 <w:szCs w:val="17"/>
               </w:rPr>
-              <w:t xml:space="preserve"> 인도네시아 취업비자는 현지 법인이 신청을 대행합니다. 필요 서류와 절차는 [인도네시아 부임 안내서] ○면에 안내되어 있으며, 현지 담당 RM을 통해 진행하시면 됩니다.</w:t>
+              <w:t xml:space="preserve"> 급여 안내서를 생성해드릴까요?　[+ 안내서 생성]</w:t>
+            </w:r>
+          </w:p>
+        </w:tc>
+      </w:tr>
+      <w:tr>
+        <w:trPr>
+          <w:tblHeader w:val="false"/>
+        </w:trPr>
+        <w:tc>
+          <w:tcPr>
+            <w:tcW w:type="dxa" w:w="841"/>
+            <w:tcMar>
+              <w:top w:type="dxa" w:w="36"/>
+              <w:left w:type="dxa" w:w="80"/>
+              <w:bottom w:type="dxa" w:w="36"/>
+              <w:right w:type="dxa" w:w="80"/>
+            </w:tcMar>
+          </w:tcPr>
+          <w:p>
+            <w:pPr>
+              <w:spacing w:after="0" w:line="224"/>
+            </w:pPr>
+            <w:r>
+              <w:rPr>
+                <w:rFonts w:ascii="맑은 고딕" w:cs="맑은 고딕" w:eastAsia="맑은 고딕" w:hAnsi="맑은 고딕"/>
+                <w:b/>
+                <w:bCs/>
+                <w:sz w:val="17"/>
+                <w:szCs w:val="17"/>
+              </w:rPr>
+              <w:t xml:space="preserve">항공권</w:t>
+            </w:r>
+          </w:p>
+        </w:tc>
+        <w:tc>
+          <w:tcPr>
+            <w:tcW w:type="dxa" w:w="8905"/>
+            <w:tcMar>
+              <w:top w:type="dxa" w:w="36"/>
+              <w:left w:type="dxa" w:w="80"/>
+              <w:bottom w:type="dxa" w:w="36"/>
+              <w:right w:type="dxa" w:w="80"/>
+            </w:tcMar>
+          </w:tcPr>
+          <w:p>
+            <w:pPr>
+              <w:spacing w:after="0" w:line="224"/>
+            </w:pPr>
+            <w:r>
+              <w:rPr>
+                <w:rFonts w:ascii="맑은 고딕" w:cs="맑은 고딕" w:eastAsia="맑은 고딕" w:hAnsi="맑은 고딕"/>
+                <w:b/>
+                <w:bCs/>
+                <w:sz w:val="17"/>
+                <w:szCs w:val="17"/>
+              </w:rPr>
+              <w:t xml:space="preserve">(직원)</w:t>
+            </w:r>
+            <w:r>
+              <w:rPr>
+                <w:rFonts w:ascii="맑은 고딕" w:cs="맑은 고딕" w:eastAsia="맑은 고딕" w:hAnsi="맑은 고딕"/>
+                <w:sz w:val="17"/>
+                <w:szCs w:val="17"/>
+              </w:rPr>
+              <w:t xml:space="preserve"> 부임 항공권 어떻게 예약해?</w:t>
+            </w:r>
+          </w:p>
+          <w:p>
+            <w:pPr>
+              <w:spacing w:after="0" w:line="224"/>
+            </w:pPr>
+            <w:r>
+              <w:rPr>
+                <w:rFonts w:ascii="맑은 고딕" w:cs="맑은 고딕" w:eastAsia="맑은 고딕" w:hAnsi="맑은 고딕"/>
+                <w:b/>
+                <w:bCs/>
+                <w:sz w:val="17"/>
+                <w:szCs w:val="17"/>
+              </w:rPr>
+              <w:t xml:space="preserve">(AI)</w:t>
+            </w:r>
+            <w:r>
+              <w:rPr>
+                <w:rFonts w:ascii="맑은 고딕" w:cs="맑은 고딕" w:eastAsia="맑은 고딕" w:hAnsi="맑은 고딕"/>
+                <w:sz w:val="17"/>
+                <w:szCs w:val="17"/>
+              </w:rPr>
+              <w:t xml:space="preserve"> 출국일 확정 후 개인카드로 직접 예매하며, 인도네시아 입국 항공권만 실비 지원됩니다. LCC·외항사 이용을 권장하고 최저가 증빙·항공권 사본·카드결제 영수증 제출이 필요합니다.</w:t>
+            </w:r>
+          </w:p>
+          <w:p>
+            <w:pPr>
+              <w:spacing w:after="0" w:line="224"/>
+            </w:pPr>
+            <w:r>
+              <w:rPr>
+                <w:rFonts w:ascii="맑은 고딕" w:cs="맑은 고딕" w:eastAsia="맑은 고딕" w:hAnsi="맑은 고딕"/>
+                <w:b/>
+                <w:bCs/>
+                <w:sz w:val="17"/>
+                <w:szCs w:val="17"/>
+              </w:rPr>
+              <w:t xml:space="preserve">(AI)</w:t>
+            </w:r>
+            <w:r>
+              <w:rPr>
+                <w:rFonts w:ascii="맑은 고딕" w:cs="맑은 고딕" w:eastAsia="맑은 고딕" w:hAnsi="맑은 고딕"/>
+                <w:sz w:val="17"/>
+                <w:szCs w:val="17"/>
+              </w:rPr>
+              <w:t xml:space="preserve"> 항공권 청구 안내서를 생성해드릴까요?　[+ 안내서 생성]</w:t>
             </w:r>
           </w:p>
         </w:tc>
@@ -4042,6 +4164,78 @@
           <w:szCs w:val="20"/>
         </w:rPr>
         <w:t xml:space="preserve"> 형태 기록</w:t>
+      </w:r>
+    </w:p>
+    <w:p>
+      <w:pPr>
+        <w:pStyle w:val="ListParagraph"/>
+        <w:numPr>
+          <w:ilvl w:val="0"/>
+          <w:numId w:val="2"/>
+        </w:numPr>
+        <w:spacing w:after="30" w:line="264"/>
+      </w:pPr>
+      <w:r>
+        <w:rPr>
+          <w:rFonts w:ascii="맑은 고딕" w:cs="맑은 고딕" w:eastAsia="맑은 고딕" w:hAnsi="맑은 고딕"/>
+          <w:sz w:val="20"/>
+          <w:szCs w:val="20"/>
+        </w:rPr>
+        <w:t xml:space="preserve">답변 완료 후 </w:t>
+      </w:r>
+      <w:r>
+        <w:rPr>
+          <w:rFonts w:ascii="맑은 고딕" w:cs="맑은 고딕" w:eastAsia="맑은 고딕" w:hAnsi="맑은 고딕"/>
+          <w:b/>
+          <w:bCs/>
+          <w:sz w:val="20"/>
+          <w:szCs w:val="20"/>
+        </w:rPr>
+        <w:t xml:space="preserve">산출물 생성 제안 및 사용자 선택 시 생성</w:t>
+      </w:r>
+      <w:r>
+        <w:rPr>
+          <w:rFonts w:ascii="맑은 고딕" w:cs="맑은 고딕" w:eastAsia="맑은 고딕" w:hAnsi="맑은 고딕"/>
+          <w:sz w:val="20"/>
+          <w:szCs w:val="20"/>
+        </w:rPr>
+        <w:t xml:space="preserve"> (체크리스트·안내서·신청서·기준표)</w:t>
+      </w:r>
+    </w:p>
+    <w:p>
+      <w:pPr>
+        <w:pStyle w:val="ListParagraph"/>
+        <w:numPr>
+          <w:ilvl w:val="0"/>
+          <w:numId w:val="2"/>
+        </w:numPr>
+        <w:spacing w:after="30" w:line="264"/>
+      </w:pPr>
+      <w:r>
+        <w:rPr>
+          <w:rFonts w:ascii="맑은 고딕" w:cs="맑은 고딕" w:eastAsia="맑은 고딕" w:hAnsi="맑은 고딕"/>
+          <w:sz w:val="20"/>
+          <w:szCs w:val="20"/>
+        </w:rPr>
+        <w:t xml:space="preserve">생성 산출물에 </w:t>
+      </w:r>
+      <w:r>
+        <w:rPr>
+          <w:rFonts w:ascii="맑은 고딕" w:cs="맑은 고딕" w:eastAsia="맑은 고딕" w:hAnsi="맑은 고딕"/>
+          <w:b/>
+          <w:bCs/>
+          <w:sz w:val="20"/>
+          <w:szCs w:val="20"/>
+        </w:rPr>
+        <w:t xml:space="preserve">근거 조항 및 생성 시점 병기</w:t>
+      </w:r>
+      <w:r>
+        <w:rPr>
+          <w:rFonts w:ascii="맑은 고딕" w:cs="맑은 고딕" w:eastAsia="맑은 고딕" w:hAnsi="맑은 고딕"/>
+          <w:sz w:val="20"/>
+          <w:szCs w:val="20"/>
+        </w:rPr>
+        <w:t xml:space="preserve">, 담당자 확정 전 초안 상태 유지</w:t>
       </w:r>
     </w:p>
     <w:p>

</xml_diff>